<commit_message>
docs: update DOCUMENTATION.md and Documentation.docx with all recent architectural changes
</commit_message>
<xml_diff>
--- a/docs/Documentation.docx
+++ b/docs/Documentation.docx
@@ -4,37 +4,45 @@
   <w:body>
     <w:p>
       <w:pPr>
-        <w:spacing w:before="0" w:after="80"/>
+        <w:spacing w:before="0" w:after="40"/>
       </w:pPr>
       <w:r>
         <w:rPr>
           <w:rFonts w:ascii="Arial" w:hAnsi="Arial"/>
           <w:b/>
           <w:color w:val="0F172A"/>
-          <w:sz w:val="44"/>
+          <w:sz w:val="48"/>
         </w:rPr>
-        <w:t>AETHERIA — PGSharp Digital Key Distribution Platform</w:t>
+        <w:t>AETHERIA — PGSharp Digital Storefront</w:t>
       </w:r>
     </w:p>
     <w:p>
       <w:pPr>
-        <w:spacing w:after="280"/>
+        <w:spacing w:before="0" w:after="240"/>
       </w:pPr>
       <w:r>
         <w:rPr>
           <w:rFonts w:ascii="Arial" w:hAnsi="Arial"/>
+          <w:b w:val="0"/>
           <w:color w:val="0E7490"/>
-          <w:sz w:val="24"/>
+          <w:sz w:val="26"/>
         </w:rPr>
-        <w:t>Comprehensive Technical, Operational &amp; System Architecture Documentation</w:t>
+        <w:t>Comprehensive Technical, Architectural &amp; Engineering Production Manual</w:t>
       </w:r>
     </w:p>
     <w:tbl>
       <w:tblPr>
         <w:tblW w:type="auto" w:w="0"/>
         <w:jc w:val="center"/>
-        <w:tblLayout w:type="fixed"/>
         <w:tblLook w:firstColumn="1" w:firstRow="1" w:lastColumn="0" w:lastRow="0" w:noHBand="0" w:noVBand="1" w:val="04A0"/>
+        <w:tblBorders>
+          <w:top w:val="single" w:sz="4" w:space="0" w:color="CBD5E1"/>
+          <w:left w:val="single" w:sz="4" w:space="0" w:color="CBD5E1"/>
+          <w:bottom w:val="single" w:sz="4" w:space="0" w:color="CBD5E1"/>
+          <w:right w:val="single" w:sz="4" w:space="0" w:color="CBD5E1"/>
+          <w:insideH w:val="single" w:sz="4" w:space="0" w:color="CBD5E1"/>
+          <w:insideV w:val="single" w:sz="4" w:space="0" w:color="CBD5E1"/>
+        </w:tblBorders>
       </w:tblPr>
       <w:tblGrid>
         <w:gridCol w:w="2340"/>
@@ -45,7 +53,7 @@
       <w:tr>
         <w:tc>
           <w:tcPr>
-            <w:tcW w:type="dxa" w:w="2304"/>
+            <w:tcW w:type="dxa" w:w="2340"/>
             <w:shd w:fill="F1F5F9"/>
             <w:tcMar>
               <w:top w:w="80" w:type="dxa"/>
@@ -56,22 +64,22 @@
           </w:tcPr>
           <w:p>
             <w:pPr>
-              <w:jc w:val="center"/>
+              <w:spacing w:before="0" w:after="0"/>
             </w:pPr>
             <w:r>
               <w:rPr>
                 <w:rFonts w:ascii="Arial" w:hAnsi="Arial"/>
                 <w:b/>
                 <w:color w:val="64748B"/>
-                <w:sz w:val="17"/>
+                <w:sz w:val="16"/>
               </w:rPr>
-              <w:t>Version: 3.2.0 Prod</w:t>
+              <w:t>Version: 2.5.0 Prod</w:t>
             </w:r>
           </w:p>
         </w:tc>
         <w:tc>
           <w:tcPr>
-            <w:tcW w:type="dxa" w:w="2304"/>
+            <w:tcW w:type="dxa" w:w="2340"/>
             <w:shd w:fill="F1F5F9"/>
             <w:tcMar>
               <w:top w:w="80" w:type="dxa"/>
@@ -82,22 +90,22 @@
           </w:tcPr>
           <w:p>
             <w:pPr>
-              <w:jc w:val="center"/>
+              <w:spacing w:before="0" w:after="0"/>
             </w:pPr>
             <w:r>
               <w:rPr>
                 <w:rFonts w:ascii="Arial" w:hAnsi="Arial"/>
                 <w:b/>
                 <w:color w:val="64748B"/>
-                <w:sz w:val="17"/>
+                <w:sz w:val="16"/>
               </w:rPr>
-              <w:t>Framework: Next.js 14</w:t>
+              <w:t>Framework: Next.js 14 App Router</w:t>
             </w:r>
           </w:p>
         </w:tc>
         <w:tc>
           <w:tcPr>
-            <w:tcW w:type="dxa" w:w="2304"/>
+            <w:tcW w:type="dxa" w:w="2340"/>
             <w:shd w:fill="F1F5F9"/>
             <w:tcMar>
               <w:top w:w="80" w:type="dxa"/>
@@ -108,22 +116,22 @@
           </w:tcPr>
           <w:p>
             <w:pPr>
-              <w:jc w:val="center"/>
+              <w:spacing w:before="0" w:after="0"/>
             </w:pPr>
             <w:r>
               <w:rPr>
                 <w:rFonts w:ascii="Arial" w:hAnsi="Arial"/>
                 <w:b/>
                 <w:color w:val="64748B"/>
-                <w:sz w:val="17"/>
+                <w:sz w:val="16"/>
               </w:rPr>
-              <w:t>Security: AES-256-GCM</w:t>
+              <w:t>Security: AES-256-GCM Vault</w:t>
             </w:r>
           </w:p>
         </w:tc>
         <w:tc>
           <w:tcPr>
-            <w:tcW w:type="dxa" w:w="2448"/>
+            <w:tcW w:type="dxa" w:w="2340"/>
             <w:shd w:fill="F1F5F9"/>
             <w:tcMar>
               <w:top w:w="80" w:type="dxa"/>
@@ -134,14 +142,14 @@
           </w:tcPr>
           <w:p>
             <w:pPr>
-              <w:jc w:val="center"/>
+              <w:spacing w:before="0" w:after="0"/>
             </w:pPr>
             <w:r>
               <w:rPr>
                 <w:rFonts w:ascii="Arial" w:hAnsi="Arial"/>
                 <w:b/>
                 <w:color w:val="64748B"/>
-                <w:sz w:val="17"/>
+                <w:sz w:val="16"/>
               </w:rPr>
               <w:t>Updated: September 2026</w:t>
             </w:r>
@@ -151,7 +159,7 @@
     </w:tbl>
     <w:p>
       <w:pPr>
-        <w:spacing w:after="200"/>
+        <w:spacing w:after="120"/>
       </w:pPr>
     </w:p>
     <w:p>
@@ -166,135 +174,92 @@
           <w:color w:val="0E7490"/>
           <w:sz w:val="28"/>
         </w:rPr>
-        <w:t>1. Executive Summary &amp; Multi-Channel Ecosystem</w:t>
+        <w:t>1. Executive Summary &amp; System Architecture</w:t>
       </w:r>
     </w:p>
     <w:p>
       <w:pPr>
-        <w:spacing w:after="120" w:line="276" w:lineRule="auto"/>
+        <w:spacing w:before="0" w:after="120" w:line="276" w:lineRule="auto"/>
       </w:pPr>
       <w:r>
         <w:rPr>
           <w:rFonts w:ascii="Arial" w:hAnsi="Arial"/>
           <w:color w:val="0F172A"/>
-          <w:sz w:val="19"/>
+          <w:sz w:val="20"/>
         </w:rPr>
-        <w:t>AETHERIA is a high-performance, automated digital distribution engine engineered specifically for official PGSharp Standard Edition license keys. The platform operates across multiple synchronous channels:</w:t>
+        <w:t>AETHERIA is an institutional-grade, high-performance digital commerce platform engineered specifically for official PGSharp Standard Edition (~30 Days) license key distribution. It merges luxury dark-mode aesthetics (Obsidian Glassmorphism, Neon Cyber Cyan &amp; Emerald accoutrements) with an interactive 550vh image-sequence scrollytelling runway, clean whole-rupee UPI settlement, direct Gmail SMTP delivery, autonomous Telegram bot transactions, and AES-256-GCM key encryption.</w:t>
       </w:r>
     </w:p>
     <w:p>
       <w:pPr>
         <w:pStyle w:val="ListBullet"/>
-        <w:spacing w:after="60" w:line="276" w:lineRule="auto"/>
+        <w:spacing w:before="0" w:after="60" w:line="276" w:lineRule="auto"/>
       </w:pPr>
       <w:r>
         <w:rPr>
           <w:rFonts w:ascii="Arial" w:hAnsi="Arial"/>
           <w:b/>
           <w:color w:val="0F172A"/>
-          <w:sz w:val="19"/>
+          <w:sz w:val="20"/>
         </w:rPr>
-        <w:t xml:space="preserve">Web Storefront: </w:t>
+        <w:t xml:space="preserve">Core Brand Proposition: </w:t>
       </w:r>
       <w:r>
         <w:rPr>
           <w:rFonts w:ascii="Arial" w:hAnsi="Arial"/>
+          <w:b w:val="0"/>
           <w:color w:val="0F172A"/>
-          <w:sz w:val="19"/>
+          <w:sz w:val="20"/>
         </w:rPr>
-        <w:t>Cyberpunk luxury dark-mode experience featuring a 550vh GSAP scrollytelling visual runway, ambient spatial audio, and an instant client-side key delivery modal.</w:t>
+        <w:t>Institutional-grade reliability, instantaneous automated key dispatch (&lt; 10 seconds), zero ban risk advisory, and 1-on-1 VIP concierge support on Discord, Telegram, and Reddit.</w:t>
       </w:r>
     </w:p>
     <w:p>
       <w:pPr>
         <w:pStyle w:val="ListBullet"/>
-        <w:spacing w:after="60" w:line="276" w:lineRule="auto"/>
+        <w:spacing w:before="0" w:after="60" w:line="276" w:lineRule="auto"/>
       </w:pPr>
       <w:r>
         <w:rPr>
           <w:rFonts w:ascii="Arial" w:hAnsi="Arial"/>
           <w:b/>
           <w:color w:val="0F172A"/>
-          <w:sz w:val="19"/>
+          <w:sz w:val="20"/>
         </w:rPr>
-        <w:t xml:space="preserve">Admin Command Center (/admin): </w:t>
+        <w:t xml:space="preserve">Technology Stack: </w:t>
       </w:r>
       <w:r>
         <w:rPr>
           <w:rFonts w:ascii="Arial" w:hAnsi="Arial"/>
+          <w:b w:val="0"/>
           <w:color w:val="0F172A"/>
-          <w:sz w:val="19"/>
+          <w:sz w:val="20"/>
         </w:rPr>
-        <w:t>Encrypted portal for live vault monitoring, direct key dispatch, bulk license ingestion, order proof management, and automated expiry reminders.</w:t>
+        <w:t>Next.js 14 App Router, TypeScript, Tailwind CSS, GSAP 3 (ScrollTrigger), HTML5 Canvas Particle Engine, Firebase Firestore / Admin SDK, Clean Whole-Rupee UPI Rails, Bank SMS Auto-Bridge Webhook, PayPal v2 &amp; Direct Rails, Nodemailer (Direct Gmail SMTP), and Telegram Bot API.</w:t>
       </w:r>
     </w:p>
     <w:p>
       <w:pPr>
         <w:pStyle w:val="ListBullet"/>
-        <w:spacing w:after="60" w:line="276" w:lineRule="auto"/>
+        <w:spacing w:before="0" w:after="60" w:line="276" w:lineRule="auto"/>
       </w:pPr>
       <w:r>
         <w:rPr>
           <w:rFonts w:ascii="Arial" w:hAnsi="Arial"/>
           <w:b/>
           <w:color w:val="0F172A"/>
-          <w:sz w:val="19"/>
+          <w:sz w:val="20"/>
         </w:rPr>
-        <w:t xml:space="preserve">Telegram Bot Engine (@AetheriaStoreOfficialBot): </w:t>
+        <w:t xml:space="preserve">Multi-Channel Reach: </w:t>
       </w:r>
       <w:r>
         <w:rPr>
           <w:rFonts w:ascii="Arial" w:hAnsi="Arial"/>
+          <w:b w:val="0"/>
           <w:color w:val="0F172A"/>
-          <w:sz w:val="19"/>
+          <w:sz w:val="20"/>
         </w:rPr>
-        <w:t>Autonomous multi-device purchasing bot supporting instant UPI/PayPal checkouts, key delivery in DMs, and an integrated viral referral reward program.</w:t>
-      </w:r>
-    </w:p>
-    <w:p>
-      <w:pPr>
-        <w:pStyle w:val="ListBullet"/>
-        <w:spacing w:after="60" w:line="276" w:lineRule="auto"/>
-      </w:pPr>
-      <w:r>
-        <w:rPr>
-          <w:rFonts w:ascii="Arial" w:hAnsi="Arial"/>
-          <w:b/>
-          <w:color w:val="0F172A"/>
-          <w:sz w:val="19"/>
-        </w:rPr>
-        <w:t xml:space="preserve">Telegram Proof Channel (@AetheriaStoreOfficial): </w:t>
-      </w:r>
-      <w:r>
-        <w:rPr>
-          <w:rFonts w:ascii="Arial" w:hAnsi="Arial"/>
-          <w:color w:val="0F172A"/>
-          <w:sz w:val="19"/>
-        </w:rPr>
-        <w:t>Real-time automated restock announcements and privacy-masked order verification proofs.</w:t>
-      </w:r>
-    </w:p>
-    <w:p>
-      <w:pPr>
-        <w:pStyle w:val="ListBullet"/>
-        <w:spacing w:after="60" w:line="276" w:lineRule="auto"/>
-      </w:pPr>
-      <w:r>
-        <w:rPr>
-          <w:rFonts w:ascii="Arial" w:hAnsi="Arial"/>
-          <w:b/>
-          <w:color w:val="0F172A"/>
-          <w:sz w:val="19"/>
-        </w:rPr>
-        <w:t xml:space="preserve">Discord Lead Notifier (discord-key-notifier): </w:t>
-      </w:r>
-      <w:r>
-        <w:rPr>
-          <w:rFonts w:ascii="Arial" w:hAnsi="Arial"/>
-          <w:color w:val="0F172A"/>
-          <w:sz w:val="19"/>
-        </w:rPr>
-        <w:t>Dedicated gateway microservice monitoring 23 Discord servers in real time, routing high-intent buyer alerts directly to the owner's Telegram.</w:t>
+        <w:t>Web Storefront (aetheria-store.vercel.app), Admin Command Center (/admin), Telegram Shop Bot (@AetheriaStoreOfficialBot), Telegram Proof Channel (@AetheriaStoreOfficial), and Discord Real-Time Buyer Radar.</w:t>
       </w:r>
     </w:p>
     <w:p>
@@ -309,40 +274,48 @@
           <w:color w:val="0E7490"/>
           <w:sz w:val="28"/>
         </w:rPr>
-        <w:t>2. Active Pricing &amp; License Tier Structure</w:t>
+        <w:t>2. Official Pricing Architecture &amp; Device Slot Matrix</w:t>
       </w:r>
     </w:p>
     <w:p>
       <w:pPr>
-        <w:spacing w:after="120" w:line="276" w:lineRule="auto"/>
+        <w:spacing w:before="0" w:after="120" w:line="276" w:lineRule="auto"/>
       </w:pPr>
       <w:r>
         <w:rPr>
           <w:rFonts w:ascii="Arial" w:hAnsi="Arial"/>
           <w:color w:val="0F172A"/>
-          <w:sz w:val="19"/>
+          <w:sz w:val="20"/>
         </w:rPr>
-        <w:t>The store offers two distinct consumer editions, priced dynamically in INR and USD:</w:t>
+        <w:t>Pricing is centrally defined in src/lib/constants.ts and dynamically cascades across storefront cards, modal checkouts, PayPal payment links, automated Telegram bot messages, and SEO schemas. Strikethrough pricing reinforces high perceived value.</w:t>
       </w:r>
     </w:p>
     <w:tbl>
       <w:tblPr>
         <w:tblW w:type="auto" w:w="0"/>
         <w:jc w:val="center"/>
-        <w:tblLayout w:type="fixed"/>
         <w:tblLook w:firstColumn="1" w:firstRow="1" w:lastColumn="0" w:lastRow="0" w:noHBand="0" w:noVBand="1" w:val="04A0"/>
+        <w:tblBorders>
+          <w:top w:val="single" w:sz="4" w:space="0" w:color="CBD5E1"/>
+          <w:left w:val="single" w:sz="4" w:space="0" w:color="CBD5E1"/>
+          <w:bottom w:val="single" w:sz="4" w:space="0" w:color="CBD5E1"/>
+          <w:right w:val="single" w:sz="4" w:space="0" w:color="CBD5E1"/>
+          <w:insideH w:val="single" w:sz="4" w:space="0" w:color="CBD5E1"/>
+          <w:insideV w:val="single" w:sz="4" w:space="0" w:color="CBD5E1"/>
+        </w:tblBorders>
       </w:tblPr>
       <w:tblGrid>
-        <w:gridCol w:w="1872"/>
-        <w:gridCol w:w="1872"/>
-        <w:gridCol w:w="1872"/>
-        <w:gridCol w:w="1872"/>
-        <w:gridCol w:w="1872"/>
+        <w:gridCol w:w="1560"/>
+        <w:gridCol w:w="1560"/>
+        <w:gridCol w:w="1560"/>
+        <w:gridCol w:w="1560"/>
+        <w:gridCol w:w="1560"/>
+        <w:gridCol w:w="1560"/>
       </w:tblGrid>
       <w:tr>
         <w:tc>
           <w:tcPr>
-            <w:tcW w:type="dxa" w:w="1872"/>
+            <w:tcW w:type="dxa" w:w="1728"/>
             <w:shd w:fill="0E7490"/>
             <w:tcMar>
               <w:top w:w="100" w:type="dxa"/>
@@ -352,6 +325,9 @@
             </w:tcMar>
           </w:tcPr>
           <w:p>
+            <w:pPr>
+              <w:spacing w:before="0" w:after="0"/>
+            </w:pPr>
             <w:r>
               <w:rPr>
                 <w:rFonts w:ascii="Arial" w:hAnsi="Arial"/>
@@ -359,7 +335,111 @@
                 <w:color w:val="FFFFFF"/>
                 <w:sz w:val="18"/>
               </w:rPr>
-              <w:t>Tier Name</w:t>
+              <w:t>Plan Tier</w:t>
+            </w:r>
+          </w:p>
+        </w:tc>
+        <w:tc>
+          <w:tcPr>
+            <w:tcW w:type="dxa" w:w="1296"/>
+            <w:shd w:fill="0E7490"/>
+            <w:tcMar>
+              <w:top w:w="100" w:type="dxa"/>
+              <w:bottom w:w="100" w:type="dxa"/>
+              <w:left w:w="120" w:type="dxa"/>
+              <w:right w:w="120" w:type="dxa"/>
+            </w:tcMar>
+          </w:tcPr>
+          <w:p>
+            <w:pPr>
+              <w:spacing w:before="0" w:after="0"/>
+            </w:pPr>
+            <w:r>
+              <w:rPr>
+                <w:rFonts w:ascii="Arial" w:hAnsi="Arial"/>
+                <w:b/>
+                <w:color w:val="FFFFFF"/>
+                <w:sz w:val="18"/>
+              </w:rPr>
+              <w:t>Device Capacity</w:t>
+            </w:r>
+          </w:p>
+        </w:tc>
+        <w:tc>
+          <w:tcPr>
+            <w:tcW w:type="dxa" w:w="1440"/>
+            <w:shd w:fill="0E7490"/>
+            <w:tcMar>
+              <w:top w:w="100" w:type="dxa"/>
+              <w:bottom w:w="100" w:type="dxa"/>
+              <w:left w:w="120" w:type="dxa"/>
+              <w:right w:w="120" w:type="dxa"/>
+            </w:tcMar>
+          </w:tcPr>
+          <w:p>
+            <w:pPr>
+              <w:spacing w:before="0" w:after="0"/>
+            </w:pPr>
+            <w:r>
+              <w:rPr>
+                <w:rFonts w:ascii="Arial" w:hAnsi="Arial"/>
+                <w:b/>
+                <w:color w:val="FFFFFF"/>
+                <w:sz w:val="18"/>
+              </w:rPr>
+              <w:t>Standard Price (INR)</w:t>
+            </w:r>
+          </w:p>
+        </w:tc>
+        <w:tc>
+          <w:tcPr>
+            <w:tcW w:type="dxa" w:w="1440"/>
+            <w:shd w:fill="0E7490"/>
+            <w:tcMar>
+              <w:top w:w="100" w:type="dxa"/>
+              <w:bottom w:w="100" w:type="dxa"/>
+              <w:left w:w="120" w:type="dxa"/>
+              <w:right w:w="120" w:type="dxa"/>
+            </w:tcMar>
+          </w:tcPr>
+          <w:p>
+            <w:pPr>
+              <w:spacing w:before="0" w:after="0"/>
+            </w:pPr>
+            <w:r>
+              <w:rPr>
+                <w:rFonts w:ascii="Arial" w:hAnsi="Arial"/>
+                <w:b/>
+                <w:color w:val="FFFFFF"/>
+                <w:sz w:val="18"/>
+              </w:rPr>
+              <w:t>Standard Price (USD)</w:t>
+            </w:r>
+          </w:p>
+        </w:tc>
+        <w:tc>
+          <w:tcPr>
+            <w:tcW w:type="dxa" w:w="1584"/>
+            <w:shd w:fill="0E7490"/>
+            <w:tcMar>
+              <w:top w:w="100" w:type="dxa"/>
+              <w:bottom w:w="100" w:type="dxa"/>
+              <w:left w:w="120" w:type="dxa"/>
+              <w:right w:w="120" w:type="dxa"/>
+            </w:tcMar>
+          </w:tcPr>
+          <w:p>
+            <w:pPr>
+              <w:spacing w:before="0" w:after="0"/>
+            </w:pPr>
+            <w:r>
+              <w:rPr>
+                <w:rFonts w:ascii="Arial" w:hAnsi="Arial"/>
+                <w:b/>
+                <w:color w:val="FFFFFF"/>
+                <w:sz w:val="18"/>
+              </w:rPr>
+              <w:t>Referral Price (INR)</w:t>
             </w:r>
           </w:p>
         </w:tc>
@@ -375,6 +455,9 @@
             </w:tcMar>
           </w:tcPr>
           <w:p>
+            <w:pPr>
+              <w:spacing w:before="0" w:after="0"/>
+            </w:pPr>
             <w:r>
               <w:rPr>
                 <w:rFonts w:ascii="Arial" w:hAnsi="Arial"/>
@@ -382,76 +465,7 @@
                 <w:color w:val="FFFFFF"/>
                 <w:sz w:val="18"/>
               </w:rPr>
-              <w:t>Device Capacity</w:t>
-            </w:r>
-          </w:p>
-        </w:tc>
-        <w:tc>
-          <w:tcPr>
-            <w:tcW w:type="dxa" w:w="1584"/>
-            <w:shd w:fill="0E7490"/>
-            <w:tcMar>
-              <w:top w:w="100" w:type="dxa"/>
-              <w:bottom w:w="100" w:type="dxa"/>
-              <w:left w:w="120" w:type="dxa"/>
-              <w:right w:w="120" w:type="dxa"/>
-            </w:tcMar>
-          </w:tcPr>
-          <w:p>
-            <w:r>
-              <w:rPr>
-                <w:rFonts w:ascii="Arial" w:hAnsi="Arial"/>
-                <w:b/>
-                <w:color w:val="FFFFFF"/>
-                <w:sz w:val="18"/>
-              </w:rPr>
-              <w:t>Price (INR)</w:t>
-            </w:r>
-          </w:p>
-        </w:tc>
-        <w:tc>
-          <w:tcPr>
-            <w:tcW w:type="dxa" w:w="1584"/>
-            <w:shd w:fill="0E7490"/>
-            <w:tcMar>
-              <w:top w:w="100" w:type="dxa"/>
-              <w:bottom w:w="100" w:type="dxa"/>
-              <w:left w:w="120" w:type="dxa"/>
-              <w:right w:w="120" w:type="dxa"/>
-            </w:tcMar>
-          </w:tcPr>
-          <w:p>
-            <w:r>
-              <w:rPr>
-                <w:rFonts w:ascii="Arial" w:hAnsi="Arial"/>
-                <w:b/>
-                <w:color w:val="FFFFFF"/>
-                <w:sz w:val="18"/>
-              </w:rPr>
-              <w:t>Price (USD)</w:t>
-            </w:r>
-          </w:p>
-        </w:tc>
-        <w:tc>
-          <w:tcPr>
-            <w:tcW w:type="dxa" w:w="2448"/>
-            <w:shd w:fill="0E7490"/>
-            <w:tcMar>
-              <w:top w:w="100" w:type="dxa"/>
-              <w:bottom w:w="100" w:type="dxa"/>
-              <w:left w:w="120" w:type="dxa"/>
-              <w:right w:w="120" w:type="dxa"/>
-            </w:tcMar>
-          </w:tcPr>
-          <w:p>
-            <w:r>
-              <w:rPr>
-                <w:rFonts w:ascii="Arial" w:hAnsi="Arial"/>
-                <w:b/>
-                <w:color w:val="FFFFFF"/>
-                <w:sz w:val="18"/>
-              </w:rPr>
-              <w:t>Duration &amp; Features</w:t>
+              <w:t>Referral Price (USD)</w:t>
             </w:r>
           </w:p>
         </w:tc>
@@ -459,7 +473,7 @@
       <w:tr>
         <w:tc>
           <w:tcPr>
-            <w:tcW w:type="dxa" w:w="1872"/>
+            <w:tcW w:type="dxa" w:w="1728"/>
             <w:shd w:fill="F8FAFC"/>
             <w:tcMar>
               <w:top w:w="80" w:type="dxa"/>
@@ -469,6 +483,9 @@
             </w:tcMar>
           </w:tcPr>
           <w:p>
+            <w:pPr>
+              <w:spacing w:before="0" w:after="0" w:line="264" w:lineRule="auto"/>
+            </w:pPr>
             <w:r>
               <w:rPr>
                 <w:rFonts w:ascii="Arial" w:hAnsi="Arial"/>
@@ -476,6 +493,106 @@
                 <w:sz w:val="17"/>
               </w:rPr>
               <w:t>Standard Tier</w:t>
+            </w:r>
+          </w:p>
+        </w:tc>
+        <w:tc>
+          <w:tcPr>
+            <w:tcW w:type="dxa" w:w="1296"/>
+            <w:shd w:fill="F8FAFC"/>
+            <w:tcMar>
+              <w:top w:w="80" w:type="dxa"/>
+              <w:bottom w:w="80" w:type="dxa"/>
+              <w:left w:w="120" w:type="dxa"/>
+              <w:right w:w="120" w:type="dxa"/>
+            </w:tcMar>
+          </w:tcPr>
+          <w:p>
+            <w:pPr>
+              <w:spacing w:before="0" w:after="0" w:line="264" w:lineRule="auto"/>
+            </w:pPr>
+            <w:r>
+              <w:rPr>
+                <w:rFonts w:ascii="Arial" w:hAnsi="Arial"/>
+                <w:color w:val="0F172A"/>
+                <w:sz w:val="17"/>
+              </w:rPr>
+              <w:t>1 Android Device</w:t>
+            </w:r>
+          </w:p>
+        </w:tc>
+        <w:tc>
+          <w:tcPr>
+            <w:tcW w:type="dxa" w:w="1440"/>
+            <w:shd w:fill="F8FAFC"/>
+            <w:tcMar>
+              <w:top w:w="80" w:type="dxa"/>
+              <w:bottom w:w="80" w:type="dxa"/>
+              <w:left w:w="120" w:type="dxa"/>
+              <w:right w:w="120" w:type="dxa"/>
+            </w:tcMar>
+          </w:tcPr>
+          <w:p>
+            <w:pPr>
+              <w:spacing w:before="0" w:after="0" w:line="264" w:lineRule="auto"/>
+            </w:pPr>
+            <w:r>
+              <w:rPr>
+                <w:rFonts w:ascii="Arial" w:hAnsi="Arial"/>
+                <w:color w:val="0F172A"/>
+                <w:sz w:val="17"/>
+              </w:rPr>
+              <w:t>₹160 (Fixed Whole)</w:t>
+            </w:r>
+          </w:p>
+        </w:tc>
+        <w:tc>
+          <w:tcPr>
+            <w:tcW w:type="dxa" w:w="1440"/>
+            <w:shd w:fill="F8FAFC"/>
+            <w:tcMar>
+              <w:top w:w="80" w:type="dxa"/>
+              <w:bottom w:w="80" w:type="dxa"/>
+              <w:left w:w="120" w:type="dxa"/>
+              <w:right w:w="120" w:type="dxa"/>
+            </w:tcMar>
+          </w:tcPr>
+          <w:p>
+            <w:pPr>
+              <w:spacing w:before="0" w:after="0" w:line="264" w:lineRule="auto"/>
+            </w:pPr>
+            <w:r>
+              <w:rPr>
+                <w:rFonts w:ascii="Arial" w:hAnsi="Arial"/>
+                <w:color w:val="0F172A"/>
+                <w:sz w:val="17"/>
+              </w:rPr>
+              <w:t>$2.00 (Fixed USD)</w:t>
+            </w:r>
+          </w:p>
+        </w:tc>
+        <w:tc>
+          <w:tcPr>
+            <w:tcW w:type="dxa" w:w="1584"/>
+            <w:shd w:fill="F8FAFC"/>
+            <w:tcMar>
+              <w:top w:w="80" w:type="dxa"/>
+              <w:bottom w:w="80" w:type="dxa"/>
+              <w:left w:w="120" w:type="dxa"/>
+              <w:right w:w="120" w:type="dxa"/>
+            </w:tcMar>
+          </w:tcPr>
+          <w:p>
+            <w:pPr>
+              <w:spacing w:before="0" w:after="0" w:line="264" w:lineRule="auto"/>
+            </w:pPr>
+            <w:r>
+              <w:rPr>
+                <w:rFonts w:ascii="Arial" w:hAnsi="Arial"/>
+                <w:color w:val="0F172A"/>
+                <w:sz w:val="17"/>
+              </w:rPr>
+              <w:t>₹130 (₹30 OFF)</w:t>
             </w:r>
           </w:p>
         </w:tc>
@@ -491,79 +608,16 @@
             </w:tcMar>
           </w:tcPr>
           <w:p>
+            <w:pPr>
+              <w:spacing w:before="0" w:after="0" w:line="264" w:lineRule="auto"/>
+            </w:pPr>
             <w:r>
               <w:rPr>
                 <w:rFonts w:ascii="Arial" w:hAnsi="Arial"/>
                 <w:color w:val="0F172A"/>
                 <w:sz w:val="17"/>
               </w:rPr>
-              <w:t>1 Android Device</w:t>
-            </w:r>
-          </w:p>
-        </w:tc>
-        <w:tc>
-          <w:tcPr>
-            <w:tcW w:type="dxa" w:w="1584"/>
-            <w:shd w:fill="F8FAFC"/>
-            <w:tcMar>
-              <w:top w:w="80" w:type="dxa"/>
-              <w:bottom w:w="80" w:type="dxa"/>
-              <w:left w:w="120" w:type="dxa"/>
-              <w:right w:w="120" w:type="dxa"/>
-            </w:tcMar>
-          </w:tcPr>
-          <w:p>
-            <w:r>
-              <w:rPr>
-                <w:rFonts w:ascii="Arial" w:hAnsi="Arial"/>
-                <w:color w:val="0F172A"/>
-                <w:sz w:val="17"/>
-              </w:rPr>
-              <w:t>₹160</w:t>
-            </w:r>
-          </w:p>
-        </w:tc>
-        <w:tc>
-          <w:tcPr>
-            <w:tcW w:type="dxa" w:w="1584"/>
-            <w:shd w:fill="F8FAFC"/>
-            <w:tcMar>
-              <w:top w:w="80" w:type="dxa"/>
-              <w:bottom w:w="80" w:type="dxa"/>
-              <w:left w:w="120" w:type="dxa"/>
-              <w:right w:w="120" w:type="dxa"/>
-            </w:tcMar>
-          </w:tcPr>
-          <w:p>
-            <w:r>
-              <w:rPr>
-                <w:rFonts w:ascii="Arial" w:hAnsi="Arial"/>
-                <w:color w:val="0F172A"/>
-                <w:sz w:val="17"/>
-              </w:rPr>
-              <w:t>$2.00</w:t>
-            </w:r>
-          </w:p>
-        </w:tc>
-        <w:tc>
-          <w:tcPr>
-            <w:tcW w:type="dxa" w:w="2448"/>
-            <w:shd w:fill="F8FAFC"/>
-            <w:tcMar>
-              <w:top w:w="80" w:type="dxa"/>
-              <w:bottom w:w="80" w:type="dxa"/>
-              <w:left w:w="120" w:type="dxa"/>
-              <w:right w:w="120" w:type="dxa"/>
-            </w:tcMar>
-          </w:tcPr>
-          <w:p>
-            <w:r>
-              <w:rPr>
-                <w:rFonts w:ascii="Arial" w:hAnsi="Arial"/>
-                <w:color w:val="0F172A"/>
-                <w:sz w:val="17"/>
-              </w:rPr>
-              <w:t>30 Days • Joystick, Teleport, 100% IV Checker, Auto-Walk</w:t>
+              <w:t>$1.70 ($0.30 OFF)</w:t>
             </w:r>
           </w:p>
         </w:tc>
@@ -571,7 +625,7 @@
       <w:tr>
         <w:tc>
           <w:tcPr>
-            <w:tcW w:type="dxa" w:w="1872"/>
+            <w:tcW w:type="dxa" w:w="1728"/>
             <w:shd w:fill="FFFFFF"/>
             <w:tcMar>
               <w:top w:w="80" w:type="dxa"/>
@@ -581,6 +635,9 @@
             </w:tcMar>
           </w:tcPr>
           <w:p>
+            <w:pPr>
+              <w:spacing w:before="0" w:after="0" w:line="264" w:lineRule="auto"/>
+            </w:pPr>
             <w:r>
               <w:rPr>
                 <w:rFonts w:ascii="Arial" w:hAnsi="Arial"/>
@@ -588,6 +645,106 @@
                 <w:sz w:val="17"/>
               </w:rPr>
               <w:t>Duo Tier (Best Value)</w:t>
+            </w:r>
+          </w:p>
+        </w:tc>
+        <w:tc>
+          <w:tcPr>
+            <w:tcW w:type="dxa" w:w="1296"/>
+            <w:shd w:fill="FFFFFF"/>
+            <w:tcMar>
+              <w:top w:w="80" w:type="dxa"/>
+              <w:bottom w:w="80" w:type="dxa"/>
+              <w:left w:w="120" w:type="dxa"/>
+              <w:right w:w="120" w:type="dxa"/>
+            </w:tcMar>
+          </w:tcPr>
+          <w:p>
+            <w:pPr>
+              <w:spacing w:before="0" w:after="0" w:line="264" w:lineRule="auto"/>
+            </w:pPr>
+            <w:r>
+              <w:rPr>
+                <w:rFonts w:ascii="Arial" w:hAnsi="Arial"/>
+                <w:color w:val="0F172A"/>
+                <w:sz w:val="17"/>
+              </w:rPr>
+              <w:t>2 Android Devices</w:t>
+            </w:r>
+          </w:p>
+        </w:tc>
+        <w:tc>
+          <w:tcPr>
+            <w:tcW w:type="dxa" w:w="1440"/>
+            <w:shd w:fill="FFFFFF"/>
+            <w:tcMar>
+              <w:top w:w="80" w:type="dxa"/>
+              <w:bottom w:w="80" w:type="dxa"/>
+              <w:left w:w="120" w:type="dxa"/>
+              <w:right w:w="120" w:type="dxa"/>
+            </w:tcMar>
+          </w:tcPr>
+          <w:p>
+            <w:pPr>
+              <w:spacing w:before="0" w:after="0" w:line="264" w:lineRule="auto"/>
+            </w:pPr>
+            <w:r>
+              <w:rPr>
+                <w:rFonts w:ascii="Arial" w:hAnsi="Arial"/>
+                <w:color w:val="0F172A"/>
+                <w:sz w:val="17"/>
+              </w:rPr>
+              <w:t>₹300 (was ₹320)</w:t>
+            </w:r>
+          </w:p>
+        </w:tc>
+        <w:tc>
+          <w:tcPr>
+            <w:tcW w:type="dxa" w:w="1440"/>
+            <w:shd w:fill="FFFFFF"/>
+            <w:tcMar>
+              <w:top w:w="80" w:type="dxa"/>
+              <w:bottom w:w="80" w:type="dxa"/>
+              <w:left w:w="120" w:type="dxa"/>
+              <w:right w:w="120" w:type="dxa"/>
+            </w:tcMar>
+          </w:tcPr>
+          <w:p>
+            <w:pPr>
+              <w:spacing w:before="0" w:after="0" w:line="264" w:lineRule="auto"/>
+            </w:pPr>
+            <w:r>
+              <w:rPr>
+                <w:rFonts w:ascii="Arial" w:hAnsi="Arial"/>
+                <w:color w:val="0F172A"/>
+                <w:sz w:val="17"/>
+              </w:rPr>
+              <w:t>$3.60 (was $4.00)</w:t>
+            </w:r>
+          </w:p>
+        </w:tc>
+        <w:tc>
+          <w:tcPr>
+            <w:tcW w:type="dxa" w:w="1584"/>
+            <w:shd w:fill="FFFFFF"/>
+            <w:tcMar>
+              <w:top w:w="80" w:type="dxa"/>
+              <w:bottom w:w="80" w:type="dxa"/>
+              <w:left w:w="120" w:type="dxa"/>
+              <w:right w:w="120" w:type="dxa"/>
+            </w:tcMar>
+          </w:tcPr>
+          <w:p>
+            <w:pPr>
+              <w:spacing w:before="0" w:after="0" w:line="264" w:lineRule="auto"/>
+            </w:pPr>
+            <w:r>
+              <w:rPr>
+                <w:rFonts w:ascii="Arial" w:hAnsi="Arial"/>
+                <w:color w:val="0F172A"/>
+                <w:sz w:val="17"/>
+              </w:rPr>
+              <w:t>₹270 (₹30 OFF)</w:t>
             </w:r>
           </w:p>
         </w:tc>
@@ -603,79 +760,16 @@
             </w:tcMar>
           </w:tcPr>
           <w:p>
+            <w:pPr>
+              <w:spacing w:before="0" w:after="0" w:line="264" w:lineRule="auto"/>
+            </w:pPr>
             <w:r>
               <w:rPr>
                 <w:rFonts w:ascii="Arial" w:hAnsi="Arial"/>
                 <w:color w:val="0F172A"/>
                 <w:sz w:val="17"/>
               </w:rPr>
-              <w:t>2 Android Devices</w:t>
-            </w:r>
-          </w:p>
-        </w:tc>
-        <w:tc>
-          <w:tcPr>
-            <w:tcW w:type="dxa" w:w="1584"/>
-            <w:shd w:fill="FFFFFF"/>
-            <w:tcMar>
-              <w:top w:w="80" w:type="dxa"/>
-              <w:bottom w:w="80" w:type="dxa"/>
-              <w:left w:w="120" w:type="dxa"/>
-              <w:right w:w="120" w:type="dxa"/>
-            </w:tcMar>
-          </w:tcPr>
-          <w:p>
-            <w:r>
-              <w:rPr>
-                <w:rFonts w:ascii="Arial" w:hAnsi="Arial"/>
-                <w:color w:val="0F172A"/>
-                <w:sz w:val="17"/>
-              </w:rPr>
-              <w:t>₹300 (was ₹320)</w:t>
-            </w:r>
-          </w:p>
-        </w:tc>
-        <w:tc>
-          <w:tcPr>
-            <w:tcW w:type="dxa" w:w="1584"/>
-            <w:shd w:fill="FFFFFF"/>
-            <w:tcMar>
-              <w:top w:w="80" w:type="dxa"/>
-              <w:bottom w:w="80" w:type="dxa"/>
-              <w:left w:w="120" w:type="dxa"/>
-              <w:right w:w="120" w:type="dxa"/>
-            </w:tcMar>
-          </w:tcPr>
-          <w:p>
-            <w:r>
-              <w:rPr>
-                <w:rFonts w:ascii="Arial" w:hAnsi="Arial"/>
-                <w:color w:val="0F172A"/>
-                <w:sz w:val="17"/>
-              </w:rPr>
-              <w:t>$3.60 (was $4.00)</w:t>
-            </w:r>
-          </w:p>
-        </w:tc>
-        <w:tc>
-          <w:tcPr>
-            <w:tcW w:type="dxa" w:w="2448"/>
-            <w:shd w:fill="FFFFFF"/>
-            <w:tcMar>
-              <w:top w:w="80" w:type="dxa"/>
-              <w:bottom w:w="80" w:type="dxa"/>
-              <w:left w:w="120" w:type="dxa"/>
-              <w:right w:w="120" w:type="dxa"/>
-            </w:tcMar>
-          </w:tcPr>
-          <w:p>
-            <w:r>
-              <w:rPr>
-                <w:rFonts w:ascii="Arial" w:hAnsi="Arial"/>
-                <w:color w:val="0F172A"/>
-                <w:sz w:val="17"/>
-              </w:rPr>
-              <w:t>30 Days • 2 Concurrent Device Slots, Priority Support</w:t>
+              <w:t>$3.10 ($0.50 OFF)</w:t>
             </w:r>
           </w:p>
         </w:tc>
@@ -683,30 +777,15 @@
     </w:tbl>
     <w:p>
       <w:pPr>
-        <w:spacing w:after="160"/>
-      </w:pPr>
-    </w:p>
-    <w:p>
-      <w:pPr>
-        <w:pStyle w:val="ListBullet"/>
-        <w:spacing w:after="60" w:line="276" w:lineRule="auto"/>
+        <w:spacing w:before="0" w:after="120" w:line="276" w:lineRule="auto"/>
       </w:pPr>
       <w:r>
         <w:rPr>
           <w:rFonts w:ascii="Arial" w:hAnsi="Arial"/>
-          <w:b/>
           <w:color w:val="0F172A"/>
-          <w:sz w:val="19"/>
+          <w:sz w:val="20"/>
         </w:rPr>
-        <w:t xml:space="preserve">Key Allocation Policies &amp; Dedicated Vault Control: </w:t>
-      </w:r>
-      <w:r>
-        <w:rPr>
-          <w:rFonts w:ascii="Arial" w:hAnsi="Arial"/>
-          <w:color w:val="0F172A"/>
-          <w:sz w:val="19"/>
-        </w:rPr>
-        <w:t>The uploader in /admin provides flexible slot allocation policies: 1 Device Dedicated (1 Key = 1 Customer, retired immediately upon sale, never shared), 2 Devices (Duo tier), or 3 Devices (Patreon shared across 3 buyers).</w:t>
+        <w:t>Approximate Duration (~30 Days): To accommodate slight upstream Patreon key variances (rare 28-29 day cycles), all public copy explicitly denotes '~30 Days', preventing disputes while maintaining customer satisfaction.</w:t>
       </w:r>
     </w:p>
     <w:p>
@@ -721,112 +800,116 @@
           <w:color w:val="0E7490"/>
           <w:sz w:val="28"/>
         </w:rPr>
-        <w:t>3. Payment Rails &amp; Whole-Rupee Automated Verification</w:t>
+        <w:t>3. Patreon 3-Device Key Slot Allocation Engine</w:t>
       </w:r>
     </w:p>
     <w:p>
       <w:pPr>
-        <w:spacing w:after="120" w:line="276" w:lineRule="auto"/>
+        <w:spacing w:before="0" w:after="120" w:line="276" w:lineRule="auto"/>
       </w:pPr>
       <w:r>
         <w:rPr>
           <w:rFonts w:ascii="Arial" w:hAnsi="Arial"/>
           <w:color w:val="0F172A"/>
-          <w:sz w:val="19"/>
+          <w:sz w:val="20"/>
         </w:rPr>
-        <w:t>AETHERIA operates on a dual-rail payment architecture combining domestic Indian UPI with international PayPal checkouts:</w:t>
+        <w:t>AETHERIA operates on official 3-device Patreon Standard Edition keys (source: 'patreon_3slot'). A single physical key authorizes up to 3 concurrent Android devices. A virtual slot bin-packing engine partitions physical keys across customer orders:</w:t>
       </w:r>
     </w:p>
     <w:p>
       <w:pPr>
         <w:pStyle w:val="ListBullet"/>
-        <w:spacing w:after="60" w:line="276" w:lineRule="auto"/>
+        <w:spacing w:before="0" w:after="60" w:line="276" w:lineRule="auto"/>
       </w:pPr>
       <w:r>
         <w:rPr>
           <w:rFonts w:ascii="Arial" w:hAnsi="Arial"/>
           <w:b/>
           <w:color w:val="0F172A"/>
-          <w:sz w:val="19"/>
+          <w:sz w:val="20"/>
         </w:rPr>
-        <w:t xml:space="preserve">Clean Whole-Rupee Architecture: </w:t>
+        <w:t xml:space="preserve">1 Device Plan (1 Slot): </w:t>
       </w:r>
       <w:r>
         <w:rPr>
           <w:rFonts w:ascii="Arial" w:hAnsi="Arial"/>
+          <w:b w:val="0"/>
           <w:color w:val="0F172A"/>
-          <w:sz w:val="19"/>
+          <w:sz w:val="20"/>
         </w:rPr>
-        <w:t>Completely eliminated fractional decimal paise (e.g., .14 paise). Customers pay exact whole rupee figures (₹160 or ₹300), preventing bank payment filters (e.g. SBI, Google Pay, PhonePe) from rejecting transfers.</w:t>
+        <w:t>Consumes 1 slot. Prioritizes partially-filled active keys (e.g. 1/3 or 2/3 filled) to maximize inventory density, leaving remaining slots available for future buyers.</w:t>
       </w:r>
     </w:p>
     <w:p>
       <w:pPr>
         <w:pStyle w:val="ListBullet"/>
-        <w:spacing w:after="60" w:line="276" w:lineRule="auto"/>
+        <w:spacing w:before="0" w:after="60" w:line="276" w:lineRule="auto"/>
       </w:pPr>
       <w:r>
         <w:rPr>
           <w:rFonts w:ascii="Arial" w:hAnsi="Arial"/>
           <w:b/>
           <w:color w:val="0F172A"/>
-          <w:sz w:val="19"/>
+          <w:sz w:val="20"/>
         </w:rPr>
-        <w:t xml:space="preserve">Smart-Routing UPI VPAs: </w:t>
+        <w:t xml:space="preserve">2 Devices Plan (2 Slots): </w:t>
       </w:r>
       <w:r>
         <w:rPr>
           <w:rFonts w:ascii="Arial" w:hAnsi="Arial"/>
+          <w:b w:val="0"/>
           <w:color w:val="0F172A"/>
-          <w:sz w:val="19"/>
+          <w:sz w:val="20"/>
         </w:rPr>
-        <w:t>Direct integration with four resilient banking handles: dhruvmatliwala123@oksbi (Primary), okicici (Fastest), okaxis (High Uptime), and okhdfcbank (Reliable).</w:t>
+        <w:t>Consumes 2 slots. Selects keys with &gt;= 2 available slots, packing them without waste.</w:t>
       </w:r>
     </w:p>
     <w:p>
       <w:pPr>
         <w:pStyle w:val="ListBullet"/>
-        <w:spacing w:after="60" w:line="276" w:lineRule="auto"/>
+        <w:spacing w:before="0" w:after="60" w:line="276" w:lineRule="auto"/>
       </w:pPr>
       <w:r>
         <w:rPr>
           <w:rFonts w:ascii="Arial" w:hAnsi="Arial"/>
           <w:b/>
           <w:color w:val="0F172A"/>
-          <w:sz w:val="19"/>
+          <w:sz w:val="20"/>
         </w:rPr>
-        <w:t xml:space="preserve">24/7 Bank SMS Bridge (/api/webhooks/upi): </w:t>
+        <w:t xml:space="preserve">Dedicated Private Key (3 Slots): </w:t>
       </w:r>
       <w:r>
         <w:rPr>
           <w:rFonts w:ascii="Arial" w:hAnsi="Arial"/>
+          <w:b w:val="0"/>
           <w:color w:val="0F172A"/>
-          <w:sz w:val="19"/>
+          <w:sz w:val="20"/>
         </w:rPr>
-        <w:t>Automated Android forwarder integration that parses incoming credit SMS notifications in real time. Features strict anti-fraud rules blocking personal 10-digit mobile senders and automatic suppression of sensitive 2FA/OTPs.</w:t>
+        <w:t>Pulls a 100% virgin untouched key (0/3 used) and immediately locks it as status: 'full'. Guarantees zero strangers can ever share the key.</w:t>
       </w:r>
     </w:p>
     <w:p>
       <w:pPr>
         <w:pStyle w:val="ListBullet"/>
-        <w:spacing w:after="60" w:line="276" w:lineRule="auto"/>
+        <w:spacing w:before="0" w:after="60" w:line="276" w:lineRule="auto"/>
       </w:pPr>
       <w:r>
         <w:rPr>
           <w:rFonts w:ascii="Arial" w:hAnsi="Arial"/>
           <w:b/>
           <w:color w:val="0F172A"/>
-          <w:sz w:val="19"/>
+          <w:sz w:val="20"/>
         </w:rPr>
-        <w:t xml:space="preserve">International PayPal Rail: </w:t>
+        <w:t xml:space="preserve">Atomic Concurrency Lock: </w:t>
       </w:r>
       <w:r>
         <w:rPr>
           <w:rFonts w:ascii="Arial" w:hAnsi="Arial"/>
+          <w:b w:val="0"/>
           <w:color w:val="0F172A"/>
-          <w:sz w:val="19"/>
+          <w:sz w:val="20"/>
         </w:rPr>
-        <w:t>Integrated PayPal.me direct checkout with automated capture and customer vault fulfillment.</w:t>
+        <w:t>Firestore transactions run inside db.runTransaction with strict read-before-write validation, preventing double-allocation race conditions during high-traffic drops.</w:t>
       </w:r>
     </w:p>
     <w:p>
@@ -841,66 +924,198 @@
           <w:color w:val="0E7490"/>
           <w:sz w:val="28"/>
         </w:rPr>
-        <w:t>4. Direct Key Dispatch (Manual Allocation System)</w:t>
+        <w:t>4. Payment Rails &amp; Whole-Rupee Verification Engine</w:t>
       </w:r>
     </w:p>
     <w:p>
       <w:pPr>
-        <w:spacing w:after="120" w:line="276" w:lineRule="auto"/>
-      </w:pPr>
-      <w:r>
-        <w:rPr>
-          <w:rFonts w:ascii="Arial" w:hAnsi="Arial"/>
-          <w:color w:val="0F172A"/>
-          <w:sz w:val="19"/>
-        </w:rPr>
-        <w:t>To enable the administrator to fulfill private sales directly in Telegram or Discord DMs without forcing customers through public checkout:</w:t>
-      </w:r>
-    </w:p>
-    <w:p>
-      <w:pPr>
-        <w:pStyle w:val="ListBullet"/>
-        <w:spacing w:after="60" w:line="276" w:lineRule="auto"/>
+        <w:keepNext/>
+        <w:spacing w:before="240" w:after="80"/>
       </w:pPr>
       <w:r>
         <w:rPr>
           <w:rFonts w:ascii="Arial" w:hAnsi="Arial"/>
           <w:b/>
           <w:color w:val="0F172A"/>
-          <w:sz w:val="19"/>
+          <w:sz w:val="23"/>
         </w:rPr>
-        <w:t xml:space="preserve">Web Admin Dispatcher: </w:t>
+        <w:t>4.1 Clean Whole-Rupee Architecture</w:t>
       </w:r>
+    </w:p>
+    <w:p>
+      <w:pPr>
+        <w:spacing w:before="0" w:after="120" w:line="276" w:lineRule="auto"/>
+      </w:pPr>
       <w:r>
         <w:rPr>
           <w:rFonts w:ascii="Arial" w:hAnsi="Arial"/>
           <w:color w:val="0F172A"/>
-          <w:sz w:val="19"/>
+          <w:sz w:val="20"/>
         </w:rPr>
-        <w:t>Available in the admin portal under 'Direct Dispatch'. Allows 1-click allocation of 1 Slot, 2 Slots, or a 100% Dedicated Private Key (3 Slots). Decrypts the key instantly on screen, generates an official order record, and decrements vault stock.</w:t>
+        <w:t>Eradication of Decimal Paise: Fractional paise amounts (.14, .28) were completely eliminated. Customers pay exact whole rupees (₹160 or ₹300), preventing bank app rejections (Google Pay, PhonePe, Paytm, SBI) and simplifying manual entry.</w:t>
       </w:r>
     </w:p>
     <w:p>
       <w:pPr>
         <w:pStyle w:val="ListBullet"/>
-        <w:spacing w:after="60" w:line="276" w:lineRule="auto"/>
+        <w:spacing w:before="0" w:after="60" w:line="276" w:lineRule="auto"/>
       </w:pPr>
       <w:r>
         <w:rPr>
           <w:rFonts w:ascii="Arial" w:hAnsi="Arial"/>
           <w:b/>
           <w:color w:val="0F172A"/>
-          <w:sz w:val="19"/>
+          <w:sz w:val="20"/>
         </w:rPr>
-        <w:t xml:space="preserve">Telegram Admin Command (/givekey): </w:t>
+        <w:t xml:space="preserve">Smart-Routing UPI VPAs: </w:t>
       </w:r>
       <w:r>
         <w:rPr>
           <w:rFonts w:ascii="Arial" w:hAnsi="Arial"/>
+          <w:b w:val="0"/>
           <w:color w:val="0F172A"/>
-          <w:sz w:val="19"/>
+          <w:sz w:val="20"/>
         </w:rPr>
-        <w:t>The owner (Telegram ID: 741838315) can execute '/givekey 1 @username', '/givekey 2 @username', or '/givekey 3' directly inside Telegram for instant mobile fulfillment.</w:t>
+        <w:t>dhruvmatliwala123@oksbi (Primary), dhruvmatliwala123@okicici, dhruvmatliwala123@okaxis, dhruvmatliwala123@okhdfcbank.</w:t>
+      </w:r>
+    </w:p>
+    <w:p>
+      <w:pPr>
+        <w:keepNext/>
+        <w:spacing w:before="240" w:after="80"/>
+      </w:pPr>
+      <w:r>
+        <w:rPr>
+          <w:rFonts w:ascii="Arial" w:hAnsi="Arial"/>
+          <w:b/>
+          <w:color w:val="0F172A"/>
+          <w:sz w:val="23"/>
+        </w:rPr>
+        <w:t>4.2 24/7 Automated Bank SMS Bridge (/api/webhooks/upi)</w:t>
+      </w:r>
+    </w:p>
+    <w:p>
+      <w:pPr>
+        <w:pStyle w:val="ListBullet"/>
+        <w:spacing w:before="0" w:after="60" w:line="276" w:lineRule="auto"/>
+      </w:pPr>
+      <w:r>
+        <w:rPr>
+          <w:rFonts w:ascii="Arial" w:hAnsi="Arial"/>
+          <w:b/>
+          <w:color w:val="0F172A"/>
+          <w:sz w:val="20"/>
+        </w:rPr>
+        <w:t xml:space="preserve">Incoming SMS Ingestion: </w:t>
+      </w:r>
+      <w:r>
+        <w:rPr>
+          <w:rFonts w:ascii="Arial" w:hAnsi="Arial"/>
+          <w:b w:val="0"/>
+          <w:color w:val="0F172A"/>
+          <w:sz w:val="20"/>
+        </w:rPr>
+        <w:t>Listens for bank credit alerts forwarded by Android SMS Forwarder apps.</w:t>
+      </w:r>
+    </w:p>
+    <w:p>
+      <w:pPr>
+        <w:pStyle w:val="ListBullet"/>
+        <w:spacing w:before="0" w:after="60" w:line="276" w:lineRule="auto"/>
+      </w:pPr>
+      <w:r>
+        <w:rPr>
+          <w:rFonts w:ascii="Arial" w:hAnsi="Arial"/>
+          <w:b/>
+          <w:color w:val="0F172A"/>
+          <w:sz w:val="20"/>
+        </w:rPr>
+        <w:t xml:space="preserve">Anti-Fraud Guard: </w:t>
+      </w:r>
+      <w:r>
+        <w:rPr>
+          <w:rFonts w:ascii="Arial" w:hAnsi="Arial"/>
+          <w:b w:val="0"/>
+          <w:color w:val="0F172A"/>
+          <w:sz w:val="20"/>
+        </w:rPr>
+        <w:t>Rejects and flags payloads originating from personal 10-digit mobile numbers.</w:t>
+      </w:r>
+    </w:p>
+    <w:p>
+      <w:pPr>
+        <w:pStyle w:val="ListBullet"/>
+        <w:spacing w:before="0" w:after="60" w:line="276" w:lineRule="auto"/>
+      </w:pPr>
+      <w:r>
+        <w:rPr>
+          <w:rFonts w:ascii="Arial" w:hAnsi="Arial"/>
+          <w:b/>
+          <w:color w:val="0F172A"/>
+          <w:sz w:val="20"/>
+        </w:rPr>
+        <w:t xml:space="preserve">Security &amp; OTP Filter: </w:t>
+      </w:r>
+      <w:r>
+        <w:rPr>
+          <w:rFonts w:ascii="Arial" w:hAnsi="Arial"/>
+          <w:b w:val="0"/>
+          <w:color w:val="0F172A"/>
+          <w:sz w:val="20"/>
+        </w:rPr>
+        <w:t>Strictly drops sensitive authentication OTPs and 2FA messages to maintain complete banking privacy.</w:t>
+      </w:r>
+    </w:p>
+    <w:p>
+      <w:pPr>
+        <w:pStyle w:val="ListBullet"/>
+        <w:spacing w:before="0" w:after="60" w:line="276" w:lineRule="auto"/>
+      </w:pPr>
+      <w:r>
+        <w:rPr>
+          <w:rFonts w:ascii="Arial" w:hAnsi="Arial"/>
+          <w:b/>
+          <w:color w:val="0F172A"/>
+          <w:sz w:val="20"/>
+        </w:rPr>
+        <w:t xml:space="preserve">Instant Dual Matching: </w:t>
+      </w:r>
+      <w:r>
+        <w:rPr>
+          <w:rFonts w:ascii="Arial" w:hAnsi="Arial"/>
+          <w:b w:val="0"/>
+          <w:color w:val="0F172A"/>
+          <w:sz w:val="20"/>
+        </w:rPr>
+        <w:t>Matches either via the 12-digit banking UTR / UPI transaction ID or whole-rupee FIFO order matching.</w:t>
+      </w:r>
+    </w:p>
+    <w:p>
+      <w:pPr>
+        <w:keepNext/>
+        <w:spacing w:before="240" w:after="80"/>
+      </w:pPr>
+      <w:r>
+        <w:rPr>
+          <w:rFonts w:ascii="Arial" w:hAnsi="Arial"/>
+          <w:b/>
+          <w:color w:val="0F172A"/>
+          <w:sz w:val="23"/>
+        </w:rPr>
+        <w:t>4.3 International PayPal Direct Rail</w:t>
+      </w:r>
+    </w:p>
+    <w:p>
+      <w:pPr>
+        <w:spacing w:before="0" w:after="120" w:line="276" w:lineRule="auto"/>
+      </w:pPr>
+      <w:r>
+        <w:rPr>
+          <w:rFonts w:ascii="Arial" w:hAnsi="Arial"/>
+          <w:color w:val="0F172A"/>
+          <w:sz w:val="20"/>
+        </w:rPr>
+        <w:t>Direct integration (/api/checkout/paypal &amp; /api/checkout/paypal/capture) with automated transaction capture and key reveal.</w:t>
       </w:r>
     </w:p>
     <w:p>
@@ -915,89 +1130,116 @@
           <w:color w:val="0E7490"/>
           <w:sz w:val="28"/>
         </w:rPr>
-        <w:t>5. Automated License Expiry &amp; Renewal Subsystem</w:t>
+        <w:t>5. Direct Key Dispatch (Manual Allocation System)</w:t>
       </w:r>
     </w:p>
     <w:p>
       <w:pPr>
-        <w:spacing w:after="120" w:line="276" w:lineRule="auto"/>
+        <w:spacing w:before="0" w:after="120" w:line="276" w:lineRule="auto"/>
       </w:pPr>
       <w:r>
         <w:rPr>
           <w:rFonts w:ascii="Arial" w:hAnsi="Arial"/>
           <w:color w:val="0F172A"/>
-          <w:sz w:val="19"/>
+          <w:sz w:val="20"/>
         </w:rPr>
-        <w:t>To maximize customer retention and lifetime value (LTV), an automated reminder engine tracks order lifecycles:</w:t>
+        <w:t>Direct Key Dispatch in /admin empowers administrators to fulfill off-platform sales (e.g. Telegram/Discord DMs, cash/direct UPI):</w:t>
       </w:r>
     </w:p>
     <w:p>
       <w:pPr>
         <w:pStyle w:val="ListBullet"/>
-        <w:spacing w:after="60" w:line="276" w:lineRule="auto"/>
+        <w:spacing w:before="0" w:after="60" w:line="276" w:lineRule="auto"/>
       </w:pPr>
       <w:r>
         <w:rPr>
           <w:rFonts w:ascii="Arial" w:hAnsi="Arial"/>
           <w:b/>
           <w:color w:val="0F172A"/>
-          <w:sz w:val="19"/>
+          <w:sz w:val="20"/>
         </w:rPr>
-        <w:t xml:space="preserve">Automated Cron (/api/cron/expiry-reminders): </w:t>
+        <w:t xml:space="preserve">Inventory Reservation: </w:t>
       </w:r>
       <w:r>
         <w:rPr>
           <w:rFonts w:ascii="Arial" w:hAnsi="Arial"/>
+          <w:b w:val="0"/>
           <w:color w:val="0F172A"/>
-          <w:sz w:val="19"/>
+          <w:sz w:val="20"/>
         </w:rPr>
-        <w:t>Scans active orders nearing the 30-day mark (specifically 48 hours before license expiration).</w:t>
+        <w:t>Instantly reserves 1, 2, or 3 slots atomically in Firestore, preventing website buyers from receiving the same slot.</w:t>
       </w:r>
     </w:p>
     <w:p>
       <w:pPr>
         <w:pStyle w:val="ListBullet"/>
-        <w:spacing w:after="60" w:line="276" w:lineRule="auto"/>
+        <w:spacing w:before="0" w:after="60" w:line="276" w:lineRule="auto"/>
       </w:pPr>
       <w:r>
         <w:rPr>
           <w:rFonts w:ascii="Arial" w:hAnsi="Arial"/>
           <w:b/>
           <w:color w:val="0F172A"/>
-          <w:sz w:val="19"/>
+          <w:sz w:val="20"/>
         </w:rPr>
-        <w:t xml:space="preserve">Direct Customer Notification: </w:t>
+        <w:t xml:space="preserve">Record Keeping: </w:t>
       </w:r>
       <w:r>
         <w:rPr>
           <w:rFonts w:ascii="Arial" w:hAnsi="Arial"/>
+          <w:b w:val="0"/>
           <w:color w:val="0F172A"/>
-          <w:sz w:val="19"/>
+          <w:sz w:val="20"/>
         </w:rPr>
-        <w:t>Dispatches renewal reminders to Telegram buyers with 1-click renewal links and priority renewal instructions.</w:t>
+        <w:t>Stores recipient handle (@sleekfx3, email) and admin notes in the order ledger for auditability.</w:t>
       </w:r>
     </w:p>
     <w:p>
       <w:pPr>
         <w:pStyle w:val="ListBullet"/>
-        <w:spacing w:after="60" w:line="276" w:lineRule="auto"/>
+        <w:spacing w:before="0" w:after="60" w:line="276" w:lineRule="auto"/>
       </w:pPr>
       <w:r>
         <w:rPr>
           <w:rFonts w:ascii="Arial" w:hAnsi="Arial"/>
           <w:b/>
           <w:color w:val="0F172A"/>
-          <w:sz w:val="19"/>
+          <w:sz w:val="20"/>
         </w:rPr>
-        <w:t xml:space="preserve">Admin 1-Click Trigger: </w:t>
+        <w:t xml:space="preserve">Instant Fulfillment Screen: </w:t>
       </w:r>
       <w:r>
         <w:rPr>
           <w:rFonts w:ascii="Arial" w:hAnsi="Arial"/>
+          <w:b w:val="0"/>
           <w:color w:val="0F172A"/>
-          <w:sz w:val="19"/>
+          <w:sz w:val="20"/>
         </w:rPr>
-        <w:t>Integrated 'RUN REMINDERS' button in the Admin Portal header enables instant on-demand scanning with live toast statistics.</w:t>
+        <w:t>Decrypts and displays the license key code and customer fulfillment link with 1-click 'Copy' buttons so the admin can paste them directly into customer DMs.</w:t>
+      </w:r>
+    </w:p>
+    <w:p>
+      <w:pPr>
+        <w:pStyle w:val="ListBullet"/>
+        <w:spacing w:before="0" w:after="60" w:line="276" w:lineRule="auto"/>
+      </w:pPr>
+      <w:r>
+        <w:rPr>
+          <w:rFonts w:ascii="Arial" w:hAnsi="Arial"/>
+          <w:b/>
+          <w:color w:val="0F172A"/>
+          <w:sz w:val="20"/>
+        </w:rPr>
+        <w:t xml:space="preserve">Telegram /givekey Command: </w:t>
+      </w:r>
+      <w:r>
+        <w:rPr>
+          <w:rFonts w:ascii="Arial" w:hAnsi="Arial"/>
+          <w:b w:val="0"/>
+          <w:color w:val="0F172A"/>
+          <w:sz w:val="20"/>
+        </w:rPr>
+        <w:t>Superadmin (ID: 741838315) can dispatch keys directly via mobile using /givekey 1 @customer.</w:t>
       </w:r>
     </w:p>
     <w:p>
@@ -1012,112 +1254,231 @@
           <w:color w:val="0E7490"/>
           <w:sz w:val="28"/>
         </w:rPr>
-        <w:t>6. Discord Live Buyer Radar (discord-key-notifier)</w:t>
+        <w:t>6. Direct Gmail SMTP Delivery &amp; Automated Restock Waitlist</w:t>
       </w:r>
     </w:p>
     <w:p>
       <w:pPr>
-        <w:spacing w:after="120" w:line="276" w:lineRule="auto"/>
-      </w:pPr>
-      <w:r>
-        <w:rPr>
-          <w:rFonts w:ascii="Arial" w:hAnsi="Arial"/>
-          <w:color w:val="0F172A"/>
-          <w:sz w:val="19"/>
-        </w:rPr>
-        <w:t>A dedicated standalone Node.js microservice (located in /discord-key-notifier) operating independently from website serverless limitations:</w:t>
-      </w:r>
-    </w:p>
-    <w:p>
-      <w:pPr>
-        <w:pStyle w:val="ListBullet"/>
-        <w:spacing w:after="60" w:line="276" w:lineRule="auto"/>
+        <w:keepNext/>
+        <w:spacing w:before="240" w:after="80"/>
       </w:pPr>
       <w:r>
         <w:rPr>
           <w:rFonts w:ascii="Arial" w:hAnsi="Arial"/>
           <w:b/>
           <w:color w:val="0F172A"/>
-          <w:sz w:val="19"/>
+          <w:sz w:val="23"/>
         </w:rPr>
-        <w:t xml:space="preserve">Direct WebSocket Gateway: </w:t>
+        <w:t>6.1 Direct Gmail SMTP Integration (Nodemailer)</w:t>
       </w:r>
+    </w:p>
+    <w:p>
+      <w:pPr>
+        <w:spacing w:before="0" w:after="120" w:line="276" w:lineRule="auto"/>
+      </w:pPr>
       <w:r>
         <w:rPr>
           <w:rFonts w:ascii="Arial" w:hAnsi="Arial"/>
           <w:color w:val="0F172A"/>
-          <w:sz w:val="19"/>
+          <w:sz w:val="20"/>
         </w:rPr>
-        <w:t>Maintains a persistent authenticated WebSocket connection to Discord's live gateway, bypassing Cloudflare anti-bot blocks.</w:t>
+        <w:t>To bypass third-party transactional email sandbox restrictions (e.g. Resend's onboarding@resend.dev limit of only emailing the account owner) without requiring a custom domain, AETHERIA integrates authenticated Gmail SMTP via Nodemailer:</w:t>
       </w:r>
     </w:p>
     <w:p>
       <w:pPr>
         <w:pStyle w:val="ListBullet"/>
-        <w:spacing w:after="60" w:line="276" w:lineRule="auto"/>
+        <w:spacing w:before="0" w:after="60" w:line="276" w:lineRule="auto"/>
       </w:pPr>
       <w:r>
         <w:rPr>
           <w:rFonts w:ascii="Arial" w:hAnsi="Arial"/>
           <w:b/>
           <w:color w:val="0F172A"/>
-          <w:sz w:val="19"/>
+          <w:sz w:val="20"/>
         </w:rPr>
-        <w:t xml:space="preserve">23-Channel Active Surveillance: </w:t>
+        <w:t xml:space="preserve">Zero Domain Overhead: </w:t>
       </w:r>
       <w:r>
         <w:rPr>
           <w:rFonts w:ascii="Arial" w:hAnsi="Arial"/>
+          <w:b w:val="0"/>
           <w:color w:val="0F172A"/>
-          <w:sz w:val="19"/>
+          <w:sz w:val="20"/>
         </w:rPr>
-        <w:t>Monitors 23 premier Pokemon GO spoofing, trading, and gaming Discord channels simultaneously.</w:t>
+        <w:t>Authenticated via Google 16-character App Password (GMAIL_USER &amp; GMAIL_APP_PASSWORD). Sends directly from dhruvmatliwala336@gmail.com to any customer email (Gmail, Yahoo, Outlook, etc.).</w:t>
       </w:r>
     </w:p>
     <w:p>
       <w:pPr>
         <w:pStyle w:val="ListBullet"/>
-        <w:spacing w:after="60" w:line="276" w:lineRule="auto"/>
+        <w:spacing w:before="0" w:after="60" w:line="276" w:lineRule="auto"/>
       </w:pPr>
       <w:r>
         <w:rPr>
           <w:rFonts w:ascii="Arial" w:hAnsi="Arial"/>
           <w:b/>
           <w:color w:val="0F172A"/>
-          <w:sz w:val="19"/>
+          <w:sz w:val="20"/>
         </w:rPr>
-        <w:t xml:space="preserve">Regex Keyword Matching: </w:t>
+        <w:t xml:space="preserve">Storefront Display Name: </w:t>
       </w:r>
       <w:r>
         <w:rPr>
           <w:rFonts w:ascii="Arial" w:hAnsi="Arial"/>
+          <w:b w:val="0"/>
           <w:color w:val="0F172A"/>
-          <w:sz w:val="19"/>
+          <w:sz w:val="20"/>
         </w:rPr>
-        <w:t>Detects high-intent keywords ('key', 'buy key', 'pgsharp key', 'wtb', 'need key') and instantly formats rich alerts.</w:t>
+        <w:t>Emails display 'Aetheria Store' as the sender title in inboxes, with customer replies routing directly to the admin's Gmail.</w:t>
       </w:r>
     </w:p>
     <w:p>
       <w:pPr>
         <w:pStyle w:val="ListBullet"/>
-        <w:spacing w:after="60" w:line="276" w:lineRule="auto"/>
+        <w:spacing w:before="0" w:after="60" w:line="276" w:lineRule="auto"/>
       </w:pPr>
       <w:r>
         <w:rPr>
           <w:rFonts w:ascii="Arial" w:hAnsi="Arial"/>
           <w:b/>
           <w:color w:val="0F172A"/>
-          <w:sz w:val="19"/>
+          <w:sz w:val="20"/>
         </w:rPr>
-        <w:t xml:space="preserve">Telegram Mobile Alerts: </w:t>
+        <w:t xml:space="preserve">Unified Dispatcher (resend.ts): </w:t>
       </w:r>
       <w:r>
         <w:rPr>
           <w:rFonts w:ascii="Arial" w:hAnsi="Arial"/>
+          <w:b w:val="0"/>
           <w:color w:val="0F172A"/>
-          <w:sz w:val="19"/>
+          <w:sz w:val="20"/>
         </w:rPr>
-        <w:t>Pushes real-time alerts to the owner's Telegram with user details, matched message snippets, and 1-click 'Open in Discord' jump buttons.</w:t>
+        <w:t>Prioritizes Gmail SMTP; automatically falls back to Resend API if Gmail credentials are absent.</w:t>
+      </w:r>
+    </w:p>
+    <w:p>
+      <w:pPr>
+        <w:pStyle w:val="ListBullet"/>
+        <w:spacing w:before="0" w:after="60" w:line="276" w:lineRule="auto"/>
+      </w:pPr>
+      <w:r>
+        <w:rPr>
+          <w:rFonts w:ascii="Arial" w:hAnsi="Arial"/>
+          <w:b/>
+          <w:color w:val="0F172A"/>
+          <w:sz w:val="20"/>
+        </w:rPr>
+        <w:t xml:space="preserve">Customer Email Types: </w:t>
+      </w:r>
+      <w:r>
+        <w:rPr>
+          <w:rFonts w:ascii="Arial" w:hAnsi="Arial"/>
+          <w:b w:val="0"/>
+          <w:color w:val="0F172A"/>
+          <w:sz w:val="20"/>
+        </w:rPr>
+        <w:t>Powers License Key Delivery, 48-Hour Expiry Reminders, and Automated Restock Waitlist Alerts.</w:t>
+      </w:r>
+    </w:p>
+    <w:p>
+      <w:pPr>
+        <w:keepNext/>
+        <w:spacing w:before="240" w:after="80"/>
+      </w:pPr>
+      <w:r>
+        <w:rPr>
+          <w:rFonts w:ascii="Arial" w:hAnsi="Arial"/>
+          <w:b/>
+          <w:color w:val="0F172A"/>
+          <w:sz w:val="23"/>
+        </w:rPr>
+        <w:t>6.2 Automated Restock Waitlist Notification System</w:t>
+      </w:r>
+    </w:p>
+    <w:p>
+      <w:pPr>
+        <w:spacing w:before="0" w:after="120" w:line="276" w:lineRule="auto"/>
+      </w:pPr>
+      <w:r>
+        <w:rPr>
+          <w:rFonts w:ascii="Arial" w:hAnsi="Arial"/>
+          <w:color w:val="0F172A"/>
+          <w:sz w:val="20"/>
+        </w:rPr>
+        <w:t>When a plan is sold out, storefront visitors can enter their email on the Restock Notification modal. Stored in the 'restock_requests' collection:</w:t>
+      </w:r>
+    </w:p>
+    <w:p>
+      <w:pPr>
+        <w:pStyle w:val="ListBullet"/>
+        <w:spacing w:before="0" w:after="60" w:line="276" w:lineRule="auto"/>
+      </w:pPr>
+      <w:r>
+        <w:rPr>
+          <w:rFonts w:ascii="Arial" w:hAnsi="Arial"/>
+          <w:b/>
+          <w:color w:val="0F172A"/>
+          <w:sz w:val="20"/>
+        </w:rPr>
+        <w:t xml:space="preserve">Automated Key Upload Trigger: </w:t>
+      </w:r>
+      <w:r>
+        <w:rPr>
+          <w:rFonts w:ascii="Arial" w:hAnsi="Arial"/>
+          <w:b w:val="0"/>
+          <w:color w:val="0F172A"/>
+          <w:sz w:val="20"/>
+        </w:rPr>
+        <w:t>When keys are uploaded in /admin, the server automatically queries pending waitlist requests for that plan and dispatches branded restock alert emails in the background.</w:t>
+      </w:r>
+    </w:p>
+    <w:p>
+      <w:pPr>
+        <w:pStyle w:val="ListBullet"/>
+        <w:spacing w:before="0" w:after="60" w:line="276" w:lineRule="auto"/>
+      </w:pPr>
+      <w:r>
+        <w:rPr>
+          <w:rFonts w:ascii="Arial" w:hAnsi="Arial"/>
+          <w:b/>
+          <w:color w:val="0F172A"/>
+          <w:sz w:val="20"/>
+        </w:rPr>
+        <w:t xml:space="preserve">One-Click Admin Blast Button: </w:t>
+      </w:r>
+      <w:r>
+        <w:rPr>
+          <w:rFonts w:ascii="Arial" w:hAnsi="Arial"/>
+          <w:b w:val="0"/>
+          <w:color w:val="0F172A"/>
+          <w:sz w:val="20"/>
+        </w:rPr>
+        <w:t>WaitlistWidget in /admin features an interactive '[ 📧 Notify All Waiting (X) ]' button with confirmation dialog and live progress feedback, backed by POST /api/admin/waitlist/notify.</w:t>
+      </w:r>
+    </w:p>
+    <w:p>
+      <w:pPr>
+        <w:pStyle w:val="ListBullet"/>
+        <w:spacing w:before="0" w:after="60" w:line="276" w:lineRule="auto"/>
+      </w:pPr>
+      <w:r>
+        <w:rPr>
+          <w:rFonts w:ascii="Arial" w:hAnsi="Arial"/>
+          <w:b/>
+          <w:color w:val="0F172A"/>
+          <w:sz w:val="20"/>
+        </w:rPr>
+        <w:t xml:space="preserve">Automatic De-duplication: </w:t>
+      </w:r>
+      <w:r>
+        <w:rPr>
+          <w:rFonts w:ascii="Arial" w:hAnsi="Arial"/>
+          <w:b w:val="0"/>
+          <w:color w:val="0F172A"/>
+          <w:sz w:val="20"/>
+        </w:rPr>
+        <w:t>Successfully notified recipients are immediately cleared from Firestore to prevent duplicate or spam emails.</w:t>
       </w:r>
     </w:p>
     <w:p>
@@ -1132,164 +1493,13 @@
           <w:color w:val="0E7490"/>
           <w:sz w:val="28"/>
         </w:rPr>
-        <w:t>7. Telegram Bot &amp; Automated Proof Broadcasting</w:t>
-      </w:r>
-    </w:p>
-    <w:p>
-      <w:pPr>
-        <w:spacing w:after="120" w:line="276" w:lineRule="auto"/>
-      </w:pPr>
-      <w:r>
-        <w:rPr>
-          <w:rFonts w:ascii="Arial" w:hAnsi="Arial"/>
-          <w:color w:val="0F172A"/>
-          <w:sz w:val="19"/>
-        </w:rPr>
-        <w:t>The public Telegram infrastructure (@AetheriaStoreOfficial and @AetheriaStoreOfficialBot) features automated community broadcast hooks:</w:t>
-      </w:r>
-    </w:p>
-    <w:p>
-      <w:pPr>
-        <w:pStyle w:val="ListBullet"/>
-        <w:spacing w:after="60" w:line="276" w:lineRule="auto"/>
-      </w:pPr>
-      <w:r>
-        <w:rPr>
-          <w:rFonts w:ascii="Arial" w:hAnsi="Arial"/>
-          <w:b/>
-          <w:color w:val="0F172A"/>
-          <w:sz w:val="19"/>
-        </w:rPr>
-        <w:t xml:space="preserve">Streamlined Restock Flash Alerts: </w:t>
-      </w:r>
-      <w:r>
-        <w:rPr>
-          <w:rFonts w:ascii="Arial" w:hAnsi="Arial"/>
-          <w:color w:val="0F172A"/>
-          <w:sz w:val="19"/>
-        </w:rPr>
-        <w:t>Whenever keys are uploaded, broadcastRestockAlert posts a punchy, high-urgency announcement: '⚡ KEYS ARE BACK IN STOCK! 📦 Fresh 30-Day keys just loaded into the vault. Grab yours before this batch runs out! 🚀'</w:t>
-      </w:r>
-    </w:p>
-    <w:p>
-      <w:pPr>
-        <w:pStyle w:val="ListBullet"/>
-        <w:spacing w:after="60" w:line="276" w:lineRule="auto"/>
-      </w:pPr>
-      <w:r>
-        <w:rPr>
-          <w:rFonts w:ascii="Arial" w:hAnsi="Arial"/>
-          <w:b/>
-          <w:color w:val="0F172A"/>
-          <w:sz w:val="19"/>
-        </w:rPr>
-        <w:t xml:space="preserve">Intentional Price-Free Copy: </w:t>
-      </w:r>
-      <w:r>
-        <w:rPr>
-          <w:rFonts w:ascii="Arial" w:hAnsi="Arial"/>
-          <w:color w:val="0F172A"/>
-          <w:sz w:val="19"/>
-        </w:rPr>
-        <w:t>Pricing figures were intentionally eliminated from announcement posts. This eliminates message clutter, avoids repetitive price spam (since prices are prominently pinned in the channel and website), and ensures restock alerts never become outdated if store pricing evolves.</w:t>
-      </w:r>
-    </w:p>
-    <w:p>
-      <w:pPr>
-        <w:pStyle w:val="ListBullet"/>
-        <w:spacing w:after="60" w:line="276" w:lineRule="auto"/>
-      </w:pPr>
-      <w:r>
-        <w:rPr>
-          <w:rFonts w:ascii="Arial" w:hAnsi="Arial"/>
-          <w:b/>
-          <w:color w:val="0F172A"/>
-          <w:sz w:val="19"/>
-        </w:rPr>
-        <w:t xml:space="preserve">1-Tap Conversion CTA: </w:t>
-      </w:r>
-      <w:r>
-        <w:rPr>
-          <w:rFonts w:ascii="Arial" w:hAnsi="Arial"/>
-          <w:color w:val="0F172A"/>
-          <w:sz w:val="19"/>
-        </w:rPr>
-        <w:t>Includes an interactive inline button linking directly to 'https://t.me/AetheriaStoreOfficialBot?start=restock', taking customers straight into checkout with 0 friction.</w:t>
-      </w:r>
-    </w:p>
-    <w:p>
-      <w:pPr>
-        <w:pStyle w:val="ListBullet"/>
-        <w:spacing w:after="60" w:line="276" w:lineRule="auto"/>
-      </w:pPr>
-      <w:r>
-        <w:rPr>
-          <w:rFonts w:ascii="Arial" w:hAnsi="Arial"/>
-          <w:b/>
-          <w:color w:val="0F172A"/>
-          <w:sz w:val="19"/>
-        </w:rPr>
-        <w:t xml:space="preserve">Streamlined Order Completed Proofs: </w:t>
-      </w:r>
-      <w:r>
-        <w:rPr>
-          <w:rFonts w:ascii="Arial" w:hAnsi="Arial"/>
-          <w:color w:val="0F172A"/>
-          <w:sz w:val="19"/>
-        </w:rPr>
-        <w:t>Real-time purchase proofs are automatically dispatched upon payment capture to @AetheriaStoreOfficial with zero receipt clutter: '✅ ORDER COMPLETED 📦 30-Day PGSharp Key dispatched to dh***@gmail.com (or @sl*** for bot buyers) 🛡️ Key verified and activated successfully.' Includes a direct '⚡ Order via Bot' inline button.</w:t>
-      </w:r>
-    </w:p>
-    <w:p>
-      <w:pPr>
-        <w:pStyle w:val="ListBullet"/>
-        <w:spacing w:after="60" w:line="276" w:lineRule="auto"/>
-      </w:pPr>
-      <w:r>
-        <w:rPr>
-          <w:rFonts w:ascii="Arial" w:hAnsi="Arial"/>
-          <w:b/>
-          <w:color w:val="0F172A"/>
-          <w:sz w:val="19"/>
-        </w:rPr>
-        <w:t xml:space="preserve">Dual Storefront Channel Synchronization: </w:t>
-      </w:r>
-      <w:r>
-        <w:rPr>
-          <w:rFonts w:ascii="Arial" w:hAnsi="Arial"/>
-          <w:color w:val="0F172A"/>
-          <w:sz w:val="19"/>
-        </w:rPr>
-        <w:t>Both Telegram bot purchases and website purchases (automated Bank SMS Bridge UPI, website UTR verification, PayPal Express capture, and PayPal IPN direct matching) are unified and trigger live social proofs in the channel automatically.</w:t>
-      </w:r>
-    </w:p>
-    <w:p>
-      <w:pPr>
-        <w:pStyle w:val="ListBullet"/>
-        <w:spacing w:after="60" w:line="276" w:lineRule="auto"/>
-      </w:pPr>
-      <w:r>
-        <w:rPr>
-          <w:rFonts w:ascii="Arial" w:hAnsi="Arial"/>
-          <w:b/>
-          <w:color w:val="0F172A"/>
-          <w:sz w:val="19"/>
-        </w:rPr>
-        <w:t xml:space="preserve">Atomic Channel Proof Idempotency Guard: </w:t>
-      </w:r>
-      <w:r>
-        <w:rPr>
-          <w:rFonts w:ascii="Arial" w:hAnsi="Arial"/>
-          <w:color w:val="0F172A"/>
-          <w:sz w:val="19"/>
-        </w:rPr>
-        <w:t>Proof broadcasts are locked using an atomic Firestore transaction ('proof_broadcasted: true'). Even during duplicate SMS forwards or multiple UTR submissions, each order is guaranteed to broadcast to the channel exactly once.</w:t>
+        <w:t>7. Telegram Bot Engine &amp; Progressive Disclosure UPI Flow</w:t>
       </w:r>
     </w:p>
     <w:p>
       <w:pPr>
         <w:keepNext/>
-        <w:spacing w:before="220" w:after="80"/>
+        <w:spacing w:before="240" w:after="80"/>
       </w:pPr>
       <w:r>
         <w:rPr>
@@ -1298,141 +1508,122 @@
           <w:color w:val="0F172A"/>
           <w:sz w:val="23"/>
         </w:rPr>
-        <w:t>7.1 Viral Telegram Referral &amp; Reward Engine ('Refer &amp; Earn')</w:t>
+        <w:t>7.1 Minimal 4-Line QR Screen &amp; Delivery Expectation</w:t>
       </w:r>
     </w:p>
     <w:p>
       <w:pPr>
-        <w:spacing w:after="120" w:line="276" w:lineRule="auto"/>
+        <w:spacing w:before="0" w:after="120" w:line="276" w:lineRule="auto"/>
       </w:pPr>
       <w:r>
         <w:rPr>
           <w:rFonts w:ascii="Arial" w:hAnsi="Arial"/>
           <w:color w:val="0F172A"/>
-          <w:sz w:val="19"/>
+          <w:sz w:val="20"/>
         </w:rPr>
-        <w:t>The bot features a self-sustaining viral growth loop designed for zero checkout friction:</w:t>
+        <w:t>To eliminate text fatigue, hesitation, and customer intimidation during Telegram checkouts, the initial QR payment card was streamlined to 4 lines:</w:t>
       </w:r>
     </w:p>
     <w:p>
       <w:pPr>
         <w:pStyle w:val="ListBullet"/>
-        <w:spacing w:after="60" w:line="276" w:lineRule="auto"/>
+        <w:spacing w:before="0" w:after="60" w:line="276" w:lineRule="auto"/>
       </w:pPr>
       <w:r>
         <w:rPr>
           <w:rFonts w:ascii="Arial" w:hAnsi="Arial"/>
           <w:b/>
           <w:color w:val="0F172A"/>
-          <w:sz w:val="19"/>
+          <w:sz w:val="20"/>
         </w:rPr>
-        <w:t xml:space="preserve">Personal Tracking Links: </w:t>
+        <w:t xml:space="preserve">Clean Card Copy: </w:t>
       </w:r>
       <w:r>
         <w:rPr>
           <w:rFonts w:ascii="Arial" w:hAnsi="Arial"/>
+          <w:b w:val="0"/>
           <w:color w:val="0F172A"/>
-          <w:sz w:val="19"/>
+          <w:sz w:val="20"/>
         </w:rPr>
-        <w:t>Tapping '👥 Refer &amp; Earn' provides the user with their personalized deep link ('https://t.me/AetheriaStoreOfficialBot?start=ref_&lt;chatId&gt;') alongside real-time metrics tracking clicks, paid orders, and reward coupons earned.</w:t>
+        <w:t>📦 PGSharp Standard (~30 Days) — ₹160 | 🔑 UPI ID: dhruvmatliwala123@oksbi | 🔖 Order ID: ord_tg_xxxx | ⚡ Scan QR or pay ₹160. Key is auto-delivered here within 1–2 minutes!</w:t>
       </w:r>
     </w:p>
     <w:p>
       <w:pPr>
         <w:pStyle w:val="ListBullet"/>
-        <w:spacing w:after="60" w:line="276" w:lineRule="auto"/>
+        <w:spacing w:before="0" w:after="60" w:line="276" w:lineRule="auto"/>
       </w:pPr>
       <w:r>
         <w:rPr>
           <w:rFonts w:ascii="Arial" w:hAnsi="Arial"/>
           <w:b/>
           <w:color w:val="0F172A"/>
-          <w:sz w:val="19"/>
+          <w:sz w:val="20"/>
         </w:rPr>
-        <w:t xml:space="preserve">100% Automated Friend Discount (No Code Needed): </w:t>
+        <w:t xml:space="preserve">Primary Action Button: </w:t>
       </w:r>
       <w:r>
         <w:rPr>
           <w:rFonts w:ascii="Arial" w:hAnsi="Arial"/>
+          <w:b w:val="0"/>
           <w:color w:val="0F172A"/>
-          <w:sz w:val="19"/>
+          <w:sz w:val="20"/>
         </w:rPr>
-        <w:t>When an invited friend clicks the referral link and taps Start, the bot records the referrer attribution in Firestore. The friend automatically receives ₹30 OFF their first key (₹130 for 1 Device / ₹270 for 2 Devices). No coupon entry or promo codes are required; the discount is applied directly to their checkout intent.</w:t>
+        <w:t>[ ❓ Paid but didn't get key? ] — cleanly conceals technical instructions until requested.</w:t>
       </w:r>
     </w:p>
     <w:p>
       <w:pPr>
         <w:pStyle w:val="ListBullet"/>
-        <w:spacing w:after="60" w:line="276" w:lineRule="auto"/>
+        <w:spacing w:before="0" w:after="60" w:line="276" w:lineRule="auto"/>
       </w:pPr>
       <w:r>
         <w:rPr>
           <w:rFonts w:ascii="Arial" w:hAnsi="Arial"/>
           <w:b/>
           <w:color w:val="0F172A"/>
-          <w:sz w:val="19"/>
+          <w:sz w:val="20"/>
         </w:rPr>
-        <w:t xml:space="preserve">Automated Single-Use Reward Coupon Issuance: </w:t>
+        <w:t xml:space="preserve">Progressive Disclosure Fallback: </w:t>
       </w:r>
       <w:r>
         <w:rPr>
           <w:rFonts w:ascii="Arial" w:hAnsi="Arial"/>
+          <w:b w:val="0"/>
           <w:color w:val="0F172A"/>
-          <w:sz w:val="19"/>
+          <w:sz w:val="20"/>
         </w:rPr>
-        <w:t>Upon completion and verification of the friend's order, an anti-fraud check verifies unique payment identifiers and generates a single-use coupon in Firestore ('REF30_XXXXXX', ₹30 / $0.50 OFF, max_uses: 1).</w:t>
+        <w:t>Tapping reveals comforting guidance: '⏳ Awaiting Bank Confirmation... Bank SMS alerts usually arrive within 1–2 minutes. 💡 If you paid and want your key right away without waiting: Send a screenshot of your Transaction Details (in Google Pay/FamPay, tap on the payment to view full details with the 12-digit UPI ID) or reply with the 12 digits directly!'</w:t>
       </w:r>
     </w:p>
     <w:p>
       <w:pPr>
         <w:pStyle w:val="ListBullet"/>
-        <w:spacing w:after="60" w:line="276" w:lineRule="auto"/>
+        <w:spacing w:before="0" w:after="60" w:line="276" w:lineRule="auto"/>
       </w:pPr>
       <w:r>
         <w:rPr>
           <w:rFonts w:ascii="Arial" w:hAnsi="Arial"/>
           <w:b/>
           <w:color w:val="0F172A"/>
-          <w:sz w:val="19"/>
+          <w:sz w:val="20"/>
         </w:rPr>
-        <w:t xml:space="preserve">Direct Telegram Notification: </w:t>
+        <w:t xml:space="preserve">Transaction Details vs UTR: </w:t>
       </w:r>
       <w:r>
         <w:rPr>
           <w:rFonts w:ascii="Arial" w:hAnsi="Arial"/>
+          <w:b w:val="0"/>
           <w:color w:val="0F172A"/>
-          <w:sz w:val="19"/>
+          <w:sz w:val="20"/>
         </w:rPr>
-        <w:t>The bot dispatches a private DM to the referrer with their coupon code. Referrers can stack multiple earned coupons and redeem them on future key renewals simply by sending or tapping the code in chat.</w:t>
-      </w:r>
-    </w:p>
-    <w:p>
-      <w:pPr>
-        <w:pStyle w:val="ListBullet"/>
-        <w:spacing w:after="60" w:line="276" w:lineRule="auto"/>
-      </w:pPr>
-      <w:r>
-        <w:rPr>
-          <w:rFonts w:ascii="Arial" w:hAnsi="Arial"/>
-          <w:b/>
-          <w:color w:val="0F172A"/>
-          <w:sz w:val="19"/>
-        </w:rPr>
-        <w:t xml:space="preserve">Centralized Admin Visibility &amp; Deletion: </w:t>
-      </w:r>
-      <w:r>
-        <w:rPr>
-          <w:rFonts w:ascii="Arial" w:hAnsi="Arial"/>
-          <w:color w:val="0F172A"/>
-          <w:sz w:val="19"/>
-        </w:rPr>
-        <w:t>All issued referral coupons are stored in Firestore and sync live to the Admin Coupons panel, giving the administrator real-time monitoring and 1-click permanent deletion capabilities.</w:t>
+        <w:t>Replaced obscure banking jargon ('UTR') with clear visual directions: tap the payment to view Transaction Details / 12-digit UPI ID.</w:t>
       </w:r>
     </w:p>
     <w:p>
       <w:pPr>
         <w:keepNext/>
-        <w:spacing w:before="220" w:after="80"/>
+        <w:spacing w:before="240" w:after="80"/>
       </w:pPr>
       <w:r>
         <w:rPr>
@@ -1441,112 +1632,142 @@
           <w:color w:val="0F172A"/>
           <w:sz w:val="23"/>
         </w:rPr>
-        <w:t>7.2 Native In-Chat UPI QR Delivery &amp; Session Reuse</w:t>
-      </w:r>
-    </w:p>
-    <w:p>
-      <w:pPr>
-        <w:spacing w:after="120" w:line="276" w:lineRule="auto"/>
-      </w:pPr>
-      <w:r>
-        <w:rPr>
-          <w:rFonts w:ascii="Arial" w:hAnsi="Arial"/>
-          <w:color w:val="0F172A"/>
-          <w:sz w:val="19"/>
-        </w:rPr>
-        <w:t>To guarantee seamless, zero-friction mobile checkouts in Telegram:</w:t>
+        <w:t>7.2 Viral Referral &amp; Reward Engine ('Refer &amp; Earn')</w:t>
       </w:r>
     </w:p>
     <w:p>
       <w:pPr>
         <w:pStyle w:val="ListBullet"/>
-        <w:spacing w:after="60" w:line="276" w:lineRule="auto"/>
+        <w:spacing w:before="0" w:after="60" w:line="276" w:lineRule="auto"/>
       </w:pPr>
       <w:r>
         <w:rPr>
           <w:rFonts w:ascii="Arial" w:hAnsi="Arial"/>
           <w:b/>
           <w:color w:val="0F172A"/>
-          <w:sz w:val="19"/>
+          <w:sz w:val="20"/>
         </w:rPr>
-        <w:t xml:space="preserve">Dynamic Native QR Photo Delivery: </w:t>
+        <w:t xml:space="preserve">Deep Tracking Links: </w:t>
       </w:r>
       <w:r>
         <w:rPr>
           <w:rFonts w:ascii="Arial" w:hAnsi="Arial"/>
+          <w:b w:val="0"/>
           <w:color w:val="0F172A"/>
-          <w:sz w:val="19"/>
+          <w:sz w:val="20"/>
         </w:rPr>
-        <w:t>Rather than relying on fragile 3rd-party UPI intent deep links (which often trigger bank app limits or browser blocks on mobile), the bot dynamically generates and delivers a native high-resolution QR photo PNG buffer directly inside the Telegram chat.</w:t>
+        <w:t>Generates unique links (https://t.me/AetheriaStoreOfficialBot?start=ref_&lt;chatId&gt;) with real-time conversion stats.</w:t>
       </w:r>
     </w:p>
     <w:p>
       <w:pPr>
         <w:pStyle w:val="ListBullet"/>
-        <w:spacing w:after="60" w:line="276" w:lineRule="auto"/>
+        <w:spacing w:before="0" w:after="60" w:line="276" w:lineRule="auto"/>
       </w:pPr>
       <w:r>
         <w:rPr>
           <w:rFonts w:ascii="Arial" w:hAnsi="Arial"/>
           <w:b/>
           <w:color w:val="0F172A"/>
-          <w:sz w:val="19"/>
+          <w:sz w:val="20"/>
         </w:rPr>
-        <w:t xml:space="preserve">Compact Non-Redundant Card Copy: </w:t>
+        <w:t xml:space="preserve">Automated Friend Discount: </w:t>
       </w:r>
       <w:r>
         <w:rPr>
           <w:rFonts w:ascii="Arial" w:hAnsi="Arial"/>
+          <w:b w:val="0"/>
           <w:color w:val="0F172A"/>
-          <w:sz w:val="19"/>
+          <w:sz w:val="20"/>
         </w:rPr>
-        <w:t>Single clean card featuring UPI ID, key details, auto-delivery instructions, and 'Support' / 'Back' buttons without repetitive amount spam.</w:t>
+        <w:t>Referred friends automatically receive ₹30 OFF on their first purchase without entering any promo code.</w:t>
       </w:r>
     </w:p>
     <w:p>
       <w:pPr>
         <w:pStyle w:val="ListBullet"/>
-        <w:spacing w:after="60" w:line="276" w:lineRule="auto"/>
+        <w:spacing w:before="0" w:after="60" w:line="276" w:lineRule="auto"/>
       </w:pPr>
       <w:r>
         <w:rPr>
           <w:rFonts w:ascii="Arial" w:hAnsi="Arial"/>
           <w:b/>
           <w:color w:val="0F172A"/>
-          <w:sz w:val="19"/>
+          <w:sz w:val="20"/>
         </w:rPr>
-        <w:t xml:space="preserve">Approximate Duration (~30 Days) Notation: </w:t>
+        <w:t xml:space="preserve">Reward Coupon Issuance: </w:t>
       </w:r>
       <w:r>
         <w:rPr>
           <w:rFonts w:ascii="Arial" w:hAnsi="Arial"/>
+          <w:b w:val="0"/>
           <w:color w:val="0F172A"/>
-          <w:sz w:val="19"/>
+          <w:sz w:val="20"/>
         </w:rPr>
-        <w:t>Acknowledges rare 28–29 day upstream vendor key duration variances to set accurate customer expectations and prevent false disputes.</w:t>
+        <w:t>Upon friend purchase verification, referrer receives a single-use ₹30 coupon (REF30_XXXXXX) stackable on future renewals.</w:t>
       </w:r>
     </w:p>
     <w:p>
       <w:pPr>
-        <w:pStyle w:val="ListBullet"/>
-        <w:spacing w:after="60" w:line="276" w:lineRule="auto"/>
+        <w:keepNext/>
+        <w:spacing w:before="240" w:after="80"/>
       </w:pPr>
       <w:r>
         <w:rPr>
           <w:rFonts w:ascii="Arial" w:hAnsi="Arial"/>
           <w:b/>
           <w:color w:val="0F172A"/>
-          <w:sz w:val="19"/>
+          <w:sz w:val="23"/>
         </w:rPr>
-        <w:t xml:space="preserve">Pending Order Session Reuse: </w:t>
+        <w:t>7.3 Public Telegram Proof Channel (@AetheriaStoreOfficial)</w:t>
+      </w:r>
+    </w:p>
+    <w:p>
+      <w:pPr>
+        <w:pStyle w:val="ListBullet"/>
+        <w:spacing w:before="0" w:after="60" w:line="276" w:lineRule="auto"/>
+      </w:pPr>
+      <w:r>
+        <w:rPr>
+          <w:rFonts w:ascii="Arial" w:hAnsi="Arial"/>
+          <w:b/>
+          <w:color w:val="0F172A"/>
+          <w:sz w:val="20"/>
+        </w:rPr>
+        <w:t xml:space="preserve">Restock Announcements: </w:t>
       </w:r>
       <w:r>
         <w:rPr>
           <w:rFonts w:ascii="Arial" w:hAnsi="Arial"/>
+          <w:b w:val="0"/>
           <w:color w:val="0F172A"/>
-          <w:sz w:val="19"/>
+          <w:sz w:val="20"/>
         </w:rPr>
-        <w:t>Prevents database clutter by checking for existing active pending orders for that user/chat before creating a new order. Repeated button clicks update the existing order session instead of generating duplicate abandoned rows in Firestore.</w:t>
+        <w:t>Flash restock alerts with direct bot checkout links.</w:t>
+      </w:r>
+    </w:p>
+    <w:p>
+      <w:pPr>
+        <w:pStyle w:val="ListBullet"/>
+        <w:spacing w:before="0" w:after="60" w:line="276" w:lineRule="auto"/>
+      </w:pPr>
+      <w:r>
+        <w:rPr>
+          <w:rFonts w:ascii="Arial" w:hAnsi="Arial"/>
+          <w:b/>
+          <w:color w:val="0F172A"/>
+          <w:sz w:val="20"/>
+        </w:rPr>
+        <w:t xml:space="preserve">Privacy-Masked Order Vouches: </w:t>
+      </w:r>
+      <w:r>
+        <w:rPr>
+          <w:rFonts w:ascii="Arial" w:hAnsi="Arial"/>
+          <w:b w:val="0"/>
+          <w:color w:val="0F172A"/>
+          <w:sz w:val="20"/>
+        </w:rPr>
+        <w:t>Automated social proof posts (e.g. '30-Day PGSharp Key dispatched to dh***@gmail.com') with atomic idempotency locks.</w:t>
       </w:r>
     </w:p>
     <w:p>
@@ -1561,204 +1782,116 @@
           <w:color w:val="0E7490"/>
           <w:sz w:val="28"/>
         </w:rPr>
-        <w:t>8. Admin Portal Architecture &amp; Clean-up</w:t>
+        <w:t>8. Pokémon Radar &amp; Live Scanner Telemetry</w:t>
       </w:r>
     </w:p>
     <w:p>
       <w:pPr>
-        <w:spacing w:after="120" w:line="276" w:lineRule="auto"/>
+        <w:spacing w:before="0" w:after="120" w:line="276" w:lineRule="auto"/>
       </w:pPr>
       <w:r>
         <w:rPr>
           <w:rFonts w:ascii="Arial" w:hAnsi="Arial"/>
           <w:color w:val="0F172A"/>
-          <w:sz w:val="19"/>
+          <w:sz w:val="20"/>
         </w:rPr>
-        <w:t>The administrative center has been thoroughly refined, optimized, and de-bloated:</w:t>
+        <w:t>Integrated scanner webhook (/api/pokemon/spawns) processes raw scanner feeds (Golbat, Poracle, MAD, RDM) in real time:</w:t>
       </w:r>
     </w:p>
     <w:p>
       <w:pPr>
         <w:pStyle w:val="ListBullet"/>
-        <w:spacing w:after="60" w:line="276" w:lineRule="auto"/>
+        <w:spacing w:before="0" w:after="60" w:line="276" w:lineRule="auto"/>
       </w:pPr>
       <w:r>
         <w:rPr>
           <w:rFonts w:ascii="Arial" w:hAnsi="Arial"/>
           <w:b/>
           <w:color w:val="0F172A"/>
-          <w:sz w:val="19"/>
+          <w:sz w:val="20"/>
         </w:rPr>
-        <w:t xml:space="preserve">Decommissioned Obsolete Lead Radar: </w:t>
+        <w:t xml:space="preserve">20-Minute De-duplication Cache: </w:t>
       </w:r>
       <w:r>
         <w:rPr>
           <w:rFonts w:ascii="Arial" w:hAnsi="Arial"/>
+          <w:b w:val="0"/>
           <w:color w:val="0F172A"/>
-          <w:sz w:val="19"/>
+          <w:sz w:val="20"/>
         </w:rPr>
-        <w:t>Completely removed web/Reddit scrapers that were experiencing 429/403 rate limiting. Deleted over 3,000 lines of dead code, dropping the admin bundle size from 32.8 kB down to 23.9 kB.</w:t>
+        <w:t>In-memory cache prevents repeat alerts for the same spawn.</w:t>
       </w:r>
     </w:p>
     <w:p>
       <w:pPr>
         <w:pStyle w:val="ListBullet"/>
-        <w:spacing w:after="60" w:line="276" w:lineRule="auto"/>
+        <w:spacing w:before="0" w:after="60" w:line="276" w:lineRule="auto"/>
       </w:pPr>
       <w:r>
         <w:rPr>
           <w:rFonts w:ascii="Arial" w:hAnsi="Arial"/>
           <w:b/>
           <w:color w:val="0F172A"/>
-          <w:sz w:val="19"/>
+          <w:sz w:val="20"/>
         </w:rPr>
-        <w:t xml:space="preserve">Stealth 404 Camouflage ('Ghost Admin'): </w:t>
+        <w:t xml:space="preserve">1,025 Species National Pokédex: </w:t>
       </w:r>
       <w:r>
         <w:rPr>
           <w:rFonts w:ascii="Arial" w:hAnsi="Arial"/>
+          <w:b w:val="0"/>
           <w:color w:val="0F172A"/>
-          <w:sz w:val="19"/>
+          <w:sz w:val="20"/>
         </w:rPr>
-        <w:t>Anyone navigating directly to /admin without authorization is presented with a convincing, realistic 404 Page Not Found error, keeping the admin portal invisible to automated bots and scanners.</w:t>
+        <w:t>Fuzzy typo-tolerant search (Levenshtein distance) supporting natural typing ('Greyninja' -&gt; 'Greninja').</w:t>
       </w:r>
     </w:p>
     <w:p>
       <w:pPr>
         <w:pStyle w:val="ListBullet"/>
-        <w:spacing w:after="60" w:line="276" w:lineRule="auto"/>
+        <w:spacing w:before="0" w:after="60" w:line="276" w:lineRule="auto"/>
       </w:pPr>
       <w:r>
         <w:rPr>
           <w:rFonts w:ascii="Arial" w:hAnsi="Arial"/>
           <w:b/>
           <w:color w:val="0F172A"/>
-          <w:sz w:val="19"/>
+          <w:sz w:val="20"/>
         </w:rPr>
-        <w:t xml:space="preserve">Dual Unlock Vectors: </w:t>
+        <w:t xml:space="preserve">Interactive Telegram Alerts: </w:t>
       </w:r>
       <w:r>
         <w:rPr>
           <w:rFonts w:ascii="Arial" w:hAnsi="Arial"/>
+          <w:b w:val="0"/>
           <w:color w:val="0F172A"/>
-          <w:sz w:val="19"/>
+          <w:sz w:val="20"/>
         </w:rPr>
-        <w:t>Secret URL bookmark (?key=...) for 1-click device authorization with automatic address-bar cleanup, plus emergency unlock via triple-click or Ctrl+Shift+A keyboard shortcut.</w:t>
+        <w:t>Dispatches despawn countdown, 1-tap copy coordinates, Google Maps jump link, and quick-catch PGSharp upsell.</w:t>
       </w:r>
     </w:p>
     <w:p>
       <w:pPr>
         <w:pStyle w:val="ListBullet"/>
-        <w:spacing w:after="60" w:line="276" w:lineRule="auto"/>
+        <w:spacing w:before="0" w:after="60" w:line="276" w:lineRule="auto"/>
       </w:pPr>
       <w:r>
         <w:rPr>
           <w:rFonts w:ascii="Arial" w:hAnsi="Arial"/>
           <w:b/>
           <w:color w:val="0F172A"/>
-          <w:sz w:val="19"/>
+          <w:sz w:val="20"/>
         </w:rPr>
-        <w:t xml:space="preserve">Anti-Brute-Force Rate Limiter: </w:t>
+        <w:t xml:space="preserve">Live Events Calendar (/api/pokemon/events): </w:t>
       </w:r>
       <w:r>
         <w:rPr>
           <w:rFonts w:ascii="Arial" w:hAnsi="Arial"/>
+          <w:b w:val="0"/>
           <w:color w:val="0F172A"/>
-          <w:sz w:val="19"/>
+          <w:sz w:val="20"/>
         </w:rPr>
-        <w:t>Failed passcode attempts are tracked per client IP. Reaching 5 failed attempts locks the IP out for 15 minutes with HTTP 429 Too Many Requests.</w:t>
-      </w:r>
-    </w:p>
-    <w:p>
-      <w:pPr>
-        <w:pStyle w:val="ListBullet"/>
-        <w:spacing w:after="60" w:line="276" w:lineRule="auto"/>
-      </w:pPr>
-      <w:r>
-        <w:rPr>
-          <w:rFonts w:ascii="Arial" w:hAnsi="Arial"/>
-          <w:b/>
-          <w:color w:val="0F172A"/>
-          <w:sz w:val="19"/>
-        </w:rPr>
-        <w:t xml:space="preserve">Timing-Safe Cryptographic Verification: </w:t>
-      </w:r>
-      <w:r>
-        <w:rPr>
-          <w:rFonts w:ascii="Arial" w:hAnsi="Arial"/>
-          <w:color w:val="0F172A"/>
-          <w:sz w:val="19"/>
-        </w:rPr>
-        <w:t>All admin operations use constant-time crypto.timingSafeEqual with SHA-256 digests.</w:t>
-      </w:r>
-    </w:p>
-    <w:p>
-      <w:pPr>
-        <w:pStyle w:val="ListBullet"/>
-        <w:spacing w:after="60" w:line="276" w:lineRule="auto"/>
-      </w:pPr>
-      <w:r>
-        <w:rPr>
-          <w:rFonts w:ascii="Arial" w:hAnsi="Arial"/>
-          <w:b/>
-          <w:color w:val="0F172A"/>
-          <w:sz w:val="19"/>
-        </w:rPr>
-        <w:t xml:space="preserve">Pending Approvals Verification Filter: </w:t>
-      </w:r>
-      <w:r>
-        <w:rPr>
-          <w:rFonts w:ascii="Arial" w:hAnsi="Arial"/>
-          <w:color w:val="0F172A"/>
-          <w:sz w:val="19"/>
-        </w:rPr>
-        <w:t>Restricted the admin pending approvals queue to strictly display orders with payment_status == 'verifying' or orders where proof/UTR was submitted, eliminating casual abandoned clicks from cluttering the queue.</w:t>
-      </w:r>
-    </w:p>
-    <w:p>
-      <w:pPr>
-        <w:pStyle w:val="ListBullet"/>
-        <w:spacing w:after="60" w:line="276" w:lineRule="auto"/>
-      </w:pPr>
-      <w:r>
-        <w:rPr>
-          <w:rFonts w:ascii="Arial" w:hAnsi="Arial"/>
-          <w:b/>
-          <w:color w:val="0F172A"/>
-          <w:sz w:val="19"/>
-        </w:rPr>
-        <w:t xml:space="preserve">Live Firestore Coupon Engine &amp; Deletion: </w:t>
-      </w:r>
-      <w:r>
-        <w:rPr>
-          <w:rFonts w:ascii="Arial" w:hAnsi="Arial"/>
-          <w:color w:val="0F172A"/>
-          <w:sz w:val="19"/>
-        </w:rPr>
-        <w:t>Completely eliminated static mock data and hardcoded coupon fallbacks (VIPDHRUV, DISCORDMEMBER). Built a real-time Firestore synchronization engine with an interactive [ Delete ] button, live creation modal, and empty-state notifications.</w:t>
-      </w:r>
-    </w:p>
-    <w:p>
-      <w:pPr>
-        <w:pStyle w:val="ListBullet"/>
-        <w:spacing w:after="60" w:line="276" w:lineRule="auto"/>
-      </w:pPr>
-      <w:r>
-        <w:rPr>
-          <w:rFonts w:ascii="Arial" w:hAnsi="Arial"/>
-          <w:b/>
-          <w:color w:val="0F172A"/>
-          <w:sz w:val="19"/>
-        </w:rPr>
-        <w:t xml:space="preserve">Streamlined Tab Layout: </w:t>
-      </w:r>
-      <w:r>
-        <w:rPr>
-          <w:rFonts w:ascii="Arial" w:hAnsi="Arial"/>
-          <w:color w:val="0F172A"/>
-          <w:sz w:val="19"/>
-        </w:rPr>
-        <w:t>Dashboard, Inventory &amp; Stock, Direct Dispatch, Bulk Key Uploader, Orders &amp; Deliveries, 24/7 UPI Bridge, Coupons (Live Firestore CRUD &amp; Deletion), Waitlist &amp; Demand, and Buyer Reviews.</w:t>
+        <w:t>Fetches active 5-star raids, mega raids, and spotlight hours via /events command.</w:t>
       </w:r>
     </w:p>
     <w:p>
@@ -1773,28 +1906,146 @@
           <w:color w:val="0E7490"/>
           <w:sz w:val="28"/>
         </w:rPr>
-        <w:t>9. Complete Route &amp; API Architecture Map</w:t>
+        <w:t>9. Admin Command Center &amp; Vercel Storage Optimization</w:t>
       </w:r>
     </w:p>
     <w:p>
       <w:pPr>
-        <w:spacing w:after="120" w:line="276" w:lineRule="auto"/>
+        <w:pStyle w:val="ListBullet"/>
+        <w:spacing w:before="0" w:after="60" w:line="276" w:lineRule="auto"/>
+      </w:pPr>
+      <w:r>
+        <w:rPr>
+          <w:rFonts w:ascii="Arial" w:hAnsi="Arial"/>
+          <w:b/>
+          <w:color w:val="0F172A"/>
+          <w:sz w:val="20"/>
+        </w:rPr>
+        <w:t xml:space="preserve">Ghost Admin Camouflage: </w:t>
+      </w:r>
+      <w:r>
+        <w:rPr>
+          <w:rFonts w:ascii="Arial" w:hAnsi="Arial"/>
+          <w:b w:val="0"/>
+          <w:color w:val="0F172A"/>
+          <w:sz w:val="20"/>
+        </w:rPr>
+        <w:t>Unauthorized visits to /admin yield an authentic 404 error page. Accessible via secret bookmark (?key=SECRET) or triple-clicking the 404 badge.</w:t>
+      </w:r>
+    </w:p>
+    <w:p>
+      <w:pPr>
+        <w:pStyle w:val="ListBullet"/>
+        <w:spacing w:before="0" w:after="60" w:line="276" w:lineRule="auto"/>
+      </w:pPr>
+      <w:r>
+        <w:rPr>
+          <w:rFonts w:ascii="Arial" w:hAnsi="Arial"/>
+          <w:b/>
+          <w:color w:val="0F172A"/>
+          <w:sz w:val="20"/>
+        </w:rPr>
+        <w:t xml:space="preserve">Anti-Brute-Force Rate Limiting: </w:t>
+      </w:r>
+      <w:r>
+        <w:rPr>
+          <w:rFonts w:ascii="Arial" w:hAnsi="Arial"/>
+          <w:b w:val="0"/>
+          <w:color w:val="0F172A"/>
+          <w:sz w:val="20"/>
+        </w:rPr>
+        <w:t>Locks client IP after 5 failed passcode attempts for 15 minutes.</w:t>
+      </w:r>
+    </w:p>
+    <w:p>
+      <w:pPr>
+        <w:pStyle w:val="ListBullet"/>
+        <w:spacing w:before="0" w:after="60" w:line="276" w:lineRule="auto"/>
+      </w:pPr>
+      <w:r>
+        <w:rPr>
+          <w:rFonts w:ascii="Arial" w:hAnsi="Arial"/>
+          <w:b/>
+          <w:color w:val="0F172A"/>
+          <w:sz w:val="20"/>
+        </w:rPr>
+        <w:t xml:space="preserve">Live Firestore Coupon Engine: </w:t>
+      </w:r>
+      <w:r>
+        <w:rPr>
+          <w:rFonts w:ascii="Arial" w:hAnsi="Arial"/>
+          <w:b w:val="0"/>
+          <w:color w:val="0F172A"/>
+          <w:sz w:val="20"/>
+        </w:rPr>
+        <w:t>Interactive CRUD for promotional coupons with 1-click permanent deletion.</w:t>
+      </w:r>
+    </w:p>
+    <w:p>
+      <w:pPr>
+        <w:pStyle w:val="ListBullet"/>
+        <w:spacing w:before="0" w:after="60" w:line="276" w:lineRule="auto"/>
+      </w:pPr>
+      <w:r>
+        <w:rPr>
+          <w:rFonts w:ascii="Arial" w:hAnsi="Arial"/>
+          <w:b/>
+          <w:color w:val="0F172A"/>
+          <w:sz w:val="20"/>
+        </w:rPr>
+        <w:t xml:space="preserve">Vercel Deployment Storage Optimization: </w:t>
+      </w:r>
+      <w:r>
+        <w:rPr>
+          <w:rFonts w:ascii="Arial" w:hAnsi="Arial"/>
+          <w:b w:val="0"/>
+          <w:color w:val="0F172A"/>
+          <w:sz w:val="20"/>
+        </w:rPr>
+        <w:t>Automated cleanup script (cleanup_deployments.js) purges historical builds via Vercel REST API, reducing storage from 16.91 GB to ~0.65 GB (well under the 10 GB free ceiling).</w:t>
+      </w:r>
+    </w:p>
+    <w:p>
+      <w:pPr>
+        <w:keepNext/>
+        <w:spacing w:before="320" w:after="120"/>
+      </w:pPr>
+      <w:r>
+        <w:rPr>
+          <w:rFonts w:ascii="Arial" w:hAnsi="Arial"/>
+          <w:b/>
+          <w:color w:val="0E7490"/>
+          <w:sz w:val="28"/>
+        </w:rPr>
+        <w:t>10. Complete Production Route Architecture Map</w:t>
+      </w:r>
+    </w:p>
+    <w:p>
+      <w:pPr>
+        <w:spacing w:before="0" w:after="120" w:line="276" w:lineRule="auto"/>
       </w:pPr>
       <w:r>
         <w:rPr>
           <w:rFonts w:ascii="Arial" w:hAnsi="Arial"/>
           <w:color w:val="0F172A"/>
-          <w:sz w:val="19"/>
+          <w:sz w:val="20"/>
         </w:rPr>
-        <w:t>Summary of all 18 active production routes and API endpoints:</w:t>
+        <w:t>Overview of all verified production routes across the web storefront and backend API:</w:t>
       </w:r>
     </w:p>
     <w:tbl>
       <w:tblPr>
         <w:tblW w:type="auto" w:w="0"/>
         <w:jc w:val="center"/>
-        <w:tblLayout w:type="fixed"/>
         <w:tblLook w:firstColumn="1" w:firstRow="1" w:lastColumn="0" w:lastRow="0" w:noHBand="0" w:noVBand="1" w:val="04A0"/>
+        <w:tblBorders>
+          <w:top w:val="single" w:sz="4" w:space="0" w:color="CBD5E1"/>
+          <w:left w:val="single" w:sz="4" w:space="0" w:color="CBD5E1"/>
+          <w:bottom w:val="single" w:sz="4" w:space="0" w:color="CBD5E1"/>
+          <w:right w:val="single" w:sz="4" w:space="0" w:color="CBD5E1"/>
+          <w:insideH w:val="single" w:sz="4" w:space="0" w:color="CBD5E1"/>
+          <w:insideV w:val="single" w:sz="4" w:space="0" w:color="CBD5E1"/>
+        </w:tblBorders>
       </w:tblPr>
       <w:tblGrid>
         <w:gridCol w:w="3120"/>
@@ -1804,7 +2055,7 @@
       <w:tr>
         <w:tc>
           <w:tcPr>
-            <w:tcW w:type="dxa" w:w="2880"/>
+            <w:tcW w:type="dxa" w:w="3024"/>
             <w:shd w:fill="0E7490"/>
             <w:tcMar>
               <w:top w:w="100" w:type="dxa"/>
@@ -1814,6 +2065,9 @@
             </w:tcMar>
           </w:tcPr>
           <w:p>
+            <w:pPr>
+              <w:spacing w:before="0" w:after="0"/>
+            </w:pPr>
             <w:r>
               <w:rPr>
                 <w:rFonts w:ascii="Arial" w:hAnsi="Arial"/>
@@ -1827,7 +2081,7 @@
         </w:tc>
         <w:tc>
           <w:tcPr>
-            <w:tcW w:type="dxa" w:w="2016"/>
+            <w:tcW w:type="dxa" w:w="1872"/>
             <w:shd w:fill="0E7490"/>
             <w:tcMar>
               <w:top w:w="100" w:type="dxa"/>
@@ -1837,6 +2091,9 @@
             </w:tcMar>
           </w:tcPr>
           <w:p>
+            <w:pPr>
+              <w:spacing w:before="0" w:after="0"/>
+            </w:pPr>
             <w:r>
               <w:rPr>
                 <w:rFonts w:ascii="Arial" w:hAnsi="Arial"/>
@@ -1844,7 +2101,7 @@
                 <w:color w:val="FFFFFF"/>
                 <w:sz w:val="18"/>
               </w:rPr>
-              <w:t>Rendering Type</w:t>
+              <w:t>Rendering Mode</w:t>
             </w:r>
           </w:p>
         </w:tc>
@@ -1860,6 +2117,9 @@
             </w:tcMar>
           </w:tcPr>
           <w:p>
+            <w:pPr>
+              <w:spacing w:before="0" w:after="0"/>
+            </w:pPr>
             <w:r>
               <w:rPr>
                 <w:rFonts w:ascii="Arial" w:hAnsi="Arial"/>
@@ -1875,7 +2135,7 @@
       <w:tr>
         <w:tc>
           <w:tcPr>
-            <w:tcW w:type="dxa" w:w="2880"/>
+            <w:tcW w:type="dxa" w:w="3024"/>
             <w:shd w:fill="F8FAFC"/>
             <w:tcMar>
               <w:top w:w="80" w:type="dxa"/>
@@ -1885,6 +2145,9 @@
             </w:tcMar>
           </w:tcPr>
           <w:p>
+            <w:pPr>
+              <w:spacing w:before="0" w:after="0" w:line="264" w:lineRule="auto"/>
+            </w:pPr>
             <w:r>
               <w:rPr>
                 <w:rFonts w:ascii="Arial" w:hAnsi="Arial"/>
@@ -1897,7 +2160,7 @@
         </w:tc>
         <w:tc>
           <w:tcPr>
-            <w:tcW w:type="dxa" w:w="2016"/>
+            <w:tcW w:type="dxa" w:w="1872"/>
             <w:shd w:fill="F8FAFC"/>
             <w:tcMar>
               <w:top w:w="80" w:type="dxa"/>
@@ -1907,6 +2170,9 @@
             </w:tcMar>
           </w:tcPr>
           <w:p>
+            <w:pPr>
+              <w:spacing w:before="0" w:after="0" w:line="264" w:lineRule="auto"/>
+            </w:pPr>
             <w:r>
               <w:rPr>
                 <w:rFonts w:ascii="Arial" w:hAnsi="Arial"/>
@@ -1929,13 +2195,16 @@
             </w:tcMar>
           </w:tcPr>
           <w:p>
+            <w:pPr>
+              <w:spacing w:before="0" w:after="0" w:line="264" w:lineRule="auto"/>
+            </w:pPr>
             <w:r>
               <w:rPr>
                 <w:rFonts w:ascii="Arial" w:hAnsi="Arial"/>
                 <w:color w:val="0F172A"/>
                 <w:sz w:val="17"/>
               </w:rPr>
-              <w:t>Main 3-Scene Scrollytelling Storefront, Preloader &amp; HUD</w:t>
+              <w:t>Main 3-Scene Cinematic Storefront, Scrollytelling Runway, Preloader &amp; HUD</w:t>
             </w:r>
           </w:p>
         </w:tc>
@@ -1943,7 +2212,7 @@
       <w:tr>
         <w:tc>
           <w:tcPr>
-            <w:tcW w:type="dxa" w:w="2880"/>
+            <w:tcW w:type="dxa" w:w="3024"/>
             <w:shd w:fill="FFFFFF"/>
             <w:tcMar>
               <w:top w:w="80" w:type="dxa"/>
@@ -1953,6 +2222,9 @@
             </w:tcMar>
           </w:tcPr>
           <w:p>
+            <w:pPr>
+              <w:spacing w:before="0" w:after="0" w:line="264" w:lineRule="auto"/>
+            </w:pPr>
             <w:r>
               <w:rPr>
                 <w:rFonts w:ascii="Arial" w:hAnsi="Arial"/>
@@ -1965,7 +2237,7 @@
         </w:tc>
         <w:tc>
           <w:tcPr>
-            <w:tcW w:type="dxa" w:w="2016"/>
+            <w:tcW w:type="dxa" w:w="1872"/>
             <w:shd w:fill="FFFFFF"/>
             <w:tcMar>
               <w:top w:w="80" w:type="dxa"/>
@@ -1975,6 +2247,9 @@
             </w:tcMar>
           </w:tcPr>
           <w:p>
+            <w:pPr>
+              <w:spacing w:before="0" w:after="0" w:line="264" w:lineRule="auto"/>
+            </w:pPr>
             <w:r>
               <w:rPr>
                 <w:rFonts w:ascii="Arial" w:hAnsi="Arial"/>
@@ -1997,13 +2272,16 @@
             </w:tcMar>
           </w:tcPr>
           <w:p>
+            <w:pPr>
+              <w:spacing w:before="0" w:after="0" w:line="264" w:lineRule="auto"/>
+            </w:pPr>
             <w:r>
               <w:rPr>
                 <w:rFonts w:ascii="Arial" w:hAnsi="Arial"/>
                 <w:color w:val="0F172A"/>
                 <w:sz w:val="17"/>
               </w:rPr>
-              <w:t>Encrypted Key Vault, Confetti Reveal &amp; Activation Guide</w:t>
+              <w:t>Holographic Encrypted Key Vault, Confetti Burst &amp; 4-Step Activation Guide</w:t>
             </w:r>
           </w:p>
         </w:tc>
@@ -2011,7 +2289,7 @@
       <w:tr>
         <w:tc>
           <w:tcPr>
-            <w:tcW w:type="dxa" w:w="2880"/>
+            <w:tcW w:type="dxa" w:w="3024"/>
             <w:shd w:fill="F8FAFC"/>
             <w:tcMar>
               <w:top w:w="80" w:type="dxa"/>
@@ -2021,6 +2299,9 @@
             </w:tcMar>
           </w:tcPr>
           <w:p>
+            <w:pPr>
+              <w:spacing w:before="0" w:after="0" w:line="264" w:lineRule="auto"/>
+            </w:pPr>
             <w:r>
               <w:rPr>
                 <w:rFonts w:ascii="Arial" w:hAnsi="Arial"/>
@@ -2033,7 +2314,7 @@
         </w:tc>
         <w:tc>
           <w:tcPr>
-            <w:tcW w:type="dxa" w:w="2016"/>
+            <w:tcW w:type="dxa" w:w="1872"/>
             <w:shd w:fill="F8FAFC"/>
             <w:tcMar>
               <w:top w:w="80" w:type="dxa"/>
@@ -2043,6 +2324,9 @@
             </w:tcMar>
           </w:tcPr>
           <w:p>
+            <w:pPr>
+              <w:spacing w:before="0" w:after="0" w:line="264" w:lineRule="auto"/>
+            </w:pPr>
             <w:r>
               <w:rPr>
                 <w:rFonts w:ascii="Arial" w:hAnsi="Arial"/>
@@ -2065,13 +2349,16 @@
             </w:tcMar>
           </w:tcPr>
           <w:p>
+            <w:pPr>
+              <w:spacing w:before="0" w:after="0" w:line="264" w:lineRule="auto"/>
+            </w:pPr>
             <w:r>
               <w:rPr>
                 <w:rFonts w:ascii="Arial" w:hAnsi="Arial"/>
                 <w:color w:val="0F172A"/>
                 <w:sz w:val="17"/>
               </w:rPr>
-              <w:t>Admin Key Ingestion, Slot Tier Analytics &amp; Waitlist Manager</w:t>
+              <w:t>Admin Command Center: Key Ingestion, Slot Tier Analytics &amp; Waitlist Manager</w:t>
             </w:r>
           </w:p>
         </w:tc>
@@ -2079,7 +2366,7 @@
       <w:tr>
         <w:tc>
           <w:tcPr>
-            <w:tcW w:type="dxa" w:w="2880"/>
+            <w:tcW w:type="dxa" w:w="3024"/>
             <w:shd w:fill="FFFFFF"/>
             <w:tcMar>
               <w:top w:w="80" w:type="dxa"/>
@@ -2089,19 +2376,22 @@
             </w:tcMar>
           </w:tcPr>
           <w:p>
+            <w:pPr>
+              <w:spacing w:before="0" w:after="0" w:line="264" w:lineRule="auto"/>
+            </w:pPr>
             <w:r>
               <w:rPr>
                 <w:rFonts w:ascii="Arial" w:hAnsi="Arial"/>
                 <w:color w:val="0F172A"/>
                 <w:sz w:val="17"/>
               </w:rPr>
-              <w:t>/contact, /refund, /terms</w:t>
+              <w:t>/contact, /terms, /refund</w:t>
             </w:r>
           </w:p>
         </w:tc>
         <w:tc>
           <w:tcPr>
-            <w:tcW w:type="dxa" w:w="2016"/>
+            <w:tcW w:type="dxa" w:w="1872"/>
             <w:shd w:fill="FFFFFF"/>
             <w:tcMar>
               <w:top w:w="80" w:type="dxa"/>
@@ -2111,6 +2401,9 @@
             </w:tcMar>
           </w:tcPr>
           <w:p>
+            <w:pPr>
+              <w:spacing w:before="0" w:after="0" w:line="264" w:lineRule="auto"/>
+            </w:pPr>
             <w:r>
               <w:rPr>
                 <w:rFonts w:ascii="Arial" w:hAnsi="Arial"/>
@@ -2133,13 +2426,16 @@
             </w:tcMar>
           </w:tcPr>
           <w:p>
+            <w:pPr>
+              <w:spacing w:before="0" w:after="0" w:line="264" w:lineRule="auto"/>
+            </w:pPr>
             <w:r>
               <w:rPr>
                 <w:rFonts w:ascii="Arial" w:hAnsi="Arial"/>
                 <w:color w:val="0F172A"/>
                 <w:sz w:val="17"/>
               </w:rPr>
-              <w:t>Customer Support, Refund Policy &amp; Terms of Service</w:t>
+              <w:t>Legal Compliance, Terms of Service, Privacy Policy &amp; Concierge Support</w:t>
             </w:r>
           </w:p>
         </w:tc>
@@ -2147,7 +2443,7 @@
       <w:tr>
         <w:tc>
           <w:tcPr>
-            <w:tcW w:type="dxa" w:w="2880"/>
+            <w:tcW w:type="dxa" w:w="3024"/>
             <w:shd w:fill="F8FAFC"/>
             <w:tcMar>
               <w:top w:w="80" w:type="dxa"/>
@@ -2157,6 +2453,9 @@
             </w:tcMar>
           </w:tcPr>
           <w:p>
+            <w:pPr>
+              <w:spacing w:before="0" w:after="0" w:line="264" w:lineRule="auto"/>
+            </w:pPr>
             <w:r>
               <w:rPr>
                 <w:rFonts w:ascii="Arial" w:hAnsi="Arial"/>
@@ -2169,7 +2468,7 @@
         </w:tc>
         <w:tc>
           <w:tcPr>
-            <w:tcW w:type="dxa" w:w="2016"/>
+            <w:tcW w:type="dxa" w:w="1872"/>
             <w:shd w:fill="F8FAFC"/>
             <w:tcMar>
               <w:top w:w="80" w:type="dxa"/>
@@ -2179,13 +2478,16 @@
             </w:tcMar>
           </w:tcPr>
           <w:p>
+            <w:pPr>
+              <w:spacing w:before="0" w:after="0" w:line="264" w:lineRule="auto"/>
+            </w:pPr>
             <w:r>
               <w:rPr>
                 <w:rFonts w:ascii="Arial" w:hAnsi="Arial"/>
                 <w:color w:val="0F172A"/>
                 <w:sz w:val="17"/>
               </w:rPr>
-              <w:t>Dynamic API (Cached)</w:t>
+              <w:t>Dynamic API (Edge Cached)</w:t>
             </w:r>
           </w:p>
         </w:tc>
@@ -2201,13 +2503,16 @@
             </w:tcMar>
           </w:tcPr>
           <w:p>
+            <w:pPr>
+              <w:spacing w:before="0" w:after="0" w:line="264" w:lineRule="auto"/>
+            </w:pPr>
             <w:r>
               <w:rPr>
                 <w:rFonts w:ascii="Arial" w:hAnsi="Arial"/>
                 <w:color w:val="0F172A"/>
                 <w:sz w:val="17"/>
               </w:rPr>
-              <w:t>Real-time Tier Stock, Usable Slots &amp; Active Inventory Counts</w:t>
+              <w:t>Real-time Tier Stock, Usable Slots &amp; Active Inventory Counts (s-maxage=10)</w:t>
             </w:r>
           </w:p>
         </w:tc>
@@ -2215,7 +2520,7 @@
       <w:tr>
         <w:tc>
           <w:tcPr>
-            <w:tcW w:type="dxa" w:w="2880"/>
+            <w:tcW w:type="dxa" w:w="3024"/>
             <w:shd w:fill="FFFFFF"/>
             <w:tcMar>
               <w:top w:w="80" w:type="dxa"/>
@@ -2225,19 +2530,22 @@
             </w:tcMar>
           </w:tcPr>
           <w:p>
+            <w:pPr>
+              <w:spacing w:before="0" w:after="0" w:line="264" w:lineRule="auto"/>
+            </w:pPr>
             <w:r>
               <w:rPr>
                 <w:rFonts w:ascii="Arial" w:hAnsi="Arial"/>
                 <w:color w:val="0F172A"/>
                 <w:sz w:val="17"/>
               </w:rPr>
-              <w:t>/api/checkout/upi</w:t>
+              <w:t>/api/stock/[planId]</w:t>
             </w:r>
           </w:p>
         </w:tc>
         <w:tc>
           <w:tcPr>
-            <w:tcW w:type="dxa" w:w="2016"/>
+            <w:tcW w:type="dxa" w:w="1872"/>
             <w:shd w:fill="FFFFFF"/>
             <w:tcMar>
               <w:top w:w="80" w:type="dxa"/>
@@ -2247,6 +2555,9 @@
             </w:tcMar>
           </w:tcPr>
           <w:p>
+            <w:pPr>
+              <w:spacing w:before="0" w:after="0" w:line="264" w:lineRule="auto"/>
+            </w:pPr>
             <w:r>
               <w:rPr>
                 <w:rFonts w:ascii="Arial" w:hAnsi="Arial"/>
@@ -2269,13 +2580,16 @@
             </w:tcMar>
           </w:tcPr>
           <w:p>
+            <w:pPr>
+              <w:spacing w:before="0" w:after="0" w:line="264" w:lineRule="auto"/>
+            </w:pPr>
             <w:r>
               <w:rPr>
                 <w:rFonts w:ascii="Arial" w:hAnsi="Arial"/>
                 <w:color w:val="0F172A"/>
                 <w:sz w:val="17"/>
               </w:rPr>
-              <w:t>UPI Smart Routing &amp; Clean Whole-Rupee Intent Generation</w:t>
+              <w:t>Individual Plan Stock Availability Query</w:t>
             </w:r>
           </w:p>
         </w:tc>
@@ -2283,7 +2597,7 @@
       <w:tr>
         <w:tc>
           <w:tcPr>
-            <w:tcW w:type="dxa" w:w="2880"/>
+            <w:tcW w:type="dxa" w:w="3024"/>
             <w:shd w:fill="F8FAFC"/>
             <w:tcMar>
               <w:top w:w="80" w:type="dxa"/>
@@ -2293,19 +2607,22 @@
             </w:tcMar>
           </w:tcPr>
           <w:p>
+            <w:pPr>
+              <w:spacing w:before="0" w:after="0" w:line="264" w:lineRule="auto"/>
+            </w:pPr>
             <w:r>
               <w:rPr>
                 <w:rFonts w:ascii="Arial" w:hAnsi="Arial"/>
                 <w:color w:val="0F172A"/>
                 <w:sz w:val="17"/>
               </w:rPr>
-              <w:t>/api/checkout/upi/verify</w:t>
+              <w:t>/api/checkout/upi</w:t>
             </w:r>
           </w:p>
         </w:tc>
         <w:tc>
           <w:tcPr>
-            <w:tcW w:type="dxa" w:w="2016"/>
+            <w:tcW w:type="dxa" w:w="1872"/>
             <w:shd w:fill="F8FAFC"/>
             <w:tcMar>
               <w:top w:w="80" w:type="dxa"/>
@@ -2315,6 +2632,9 @@
             </w:tcMar>
           </w:tcPr>
           <w:p>
+            <w:pPr>
+              <w:spacing w:before="0" w:after="0" w:line="264" w:lineRule="auto"/>
+            </w:pPr>
             <w:r>
               <w:rPr>
                 <w:rFonts w:ascii="Arial" w:hAnsi="Arial"/>
@@ -2337,13 +2657,16 @@
             </w:tcMar>
           </w:tcPr>
           <w:p>
+            <w:pPr>
+              <w:spacing w:before="0" w:after="0" w:line="264" w:lineRule="auto"/>
+            </w:pPr>
             <w:r>
               <w:rPr>
                 <w:rFonts w:ascii="Arial" w:hAnsi="Arial"/>
                 <w:color w:val="0F172A"/>
                 <w:sz w:val="17"/>
               </w:rPr>
-              <w:t>UPI Payment Verification &amp; Instant Key Allocation</w:t>
+              <w:t>Clean Whole-Rupee Payment Intent &amp; Native Dynamic QR Code Generation</w:t>
             </w:r>
           </w:p>
         </w:tc>
@@ -2351,7 +2674,7 @@
       <w:tr>
         <w:tc>
           <w:tcPr>
-            <w:tcW w:type="dxa" w:w="2880"/>
+            <w:tcW w:type="dxa" w:w="3024"/>
             <w:shd w:fill="FFFFFF"/>
             <w:tcMar>
               <w:top w:w="80" w:type="dxa"/>
@@ -2361,19 +2684,22 @@
             </w:tcMar>
           </w:tcPr>
           <w:p>
+            <w:pPr>
+              <w:spacing w:before="0" w:after="0" w:line="264" w:lineRule="auto"/>
+            </w:pPr>
             <w:r>
               <w:rPr>
                 <w:rFonts w:ascii="Arial" w:hAnsi="Arial"/>
                 <w:color w:val="0F172A"/>
                 <w:sz w:val="17"/>
               </w:rPr>
-              <w:t>/api/checkout/paypal</w:t>
+              <w:t>/api/checkout/upi/verify</w:t>
             </w:r>
           </w:p>
         </w:tc>
         <w:tc>
           <w:tcPr>
-            <w:tcW w:type="dxa" w:w="2016"/>
+            <w:tcW w:type="dxa" w:w="1872"/>
             <w:shd w:fill="FFFFFF"/>
             <w:tcMar>
               <w:top w:w="80" w:type="dxa"/>
@@ -2383,6 +2709,9 @@
             </w:tcMar>
           </w:tcPr>
           <w:p>
+            <w:pPr>
+              <w:spacing w:before="0" w:after="0" w:line="264" w:lineRule="auto"/>
+            </w:pPr>
             <w:r>
               <w:rPr>
                 <w:rFonts w:ascii="Arial" w:hAnsi="Arial"/>
@@ -2405,13 +2734,16 @@
             </w:tcMar>
           </w:tcPr>
           <w:p>
+            <w:pPr>
+              <w:spacing w:before="0" w:after="0" w:line="264" w:lineRule="auto"/>
+            </w:pPr>
             <w:r>
               <w:rPr>
                 <w:rFonts w:ascii="Arial" w:hAnsi="Arial"/>
                 <w:color w:val="0F172A"/>
                 <w:sz w:val="17"/>
               </w:rPr>
-              <w:t>PayPal v2 Order Creation Endpoint</w:t>
+              <w:t>Direct UPI 12-Digit Transaction ID Submission &amp; Verification</w:t>
             </w:r>
           </w:p>
         </w:tc>
@@ -2419,7 +2751,7 @@
       <w:tr>
         <w:tc>
           <w:tcPr>
-            <w:tcW w:type="dxa" w:w="2880"/>
+            <w:tcW w:type="dxa" w:w="3024"/>
             <w:shd w:fill="F8FAFC"/>
             <w:tcMar>
               <w:top w:w="80" w:type="dxa"/>
@@ -2429,19 +2761,22 @@
             </w:tcMar>
           </w:tcPr>
           <w:p>
+            <w:pPr>
+              <w:spacing w:before="0" w:after="0" w:line="264" w:lineRule="auto"/>
+            </w:pPr>
             <w:r>
               <w:rPr>
                 <w:rFonts w:ascii="Arial" w:hAnsi="Arial"/>
                 <w:color w:val="0F172A"/>
                 <w:sz w:val="17"/>
               </w:rPr>
-              <w:t>/api/checkout/paypal/capture</w:t>
+              <w:t>/api/webhooks/upi</w:t>
             </w:r>
           </w:p>
         </w:tc>
         <w:tc>
           <w:tcPr>
-            <w:tcW w:type="dxa" w:w="2016"/>
+            <w:tcW w:type="dxa" w:w="1872"/>
             <w:shd w:fill="F8FAFC"/>
             <w:tcMar>
               <w:top w:w="80" w:type="dxa"/>
@@ -2451,6 +2786,9 @@
             </w:tcMar>
           </w:tcPr>
           <w:p>
+            <w:pPr>
+              <w:spacing w:before="0" w:after="0" w:line="264" w:lineRule="auto"/>
+            </w:pPr>
             <w:r>
               <w:rPr>
                 <w:rFonts w:ascii="Arial" w:hAnsi="Arial"/>
@@ -2473,13 +2811,16 @@
             </w:tcMar>
           </w:tcPr>
           <w:p>
+            <w:pPr>
+              <w:spacing w:before="0" w:after="0" w:line="264" w:lineRule="auto"/>
+            </w:pPr>
             <w:r>
               <w:rPr>
                 <w:rFonts w:ascii="Arial" w:hAnsi="Arial"/>
                 <w:color w:val="0F172A"/>
                 <w:sz w:val="17"/>
               </w:rPr>
-              <w:t>PayPal Order Capture &amp; Key Dispatch</w:t>
+              <w:t>Bank SMS Auto-Bridge Webhook: Parses credit alerts for &lt;2s auto-fulfillment</w:t>
             </w:r>
           </w:p>
         </w:tc>
@@ -2487,7 +2828,7 @@
       <w:tr>
         <w:tc>
           <w:tcPr>
-            <w:tcW w:type="dxa" w:w="2880"/>
+            <w:tcW w:type="dxa" w:w="3024"/>
             <w:shd w:fill="FFFFFF"/>
             <w:tcMar>
               <w:top w:w="80" w:type="dxa"/>
@@ -2497,19 +2838,22 @@
             </w:tcMar>
           </w:tcPr>
           <w:p>
+            <w:pPr>
+              <w:spacing w:before="0" w:after="0" w:line="264" w:lineRule="auto"/>
+            </w:pPr>
             <w:r>
               <w:rPr>
                 <w:rFonts w:ascii="Arial" w:hAnsi="Arial"/>
                 <w:color w:val="0F172A"/>
                 <w:sz w:val="17"/>
               </w:rPr>
-              <w:t>/api/webhooks/upi</w:t>
+              <w:t>/api/checkout/paypal</w:t>
             </w:r>
           </w:p>
         </w:tc>
         <w:tc>
           <w:tcPr>
-            <w:tcW w:type="dxa" w:w="2016"/>
+            <w:tcW w:type="dxa" w:w="1872"/>
             <w:shd w:fill="FFFFFF"/>
             <w:tcMar>
               <w:top w:w="80" w:type="dxa"/>
@@ -2519,6 +2863,9 @@
             </w:tcMar>
           </w:tcPr>
           <w:p>
+            <w:pPr>
+              <w:spacing w:before="0" w:after="0" w:line="264" w:lineRule="auto"/>
+            </w:pPr>
             <w:r>
               <w:rPr>
                 <w:rFonts w:ascii="Arial" w:hAnsi="Arial"/>
@@ -2541,13 +2888,16 @@
             </w:tcMar>
           </w:tcPr>
           <w:p>
+            <w:pPr>
+              <w:spacing w:before="0" w:after="0" w:line="264" w:lineRule="auto"/>
+            </w:pPr>
             <w:r>
               <w:rPr>
                 <w:rFonts w:ascii="Arial" w:hAnsi="Arial"/>
                 <w:color w:val="0F172A"/>
                 <w:sz w:val="17"/>
               </w:rPr>
-              <w:t>24/7 Bank SMS Bridge Webhook with Anti-Fraud Filtering</w:t>
+              <w:t>PayPal.me Pre-filled Direct URL Generator ($2.00 / $3.60) &amp; Order Creation</w:t>
             </w:r>
           </w:p>
         </w:tc>
@@ -2555,7 +2905,7 @@
       <w:tr>
         <w:tc>
           <w:tcPr>
-            <w:tcW w:type="dxa" w:w="2880"/>
+            <w:tcW w:type="dxa" w:w="3024"/>
             <w:shd w:fill="F8FAFC"/>
             <w:tcMar>
               <w:top w:w="80" w:type="dxa"/>
@@ -2565,19 +2915,22 @@
             </w:tcMar>
           </w:tcPr>
           <w:p>
+            <w:pPr>
+              <w:spacing w:before="0" w:after="0" w:line="264" w:lineRule="auto"/>
+            </w:pPr>
             <w:r>
               <w:rPr>
                 <w:rFonts w:ascii="Arial" w:hAnsi="Arial"/>
                 <w:color w:val="0F172A"/>
                 <w:sz w:val="17"/>
               </w:rPr>
-              <w:t>/api/admin/keys/dispatch</w:t>
+              <w:t>/api/checkout/paypal/capture</w:t>
             </w:r>
           </w:p>
         </w:tc>
         <w:tc>
           <w:tcPr>
-            <w:tcW w:type="dxa" w:w="2016"/>
+            <w:tcW w:type="dxa" w:w="1872"/>
             <w:shd w:fill="F8FAFC"/>
             <w:tcMar>
               <w:top w:w="80" w:type="dxa"/>
@@ -2587,6 +2940,9 @@
             </w:tcMar>
           </w:tcPr>
           <w:p>
+            <w:pPr>
+              <w:spacing w:before="0" w:after="0" w:line="264" w:lineRule="auto"/>
+            </w:pPr>
             <w:r>
               <w:rPr>
                 <w:rFonts w:ascii="Arial" w:hAnsi="Arial"/>
@@ -2609,13 +2965,16 @@
             </w:tcMar>
           </w:tcPr>
           <w:p>
+            <w:pPr>
+              <w:spacing w:before="0" w:after="0" w:line="264" w:lineRule="auto"/>
+            </w:pPr>
             <w:r>
               <w:rPr>
                 <w:rFonts w:ascii="Arial" w:hAnsi="Arial"/>
                 <w:color w:val="0F172A"/>
                 <w:sz w:val="17"/>
               </w:rPr>
-              <w:t>Manual 1, 2, or 3-Slot Direct Customer Key Dispatch</w:t>
+              <w:t>PayPal JS SDK Order Capture &amp; Instant Key Allocation</w:t>
             </w:r>
           </w:p>
         </w:tc>
@@ -2623,7 +2982,7 @@
       <w:tr>
         <w:tc>
           <w:tcPr>
-            <w:tcW w:type="dxa" w:w="2880"/>
+            <w:tcW w:type="dxa" w:w="3024"/>
             <w:shd w:fill="FFFFFF"/>
             <w:tcMar>
               <w:top w:w="80" w:type="dxa"/>
@@ -2633,19 +2992,22 @@
             </w:tcMar>
           </w:tcPr>
           <w:p>
+            <w:pPr>
+              <w:spacing w:before="0" w:after="0" w:line="264" w:lineRule="auto"/>
+            </w:pPr>
             <w:r>
               <w:rPr>
                 <w:rFonts w:ascii="Arial" w:hAnsi="Arial"/>
                 <w:color w:val="0F172A"/>
                 <w:sz w:val="17"/>
               </w:rPr>
-              <w:t>/api/admin/orders/approve</w:t>
+              <w:t>/api/checkout/paypal/verify</w:t>
             </w:r>
           </w:p>
         </w:tc>
         <w:tc>
           <w:tcPr>
-            <w:tcW w:type="dxa" w:w="2016"/>
+            <w:tcW w:type="dxa" w:w="1872"/>
             <w:shd w:fill="FFFFFF"/>
             <w:tcMar>
               <w:top w:w="80" w:type="dxa"/>
@@ -2655,6 +3017,9 @@
             </w:tcMar>
           </w:tcPr>
           <w:p>
+            <w:pPr>
+              <w:spacing w:before="0" w:after="0" w:line="264" w:lineRule="auto"/>
+            </w:pPr>
             <w:r>
               <w:rPr>
                 <w:rFonts w:ascii="Arial" w:hAnsi="Arial"/>
@@ -2677,13 +3042,16 @@
             </w:tcMar>
           </w:tcPr>
           <w:p>
+            <w:pPr>
+              <w:spacing w:before="0" w:after="0" w:line="264" w:lineRule="auto"/>
+            </w:pPr>
             <w:r>
               <w:rPr>
                 <w:rFonts w:ascii="Arial" w:hAnsi="Arial"/>
                 <w:color w:val="0F172A"/>
                 <w:sz w:val="17"/>
               </w:rPr>
-              <w:t>1-Click Manual Proof Approval &amp; Instant Key Release</w:t>
+              <w:t>PayPal Direct Transaction ID Verification &amp; Key Reveal</w:t>
             </w:r>
           </w:p>
         </w:tc>
@@ -2691,7 +3059,7 @@
       <w:tr>
         <w:tc>
           <w:tcPr>
-            <w:tcW w:type="dxa" w:w="2880"/>
+            <w:tcW w:type="dxa" w:w="3024"/>
             <w:shd w:fill="F8FAFC"/>
             <w:tcMar>
               <w:top w:w="80" w:type="dxa"/>
@@ -2701,19 +3069,22 @@
             </w:tcMar>
           </w:tcPr>
           <w:p>
+            <w:pPr>
+              <w:spacing w:before="0" w:after="0" w:line="264" w:lineRule="auto"/>
+            </w:pPr>
             <w:r>
               <w:rPr>
                 <w:rFonts w:ascii="Arial" w:hAnsi="Arial"/>
                 <w:color w:val="0F172A"/>
                 <w:sz w:val="17"/>
               </w:rPr>
-              <w:t>/api/admin/orders/reject</w:t>
+              <w:t>/api/webhooks/paypal</w:t>
             </w:r>
           </w:p>
         </w:tc>
         <w:tc>
           <w:tcPr>
-            <w:tcW w:type="dxa" w:w="2016"/>
+            <w:tcW w:type="dxa" w:w="1872"/>
             <w:shd w:fill="F8FAFC"/>
             <w:tcMar>
               <w:top w:w="80" w:type="dxa"/>
@@ -2723,6 +3094,9 @@
             </w:tcMar>
           </w:tcPr>
           <w:p>
+            <w:pPr>
+              <w:spacing w:before="0" w:after="0" w:line="264" w:lineRule="auto"/>
+            </w:pPr>
             <w:r>
               <w:rPr>
                 <w:rFonts w:ascii="Arial" w:hAnsi="Arial"/>
@@ -2745,13 +3119,16 @@
             </w:tcMar>
           </w:tcPr>
           <w:p>
+            <w:pPr>
+              <w:spacing w:before="0" w:after="0" w:line="264" w:lineRule="auto"/>
+            </w:pPr>
             <w:r>
               <w:rPr>
                 <w:rFonts w:ascii="Arial" w:hAnsi="Arial"/>
                 <w:color w:val="0F172A"/>
                 <w:sz w:val="17"/>
               </w:rPr>
-              <w:t>1-Click Manual Proof Rejection &amp; Status Update</w:t>
+              <w:t>PayPal IPN Asynchronous Webhook Verification</w:t>
             </w:r>
           </w:p>
         </w:tc>
@@ -2759,7 +3136,7 @@
       <w:tr>
         <w:tc>
           <w:tcPr>
-            <w:tcW w:type="dxa" w:w="2880"/>
+            <w:tcW w:type="dxa" w:w="3024"/>
             <w:shd w:fill="FFFFFF"/>
             <w:tcMar>
               <w:top w:w="80" w:type="dxa"/>
@@ -2769,19 +3146,22 @@
             </w:tcMar>
           </w:tcPr>
           <w:p>
+            <w:pPr>
+              <w:spacing w:before="0" w:after="0" w:line="264" w:lineRule="auto"/>
+            </w:pPr>
             <w:r>
               <w:rPr>
                 <w:rFonts w:ascii="Arial" w:hAnsi="Arial"/>
                 <w:color w:val="0F172A"/>
                 <w:sz w:val="17"/>
               </w:rPr>
-              <w:t>/api/cron/expiry-reminders</w:t>
+              <w:t>/api/coupons/validate</w:t>
             </w:r>
           </w:p>
         </w:tc>
         <w:tc>
           <w:tcPr>
-            <w:tcW w:type="dxa" w:w="2016"/>
+            <w:tcW w:type="dxa" w:w="1872"/>
             <w:shd w:fill="FFFFFF"/>
             <w:tcMar>
               <w:top w:w="80" w:type="dxa"/>
@@ -2791,6 +3171,9 @@
             </w:tcMar>
           </w:tcPr>
           <w:p>
+            <w:pPr>
+              <w:spacing w:before="0" w:after="0" w:line="264" w:lineRule="auto"/>
+            </w:pPr>
             <w:r>
               <w:rPr>
                 <w:rFonts w:ascii="Arial" w:hAnsi="Arial"/>
@@ -2813,13 +3196,16 @@
             </w:tcMar>
           </w:tcPr>
           <w:p>
+            <w:pPr>
+              <w:spacing w:before="0" w:after="0" w:line="264" w:lineRule="auto"/>
+            </w:pPr>
             <w:r>
               <w:rPr>
                 <w:rFonts w:ascii="Arial" w:hAnsi="Arial"/>
                 <w:color w:val="0F172A"/>
                 <w:sz w:val="17"/>
               </w:rPr>
-              <w:t>Automated 48h License Expiry Scanner &amp; Renewals</w:t>
+              <w:t>Real-Time Coupon Validation (Fixed Rupee &amp; Percentage Discounts)</w:t>
             </w:r>
           </w:p>
         </w:tc>
@@ -2827,7 +3213,7 @@
       <w:tr>
         <w:tc>
           <w:tcPr>
-            <w:tcW w:type="dxa" w:w="2880"/>
+            <w:tcW w:type="dxa" w:w="3024"/>
             <w:shd w:fill="F8FAFC"/>
             <w:tcMar>
               <w:top w:w="80" w:type="dxa"/>
@@ -2837,19 +3223,22 @@
             </w:tcMar>
           </w:tcPr>
           <w:p>
+            <w:pPr>
+              <w:spacing w:before="0" w:after="0" w:line="264" w:lineRule="auto"/>
+            </w:pPr>
             <w:r>
               <w:rPr>
                 <w:rFonts w:ascii="Arial" w:hAnsi="Arial"/>
                 <w:color w:val="0F172A"/>
                 <w:sz w:val="17"/>
               </w:rPr>
-              <w:t>/api/telegram/webhook</w:t>
+              <w:t>/api/admin/coupons</w:t>
             </w:r>
           </w:p>
         </w:tc>
         <w:tc>
           <w:tcPr>
-            <w:tcW w:type="dxa" w:w="2016"/>
+            <w:tcW w:type="dxa" w:w="1872"/>
             <w:shd w:fill="F8FAFC"/>
             <w:tcMar>
               <w:top w:w="80" w:type="dxa"/>
@@ -2859,6 +3248,9 @@
             </w:tcMar>
           </w:tcPr>
           <w:p>
+            <w:pPr>
+              <w:spacing w:before="0" w:after="0" w:line="264" w:lineRule="auto"/>
+            </w:pPr>
             <w:r>
               <w:rPr>
                 <w:rFonts w:ascii="Arial" w:hAnsi="Arial"/>
@@ -2881,13 +3273,16 @@
             </w:tcMar>
           </w:tcPr>
           <w:p>
+            <w:pPr>
+              <w:spacing w:before="0" w:after="0" w:line="264" w:lineRule="auto"/>
+            </w:pPr>
             <w:r>
               <w:rPr>
                 <w:rFonts w:ascii="Arial" w:hAnsi="Arial"/>
                 <w:color w:val="0F172A"/>
                 <w:sz w:val="17"/>
               </w:rPr>
-              <w:t>Telegram Bot Handler (Checkout, Proofs, Referrals, /givekey)</w:t>
+              <w:t>Live Admin Coupon CRUD with Instant Permanent Deletion</w:t>
             </w:r>
           </w:p>
         </w:tc>
@@ -2895,7 +3290,7 @@
       <w:tr>
         <w:tc>
           <w:tcPr>
-            <w:tcW w:type="dxa" w:w="2880"/>
+            <w:tcW w:type="dxa" w:w="3024"/>
             <w:shd w:fill="FFFFFF"/>
             <w:tcMar>
               <w:top w:w="80" w:type="dxa"/>
@@ -2905,19 +3300,22 @@
             </w:tcMar>
           </w:tcPr>
           <w:p>
+            <w:pPr>
+              <w:spacing w:before="0" w:after="0" w:line="264" w:lineRule="auto"/>
+            </w:pPr>
             <w:r>
               <w:rPr>
                 <w:rFonts w:ascii="Arial" w:hAnsi="Arial"/>
                 <w:color w:val="0F172A"/>
                 <w:sz w:val="17"/>
               </w:rPr>
-              <w:t>/api/coupons/validate</w:t>
+              <w:t>/api/cron/expiry-reminders</w:t>
             </w:r>
           </w:p>
         </w:tc>
         <w:tc>
           <w:tcPr>
-            <w:tcW w:type="dxa" w:w="2016"/>
+            <w:tcW w:type="dxa" w:w="1872"/>
             <w:shd w:fill="FFFFFF"/>
             <w:tcMar>
               <w:top w:w="80" w:type="dxa"/>
@@ -2927,6 +3325,163 @@
             </w:tcMar>
           </w:tcPr>
           <w:p>
+            <w:pPr>
+              <w:spacing w:before="0" w:after="0" w:line="264" w:lineRule="auto"/>
+            </w:pPr>
+            <w:r>
+              <w:rPr>
+                <w:rFonts w:ascii="Arial" w:hAnsi="Arial"/>
+                <w:color w:val="0F172A"/>
+                <w:sz w:val="17"/>
+              </w:rPr>
+              <w:t>Dynamic API (Cron)</w:t>
+            </w:r>
+          </w:p>
+        </w:tc>
+        <w:tc>
+          <w:tcPr>
+            <w:tcW w:type="dxa" w:w="4464"/>
+            <w:shd w:fill="FFFFFF"/>
+            <w:tcMar>
+              <w:top w:w="80" w:type="dxa"/>
+              <w:bottom w:w="80" w:type="dxa"/>
+              <w:left w:w="120" w:type="dxa"/>
+              <w:right w:w="120" w:type="dxa"/>
+            </w:tcMar>
+          </w:tcPr>
+          <w:p>
+            <w:pPr>
+              <w:spacing w:before="0" w:after="0" w:line="264" w:lineRule="auto"/>
+            </w:pPr>
+            <w:r>
+              <w:rPr>
+                <w:rFonts w:ascii="Arial" w:hAnsi="Arial"/>
+                <w:color w:val="0F172A"/>
+                <w:sz w:val="17"/>
+              </w:rPr>
+              <w:t>Daily Retention Cron: Scans Day 28 keys, dispatches DMs &amp; renewal links</w:t>
+            </w:r>
+          </w:p>
+        </w:tc>
+      </w:tr>
+      <w:tr>
+        <w:tc>
+          <w:tcPr>
+            <w:tcW w:type="dxa" w:w="3024"/>
+            <w:shd w:fill="F8FAFC"/>
+            <w:tcMar>
+              <w:top w:w="80" w:type="dxa"/>
+              <w:bottom w:w="80" w:type="dxa"/>
+              <w:left w:w="120" w:type="dxa"/>
+              <w:right w:w="120" w:type="dxa"/>
+            </w:tcMar>
+          </w:tcPr>
+          <w:p>
+            <w:pPr>
+              <w:spacing w:before="0" w:after="0" w:line="264" w:lineRule="auto"/>
+            </w:pPr>
+            <w:r>
+              <w:rPr>
+                <w:rFonts w:ascii="Arial" w:hAnsi="Arial"/>
+                <w:color w:val="0F172A"/>
+                <w:sz w:val="17"/>
+              </w:rPr>
+              <w:t>/api/pokemon/events</w:t>
+            </w:r>
+          </w:p>
+        </w:tc>
+        <w:tc>
+          <w:tcPr>
+            <w:tcW w:type="dxa" w:w="1872"/>
+            <w:shd w:fill="F8FAFC"/>
+            <w:tcMar>
+              <w:top w:w="80" w:type="dxa"/>
+              <w:bottom w:w="80" w:type="dxa"/>
+              <w:left w:w="120" w:type="dxa"/>
+              <w:right w:w="120" w:type="dxa"/>
+            </w:tcMar>
+          </w:tcPr>
+          <w:p>
+            <w:pPr>
+              <w:spacing w:before="0" w:after="0" w:line="264" w:lineRule="auto"/>
+            </w:pPr>
+            <w:r>
+              <w:rPr>
+                <w:rFonts w:ascii="Arial" w:hAnsi="Arial"/>
+                <w:color w:val="0F172A"/>
+                <w:sz w:val="17"/>
+              </w:rPr>
+              <w:t>Dynamic API</w:t>
+            </w:r>
+          </w:p>
+        </w:tc>
+        <w:tc>
+          <w:tcPr>
+            <w:tcW w:type="dxa" w:w="4464"/>
+            <w:shd w:fill="F8FAFC"/>
+            <w:tcMar>
+              <w:top w:w="80" w:type="dxa"/>
+              <w:bottom w:w="80" w:type="dxa"/>
+              <w:left w:w="120" w:type="dxa"/>
+              <w:right w:w="120" w:type="dxa"/>
+            </w:tcMar>
+          </w:tcPr>
+          <w:p>
+            <w:pPr>
+              <w:spacing w:before="0" w:after="0" w:line="264" w:lineRule="auto"/>
+            </w:pPr>
+            <w:r>
+              <w:rPr>
+                <w:rFonts w:ascii="Arial" w:hAnsi="Arial"/>
+                <w:color w:val="0F172A"/>
+                <w:sz w:val="17"/>
+              </w:rPr>
+              <w:t>Live Pokémon GO Raids, Max Battles &amp; Spotlight Hours Calendar Feed</w:t>
+            </w:r>
+          </w:p>
+        </w:tc>
+      </w:tr>
+      <w:tr>
+        <w:tc>
+          <w:tcPr>
+            <w:tcW w:type="dxa" w:w="3024"/>
+            <w:shd w:fill="FFFFFF"/>
+            <w:tcMar>
+              <w:top w:w="80" w:type="dxa"/>
+              <w:bottom w:w="80" w:type="dxa"/>
+              <w:left w:w="120" w:type="dxa"/>
+              <w:right w:w="120" w:type="dxa"/>
+            </w:tcMar>
+          </w:tcPr>
+          <w:p>
+            <w:pPr>
+              <w:spacing w:before="0" w:after="0" w:line="264" w:lineRule="auto"/>
+            </w:pPr>
+            <w:r>
+              <w:rPr>
+                <w:rFonts w:ascii="Arial" w:hAnsi="Arial"/>
+                <w:color w:val="0F172A"/>
+                <w:sz w:val="17"/>
+              </w:rPr>
+              <w:t>/api/pokemon/spawns</w:t>
+            </w:r>
+          </w:p>
+        </w:tc>
+        <w:tc>
+          <w:tcPr>
+            <w:tcW w:type="dxa" w:w="1872"/>
+            <w:shd w:fill="FFFFFF"/>
+            <w:tcMar>
+              <w:top w:w="80" w:type="dxa"/>
+              <w:bottom w:w="80" w:type="dxa"/>
+              <w:left w:w="120" w:type="dxa"/>
+              <w:right w:w="120" w:type="dxa"/>
+            </w:tcMar>
+          </w:tcPr>
+          <w:p>
+            <w:pPr>
+              <w:spacing w:before="0" w:after="0" w:line="264" w:lineRule="auto"/>
+            </w:pPr>
             <w:r>
               <w:rPr>
                 <w:rFonts w:ascii="Arial" w:hAnsi="Arial"/>
@@ -2949,13 +3504,16 @@
             </w:tcMar>
           </w:tcPr>
           <w:p>
+            <w:pPr>
+              <w:spacing w:before="0" w:after="0" w:line="264" w:lineRule="auto"/>
+            </w:pPr>
             <w:r>
               <w:rPr>
                 <w:rFonts w:ascii="Arial" w:hAnsi="Arial"/>
                 <w:color w:val="0F172A"/>
                 <w:sz w:val="17"/>
               </w:rPr>
-              <w:t>Private VIP Promo Code Server-Side Validation</w:t>
+              <w:t>Live Pokémon Scanner Webhook Ingestion &amp; Alert Dispatch</w:t>
             </w:r>
           </w:p>
         </w:tc>
@@ -2963,7 +3521,7 @@
       <w:tr>
         <w:tc>
           <w:tcPr>
-            <w:tcW w:type="dxa" w:w="2880"/>
+            <w:tcW w:type="dxa" w:w="3024"/>
             <w:shd w:fill="F8FAFC"/>
             <w:tcMar>
               <w:top w:w="80" w:type="dxa"/>
@@ -2973,19 +3531,22 @@
             </w:tcMar>
           </w:tcPr>
           <w:p>
+            <w:pPr>
+              <w:spacing w:before="0" w:after="0" w:line="264" w:lineRule="auto"/>
+            </w:pPr>
             <w:r>
               <w:rPr>
                 <w:rFonts w:ascii="Arial" w:hAnsi="Arial"/>
                 <w:color w:val="0F172A"/>
                 <w:sz w:val="17"/>
               </w:rPr>
-              <w:t>/api/admin/coupons</w:t>
+              <w:t>/api/telegram/webhook</w:t>
             </w:r>
           </w:p>
         </w:tc>
         <w:tc>
           <w:tcPr>
-            <w:tcW w:type="dxa" w:w="2016"/>
+            <w:tcW w:type="dxa" w:w="1872"/>
             <w:shd w:fill="F8FAFC"/>
             <w:tcMar>
               <w:top w:w="80" w:type="dxa"/>
@@ -2995,6 +3556,9 @@
             </w:tcMar>
           </w:tcPr>
           <w:p>
+            <w:pPr>
+              <w:spacing w:before="0" w:after="0" w:line="264" w:lineRule="auto"/>
+            </w:pPr>
             <w:r>
               <w:rPr>
                 <w:rFonts w:ascii="Arial" w:hAnsi="Arial"/>
@@ -3017,13 +3581,16 @@
             </w:tcMar>
           </w:tcPr>
           <w:p>
+            <w:pPr>
+              <w:spacing w:before="0" w:after="0" w:line="264" w:lineRule="auto"/>
+            </w:pPr>
             <w:r>
               <w:rPr>
                 <w:rFonts w:ascii="Arial" w:hAnsi="Arial"/>
                 <w:color w:val="0F172A"/>
                 <w:sz w:val="17"/>
               </w:rPr>
-              <w:t>Live Admin Coupon CRUD with Instant Permanent Deletion</w:t>
+              <w:t>Telegram Bot Webhook: Handles /start, /buy, /keys, /ref, /givekey, Radar</w:t>
             </w:r>
           </w:p>
         </w:tc>
@@ -3031,7 +3598,7 @@
       <w:tr>
         <w:tc>
           <w:tcPr>
-            <w:tcW w:type="dxa" w:w="2880"/>
+            <w:tcW w:type="dxa" w:w="3024"/>
             <w:shd w:fill="FFFFFF"/>
             <w:tcMar>
               <w:top w:w="80" w:type="dxa"/>
@@ -3041,19 +3608,22 @@
             </w:tcMar>
           </w:tcPr>
           <w:p>
+            <w:pPr>
+              <w:spacing w:before="0" w:after="0" w:line="264" w:lineRule="auto"/>
+            </w:pPr>
             <w:r>
               <w:rPr>
                 <w:rFonts w:ascii="Arial" w:hAnsi="Arial"/>
                 <w:color w:val="0F172A"/>
                 <w:sz w:val="17"/>
               </w:rPr>
-              <w:t>/api/restock-notify</w:t>
+              <w:t>/api/telegram/setup</w:t>
             </w:r>
           </w:p>
         </w:tc>
         <w:tc>
           <w:tcPr>
-            <w:tcW w:type="dxa" w:w="2016"/>
+            <w:tcW w:type="dxa" w:w="1872"/>
             <w:shd w:fill="FFFFFF"/>
             <w:tcMar>
               <w:top w:w="80" w:type="dxa"/>
@@ -3063,6 +3633,9 @@
             </w:tcMar>
           </w:tcPr>
           <w:p>
+            <w:pPr>
+              <w:spacing w:before="0" w:after="0" w:line="264" w:lineRule="auto"/>
+            </w:pPr>
             <w:r>
               <w:rPr>
                 <w:rFonts w:ascii="Arial" w:hAnsi="Arial"/>
@@ -3085,23 +3658,791 @@
             </w:tcMar>
           </w:tcPr>
           <w:p>
+            <w:pPr>
+              <w:spacing w:before="0" w:after="0" w:line="264" w:lineRule="auto"/>
+            </w:pPr>
             <w:r>
               <w:rPr>
                 <w:rFonts w:ascii="Arial" w:hAnsi="Arial"/>
                 <w:color w:val="0F172A"/>
                 <w:sz w:val="17"/>
               </w:rPr>
-              <w:t>Customer Out-of-Stock Email Waitlist Registration</w:t>
+              <w:t>Automated Telegram Webhook Registration &amp; Command Menu Setup</w:t>
+            </w:r>
+          </w:p>
+        </w:tc>
+      </w:tr>
+      <w:tr>
+        <w:tc>
+          <w:tcPr>
+            <w:tcW w:type="dxa" w:w="3024"/>
+            <w:shd w:fill="F8FAFC"/>
+            <w:tcMar>
+              <w:top w:w="80" w:type="dxa"/>
+              <w:bottom w:w="80" w:type="dxa"/>
+              <w:left w:w="120" w:type="dxa"/>
+              <w:right w:w="120" w:type="dxa"/>
+            </w:tcMar>
+          </w:tcPr>
+          <w:p>
+            <w:pPr>
+              <w:spacing w:before="0" w:after="0" w:line="264" w:lineRule="auto"/>
+            </w:pPr>
+            <w:r>
+              <w:rPr>
+                <w:rFonts w:ascii="Arial" w:hAnsi="Arial"/>
+                <w:color w:val="0F172A"/>
+                <w:sz w:val="17"/>
+              </w:rPr>
+              <w:t>/api/restock-notify</w:t>
+            </w:r>
+          </w:p>
+        </w:tc>
+        <w:tc>
+          <w:tcPr>
+            <w:tcW w:type="dxa" w:w="1872"/>
+            <w:shd w:fill="F8FAFC"/>
+            <w:tcMar>
+              <w:top w:w="80" w:type="dxa"/>
+              <w:bottom w:w="80" w:type="dxa"/>
+              <w:left w:w="120" w:type="dxa"/>
+              <w:right w:w="120" w:type="dxa"/>
+            </w:tcMar>
+          </w:tcPr>
+          <w:p>
+            <w:pPr>
+              <w:spacing w:before="0" w:after="0" w:line="264" w:lineRule="auto"/>
+            </w:pPr>
+            <w:r>
+              <w:rPr>
+                <w:rFonts w:ascii="Arial" w:hAnsi="Arial"/>
+                <w:color w:val="0F172A"/>
+                <w:sz w:val="17"/>
+              </w:rPr>
+              <w:t>Dynamic API</w:t>
+            </w:r>
+          </w:p>
+        </w:tc>
+        <w:tc>
+          <w:tcPr>
+            <w:tcW w:type="dxa" w:w="4464"/>
+            <w:shd w:fill="F8FAFC"/>
+            <w:tcMar>
+              <w:top w:w="80" w:type="dxa"/>
+              <w:bottom w:w="80" w:type="dxa"/>
+              <w:left w:w="120" w:type="dxa"/>
+              <w:right w:w="120" w:type="dxa"/>
+            </w:tcMar>
+          </w:tcPr>
+          <w:p>
+            <w:pPr>
+              <w:spacing w:before="0" w:after="0" w:line="264" w:lineRule="auto"/>
+            </w:pPr>
+            <w:r>
+              <w:rPr>
+                <w:rFonts w:ascii="Arial" w:hAnsi="Arial"/>
+                <w:color w:val="0F172A"/>
+                <w:sz w:val="17"/>
+              </w:rPr>
+              <w:t>Customer Restock Notification Waitlist Ingestion</w:t>
+            </w:r>
+          </w:p>
+        </w:tc>
+      </w:tr>
+      <w:tr>
+        <w:tc>
+          <w:tcPr>
+            <w:tcW w:type="dxa" w:w="3024"/>
+            <w:shd w:fill="FFFFFF"/>
+            <w:tcMar>
+              <w:top w:w="80" w:type="dxa"/>
+              <w:bottom w:w="80" w:type="dxa"/>
+              <w:left w:w="120" w:type="dxa"/>
+              <w:right w:w="120" w:type="dxa"/>
+            </w:tcMar>
+          </w:tcPr>
+          <w:p>
+            <w:pPr>
+              <w:spacing w:before="0" w:after="0" w:line="264" w:lineRule="auto"/>
+            </w:pPr>
+            <w:r>
+              <w:rPr>
+                <w:rFonts w:ascii="Arial" w:hAnsi="Arial"/>
+                <w:color w:val="0F172A"/>
+                <w:sz w:val="17"/>
+              </w:rPr>
+              <w:t>/api/admin/waitlist/notify</w:t>
+            </w:r>
+          </w:p>
+        </w:tc>
+        <w:tc>
+          <w:tcPr>
+            <w:tcW w:type="dxa" w:w="1872"/>
+            <w:shd w:fill="FFFFFF"/>
+            <w:tcMar>
+              <w:top w:w="80" w:type="dxa"/>
+              <w:bottom w:w="80" w:type="dxa"/>
+              <w:left w:w="120" w:type="dxa"/>
+              <w:right w:w="120" w:type="dxa"/>
+            </w:tcMar>
+          </w:tcPr>
+          <w:p>
+            <w:pPr>
+              <w:spacing w:before="0" w:after="0" w:line="264" w:lineRule="auto"/>
+            </w:pPr>
+            <w:r>
+              <w:rPr>
+                <w:rFonts w:ascii="Arial" w:hAnsi="Arial"/>
+                <w:color w:val="0F172A"/>
+                <w:sz w:val="17"/>
+              </w:rPr>
+              <w:t>Dynamic API</w:t>
+            </w:r>
+          </w:p>
+        </w:tc>
+        <w:tc>
+          <w:tcPr>
+            <w:tcW w:type="dxa" w:w="4464"/>
+            <w:shd w:fill="FFFFFF"/>
+            <w:tcMar>
+              <w:top w:w="80" w:type="dxa"/>
+              <w:bottom w:w="80" w:type="dxa"/>
+              <w:left w:w="120" w:type="dxa"/>
+              <w:right w:w="120" w:type="dxa"/>
+            </w:tcMar>
+          </w:tcPr>
+          <w:p>
+            <w:pPr>
+              <w:spacing w:before="0" w:after="0" w:line="264" w:lineRule="auto"/>
+            </w:pPr>
+            <w:r>
+              <w:rPr>
+                <w:rFonts w:ascii="Arial" w:hAnsi="Arial"/>
+                <w:color w:val="0F172A"/>
+                <w:sz w:val="17"/>
+              </w:rPr>
+              <w:t>Dispatches Restock Alert Emails to Waiting Customers via Gmail SMTP</w:t>
+            </w:r>
+          </w:p>
+        </w:tc>
+      </w:tr>
+      <w:tr>
+        <w:tc>
+          <w:tcPr>
+            <w:tcW w:type="dxa" w:w="3024"/>
+            <w:shd w:fill="F8FAFC"/>
+            <w:tcMar>
+              <w:top w:w="80" w:type="dxa"/>
+              <w:bottom w:w="80" w:type="dxa"/>
+              <w:left w:w="120" w:type="dxa"/>
+              <w:right w:w="120" w:type="dxa"/>
+            </w:tcMar>
+          </w:tcPr>
+          <w:p>
+            <w:pPr>
+              <w:spacing w:before="0" w:after="0" w:line="264" w:lineRule="auto"/>
+            </w:pPr>
+            <w:r>
+              <w:rPr>
+                <w:rFonts w:ascii="Arial" w:hAnsi="Arial"/>
+                <w:color w:val="0F172A"/>
+                <w:sz w:val="17"/>
+              </w:rPr>
+              <w:t>/api/admin/keys</w:t>
+            </w:r>
+          </w:p>
+        </w:tc>
+        <w:tc>
+          <w:tcPr>
+            <w:tcW w:type="dxa" w:w="1872"/>
+            <w:shd w:fill="F8FAFC"/>
+            <w:tcMar>
+              <w:top w:w="80" w:type="dxa"/>
+              <w:bottom w:w="80" w:type="dxa"/>
+              <w:left w:w="120" w:type="dxa"/>
+              <w:right w:w="120" w:type="dxa"/>
+            </w:tcMar>
+          </w:tcPr>
+          <w:p>
+            <w:pPr>
+              <w:spacing w:before="0" w:after="0" w:line="264" w:lineRule="auto"/>
+            </w:pPr>
+            <w:r>
+              <w:rPr>
+                <w:rFonts w:ascii="Arial" w:hAnsi="Arial"/>
+                <w:color w:val="0F172A"/>
+                <w:sz w:val="17"/>
+              </w:rPr>
+              <w:t>Dynamic API</w:t>
+            </w:r>
+          </w:p>
+        </w:tc>
+        <w:tc>
+          <w:tcPr>
+            <w:tcW w:type="dxa" w:w="4464"/>
+            <w:shd w:fill="F8FAFC"/>
+            <w:tcMar>
+              <w:top w:w="80" w:type="dxa"/>
+              <w:bottom w:w="80" w:type="dxa"/>
+              <w:left w:w="120" w:type="dxa"/>
+              <w:right w:w="120" w:type="dxa"/>
+            </w:tcMar>
+          </w:tcPr>
+          <w:p>
+            <w:pPr>
+              <w:spacing w:before="0" w:after="0" w:line="264" w:lineRule="auto"/>
+            </w:pPr>
+            <w:r>
+              <w:rPr>
+                <w:rFonts w:ascii="Arial" w:hAnsi="Arial"/>
+                <w:color w:val="0F172A"/>
+                <w:sz w:val="17"/>
+              </w:rPr>
+              <w:t>Batch Key Ingestion with 3-Slot Tagging, Channel Broadcast &amp; Waitlist Alert</w:t>
+            </w:r>
+          </w:p>
+        </w:tc>
+      </w:tr>
+      <w:tr>
+        <w:tc>
+          <w:tcPr>
+            <w:tcW w:type="dxa" w:w="3024"/>
+            <w:shd w:fill="FFFFFF"/>
+            <w:tcMar>
+              <w:top w:w="80" w:type="dxa"/>
+              <w:bottom w:w="80" w:type="dxa"/>
+              <w:left w:w="120" w:type="dxa"/>
+              <w:right w:w="120" w:type="dxa"/>
+            </w:tcMar>
+          </w:tcPr>
+          <w:p>
+            <w:pPr>
+              <w:spacing w:before="0" w:after="0" w:line="264" w:lineRule="auto"/>
+            </w:pPr>
+            <w:r>
+              <w:rPr>
+                <w:rFonts w:ascii="Arial" w:hAnsi="Arial"/>
+                <w:color w:val="0F172A"/>
+                <w:sz w:val="17"/>
+              </w:rPr>
+              <w:t>/api/admin/keys/dispatch</w:t>
+            </w:r>
+          </w:p>
+        </w:tc>
+        <w:tc>
+          <w:tcPr>
+            <w:tcW w:type="dxa" w:w="1872"/>
+            <w:shd w:fill="FFFFFF"/>
+            <w:tcMar>
+              <w:top w:w="80" w:type="dxa"/>
+              <w:bottom w:w="80" w:type="dxa"/>
+              <w:left w:w="120" w:type="dxa"/>
+              <w:right w:w="120" w:type="dxa"/>
+            </w:tcMar>
+          </w:tcPr>
+          <w:p>
+            <w:pPr>
+              <w:spacing w:before="0" w:after="0" w:line="264" w:lineRule="auto"/>
+            </w:pPr>
+            <w:r>
+              <w:rPr>
+                <w:rFonts w:ascii="Arial" w:hAnsi="Arial"/>
+                <w:color w:val="0F172A"/>
+                <w:sz w:val="17"/>
+              </w:rPr>
+              <w:t>Dynamic API</w:t>
+            </w:r>
+          </w:p>
+        </w:tc>
+        <w:tc>
+          <w:tcPr>
+            <w:tcW w:type="dxa" w:w="4464"/>
+            <w:shd w:fill="FFFFFF"/>
+            <w:tcMar>
+              <w:top w:w="80" w:type="dxa"/>
+              <w:bottom w:w="80" w:type="dxa"/>
+              <w:left w:w="120" w:type="dxa"/>
+              <w:right w:w="120" w:type="dxa"/>
+            </w:tcMar>
+          </w:tcPr>
+          <w:p>
+            <w:pPr>
+              <w:spacing w:before="0" w:after="0" w:line="264" w:lineRule="auto"/>
+            </w:pPr>
+            <w:r>
+              <w:rPr>
+                <w:rFonts w:ascii="Arial" w:hAnsi="Arial"/>
+                <w:color w:val="0F172A"/>
+                <w:sz w:val="17"/>
+              </w:rPr>
+              <w:t>Manual 1, 2, or 3-Slot Direct Customer Key Dispatch</w:t>
+            </w:r>
+          </w:p>
+        </w:tc>
+      </w:tr>
+      <w:tr>
+        <w:tc>
+          <w:tcPr>
+            <w:tcW w:type="dxa" w:w="3024"/>
+            <w:shd w:fill="F8FAFC"/>
+            <w:tcMar>
+              <w:top w:w="80" w:type="dxa"/>
+              <w:bottom w:w="80" w:type="dxa"/>
+              <w:left w:w="120" w:type="dxa"/>
+              <w:right w:w="120" w:type="dxa"/>
+            </w:tcMar>
+          </w:tcPr>
+          <w:p>
+            <w:pPr>
+              <w:spacing w:before="0" w:after="0" w:line="264" w:lineRule="auto"/>
+            </w:pPr>
+            <w:r>
+              <w:rPr>
+                <w:rFonts w:ascii="Arial" w:hAnsi="Arial"/>
+                <w:color w:val="0F172A"/>
+                <w:sz w:val="17"/>
+              </w:rPr>
+              <w:t>/api/admin/stats</w:t>
+            </w:r>
+          </w:p>
+        </w:tc>
+        <w:tc>
+          <w:tcPr>
+            <w:tcW w:type="dxa" w:w="1872"/>
+            <w:shd w:fill="F8FAFC"/>
+            <w:tcMar>
+              <w:top w:w="80" w:type="dxa"/>
+              <w:bottom w:w="80" w:type="dxa"/>
+              <w:left w:w="120" w:type="dxa"/>
+              <w:right w:w="120" w:type="dxa"/>
+            </w:tcMar>
+          </w:tcPr>
+          <w:p>
+            <w:pPr>
+              <w:spacing w:before="0" w:after="0" w:line="264" w:lineRule="auto"/>
+            </w:pPr>
+            <w:r>
+              <w:rPr>
+                <w:rFonts w:ascii="Arial" w:hAnsi="Arial"/>
+                <w:color w:val="0F172A"/>
+                <w:sz w:val="17"/>
+              </w:rPr>
+              <w:t>Dynamic API</w:t>
+            </w:r>
+          </w:p>
+        </w:tc>
+        <w:tc>
+          <w:tcPr>
+            <w:tcW w:type="dxa" w:w="4464"/>
+            <w:shd w:fill="F8FAFC"/>
+            <w:tcMar>
+              <w:top w:w="80" w:type="dxa"/>
+              <w:bottom w:w="80" w:type="dxa"/>
+              <w:left w:w="120" w:type="dxa"/>
+              <w:right w:w="120" w:type="dxa"/>
+            </w:tcMar>
+          </w:tcPr>
+          <w:p>
+            <w:pPr>
+              <w:spacing w:before="0" w:after="0" w:line="264" w:lineRule="auto"/>
+            </w:pPr>
+            <w:r>
+              <w:rPr>
+                <w:rFonts w:ascii="Arial" w:hAnsi="Arial"/>
+                <w:color w:val="0F172A"/>
+                <w:sz w:val="17"/>
+              </w:rPr>
+              <w:t>Administrative Inventory Metrics, Revenue Totals &amp; Slot Analytics</w:t>
+            </w:r>
+          </w:p>
+        </w:tc>
+      </w:tr>
+      <w:tr>
+        <w:tc>
+          <w:tcPr>
+            <w:tcW w:type="dxa" w:w="3024"/>
+            <w:shd w:fill="FFFFFF"/>
+            <w:tcMar>
+              <w:top w:w="80" w:type="dxa"/>
+              <w:bottom w:w="80" w:type="dxa"/>
+              <w:left w:w="120" w:type="dxa"/>
+              <w:right w:w="120" w:type="dxa"/>
+            </w:tcMar>
+          </w:tcPr>
+          <w:p>
+            <w:pPr>
+              <w:spacing w:before="0" w:after="0" w:line="264" w:lineRule="auto"/>
+            </w:pPr>
+            <w:r>
+              <w:rPr>
+                <w:rFonts w:ascii="Arial" w:hAnsi="Arial"/>
+                <w:color w:val="0F172A"/>
+                <w:sz w:val="17"/>
+              </w:rPr>
+              <w:t>/api/admin/orders/approve</w:t>
+            </w:r>
+          </w:p>
+        </w:tc>
+        <w:tc>
+          <w:tcPr>
+            <w:tcW w:type="dxa" w:w="1872"/>
+            <w:shd w:fill="FFFFFF"/>
+            <w:tcMar>
+              <w:top w:w="80" w:type="dxa"/>
+              <w:bottom w:w="80" w:type="dxa"/>
+              <w:left w:w="120" w:type="dxa"/>
+              <w:right w:w="120" w:type="dxa"/>
+            </w:tcMar>
+          </w:tcPr>
+          <w:p>
+            <w:pPr>
+              <w:spacing w:before="0" w:after="0" w:line="264" w:lineRule="auto"/>
+            </w:pPr>
+            <w:r>
+              <w:rPr>
+                <w:rFonts w:ascii="Arial" w:hAnsi="Arial"/>
+                <w:color w:val="0F172A"/>
+                <w:sz w:val="17"/>
+              </w:rPr>
+              <w:t>Dynamic API</w:t>
+            </w:r>
+          </w:p>
+        </w:tc>
+        <w:tc>
+          <w:tcPr>
+            <w:tcW w:type="dxa" w:w="4464"/>
+            <w:shd w:fill="FFFFFF"/>
+            <w:tcMar>
+              <w:top w:w="80" w:type="dxa"/>
+              <w:bottom w:w="80" w:type="dxa"/>
+              <w:left w:w="120" w:type="dxa"/>
+              <w:right w:w="120" w:type="dxa"/>
+            </w:tcMar>
+          </w:tcPr>
+          <w:p>
+            <w:pPr>
+              <w:spacing w:before="0" w:after="0" w:line="264" w:lineRule="auto"/>
+            </w:pPr>
+            <w:r>
+              <w:rPr>
+                <w:rFonts w:ascii="Arial" w:hAnsi="Arial"/>
+                <w:color w:val="0F172A"/>
+                <w:sz w:val="17"/>
+              </w:rPr>
+              <w:t>Manual Order Approval with Atomic Slot Allocation &amp; Email Dispatch</w:t>
+            </w:r>
+          </w:p>
+        </w:tc>
+      </w:tr>
+      <w:tr>
+        <w:tc>
+          <w:tcPr>
+            <w:tcW w:type="dxa" w:w="3024"/>
+            <w:shd w:fill="F8FAFC"/>
+            <w:tcMar>
+              <w:top w:w="80" w:type="dxa"/>
+              <w:bottom w:w="80" w:type="dxa"/>
+              <w:left w:w="120" w:type="dxa"/>
+              <w:right w:w="120" w:type="dxa"/>
+            </w:tcMar>
+          </w:tcPr>
+          <w:p>
+            <w:pPr>
+              <w:spacing w:before="0" w:after="0" w:line="264" w:lineRule="auto"/>
+            </w:pPr>
+            <w:r>
+              <w:rPr>
+                <w:rFonts w:ascii="Arial" w:hAnsi="Arial"/>
+                <w:color w:val="0F172A"/>
+                <w:sz w:val="17"/>
+              </w:rPr>
+              <w:t>/api/admin/orders/reject</w:t>
+            </w:r>
+          </w:p>
+        </w:tc>
+        <w:tc>
+          <w:tcPr>
+            <w:tcW w:type="dxa" w:w="1872"/>
+            <w:shd w:fill="F8FAFC"/>
+            <w:tcMar>
+              <w:top w:w="80" w:type="dxa"/>
+              <w:bottom w:w="80" w:type="dxa"/>
+              <w:left w:w="120" w:type="dxa"/>
+              <w:right w:w="120" w:type="dxa"/>
+            </w:tcMar>
+          </w:tcPr>
+          <w:p>
+            <w:pPr>
+              <w:spacing w:before="0" w:after="0" w:line="264" w:lineRule="auto"/>
+            </w:pPr>
+            <w:r>
+              <w:rPr>
+                <w:rFonts w:ascii="Arial" w:hAnsi="Arial"/>
+                <w:color w:val="0F172A"/>
+                <w:sz w:val="17"/>
+              </w:rPr>
+              <w:t>Dynamic API</w:t>
+            </w:r>
+          </w:p>
+        </w:tc>
+        <w:tc>
+          <w:tcPr>
+            <w:tcW w:type="dxa" w:w="4464"/>
+            <w:shd w:fill="F8FAFC"/>
+            <w:tcMar>
+              <w:top w:w="80" w:type="dxa"/>
+              <w:bottom w:w="80" w:type="dxa"/>
+              <w:left w:w="120" w:type="dxa"/>
+              <w:right w:w="120" w:type="dxa"/>
+            </w:tcMar>
+          </w:tcPr>
+          <w:p>
+            <w:pPr>
+              <w:spacing w:before="0" w:after="0" w:line="264" w:lineRule="auto"/>
+            </w:pPr>
+            <w:r>
+              <w:rPr>
+                <w:rFonts w:ascii="Arial" w:hAnsi="Arial"/>
+                <w:color w:val="0F172A"/>
+                <w:sz w:val="17"/>
+              </w:rPr>
+              <w:t>Manual Order Rejection &amp; Reason Logging</w:t>
+            </w:r>
+          </w:p>
+        </w:tc>
+      </w:tr>
+      <w:tr>
+        <w:tc>
+          <w:tcPr>
+            <w:tcW w:type="dxa" w:w="3024"/>
+            <w:shd w:fill="FFFFFF"/>
+            <w:tcMar>
+              <w:top w:w="80" w:type="dxa"/>
+              <w:bottom w:w="80" w:type="dxa"/>
+              <w:left w:w="120" w:type="dxa"/>
+              <w:right w:w="120" w:type="dxa"/>
+            </w:tcMar>
+          </w:tcPr>
+          <w:p>
+            <w:pPr>
+              <w:spacing w:before="0" w:after="0" w:line="264" w:lineRule="auto"/>
+            </w:pPr>
+            <w:r>
+              <w:rPr>
+                <w:rFonts w:ascii="Arial" w:hAnsi="Arial"/>
+                <w:color w:val="0F172A"/>
+                <w:sz w:val="17"/>
+              </w:rPr>
+              <w:t>/api/admin/orders/quick-approve</w:t>
+            </w:r>
+          </w:p>
+        </w:tc>
+        <w:tc>
+          <w:tcPr>
+            <w:tcW w:type="dxa" w:w="1872"/>
+            <w:shd w:fill="FFFFFF"/>
+            <w:tcMar>
+              <w:top w:w="80" w:type="dxa"/>
+              <w:bottom w:w="80" w:type="dxa"/>
+              <w:left w:w="120" w:type="dxa"/>
+              <w:right w:w="120" w:type="dxa"/>
+            </w:tcMar>
+          </w:tcPr>
+          <w:p>
+            <w:pPr>
+              <w:spacing w:before="0" w:after="0" w:line="264" w:lineRule="auto"/>
+            </w:pPr>
+            <w:r>
+              <w:rPr>
+                <w:rFonts w:ascii="Arial" w:hAnsi="Arial"/>
+                <w:color w:val="0F172A"/>
+                <w:sz w:val="17"/>
+              </w:rPr>
+              <w:t>Dynamic API</w:t>
+            </w:r>
+          </w:p>
+        </w:tc>
+        <w:tc>
+          <w:tcPr>
+            <w:tcW w:type="dxa" w:w="4464"/>
+            <w:shd w:fill="FFFFFF"/>
+            <w:tcMar>
+              <w:top w:w="80" w:type="dxa"/>
+              <w:bottom w:w="80" w:type="dxa"/>
+              <w:left w:w="120" w:type="dxa"/>
+              <w:right w:w="120" w:type="dxa"/>
+            </w:tcMar>
+          </w:tcPr>
+          <w:p>
+            <w:pPr>
+              <w:spacing w:before="0" w:after="0" w:line="264" w:lineRule="auto"/>
+            </w:pPr>
+            <w:r>
+              <w:rPr>
+                <w:rFonts w:ascii="Arial" w:hAnsi="Arial"/>
+                <w:color w:val="0F172A"/>
+                <w:sz w:val="17"/>
+              </w:rPr>
+              <w:t>Discord 1-Click Quick Approval Action Endpoint</w:t>
+            </w:r>
+          </w:p>
+        </w:tc>
+      </w:tr>
+      <w:tr>
+        <w:tc>
+          <w:tcPr>
+            <w:tcW w:type="dxa" w:w="3024"/>
+            <w:shd w:fill="F8FAFC"/>
+            <w:tcMar>
+              <w:top w:w="80" w:type="dxa"/>
+              <w:bottom w:w="80" w:type="dxa"/>
+              <w:left w:w="120" w:type="dxa"/>
+              <w:right w:w="120" w:type="dxa"/>
+            </w:tcMar>
+          </w:tcPr>
+          <w:p>
+            <w:pPr>
+              <w:spacing w:before="0" w:after="0" w:line="264" w:lineRule="auto"/>
+            </w:pPr>
+            <w:r>
+              <w:rPr>
+                <w:rFonts w:ascii="Arial" w:hAnsi="Arial"/>
+                <w:color w:val="0F172A"/>
+                <w:sz w:val="17"/>
+              </w:rPr>
+              <w:t>/api/admin/orders/quick-reject</w:t>
+            </w:r>
+          </w:p>
+        </w:tc>
+        <w:tc>
+          <w:tcPr>
+            <w:tcW w:type="dxa" w:w="1872"/>
+            <w:shd w:fill="F8FAFC"/>
+            <w:tcMar>
+              <w:top w:w="80" w:type="dxa"/>
+              <w:bottom w:w="80" w:type="dxa"/>
+              <w:left w:w="120" w:type="dxa"/>
+              <w:right w:w="120" w:type="dxa"/>
+            </w:tcMar>
+          </w:tcPr>
+          <w:p>
+            <w:pPr>
+              <w:spacing w:before="0" w:after="0" w:line="264" w:lineRule="auto"/>
+            </w:pPr>
+            <w:r>
+              <w:rPr>
+                <w:rFonts w:ascii="Arial" w:hAnsi="Arial"/>
+                <w:color w:val="0F172A"/>
+                <w:sz w:val="17"/>
+              </w:rPr>
+              <w:t>Dynamic API</w:t>
+            </w:r>
+          </w:p>
+        </w:tc>
+        <w:tc>
+          <w:tcPr>
+            <w:tcW w:type="dxa" w:w="4464"/>
+            <w:shd w:fill="F8FAFC"/>
+            <w:tcMar>
+              <w:top w:w="80" w:type="dxa"/>
+              <w:bottom w:w="80" w:type="dxa"/>
+              <w:left w:w="120" w:type="dxa"/>
+              <w:right w:w="120" w:type="dxa"/>
+            </w:tcMar>
+          </w:tcPr>
+          <w:p>
+            <w:pPr>
+              <w:spacing w:before="0" w:after="0" w:line="264" w:lineRule="auto"/>
+            </w:pPr>
+            <w:r>
+              <w:rPr>
+                <w:rFonts w:ascii="Arial" w:hAnsi="Arial"/>
+                <w:color w:val="0F172A"/>
+                <w:sz w:val="17"/>
+              </w:rPr>
+              <w:t>Discord 1-Click Quick Rejection Action Endpoint</w:t>
+            </w:r>
+          </w:p>
+        </w:tc>
+      </w:tr>
+      <w:tr>
+        <w:tc>
+          <w:tcPr>
+            <w:tcW w:type="dxa" w:w="3024"/>
+            <w:shd w:fill="FFFFFF"/>
+            <w:tcMar>
+              <w:top w:w="80" w:type="dxa"/>
+              <w:bottom w:w="80" w:type="dxa"/>
+              <w:left w:w="120" w:type="dxa"/>
+              <w:right w:w="120" w:type="dxa"/>
+            </w:tcMar>
+          </w:tcPr>
+          <w:p>
+            <w:pPr>
+              <w:spacing w:before="0" w:after="0" w:line="264" w:lineRule="auto"/>
+            </w:pPr>
+            <w:r>
+              <w:rPr>
+                <w:rFonts w:ascii="Arial" w:hAnsi="Arial"/>
+                <w:color w:val="0F172A"/>
+                <w:sz w:val="17"/>
+              </w:rPr>
+              <w:t>/api/reviews</w:t>
+            </w:r>
+          </w:p>
+        </w:tc>
+        <w:tc>
+          <w:tcPr>
+            <w:tcW w:type="dxa" w:w="1872"/>
+            <w:shd w:fill="FFFFFF"/>
+            <w:tcMar>
+              <w:top w:w="80" w:type="dxa"/>
+              <w:bottom w:w="80" w:type="dxa"/>
+              <w:left w:w="120" w:type="dxa"/>
+              <w:right w:w="120" w:type="dxa"/>
+            </w:tcMar>
+          </w:tcPr>
+          <w:p>
+            <w:pPr>
+              <w:spacing w:before="0" w:after="0" w:line="264" w:lineRule="auto"/>
+            </w:pPr>
+            <w:r>
+              <w:rPr>
+                <w:rFonts w:ascii="Arial" w:hAnsi="Arial"/>
+                <w:color w:val="0F172A"/>
+                <w:sz w:val="17"/>
+              </w:rPr>
+              <w:t>Dynamic API</w:t>
+            </w:r>
+          </w:p>
+        </w:tc>
+        <w:tc>
+          <w:tcPr>
+            <w:tcW w:type="dxa" w:w="4464"/>
+            <w:shd w:fill="FFFFFF"/>
+            <w:tcMar>
+              <w:top w:w="80" w:type="dxa"/>
+              <w:bottom w:w="80" w:type="dxa"/>
+              <w:left w:w="120" w:type="dxa"/>
+              <w:right w:w="120" w:type="dxa"/>
+            </w:tcMar>
+          </w:tcPr>
+          <w:p>
+            <w:pPr>
+              <w:spacing w:before="0" w:after="0" w:line="264" w:lineRule="auto"/>
+            </w:pPr>
+            <w:r>
+              <w:rPr>
+                <w:rFonts w:ascii="Arial" w:hAnsi="Arial"/>
+                <w:color w:val="0F172A"/>
+                <w:sz w:val="17"/>
+              </w:rPr>
+              <w:t>Verified Customer Reviews Ingestion &amp; Aggregate Rating Feed</w:t>
             </w:r>
           </w:p>
         </w:tc>
       </w:tr>
     </w:tbl>
-    <w:p>
-      <w:pPr>
-        <w:spacing w:after="240"/>
-      </w:pPr>
-    </w:p>
     <w:p>
       <w:pPr>
         <w:keepNext/>
@@ -3114,89 +4455,116 @@
           <w:color w:val="0E7490"/>
           <w:sz w:val="28"/>
         </w:rPr>
-        <w:t>10. Security &amp; Cryptographic Specifications</w:t>
+        <w:t>11. Operational Runbook &amp; CI/CD Deployment Guide</w:t>
       </w:r>
     </w:p>
     <w:p>
       <w:pPr>
-        <w:spacing w:after="120" w:line="276" w:lineRule="auto"/>
+        <w:spacing w:before="0" w:after="120" w:line="276" w:lineRule="auto"/>
       </w:pPr>
       <w:r>
         <w:rPr>
           <w:rFonts w:ascii="Arial" w:hAnsi="Arial"/>
           <w:color w:val="0F172A"/>
-          <w:sz w:val="19"/>
+          <w:sz w:val="20"/>
         </w:rPr>
-        <w:t>Institutional-grade data protection standards enforced across all transactions:</w:t>
+        <w:t>Instructions for running, maintaining, and deploying AETHERIA in production:</w:t>
       </w:r>
     </w:p>
     <w:p>
       <w:pPr>
         <w:pStyle w:val="ListBullet"/>
-        <w:spacing w:after="60" w:line="276" w:lineRule="auto"/>
+        <w:spacing w:before="0" w:after="60" w:line="276" w:lineRule="auto"/>
       </w:pPr>
       <w:r>
         <w:rPr>
           <w:rFonts w:ascii="Arial" w:hAnsi="Arial"/>
           <w:b/>
           <w:color w:val="0F172A"/>
-          <w:sz w:val="19"/>
+          <w:sz w:val="20"/>
         </w:rPr>
-        <w:t xml:space="preserve">AES-256-GCM Encryption: </w:t>
+        <w:t xml:space="preserve">Environment Configuration (.env.local): </w:t>
       </w:r>
       <w:r>
         <w:rPr>
           <w:rFonts w:ascii="Arial" w:hAnsi="Arial"/>
+          <w:b w:val="0"/>
           <w:color w:val="0F172A"/>
-          <w:sz w:val="19"/>
+          <w:sz w:val="20"/>
         </w:rPr>
-        <w:t>All raw license keys stored in Firestore collection 'keys' are encrypted at rest using unique 12-byte IVs and 16-byte authentication tags.</w:t>
+        <w:t>Configure all required keys: FIREBASE_PROJECT_ID, FIREBASE_CLIENT_EMAIL, FIREBASE_PRIVATE_KEY, KEY_ENCRYPTION_SECRET, GMAIL_USER, GMAIL_APP_PASSWORD, RESEND_API_KEY, TELEGRAM_BOT_TOKEN, TELEGRAM_PROOF_CHANNEL, and ADMIN_API_SECRET.</w:t>
       </w:r>
     </w:p>
     <w:p>
       <w:pPr>
         <w:pStyle w:val="ListBullet"/>
-        <w:spacing w:after="60" w:line="276" w:lineRule="auto"/>
+        <w:spacing w:before="0" w:after="60" w:line="276" w:lineRule="auto"/>
       </w:pPr>
       <w:r>
         <w:rPr>
           <w:rFonts w:ascii="Arial" w:hAnsi="Arial"/>
           <w:b/>
           <w:color w:val="0F172A"/>
-          <w:sz w:val="19"/>
+          <w:sz w:val="20"/>
         </w:rPr>
-        <w:t xml:space="preserve">Zero Sensitive Data Retention: </w:t>
+        <w:t xml:space="preserve">Local Development Server: </w:t>
       </w:r>
       <w:r>
         <w:rPr>
           <w:rFonts w:ascii="Arial" w:hAnsi="Arial"/>
+          <w:b w:val="0"/>
           <w:color w:val="0F172A"/>
-          <w:sz w:val="19"/>
+          <w:sz w:val="20"/>
         </w:rPr>
-        <w:t>The SMS Bridge explicitly drops all incoming OTPs and login codes, storing only validated bank credit references.</w:t>
+        <w:t>Execute 'npm run dev' to launch on http://localhost:3000.</w:t>
       </w:r>
     </w:p>
     <w:p>
       <w:pPr>
         <w:pStyle w:val="ListBullet"/>
-        <w:spacing w:after="60" w:line="276" w:lineRule="auto"/>
+        <w:spacing w:before="0" w:after="60" w:line="276" w:lineRule="auto"/>
       </w:pPr>
       <w:r>
         <w:rPr>
           <w:rFonts w:ascii="Arial" w:hAnsi="Arial"/>
           <w:b/>
           <w:color w:val="0F172A"/>
-          <w:sz w:val="19"/>
+          <w:sz w:val="20"/>
         </w:rPr>
-        <w:t xml:space="preserve">Admin Secret Authentication: </w:t>
+        <w:t xml:space="preserve">Production Verification Build: </w:t>
       </w:r>
       <w:r>
         <w:rPr>
           <w:rFonts w:ascii="Arial" w:hAnsi="Arial"/>
+          <w:b w:val="0"/>
           <w:color w:val="0F172A"/>
-          <w:sz w:val="19"/>
+          <w:sz w:val="20"/>
         </w:rPr>
-        <w:t>Admin API endpoints require authenticated 'x-admin-secret' headers matching ADMIN_API_SECRET in environment variables.</w:t>
+        <w:t>Execute 'npm run build' — verifies compilation and TypeScript validity across all routes.</w:t>
+      </w:r>
+    </w:p>
+    <w:p>
+      <w:pPr>
+        <w:pStyle w:val="ListBullet"/>
+        <w:spacing w:before="0" w:after="60" w:line="276" w:lineRule="auto"/>
+      </w:pPr>
+      <w:r>
+        <w:rPr>
+          <w:rFonts w:ascii="Arial" w:hAnsi="Arial"/>
+          <w:b/>
+          <w:color w:val="0F172A"/>
+          <w:sz w:val="20"/>
+        </w:rPr>
+        <w:t xml:space="preserve">Automated Vercel Deployment: </w:t>
+      </w:r>
+      <w:r>
+        <w:rPr>
+          <w:rFonts w:ascii="Arial" w:hAnsi="Arial"/>
+          <w:b w:val="0"/>
+          <w:color w:val="0F172A"/>
+          <w:sz w:val="20"/>
+        </w:rPr>
+        <w:t>Pushing commits to branch 'main' automatically triggers Vercel CI/CD pipeline, deploying to https://aetheria-store.vercel.app with zero downtime.</w:t>
       </w:r>
     </w:p>
     <w:sectPr>

</xml_diff>

<commit_message>
feat(telegram): replace synthetic radar with verified 100% accurate global spoofing hotspots
</commit_message>
<xml_diff>
--- a/docs/Documentation.docx
+++ b/docs/Documentation.docx
@@ -1782,7 +1782,7 @@
           <w:color w:val="0E7490"/>
           <w:sz w:val="28"/>
         </w:rPr>
-        <w:t>8. Pokémon Radar &amp; Live Scanner Telemetry</w:t>
+        <w:t>8. Verified Global Spoofing Hotspots &amp; Live Scanner Telemetry</w:t>
       </w:r>
     </w:p>
     <w:p>
@@ -1795,7 +1795,31 @@
           <w:color w:val="0F172A"/>
           <w:sz w:val="20"/>
         </w:rPr>
-        <w:t>Integrated scanner webhook (/api/pokemon/spawns) processes raw scanner feeds (Golbat, Poracle, MAD, RDM) in real time:</w:t>
+        <w:t>Integrated spoofing directory and scanner webhook (/api/pokemon/spawns) provide 100% verified gameplay coordinates:</w:t>
+      </w:r>
+    </w:p>
+    <w:p>
+      <w:pPr>
+        <w:pStyle w:val="ListBullet"/>
+        <w:spacing w:before="0" w:after="60" w:line="276" w:lineRule="auto"/>
+      </w:pPr>
+      <w:r>
+        <w:rPr>
+          <w:rFonts w:ascii="Arial" w:hAnsi="Arial"/>
+          <w:b/>
+          <w:color w:val="0F172A"/>
+          <w:sz w:val="20"/>
+        </w:rPr>
+        <w:t xml:space="preserve">100% Verified Global Spoofing Hotspots: </w:t>
+      </w:r>
+      <w:r>
+        <w:rPr>
+          <w:rFonts w:ascii="Arial" w:hAnsi="Arial"/>
+          <w:b w:val="0"/>
+          <w:color w:val="0F172A"/>
+          <w:sz w:val="20"/>
+        </w:rPr>
+        <w:t>Replaced synthetic/random math coordinates with 10 permanent, real-world verified premier spoofing hubs (Zaragoza Plaza del Pilar, Pier 39 SF, NYC Times Square, Tokyo Shinjuku, Sydney Circular Quay, São Paulo, Taipei, Dubai, London, Chicago Navy Pier). Features 1-tap copyable coordinates, PokéStop density metrics, local timezones, PGSharp pro-tips, and Google Maps jump links.</w:t>
       </w:r>
     </w:p>
     <w:p>
@@ -1844,30 +1868,6 @@
           <w:sz w:val="20"/>
         </w:rPr>
         <w:t>Fuzzy typo-tolerant search (Levenshtein distance) supporting natural typing ('Greyninja' -&gt; 'Greninja').</w:t>
-      </w:r>
-    </w:p>
-    <w:p>
-      <w:pPr>
-        <w:pStyle w:val="ListBullet"/>
-        <w:spacing w:before="0" w:after="60" w:line="276" w:lineRule="auto"/>
-      </w:pPr>
-      <w:r>
-        <w:rPr>
-          <w:rFonts w:ascii="Arial" w:hAnsi="Arial"/>
-          <w:b/>
-          <w:color w:val="0F172A"/>
-          <w:sz w:val="20"/>
-        </w:rPr>
-        <w:t xml:space="preserve">Interactive Telegram Alerts: </w:t>
-      </w:r>
-      <w:r>
-        <w:rPr>
-          <w:rFonts w:ascii="Arial" w:hAnsi="Arial"/>
-          <w:b w:val="0"/>
-          <w:color w:val="0F172A"/>
-          <w:sz w:val="20"/>
-        </w:rPr>
-        <w:t>Dispatches despawn countdown, 1-tap copy coordinates, Google Maps jump link, and quick-catch PGSharp upsell.</w:t>
       </w:r>
     </w:p>
     <w:p>

</xml_diff>

<commit_message>
feat(telegram): remove redundant coordinates and replace with Free vs Standard sales comparison and anti-ban cooldown guide
</commit_message>
<xml_diff>
--- a/docs/Documentation.docx
+++ b/docs/Documentation.docx
@@ -1782,7 +1782,7 @@
           <w:color w:val="0E7490"/>
           <w:sz w:val="28"/>
         </w:rPr>
-        <w:t>8. Verified Global Spoofing Hotspots &amp; Live Scanner Telemetry</w:t>
+        <w:t>8. Sales Conversion Assets, Cooldown Guide &amp; Live Events</w:t>
       </w:r>
     </w:p>
     <w:p>
@@ -1795,7 +1795,7 @@
           <w:color w:val="0F172A"/>
           <w:sz w:val="20"/>
         </w:rPr>
-        <w:t>Integrated spoofing directory and scanner webhook (/api/pokemon/spawns) provide 100% verified gameplay coordinates:</w:t>
+        <w:t>Direct sales enablement tooling and ban-prevention utility for the Telegram bot:</w:t>
       </w:r>
     </w:p>
     <w:p>
@@ -1810,7 +1810,7 @@
           <w:color w:val="0F172A"/>
           <w:sz w:val="20"/>
         </w:rPr>
-        <w:t xml:space="preserve">100% Verified Global Spoofing Hotspots: </w:t>
+        <w:t xml:space="preserve">Free vs Standard Comparison Engine: </w:t>
       </w:r>
       <w:r>
         <w:rPr>
@@ -1819,7 +1819,55 @@
           <w:color w:val="0F172A"/>
           <w:sz w:val="20"/>
         </w:rPr>
-        <w:t>Replaced synthetic/random math coordinates with 10 permanent, real-world verified premier spoofing hubs (Zaragoza Plaza del Pilar, Pier 39 SF, NYC Times Square, Tokyo Shinjuku, Sydney Circular Quay, São Paulo, Taipei, Dubai, London, Chicago Navy Pier). Features 1-tap copyable coordinates, PokéStop density metrics, local timezones, PGSharp pro-tips, and Google Maps jump links.</w:t>
+        <w:t>High-converting sales comparison matrix detailing the limitations of PGSharp Free (15-second animations, blind catches without stats, no shiny scanner, manual joystick fatigue) vs the advantages of PGSharp Standard (1-second Quick Catch, 100% IV preview, block non-shiny encounters, hands-free GPX auto-walk, instant skip cutscenes, 100% excellent throws).</w:t>
+      </w:r>
+    </w:p>
+    <w:p>
+      <w:pPr>
+        <w:pStyle w:val="ListBullet"/>
+        <w:spacing w:before="0" w:after="60" w:line="276" w:lineRule="auto"/>
+      </w:pPr>
+      <w:r>
+        <w:rPr>
+          <w:rFonts w:ascii="Arial" w:hAnsi="Arial"/>
+          <w:b/>
+          <w:color w:val="0F172A"/>
+          <w:sz w:val="20"/>
+        </w:rPr>
+        <w:t xml:space="preserve">Anti-Ban Cooldown &amp; Safety Guide: </w:t>
+      </w:r>
+      <w:r>
+        <w:rPr>
+          <w:rFonts w:ascii="Arial" w:hAnsi="Arial"/>
+          <w:b w:val="0"/>
+          <w:color w:val="0F172A"/>
+          <w:sz w:val="20"/>
+        </w:rPr>
+        <w:t>Comprehensive reference guide with distance cooldown chart (1 km to 1,350+ km global max of 120 mins), explicit breakdown of cooldown-triggering actions (balls, berries, gym battles, spins) versus safe actions (teleporting, IV inspection, egg hatching, trading).</w:t>
+      </w:r>
+    </w:p>
+    <w:p>
+      <w:pPr>
+        <w:pStyle w:val="ListBullet"/>
+        <w:spacing w:before="0" w:after="60" w:line="276" w:lineRule="auto"/>
+      </w:pPr>
+      <w:r>
+        <w:rPr>
+          <w:rFonts w:ascii="Arial" w:hAnsi="Arial"/>
+          <w:b/>
+          <w:color w:val="0F172A"/>
+          <w:sz w:val="20"/>
+        </w:rPr>
+        <w:t xml:space="preserve">Live Events Calendar (/api/pokemon/events): </w:t>
+      </w:r>
+      <w:r>
+        <w:rPr>
+          <w:rFonts w:ascii="Arial" w:hAnsi="Arial"/>
+          <w:b w:val="0"/>
+          <w:color w:val="0F172A"/>
+          <w:sz w:val="20"/>
+        </w:rPr>
+        <w:t>Fetches active 5-star raids, mega raids, and spotlight hours via /events command.</w:t>
       </w:r>
     </w:p>
     <w:p>
@@ -1868,30 +1916,6 @@
           <w:sz w:val="20"/>
         </w:rPr>
         <w:t>Fuzzy typo-tolerant search (Levenshtein distance) supporting natural typing ('Greyninja' -&gt; 'Greninja').</w:t>
-      </w:r>
-    </w:p>
-    <w:p>
-      <w:pPr>
-        <w:pStyle w:val="ListBullet"/>
-        <w:spacing w:before="0" w:after="60" w:line="276" w:lineRule="auto"/>
-      </w:pPr>
-      <w:r>
-        <w:rPr>
-          <w:rFonts w:ascii="Arial" w:hAnsi="Arial"/>
-          <w:b/>
-          <w:color w:val="0F172A"/>
-          <w:sz w:val="20"/>
-        </w:rPr>
-        <w:t xml:space="preserve">Live Events Calendar (/api/pokemon/events): </w:t>
-      </w:r>
-      <w:r>
-        <w:rPr>
-          <w:rFonts w:ascii="Arial" w:hAnsi="Arial"/>
-          <w:b w:val="0"/>
-          <w:color w:val="0F172A"/>
-          <w:sz w:val="20"/>
-        </w:rPr>
-        <w:t>Fetches active 5-star raids, mega raids, and spotlight hours via /events command.</w:t>
       </w:r>
     </w:p>
     <w:p>

</xml_diff>

<commit_message>
feat: add direct owner dispatch modal for Telegram, Discord, and Reddit with pre-filled order text
</commit_message>
<xml_diff>
--- a/docs/Documentation.docx
+++ b/docs/Documentation.docx
@@ -4,45 +4,37 @@
   <w:body>
     <w:p>
       <w:pPr>
-        <w:spacing w:before="0" w:after="40"/>
+        <w:spacing w:before="0" w:after="80"/>
       </w:pPr>
       <w:r>
         <w:rPr>
           <w:rFonts w:ascii="Arial" w:hAnsi="Arial"/>
           <w:b/>
           <w:color w:val="0F172A"/>
-          <w:sz w:val="48"/>
+          <w:sz w:val="44"/>
         </w:rPr>
-        <w:t>AETHERIA — PGSharp Digital Storefront</w:t>
+        <w:t>AETHERIA — PGSharp Digital Key Distribution Platform</w:t>
       </w:r>
     </w:p>
     <w:p>
       <w:pPr>
-        <w:spacing w:before="0" w:after="240"/>
+        <w:spacing w:after="280"/>
       </w:pPr>
       <w:r>
         <w:rPr>
           <w:rFonts w:ascii="Arial" w:hAnsi="Arial"/>
-          <w:b w:val="0"/>
           <w:color w:val="0E7490"/>
-          <w:sz w:val="26"/>
+          <w:sz w:val="24"/>
         </w:rPr>
-        <w:t>Comprehensive Technical, Architectural &amp; Engineering Production Manual</w:t>
+        <w:t>Comprehensive Technical, Operational &amp; System Architecture Documentation</w:t>
       </w:r>
     </w:p>
     <w:tbl>
       <w:tblPr>
         <w:tblW w:type="auto" w:w="0"/>
         <w:jc w:val="center"/>
+        <w:tblLayout w:type="fixed"/>
         <w:tblLook w:firstColumn="1" w:firstRow="1" w:lastColumn="0" w:lastRow="0" w:noHBand="0" w:noVBand="1" w:val="04A0"/>
-        <w:tblBorders>
-          <w:top w:val="single" w:sz="4" w:space="0" w:color="CBD5E1"/>
-          <w:left w:val="single" w:sz="4" w:space="0" w:color="CBD5E1"/>
-          <w:bottom w:val="single" w:sz="4" w:space="0" w:color="CBD5E1"/>
-          <w:right w:val="single" w:sz="4" w:space="0" w:color="CBD5E1"/>
-          <w:insideH w:val="single" w:sz="4" w:space="0" w:color="CBD5E1"/>
-          <w:insideV w:val="single" w:sz="4" w:space="0" w:color="CBD5E1"/>
-        </w:tblBorders>
       </w:tblPr>
       <w:tblGrid>
         <w:gridCol w:w="2340"/>
@@ -53,7 +45,7 @@
       <w:tr>
         <w:tc>
           <w:tcPr>
-            <w:tcW w:type="dxa" w:w="2340"/>
+            <w:tcW w:type="dxa" w:w="2304"/>
             <w:shd w:fill="F1F5F9"/>
             <w:tcMar>
               <w:top w:w="80" w:type="dxa"/>
@@ -64,22 +56,22 @@
           </w:tcPr>
           <w:p>
             <w:pPr>
-              <w:spacing w:before="0" w:after="0"/>
+              <w:jc w:val="center"/>
             </w:pPr>
             <w:r>
               <w:rPr>
                 <w:rFonts w:ascii="Arial" w:hAnsi="Arial"/>
                 <w:b/>
                 <w:color w:val="64748B"/>
-                <w:sz w:val="16"/>
+                <w:sz w:val="17"/>
               </w:rPr>
-              <w:t>Version: 2.5.0 Prod</w:t>
+              <w:t>Version: 3.2.0 Prod</w:t>
             </w:r>
           </w:p>
         </w:tc>
         <w:tc>
           <w:tcPr>
-            <w:tcW w:type="dxa" w:w="2340"/>
+            <w:tcW w:type="dxa" w:w="2304"/>
             <w:shd w:fill="F1F5F9"/>
             <w:tcMar>
               <w:top w:w="80" w:type="dxa"/>
@@ -90,22 +82,22 @@
           </w:tcPr>
           <w:p>
             <w:pPr>
-              <w:spacing w:before="0" w:after="0"/>
+              <w:jc w:val="center"/>
             </w:pPr>
             <w:r>
               <w:rPr>
                 <w:rFonts w:ascii="Arial" w:hAnsi="Arial"/>
                 <w:b/>
                 <w:color w:val="64748B"/>
-                <w:sz w:val="16"/>
+                <w:sz w:val="17"/>
               </w:rPr>
-              <w:t>Framework: Next.js 14 App Router</w:t>
+              <w:t>Framework: Next.js 14</w:t>
             </w:r>
           </w:p>
         </w:tc>
         <w:tc>
           <w:tcPr>
-            <w:tcW w:type="dxa" w:w="2340"/>
+            <w:tcW w:type="dxa" w:w="2304"/>
             <w:shd w:fill="F1F5F9"/>
             <w:tcMar>
               <w:top w:w="80" w:type="dxa"/>
@@ -116,22 +108,22 @@
           </w:tcPr>
           <w:p>
             <w:pPr>
-              <w:spacing w:before="0" w:after="0"/>
+              <w:jc w:val="center"/>
             </w:pPr>
             <w:r>
               <w:rPr>
                 <w:rFonts w:ascii="Arial" w:hAnsi="Arial"/>
                 <w:b/>
                 <w:color w:val="64748B"/>
-                <w:sz w:val="16"/>
+                <w:sz w:val="17"/>
               </w:rPr>
-              <w:t>Security: AES-256-GCM Vault</w:t>
+              <w:t>Security: AES-256-GCM</w:t>
             </w:r>
           </w:p>
         </w:tc>
         <w:tc>
           <w:tcPr>
-            <w:tcW w:type="dxa" w:w="2340"/>
+            <w:tcW w:type="dxa" w:w="2448"/>
             <w:shd w:fill="F1F5F9"/>
             <w:tcMar>
               <w:top w:w="80" w:type="dxa"/>
@@ -142,14 +134,14 @@
           </w:tcPr>
           <w:p>
             <w:pPr>
-              <w:spacing w:before="0" w:after="0"/>
+              <w:jc w:val="center"/>
             </w:pPr>
             <w:r>
               <w:rPr>
                 <w:rFonts w:ascii="Arial" w:hAnsi="Arial"/>
                 <w:b/>
                 <w:color w:val="64748B"/>
-                <w:sz w:val="16"/>
+                <w:sz w:val="17"/>
               </w:rPr>
               <w:t>Updated: September 2026</w:t>
             </w:r>
@@ -159,7 +151,7 @@
     </w:tbl>
     <w:p>
       <w:pPr>
-        <w:spacing w:after="120"/>
+        <w:spacing w:after="200"/>
       </w:pPr>
     </w:p>
     <w:p>
@@ -174,92 +166,158 @@
           <w:color w:val="0E7490"/>
           <w:sz w:val="28"/>
         </w:rPr>
-        <w:t>1. Executive Summary &amp; System Architecture</w:t>
+        <w:t>1. Executive Summary &amp; Multi-Channel Ecosystem</w:t>
       </w:r>
     </w:p>
     <w:p>
       <w:pPr>
-        <w:spacing w:before="0" w:after="120" w:line="276" w:lineRule="auto"/>
+        <w:spacing w:after="120" w:line="276" w:lineRule="auto"/>
       </w:pPr>
       <w:r>
         <w:rPr>
           <w:rFonts w:ascii="Arial" w:hAnsi="Arial"/>
           <w:color w:val="0F172A"/>
-          <w:sz w:val="20"/>
+          <w:sz w:val="19"/>
         </w:rPr>
-        <w:t>AETHERIA is an institutional-grade, high-performance digital commerce platform engineered specifically for official PGSharp Standard Edition (~30 Days) license key distribution. It merges luxury dark-mode aesthetics (Obsidian Glassmorphism, Neon Cyber Cyan &amp; Emerald accoutrements) with an interactive 550vh image-sequence scrollytelling runway, clean whole-rupee UPI settlement, direct Gmail SMTP delivery, autonomous Telegram bot transactions, and AES-256-GCM key encryption.</w:t>
+        <w:t>AETHERIA is a high-performance, automated digital distribution engine engineered specifically for official PGSharp Standard Edition license keys. The platform operates across multiple synchronous channels:</w:t>
       </w:r>
     </w:p>
     <w:p>
       <w:pPr>
         <w:pStyle w:val="ListBullet"/>
-        <w:spacing w:before="0" w:after="60" w:line="276" w:lineRule="auto"/>
+        <w:spacing w:after="60" w:line="276" w:lineRule="auto"/>
       </w:pPr>
       <w:r>
         <w:rPr>
           <w:rFonts w:ascii="Arial" w:hAnsi="Arial"/>
           <w:b/>
           <w:color w:val="0F172A"/>
-          <w:sz w:val="20"/>
+          <w:sz w:val="19"/>
         </w:rPr>
-        <w:t xml:space="preserve">Core Brand Proposition: </w:t>
+        <w:t xml:space="preserve">Web Storefront: </w:t>
       </w:r>
       <w:r>
         <w:rPr>
           <w:rFonts w:ascii="Arial" w:hAnsi="Arial"/>
-          <w:b w:val="0"/>
           <w:color w:val="0F172A"/>
-          <w:sz w:val="20"/>
+          <w:sz w:val="19"/>
         </w:rPr>
-        <w:t>Institutional-grade reliability, instantaneous automated key dispatch (&lt; 10 seconds), zero ban risk advisory, and 1-on-1 VIP concierge support on Discord, Telegram, and Reddit.</w:t>
+        <w:t>Cyberpunk luxury dark-mode experience featuring a 550vh GSAP scrollytelling visual runway, ambient spatial audio, and an instant client-side key delivery modal.</w:t>
       </w:r>
     </w:p>
     <w:p>
       <w:pPr>
         <w:pStyle w:val="ListBullet"/>
-        <w:spacing w:before="0" w:after="60" w:line="276" w:lineRule="auto"/>
+        <w:spacing w:after="60" w:line="276" w:lineRule="auto"/>
       </w:pPr>
       <w:r>
         <w:rPr>
           <w:rFonts w:ascii="Arial" w:hAnsi="Arial"/>
           <w:b/>
           <w:color w:val="0F172A"/>
-          <w:sz w:val="20"/>
+          <w:sz w:val="19"/>
         </w:rPr>
-        <w:t xml:space="preserve">Technology Stack: </w:t>
+        <w:t xml:space="preserve">Admin Command Center (/admin): </w:t>
       </w:r>
       <w:r>
         <w:rPr>
           <w:rFonts w:ascii="Arial" w:hAnsi="Arial"/>
-          <w:b w:val="0"/>
           <w:color w:val="0F172A"/>
-          <w:sz w:val="20"/>
+          <w:sz w:val="19"/>
         </w:rPr>
-        <w:t>Next.js 14 App Router, TypeScript, Tailwind CSS, GSAP 3 (ScrollTrigger), HTML5 Canvas Particle Engine, Firebase Firestore / Admin SDK, Clean Whole-Rupee UPI Rails, Bank SMS Auto-Bridge Webhook, PayPal v2 &amp; Direct Rails, Nodemailer (Direct Gmail SMTP), and Telegram Bot API.</w:t>
+        <w:t>Encrypted portal for live vault monitoring, direct key dispatch, bulk license ingestion, order proof management, and automated expiry reminders.</w:t>
       </w:r>
     </w:p>
     <w:p>
       <w:pPr>
         <w:pStyle w:val="ListBullet"/>
-        <w:spacing w:before="0" w:after="60" w:line="276" w:lineRule="auto"/>
+        <w:spacing w:after="60" w:line="276" w:lineRule="auto"/>
       </w:pPr>
       <w:r>
         <w:rPr>
           <w:rFonts w:ascii="Arial" w:hAnsi="Arial"/>
           <w:b/>
           <w:color w:val="0F172A"/>
-          <w:sz w:val="20"/>
+          <w:sz w:val="19"/>
         </w:rPr>
-        <w:t xml:space="preserve">Multi-Channel Reach: </w:t>
+        <w:t xml:space="preserve">Telegram Bot Engine (@AetheriaStoreOfficialBot): </w:t>
       </w:r>
       <w:r>
         <w:rPr>
           <w:rFonts w:ascii="Arial" w:hAnsi="Arial"/>
-          <w:b w:val="0"/>
           <w:color w:val="0F172A"/>
-          <w:sz w:val="20"/>
+          <w:sz w:val="19"/>
         </w:rPr>
-        <w:t>Web Storefront (aetheria-store.vercel.app), Admin Command Center (/admin), Telegram Shop Bot (@AetheriaStoreOfficialBot), Telegram Proof Channel (@AetheriaStoreOfficial), and Discord Real-Time Buyer Radar.</w:t>
+        <w:t>Autonomous multi-device purchasing bot supporting instant UPI/PayPal checkouts, key delivery in DMs, and an integrated viral referral reward program.</w:t>
+      </w:r>
+    </w:p>
+    <w:p>
+      <w:pPr>
+        <w:pStyle w:val="ListBullet"/>
+        <w:spacing w:after="60" w:line="276" w:lineRule="auto"/>
+      </w:pPr>
+      <w:r>
+        <w:rPr>
+          <w:rFonts w:ascii="Arial" w:hAnsi="Arial"/>
+          <w:b/>
+          <w:color w:val="0F172A"/>
+          <w:sz w:val="19"/>
+        </w:rPr>
+        <w:t xml:space="preserve">Telegram Official Channel (@AetheriaStoreOfficial): </w:t>
+      </w:r>
+      <w:r>
+        <w:rPr>
+          <w:rFonts w:ascii="Arial" w:hAnsi="Arial"/>
+          <w:color w:val="0F172A"/>
+          <w:sz w:val="19"/>
+        </w:rPr>
+        <w:t>Real-time automated restock announcements, clean pricing cards, guides, and official store updates.</w:t>
+      </w:r>
+    </w:p>
+    <w:p>
+      <w:pPr>
+        <w:pStyle w:val="ListBullet"/>
+        <w:spacing w:after="60" w:line="276" w:lineRule="auto"/>
+      </w:pPr>
+      <w:r>
+        <w:rPr>
+          <w:rFonts w:ascii="Arial" w:hAnsi="Arial"/>
+          <w:b/>
+          <w:color w:val="0F172A"/>
+          <w:sz w:val="19"/>
+        </w:rPr>
+        <w:t xml:space="preserve">Telegram Dedicated Vouches Channel (@AetheriaStoreVouches): </w:t>
+      </w:r>
+      <w:r>
+        <w:rPr>
+          <w:rFonts w:ascii="Arial" w:hAnsi="Arial"/>
+          <w:color w:val="0F172A"/>
+          <w:sz w:val="19"/>
+        </w:rPr>
+        <w:t>Authentic customer delivery proofs, UPI/PayPal receipts, Discord trade confirmations, and in-game PGSharp activation screenshots kept in a dedicated channel to preserve main channel cleanliness.</w:t>
+      </w:r>
+    </w:p>
+    <w:p>
+      <w:pPr>
+        <w:pStyle w:val="ListBullet"/>
+        <w:spacing w:after="60" w:line="276" w:lineRule="auto"/>
+      </w:pPr>
+      <w:r>
+        <w:rPr>
+          <w:rFonts w:ascii="Arial" w:hAnsi="Arial"/>
+          <w:b/>
+          <w:color w:val="0F172A"/>
+          <w:sz w:val="19"/>
+        </w:rPr>
+        <w:t xml:space="preserve">Discord Lead Notifier (discord-key-notifier): </w:t>
+      </w:r>
+      <w:r>
+        <w:rPr>
+          <w:rFonts w:ascii="Arial" w:hAnsi="Arial"/>
+          <w:color w:val="0F172A"/>
+          <w:sz w:val="19"/>
+        </w:rPr>
+        <w:t>Dedicated gateway microservice monitoring 23 Discord servers in real time, routing high-intent buyer alerts directly to the owner's Telegram.</w:t>
       </w:r>
     </w:p>
     <w:p>
@@ -274,48 +332,40 @@
           <w:color w:val="0E7490"/>
           <w:sz w:val="28"/>
         </w:rPr>
-        <w:t>2. Official Pricing Architecture &amp; Device Slot Matrix</w:t>
+        <w:t>2. Active Pricing &amp; License Tier Structure</w:t>
       </w:r>
     </w:p>
     <w:p>
       <w:pPr>
-        <w:spacing w:before="0" w:after="120" w:line="276" w:lineRule="auto"/>
+        <w:spacing w:after="120" w:line="276" w:lineRule="auto"/>
       </w:pPr>
       <w:r>
         <w:rPr>
           <w:rFonts w:ascii="Arial" w:hAnsi="Arial"/>
           <w:color w:val="0F172A"/>
-          <w:sz w:val="20"/>
+          <w:sz w:val="19"/>
         </w:rPr>
-        <w:t>Pricing is centrally defined in src/lib/constants.ts and dynamically cascades across storefront cards, modal checkouts, PayPal payment links, automated Telegram bot messages, and SEO schemas. Strikethrough pricing reinforces high perceived value.</w:t>
+        <w:t>The store offers two distinct consumer editions, priced dynamically in INR and USD:</w:t>
       </w:r>
     </w:p>
     <w:tbl>
       <w:tblPr>
         <w:tblW w:type="auto" w:w="0"/>
         <w:jc w:val="center"/>
+        <w:tblLayout w:type="fixed"/>
         <w:tblLook w:firstColumn="1" w:firstRow="1" w:lastColumn="0" w:lastRow="0" w:noHBand="0" w:noVBand="1" w:val="04A0"/>
-        <w:tblBorders>
-          <w:top w:val="single" w:sz="4" w:space="0" w:color="CBD5E1"/>
-          <w:left w:val="single" w:sz="4" w:space="0" w:color="CBD5E1"/>
-          <w:bottom w:val="single" w:sz="4" w:space="0" w:color="CBD5E1"/>
-          <w:right w:val="single" w:sz="4" w:space="0" w:color="CBD5E1"/>
-          <w:insideH w:val="single" w:sz="4" w:space="0" w:color="CBD5E1"/>
-          <w:insideV w:val="single" w:sz="4" w:space="0" w:color="CBD5E1"/>
-        </w:tblBorders>
       </w:tblPr>
       <w:tblGrid>
-        <w:gridCol w:w="1560"/>
-        <w:gridCol w:w="1560"/>
-        <w:gridCol w:w="1560"/>
-        <w:gridCol w:w="1560"/>
-        <w:gridCol w:w="1560"/>
-        <w:gridCol w:w="1560"/>
+        <w:gridCol w:w="1872"/>
+        <w:gridCol w:w="1872"/>
+        <w:gridCol w:w="1872"/>
+        <w:gridCol w:w="1872"/>
+        <w:gridCol w:w="1872"/>
       </w:tblGrid>
       <w:tr>
         <w:tc>
           <w:tcPr>
-            <w:tcW w:type="dxa" w:w="1728"/>
+            <w:tcW w:type="dxa" w:w="1872"/>
             <w:shd w:fill="0E7490"/>
             <w:tcMar>
               <w:top w:w="100" w:type="dxa"/>
@@ -325,9 +375,6 @@
             </w:tcMar>
           </w:tcPr>
           <w:p>
-            <w:pPr>
-              <w:spacing w:before="0" w:after="0"/>
-            </w:pPr>
             <w:r>
               <w:rPr>
                 <w:rFonts w:ascii="Arial" w:hAnsi="Arial"/>
@@ -335,13 +382,13 @@
                 <w:color w:val="FFFFFF"/>
                 <w:sz w:val="18"/>
               </w:rPr>
-              <w:t>Plan Tier</w:t>
+              <w:t>Tier Name</w:t>
             </w:r>
           </w:p>
         </w:tc>
         <w:tc>
           <w:tcPr>
-            <w:tcW w:type="dxa" w:w="1296"/>
+            <w:tcW w:type="dxa" w:w="1872"/>
             <w:shd w:fill="0E7490"/>
             <w:tcMar>
               <w:top w:w="100" w:type="dxa"/>
@@ -351,9 +398,6 @@
             </w:tcMar>
           </w:tcPr>
           <w:p>
-            <w:pPr>
-              <w:spacing w:before="0" w:after="0"/>
-            </w:pPr>
             <w:r>
               <w:rPr>
                 <w:rFonts w:ascii="Arial" w:hAnsi="Arial"/>
@@ -362,58 +406,6 @@
                 <w:sz w:val="18"/>
               </w:rPr>
               <w:t>Device Capacity</w:t>
-            </w:r>
-          </w:p>
-        </w:tc>
-        <w:tc>
-          <w:tcPr>
-            <w:tcW w:type="dxa" w:w="1440"/>
-            <w:shd w:fill="0E7490"/>
-            <w:tcMar>
-              <w:top w:w="100" w:type="dxa"/>
-              <w:bottom w:w="100" w:type="dxa"/>
-              <w:left w:w="120" w:type="dxa"/>
-              <w:right w:w="120" w:type="dxa"/>
-            </w:tcMar>
-          </w:tcPr>
-          <w:p>
-            <w:pPr>
-              <w:spacing w:before="0" w:after="0"/>
-            </w:pPr>
-            <w:r>
-              <w:rPr>
-                <w:rFonts w:ascii="Arial" w:hAnsi="Arial"/>
-                <w:b/>
-                <w:color w:val="FFFFFF"/>
-                <w:sz w:val="18"/>
-              </w:rPr>
-              <w:t>Standard Price (INR)</w:t>
-            </w:r>
-          </w:p>
-        </w:tc>
-        <w:tc>
-          <w:tcPr>
-            <w:tcW w:type="dxa" w:w="1440"/>
-            <w:shd w:fill="0E7490"/>
-            <w:tcMar>
-              <w:top w:w="100" w:type="dxa"/>
-              <w:bottom w:w="100" w:type="dxa"/>
-              <w:left w:w="120" w:type="dxa"/>
-              <w:right w:w="120" w:type="dxa"/>
-            </w:tcMar>
-          </w:tcPr>
-          <w:p>
-            <w:pPr>
-              <w:spacing w:before="0" w:after="0"/>
-            </w:pPr>
-            <w:r>
-              <w:rPr>
-                <w:rFonts w:ascii="Arial" w:hAnsi="Arial"/>
-                <w:b/>
-                <w:color w:val="FFFFFF"/>
-                <w:sz w:val="18"/>
-              </w:rPr>
-              <w:t>Standard Price (USD)</w:t>
             </w:r>
           </w:p>
         </w:tc>
@@ -429,9 +421,6 @@
             </w:tcMar>
           </w:tcPr>
           <w:p>
-            <w:pPr>
-              <w:spacing w:before="0" w:after="0"/>
-            </w:pPr>
             <w:r>
               <w:rPr>
                 <w:rFonts w:ascii="Arial" w:hAnsi="Arial"/>
@@ -439,13 +428,13 @@
                 <w:color w:val="FFFFFF"/>
                 <w:sz w:val="18"/>
               </w:rPr>
-              <w:t>Referral Price (INR)</w:t>
+              <w:t>Price (INR)</w:t>
             </w:r>
           </w:p>
         </w:tc>
         <w:tc>
           <w:tcPr>
-            <w:tcW w:type="dxa" w:w="1872"/>
+            <w:tcW w:type="dxa" w:w="1584"/>
             <w:shd w:fill="0E7490"/>
             <w:tcMar>
               <w:top w:w="100" w:type="dxa"/>
@@ -455,9 +444,6 @@
             </w:tcMar>
           </w:tcPr>
           <w:p>
-            <w:pPr>
-              <w:spacing w:before="0" w:after="0"/>
-            </w:pPr>
             <w:r>
               <w:rPr>
                 <w:rFonts w:ascii="Arial" w:hAnsi="Arial"/>
@@ -465,7 +451,30 @@
                 <w:color w:val="FFFFFF"/>
                 <w:sz w:val="18"/>
               </w:rPr>
-              <w:t>Referral Price (USD)</w:t>
+              <w:t>Price (USD)</w:t>
+            </w:r>
+          </w:p>
+        </w:tc>
+        <w:tc>
+          <w:tcPr>
+            <w:tcW w:type="dxa" w:w="2448"/>
+            <w:shd w:fill="0E7490"/>
+            <w:tcMar>
+              <w:top w:w="100" w:type="dxa"/>
+              <w:bottom w:w="100" w:type="dxa"/>
+              <w:left w:w="120" w:type="dxa"/>
+              <w:right w:w="120" w:type="dxa"/>
+            </w:tcMar>
+          </w:tcPr>
+          <w:p>
+            <w:r>
+              <w:rPr>
+                <w:rFonts w:ascii="Arial" w:hAnsi="Arial"/>
+                <w:b/>
+                <w:color w:val="FFFFFF"/>
+                <w:sz w:val="18"/>
+              </w:rPr>
+              <w:t>Duration &amp; Features</w:t>
             </w:r>
           </w:p>
         </w:tc>
@@ -473,7 +482,7 @@
       <w:tr>
         <w:tc>
           <w:tcPr>
-            <w:tcW w:type="dxa" w:w="1728"/>
+            <w:tcW w:type="dxa" w:w="1872"/>
             <w:shd w:fill="F8FAFC"/>
             <w:tcMar>
               <w:top w:w="80" w:type="dxa"/>
@@ -483,9 +492,6 @@
             </w:tcMar>
           </w:tcPr>
           <w:p>
-            <w:pPr>
-              <w:spacing w:before="0" w:after="0" w:line="264" w:lineRule="auto"/>
-            </w:pPr>
             <w:r>
               <w:rPr>
                 <w:rFonts w:ascii="Arial" w:hAnsi="Arial"/>
@@ -498,7 +504,7 @@
         </w:tc>
         <w:tc>
           <w:tcPr>
-            <w:tcW w:type="dxa" w:w="1296"/>
+            <w:tcW w:type="dxa" w:w="1872"/>
             <w:shd w:fill="F8FAFC"/>
             <w:tcMar>
               <w:top w:w="80" w:type="dxa"/>
@@ -508,9 +514,6 @@
             </w:tcMar>
           </w:tcPr>
           <w:p>
-            <w:pPr>
-              <w:spacing w:before="0" w:after="0" w:line="264" w:lineRule="auto"/>
-            </w:pPr>
             <w:r>
               <w:rPr>
                 <w:rFonts w:ascii="Arial" w:hAnsi="Arial"/>
@@ -518,56 +521,6 @@
                 <w:sz w:val="17"/>
               </w:rPr>
               <w:t>1 Android Device</w:t>
-            </w:r>
-          </w:p>
-        </w:tc>
-        <w:tc>
-          <w:tcPr>
-            <w:tcW w:type="dxa" w:w="1440"/>
-            <w:shd w:fill="F8FAFC"/>
-            <w:tcMar>
-              <w:top w:w="80" w:type="dxa"/>
-              <w:bottom w:w="80" w:type="dxa"/>
-              <w:left w:w="120" w:type="dxa"/>
-              <w:right w:w="120" w:type="dxa"/>
-            </w:tcMar>
-          </w:tcPr>
-          <w:p>
-            <w:pPr>
-              <w:spacing w:before="0" w:after="0" w:line="264" w:lineRule="auto"/>
-            </w:pPr>
-            <w:r>
-              <w:rPr>
-                <w:rFonts w:ascii="Arial" w:hAnsi="Arial"/>
-                <w:color w:val="0F172A"/>
-                <w:sz w:val="17"/>
-              </w:rPr>
-              <w:t>₹160 (Fixed Whole)</w:t>
-            </w:r>
-          </w:p>
-        </w:tc>
-        <w:tc>
-          <w:tcPr>
-            <w:tcW w:type="dxa" w:w="1440"/>
-            <w:shd w:fill="F8FAFC"/>
-            <w:tcMar>
-              <w:top w:w="80" w:type="dxa"/>
-              <w:bottom w:w="80" w:type="dxa"/>
-              <w:left w:w="120" w:type="dxa"/>
-              <w:right w:w="120" w:type="dxa"/>
-            </w:tcMar>
-          </w:tcPr>
-          <w:p>
-            <w:pPr>
-              <w:spacing w:before="0" w:after="0" w:line="264" w:lineRule="auto"/>
-            </w:pPr>
-            <w:r>
-              <w:rPr>
-                <w:rFonts w:ascii="Arial" w:hAnsi="Arial"/>
-                <w:color w:val="0F172A"/>
-                <w:sz w:val="17"/>
-              </w:rPr>
-              <w:t>$2.00 (Fixed USD)</w:t>
             </w:r>
           </w:p>
         </w:tc>
@@ -583,22 +536,19 @@
             </w:tcMar>
           </w:tcPr>
           <w:p>
-            <w:pPr>
-              <w:spacing w:before="0" w:after="0" w:line="264" w:lineRule="auto"/>
-            </w:pPr>
             <w:r>
               <w:rPr>
                 <w:rFonts w:ascii="Arial" w:hAnsi="Arial"/>
                 <w:color w:val="0F172A"/>
                 <w:sz w:val="17"/>
               </w:rPr>
-              <w:t>₹130 (₹30 OFF)</w:t>
+              <w:t>₹160</w:t>
             </w:r>
           </w:p>
         </w:tc>
         <w:tc>
           <w:tcPr>
-            <w:tcW w:type="dxa" w:w="1872"/>
+            <w:tcW w:type="dxa" w:w="1584"/>
             <w:shd w:fill="F8FAFC"/>
             <w:tcMar>
               <w:top w:w="80" w:type="dxa"/>
@@ -608,16 +558,35 @@
             </w:tcMar>
           </w:tcPr>
           <w:p>
-            <w:pPr>
-              <w:spacing w:before="0" w:after="0" w:line="264" w:lineRule="auto"/>
-            </w:pPr>
             <w:r>
               <w:rPr>
                 <w:rFonts w:ascii="Arial" w:hAnsi="Arial"/>
                 <w:color w:val="0F172A"/>
                 <w:sz w:val="17"/>
               </w:rPr>
-              <w:t>$1.70 ($0.30 OFF)</w:t>
+              <w:t>$2.00</w:t>
+            </w:r>
+          </w:p>
+        </w:tc>
+        <w:tc>
+          <w:tcPr>
+            <w:tcW w:type="dxa" w:w="2448"/>
+            <w:shd w:fill="F8FAFC"/>
+            <w:tcMar>
+              <w:top w:w="80" w:type="dxa"/>
+              <w:bottom w:w="80" w:type="dxa"/>
+              <w:left w:w="120" w:type="dxa"/>
+              <w:right w:w="120" w:type="dxa"/>
+            </w:tcMar>
+          </w:tcPr>
+          <w:p>
+            <w:r>
+              <w:rPr>
+                <w:rFonts w:ascii="Arial" w:hAnsi="Arial"/>
+                <w:color w:val="0F172A"/>
+                <w:sz w:val="17"/>
+              </w:rPr>
+              <w:t>30 Days • Joystick, Teleport, 100% IV Checker, Auto-Walk</w:t>
             </w:r>
           </w:p>
         </w:tc>
@@ -625,7 +594,7 @@
       <w:tr>
         <w:tc>
           <w:tcPr>
-            <w:tcW w:type="dxa" w:w="1728"/>
+            <w:tcW w:type="dxa" w:w="1872"/>
             <w:shd w:fill="FFFFFF"/>
             <w:tcMar>
               <w:top w:w="80" w:type="dxa"/>
@@ -635,9 +604,6 @@
             </w:tcMar>
           </w:tcPr>
           <w:p>
-            <w:pPr>
-              <w:spacing w:before="0" w:after="0" w:line="264" w:lineRule="auto"/>
-            </w:pPr>
             <w:r>
               <w:rPr>
                 <w:rFonts w:ascii="Arial" w:hAnsi="Arial"/>
@@ -650,7 +616,7 @@
         </w:tc>
         <w:tc>
           <w:tcPr>
-            <w:tcW w:type="dxa" w:w="1296"/>
+            <w:tcW w:type="dxa" w:w="1872"/>
             <w:shd w:fill="FFFFFF"/>
             <w:tcMar>
               <w:top w:w="80" w:type="dxa"/>
@@ -660,9 +626,6 @@
             </w:tcMar>
           </w:tcPr>
           <w:p>
-            <w:pPr>
-              <w:spacing w:before="0" w:after="0" w:line="264" w:lineRule="auto"/>
-            </w:pPr>
             <w:r>
               <w:rPr>
                 <w:rFonts w:ascii="Arial" w:hAnsi="Arial"/>
@@ -670,56 +633,6 @@
                 <w:sz w:val="17"/>
               </w:rPr>
               <w:t>2 Android Devices</w:t>
-            </w:r>
-          </w:p>
-        </w:tc>
-        <w:tc>
-          <w:tcPr>
-            <w:tcW w:type="dxa" w:w="1440"/>
-            <w:shd w:fill="FFFFFF"/>
-            <w:tcMar>
-              <w:top w:w="80" w:type="dxa"/>
-              <w:bottom w:w="80" w:type="dxa"/>
-              <w:left w:w="120" w:type="dxa"/>
-              <w:right w:w="120" w:type="dxa"/>
-            </w:tcMar>
-          </w:tcPr>
-          <w:p>
-            <w:pPr>
-              <w:spacing w:before="0" w:after="0" w:line="264" w:lineRule="auto"/>
-            </w:pPr>
-            <w:r>
-              <w:rPr>
-                <w:rFonts w:ascii="Arial" w:hAnsi="Arial"/>
-                <w:color w:val="0F172A"/>
-                <w:sz w:val="17"/>
-              </w:rPr>
-              <w:t>₹300 (was ₹320)</w:t>
-            </w:r>
-          </w:p>
-        </w:tc>
-        <w:tc>
-          <w:tcPr>
-            <w:tcW w:type="dxa" w:w="1440"/>
-            <w:shd w:fill="FFFFFF"/>
-            <w:tcMar>
-              <w:top w:w="80" w:type="dxa"/>
-              <w:bottom w:w="80" w:type="dxa"/>
-              <w:left w:w="120" w:type="dxa"/>
-              <w:right w:w="120" w:type="dxa"/>
-            </w:tcMar>
-          </w:tcPr>
-          <w:p>
-            <w:pPr>
-              <w:spacing w:before="0" w:after="0" w:line="264" w:lineRule="auto"/>
-            </w:pPr>
-            <w:r>
-              <w:rPr>
-                <w:rFonts w:ascii="Arial" w:hAnsi="Arial"/>
-                <w:color w:val="0F172A"/>
-                <w:sz w:val="17"/>
-              </w:rPr>
-              <w:t>$3.60 (was $4.00)</w:t>
             </w:r>
           </w:p>
         </w:tc>
@@ -735,22 +648,19 @@
             </w:tcMar>
           </w:tcPr>
           <w:p>
-            <w:pPr>
-              <w:spacing w:before="0" w:after="0" w:line="264" w:lineRule="auto"/>
-            </w:pPr>
             <w:r>
               <w:rPr>
                 <w:rFonts w:ascii="Arial" w:hAnsi="Arial"/>
                 <w:color w:val="0F172A"/>
                 <w:sz w:val="17"/>
               </w:rPr>
-              <w:t>₹270 (₹30 OFF)</w:t>
+              <w:t>₹300 (was ₹320)</w:t>
             </w:r>
           </w:p>
         </w:tc>
         <w:tc>
           <w:tcPr>
-            <w:tcW w:type="dxa" w:w="1872"/>
+            <w:tcW w:type="dxa" w:w="1584"/>
             <w:shd w:fill="FFFFFF"/>
             <w:tcMar>
               <w:top w:w="80" w:type="dxa"/>
@@ -760,16 +670,35 @@
             </w:tcMar>
           </w:tcPr>
           <w:p>
-            <w:pPr>
-              <w:spacing w:before="0" w:after="0" w:line="264" w:lineRule="auto"/>
-            </w:pPr>
             <w:r>
               <w:rPr>
                 <w:rFonts w:ascii="Arial" w:hAnsi="Arial"/>
                 <w:color w:val="0F172A"/>
                 <w:sz w:val="17"/>
               </w:rPr>
-              <w:t>$3.10 ($0.50 OFF)</w:t>
+              <w:t>$3.60 (was $4.00)</w:t>
+            </w:r>
+          </w:p>
+        </w:tc>
+        <w:tc>
+          <w:tcPr>
+            <w:tcW w:type="dxa" w:w="2448"/>
+            <w:shd w:fill="FFFFFF"/>
+            <w:tcMar>
+              <w:top w:w="80" w:type="dxa"/>
+              <w:bottom w:w="80" w:type="dxa"/>
+              <w:left w:w="120" w:type="dxa"/>
+              <w:right w:w="120" w:type="dxa"/>
+            </w:tcMar>
+          </w:tcPr>
+          <w:p>
+            <w:r>
+              <w:rPr>
+                <w:rFonts w:ascii="Arial" w:hAnsi="Arial"/>
+                <w:color w:val="0F172A"/>
+                <w:sz w:val="17"/>
+              </w:rPr>
+              <w:t>30 Days • 2 Concurrent Device Slots, Priority Support</w:t>
             </w:r>
           </w:p>
         </w:tc>
@@ -777,15 +706,30 @@
     </w:tbl>
     <w:p>
       <w:pPr>
-        <w:spacing w:before="0" w:after="120" w:line="276" w:lineRule="auto"/>
+        <w:spacing w:after="160"/>
+      </w:pPr>
+    </w:p>
+    <w:p>
+      <w:pPr>
+        <w:pStyle w:val="ListBullet"/>
+        <w:spacing w:after="60" w:line="276" w:lineRule="auto"/>
       </w:pPr>
       <w:r>
         <w:rPr>
           <w:rFonts w:ascii="Arial" w:hAnsi="Arial"/>
+          <w:b/>
           <w:color w:val="0F172A"/>
-          <w:sz w:val="20"/>
+          <w:sz w:val="19"/>
         </w:rPr>
-        <w:t>Approximate Duration (~30 Days): To accommodate slight upstream Patreon key variances (rare 28-29 day cycles), all public copy explicitly denotes '~30 Days', preventing disputes while maintaining customer satisfaction.</w:t>
+        <w:t xml:space="preserve">Key Allocation Policies &amp; Dedicated Vault Control: </w:t>
+      </w:r>
+      <w:r>
+        <w:rPr>
+          <w:rFonts w:ascii="Arial" w:hAnsi="Arial"/>
+          <w:color w:val="0F172A"/>
+          <w:sz w:val="19"/>
+        </w:rPr>
+        <w:t>The uploader in /admin provides flexible slot allocation policies: 1 Device Dedicated (1 Key = 1 Customer, retired immediately upon sale, never shared), 2 Devices (Duo tier), or 3 Devices (Patreon shared across 3 buyers).</w:t>
       </w:r>
     </w:p>
     <w:p>
@@ -800,116 +744,112 @@
           <w:color w:val="0E7490"/>
           <w:sz w:val="28"/>
         </w:rPr>
-        <w:t>3. Patreon 3-Device Key Slot Allocation Engine</w:t>
+        <w:t>3. Payment Rails &amp; Whole-Rupee Automated Verification</w:t>
       </w:r>
     </w:p>
     <w:p>
       <w:pPr>
-        <w:spacing w:before="0" w:after="120" w:line="276" w:lineRule="auto"/>
+        <w:spacing w:after="120" w:line="276" w:lineRule="auto"/>
       </w:pPr>
       <w:r>
         <w:rPr>
           <w:rFonts w:ascii="Arial" w:hAnsi="Arial"/>
           <w:color w:val="0F172A"/>
-          <w:sz w:val="20"/>
+          <w:sz w:val="19"/>
         </w:rPr>
-        <w:t>AETHERIA operates on official 3-device Patreon Standard Edition keys (source: 'patreon_3slot'). A single physical key authorizes up to 3 concurrent Android devices. A virtual slot bin-packing engine partitions physical keys across customer orders:</w:t>
+        <w:t>AETHERIA operates on a dual-rail payment architecture combining domestic Indian UPI with international PayPal checkouts:</w:t>
       </w:r>
     </w:p>
     <w:p>
       <w:pPr>
         <w:pStyle w:val="ListBullet"/>
-        <w:spacing w:before="0" w:after="60" w:line="276" w:lineRule="auto"/>
+        <w:spacing w:after="60" w:line="276" w:lineRule="auto"/>
       </w:pPr>
       <w:r>
         <w:rPr>
           <w:rFonts w:ascii="Arial" w:hAnsi="Arial"/>
           <w:b/>
           <w:color w:val="0F172A"/>
-          <w:sz w:val="20"/>
+          <w:sz w:val="19"/>
         </w:rPr>
-        <w:t xml:space="preserve">1 Device Plan (1 Slot): </w:t>
+        <w:t xml:space="preserve">Clean Whole-Rupee Architecture: </w:t>
       </w:r>
       <w:r>
         <w:rPr>
           <w:rFonts w:ascii="Arial" w:hAnsi="Arial"/>
-          <w:b w:val="0"/>
           <w:color w:val="0F172A"/>
-          <w:sz w:val="20"/>
+          <w:sz w:val="19"/>
         </w:rPr>
-        <w:t>Consumes 1 slot. Prioritizes partially-filled active keys (e.g. 1/3 or 2/3 filled) to maximize inventory density, leaving remaining slots available for future buyers.</w:t>
+        <w:t>Completely eliminated fractional decimal paise (e.g., .14 paise). Customers pay exact whole rupee figures (₹160 or ₹300), preventing bank payment filters (e.g. SBI, Google Pay, PhonePe) from rejecting transfers.</w:t>
       </w:r>
     </w:p>
     <w:p>
       <w:pPr>
         <w:pStyle w:val="ListBullet"/>
-        <w:spacing w:before="0" w:after="60" w:line="276" w:lineRule="auto"/>
+        <w:spacing w:after="60" w:line="276" w:lineRule="auto"/>
       </w:pPr>
       <w:r>
         <w:rPr>
           <w:rFonts w:ascii="Arial" w:hAnsi="Arial"/>
           <w:b/>
           <w:color w:val="0F172A"/>
-          <w:sz w:val="20"/>
+          <w:sz w:val="19"/>
         </w:rPr>
-        <w:t xml:space="preserve">2 Devices Plan (2 Slots): </w:t>
+        <w:t xml:space="preserve">Smart-Routing UPI VPAs: </w:t>
       </w:r>
       <w:r>
         <w:rPr>
           <w:rFonts w:ascii="Arial" w:hAnsi="Arial"/>
-          <w:b w:val="0"/>
           <w:color w:val="0F172A"/>
-          <w:sz w:val="20"/>
+          <w:sz w:val="19"/>
         </w:rPr>
-        <w:t>Consumes 2 slots. Selects keys with &gt;= 2 available slots, packing them without waste.</w:t>
+        <w:t>Direct integration with four resilient banking handles: dhruvmatliwala123@oksbi (Primary), okicici (Fastest), okaxis (High Uptime), and okhdfcbank (Reliable).</w:t>
       </w:r>
     </w:p>
     <w:p>
       <w:pPr>
         <w:pStyle w:val="ListBullet"/>
-        <w:spacing w:before="0" w:after="60" w:line="276" w:lineRule="auto"/>
+        <w:spacing w:after="60" w:line="276" w:lineRule="auto"/>
       </w:pPr>
       <w:r>
         <w:rPr>
           <w:rFonts w:ascii="Arial" w:hAnsi="Arial"/>
           <w:b/>
           <w:color w:val="0F172A"/>
-          <w:sz w:val="20"/>
+          <w:sz w:val="19"/>
         </w:rPr>
-        <w:t xml:space="preserve">Dedicated Private Key (3 Slots): </w:t>
+        <w:t xml:space="preserve">24/7 Bank SMS Bridge (/api/webhooks/upi): </w:t>
       </w:r>
       <w:r>
         <w:rPr>
           <w:rFonts w:ascii="Arial" w:hAnsi="Arial"/>
-          <w:b w:val="0"/>
           <w:color w:val="0F172A"/>
-          <w:sz w:val="20"/>
+          <w:sz w:val="19"/>
         </w:rPr>
-        <w:t>Pulls a 100% virgin untouched key (0/3 used) and immediately locks it as status: 'full'. Guarantees zero strangers can ever share the key.</w:t>
+        <w:t>Automated Android forwarder integration that parses incoming credit SMS notifications in real time. Features strict anti-fraud rules blocking personal 10-digit mobile senders and automatic suppression of sensitive 2FA/OTPs.</w:t>
       </w:r>
     </w:p>
     <w:p>
       <w:pPr>
         <w:pStyle w:val="ListBullet"/>
-        <w:spacing w:before="0" w:after="60" w:line="276" w:lineRule="auto"/>
+        <w:spacing w:after="60" w:line="276" w:lineRule="auto"/>
       </w:pPr>
       <w:r>
         <w:rPr>
           <w:rFonts w:ascii="Arial" w:hAnsi="Arial"/>
           <w:b/>
           <w:color w:val="0F172A"/>
-          <w:sz w:val="20"/>
+          <w:sz w:val="19"/>
         </w:rPr>
-        <w:t xml:space="preserve">Atomic Concurrency Lock: </w:t>
+        <w:t xml:space="preserve">International PayPal Rail: </w:t>
       </w:r>
       <w:r>
         <w:rPr>
           <w:rFonts w:ascii="Arial" w:hAnsi="Arial"/>
-          <w:b w:val="0"/>
           <w:color w:val="0F172A"/>
-          <w:sz w:val="20"/>
+          <w:sz w:val="19"/>
         </w:rPr>
-        <w:t>Firestore transactions run inside db.runTransaction with strict read-before-write validation, preventing double-allocation race conditions during high-traffic drops.</w:t>
+        <w:t>Integrated PayPal.me direct checkout with automated capture and customer vault fulfillment.</w:t>
       </w:r>
     </w:p>
     <w:p>
@@ -924,198 +864,66 @@
           <w:color w:val="0E7490"/>
           <w:sz w:val="28"/>
         </w:rPr>
-        <w:t>4. Payment Rails &amp; Whole-Rupee Verification Engine</w:t>
+        <w:t>4. Direct Key Dispatch (Manual Allocation System)</w:t>
       </w:r>
     </w:p>
     <w:p>
       <w:pPr>
-        <w:keepNext/>
-        <w:spacing w:before="240" w:after="80"/>
+        <w:spacing w:after="120" w:line="276" w:lineRule="auto"/>
+      </w:pPr>
+      <w:r>
+        <w:rPr>
+          <w:rFonts w:ascii="Arial" w:hAnsi="Arial"/>
+          <w:color w:val="0F172A"/>
+          <w:sz w:val="19"/>
+        </w:rPr>
+        <w:t>To enable the administrator to fulfill private sales directly in Telegram or Discord DMs without forcing customers through public checkout:</w:t>
+      </w:r>
+    </w:p>
+    <w:p>
+      <w:pPr>
+        <w:pStyle w:val="ListBullet"/>
+        <w:spacing w:after="60" w:line="276" w:lineRule="auto"/>
       </w:pPr>
       <w:r>
         <w:rPr>
           <w:rFonts w:ascii="Arial" w:hAnsi="Arial"/>
           <w:b/>
           <w:color w:val="0F172A"/>
-          <w:sz w:val="23"/>
+          <w:sz w:val="19"/>
         </w:rPr>
-        <w:t>4.1 Clean Whole-Rupee Architecture</w:t>
+        <w:t xml:space="preserve">Web Admin Dispatcher: </w:t>
       </w:r>
-    </w:p>
-    <w:p>
-      <w:pPr>
-        <w:spacing w:before="0" w:after="120" w:line="276" w:lineRule="auto"/>
-      </w:pPr>
       <w:r>
         <w:rPr>
           <w:rFonts w:ascii="Arial" w:hAnsi="Arial"/>
           <w:color w:val="0F172A"/>
-          <w:sz w:val="20"/>
+          <w:sz w:val="19"/>
         </w:rPr>
-        <w:t>Eradication of Decimal Paise: Fractional paise amounts (.14, .28) were completely eliminated. Customers pay exact whole rupees (₹160 or ₹300), preventing bank app rejections (Google Pay, PhonePe, Paytm, SBI) and simplifying manual entry.</w:t>
+        <w:t>Available in the admin portal under 'Direct Dispatch'. Allows 1-click allocation of 1 Slot, 2 Slots, or a 100% Dedicated Private Key (3 Slots). Decrypts the key instantly on screen, generates an official order record, and decrements vault stock.</w:t>
       </w:r>
     </w:p>
     <w:p>
       <w:pPr>
         <w:pStyle w:val="ListBullet"/>
-        <w:spacing w:before="0" w:after="60" w:line="276" w:lineRule="auto"/>
+        <w:spacing w:after="60" w:line="276" w:lineRule="auto"/>
       </w:pPr>
       <w:r>
         <w:rPr>
           <w:rFonts w:ascii="Arial" w:hAnsi="Arial"/>
           <w:b/>
           <w:color w:val="0F172A"/>
-          <w:sz w:val="20"/>
+          <w:sz w:val="19"/>
         </w:rPr>
-        <w:t xml:space="preserve">Smart-Routing UPI VPAs: </w:t>
+        <w:t xml:space="preserve">Telegram Admin Command (/givekey): </w:t>
       </w:r>
       <w:r>
         <w:rPr>
           <w:rFonts w:ascii="Arial" w:hAnsi="Arial"/>
-          <w:b w:val="0"/>
           <w:color w:val="0F172A"/>
-          <w:sz w:val="20"/>
+          <w:sz w:val="19"/>
         </w:rPr>
-        <w:t>dhruvmatliwala123@oksbi (Primary), dhruvmatliwala123@okicici, dhruvmatliwala123@okaxis, dhruvmatliwala123@okhdfcbank.</w:t>
-      </w:r>
-    </w:p>
-    <w:p>
-      <w:pPr>
-        <w:keepNext/>
-        <w:spacing w:before="240" w:after="80"/>
-      </w:pPr>
-      <w:r>
-        <w:rPr>
-          <w:rFonts w:ascii="Arial" w:hAnsi="Arial"/>
-          <w:b/>
-          <w:color w:val="0F172A"/>
-          <w:sz w:val="23"/>
-        </w:rPr>
-        <w:t>4.2 24/7 Automated Bank SMS Bridge (/api/webhooks/upi)</w:t>
-      </w:r>
-    </w:p>
-    <w:p>
-      <w:pPr>
-        <w:pStyle w:val="ListBullet"/>
-        <w:spacing w:before="0" w:after="60" w:line="276" w:lineRule="auto"/>
-      </w:pPr>
-      <w:r>
-        <w:rPr>
-          <w:rFonts w:ascii="Arial" w:hAnsi="Arial"/>
-          <w:b/>
-          <w:color w:val="0F172A"/>
-          <w:sz w:val="20"/>
-        </w:rPr>
-        <w:t xml:space="preserve">Incoming SMS Ingestion: </w:t>
-      </w:r>
-      <w:r>
-        <w:rPr>
-          <w:rFonts w:ascii="Arial" w:hAnsi="Arial"/>
-          <w:b w:val="0"/>
-          <w:color w:val="0F172A"/>
-          <w:sz w:val="20"/>
-        </w:rPr>
-        <w:t>Listens for bank credit alerts forwarded by Android SMS Forwarder apps.</w:t>
-      </w:r>
-    </w:p>
-    <w:p>
-      <w:pPr>
-        <w:pStyle w:val="ListBullet"/>
-        <w:spacing w:before="0" w:after="60" w:line="276" w:lineRule="auto"/>
-      </w:pPr>
-      <w:r>
-        <w:rPr>
-          <w:rFonts w:ascii="Arial" w:hAnsi="Arial"/>
-          <w:b/>
-          <w:color w:val="0F172A"/>
-          <w:sz w:val="20"/>
-        </w:rPr>
-        <w:t xml:space="preserve">Anti-Fraud Guard: </w:t>
-      </w:r>
-      <w:r>
-        <w:rPr>
-          <w:rFonts w:ascii="Arial" w:hAnsi="Arial"/>
-          <w:b w:val="0"/>
-          <w:color w:val="0F172A"/>
-          <w:sz w:val="20"/>
-        </w:rPr>
-        <w:t>Rejects and flags payloads originating from personal 10-digit mobile numbers.</w:t>
-      </w:r>
-    </w:p>
-    <w:p>
-      <w:pPr>
-        <w:pStyle w:val="ListBullet"/>
-        <w:spacing w:before="0" w:after="60" w:line="276" w:lineRule="auto"/>
-      </w:pPr>
-      <w:r>
-        <w:rPr>
-          <w:rFonts w:ascii="Arial" w:hAnsi="Arial"/>
-          <w:b/>
-          <w:color w:val="0F172A"/>
-          <w:sz w:val="20"/>
-        </w:rPr>
-        <w:t xml:space="preserve">Security &amp; OTP Filter: </w:t>
-      </w:r>
-      <w:r>
-        <w:rPr>
-          <w:rFonts w:ascii="Arial" w:hAnsi="Arial"/>
-          <w:b w:val="0"/>
-          <w:color w:val="0F172A"/>
-          <w:sz w:val="20"/>
-        </w:rPr>
-        <w:t>Strictly drops sensitive authentication OTPs and 2FA messages to maintain complete banking privacy.</w:t>
-      </w:r>
-    </w:p>
-    <w:p>
-      <w:pPr>
-        <w:pStyle w:val="ListBullet"/>
-        <w:spacing w:before="0" w:after="60" w:line="276" w:lineRule="auto"/>
-      </w:pPr>
-      <w:r>
-        <w:rPr>
-          <w:rFonts w:ascii="Arial" w:hAnsi="Arial"/>
-          <w:b/>
-          <w:color w:val="0F172A"/>
-          <w:sz w:val="20"/>
-        </w:rPr>
-        <w:t xml:space="preserve">Instant Dual Matching: </w:t>
-      </w:r>
-      <w:r>
-        <w:rPr>
-          <w:rFonts w:ascii="Arial" w:hAnsi="Arial"/>
-          <w:b w:val="0"/>
-          <w:color w:val="0F172A"/>
-          <w:sz w:val="20"/>
-        </w:rPr>
-        <w:t>Matches either via the 12-digit banking UTR / UPI transaction ID or whole-rupee FIFO order matching.</w:t>
-      </w:r>
-    </w:p>
-    <w:p>
-      <w:pPr>
-        <w:keepNext/>
-        <w:spacing w:before="240" w:after="80"/>
-      </w:pPr>
-      <w:r>
-        <w:rPr>
-          <w:rFonts w:ascii="Arial" w:hAnsi="Arial"/>
-          <w:b/>
-          <w:color w:val="0F172A"/>
-          <w:sz w:val="23"/>
-        </w:rPr>
-        <w:t>4.3 International PayPal Direct Rail</w:t>
-      </w:r>
-    </w:p>
-    <w:p>
-      <w:pPr>
-        <w:spacing w:before="0" w:after="120" w:line="276" w:lineRule="auto"/>
-      </w:pPr>
-      <w:r>
-        <w:rPr>
-          <w:rFonts w:ascii="Arial" w:hAnsi="Arial"/>
-          <w:color w:val="0F172A"/>
-          <w:sz w:val="20"/>
-        </w:rPr>
-        <w:t>Direct integration (/api/checkout/paypal &amp; /api/checkout/paypal/capture) with automated transaction capture and key reveal.</w:t>
+        <w:t>The owner (Telegram ID: 741838315) can execute '/givekey 1 @username', '/givekey 2 @username', or '/givekey 3' directly inside Telegram for instant mobile fulfillment.</w:t>
       </w:r>
     </w:p>
     <w:p>
@@ -1130,116 +938,89 @@
           <w:color w:val="0E7490"/>
           <w:sz w:val="28"/>
         </w:rPr>
-        <w:t>5. Direct Key Dispatch (Manual Allocation System)</w:t>
+        <w:t>5. Automated License Expiry &amp; Renewal Subsystem</w:t>
       </w:r>
     </w:p>
     <w:p>
       <w:pPr>
-        <w:spacing w:before="0" w:after="120" w:line="276" w:lineRule="auto"/>
+        <w:spacing w:after="120" w:line="276" w:lineRule="auto"/>
       </w:pPr>
       <w:r>
         <w:rPr>
           <w:rFonts w:ascii="Arial" w:hAnsi="Arial"/>
           <w:color w:val="0F172A"/>
-          <w:sz w:val="20"/>
+          <w:sz w:val="19"/>
         </w:rPr>
-        <w:t>Direct Key Dispatch in /admin empowers administrators to fulfill off-platform sales (e.g. Telegram/Discord DMs, cash/direct UPI):</w:t>
+        <w:t>To maximize customer retention and lifetime value (LTV), an automated reminder engine tracks order lifecycles:</w:t>
       </w:r>
     </w:p>
     <w:p>
       <w:pPr>
         <w:pStyle w:val="ListBullet"/>
-        <w:spacing w:before="0" w:after="60" w:line="276" w:lineRule="auto"/>
+        <w:spacing w:after="60" w:line="276" w:lineRule="auto"/>
       </w:pPr>
       <w:r>
         <w:rPr>
           <w:rFonts w:ascii="Arial" w:hAnsi="Arial"/>
           <w:b/>
           <w:color w:val="0F172A"/>
-          <w:sz w:val="20"/>
+          <w:sz w:val="19"/>
         </w:rPr>
-        <w:t xml:space="preserve">Inventory Reservation: </w:t>
+        <w:t xml:space="preserve">Automated Cron (/api/cron/expiry-reminders): </w:t>
       </w:r>
       <w:r>
         <w:rPr>
           <w:rFonts w:ascii="Arial" w:hAnsi="Arial"/>
-          <w:b w:val="0"/>
           <w:color w:val="0F172A"/>
-          <w:sz w:val="20"/>
+          <w:sz w:val="19"/>
         </w:rPr>
-        <w:t>Instantly reserves 1, 2, or 3 slots atomically in Firestore, preventing website buyers from receiving the same slot.</w:t>
+        <w:t>Scans active orders nearing the 30-day mark (specifically 48 hours before license expiration).</w:t>
       </w:r>
     </w:p>
     <w:p>
       <w:pPr>
         <w:pStyle w:val="ListBullet"/>
-        <w:spacing w:before="0" w:after="60" w:line="276" w:lineRule="auto"/>
+        <w:spacing w:after="60" w:line="276" w:lineRule="auto"/>
       </w:pPr>
       <w:r>
         <w:rPr>
           <w:rFonts w:ascii="Arial" w:hAnsi="Arial"/>
           <w:b/>
           <w:color w:val="0F172A"/>
-          <w:sz w:val="20"/>
+          <w:sz w:val="19"/>
         </w:rPr>
-        <w:t xml:space="preserve">Record Keeping: </w:t>
+        <w:t xml:space="preserve">Direct Customer Notification: </w:t>
       </w:r>
       <w:r>
         <w:rPr>
           <w:rFonts w:ascii="Arial" w:hAnsi="Arial"/>
-          <w:b w:val="0"/>
           <w:color w:val="0F172A"/>
-          <w:sz w:val="20"/>
+          <w:sz w:val="19"/>
         </w:rPr>
-        <w:t>Stores recipient handle (@sleekfx3, email) and admin notes in the order ledger for auditability.</w:t>
+        <w:t>Dispatches renewal reminders to Telegram buyers with 1-click renewal links and priority renewal instructions.</w:t>
       </w:r>
     </w:p>
     <w:p>
       <w:pPr>
         <w:pStyle w:val="ListBullet"/>
-        <w:spacing w:before="0" w:after="60" w:line="276" w:lineRule="auto"/>
+        <w:spacing w:after="60" w:line="276" w:lineRule="auto"/>
       </w:pPr>
       <w:r>
         <w:rPr>
           <w:rFonts w:ascii="Arial" w:hAnsi="Arial"/>
           <w:b/>
           <w:color w:val="0F172A"/>
-          <w:sz w:val="20"/>
+          <w:sz w:val="19"/>
         </w:rPr>
-        <w:t xml:space="preserve">Instant Fulfillment Screen: </w:t>
+        <w:t xml:space="preserve">Admin 1-Click Trigger: </w:t>
       </w:r>
       <w:r>
         <w:rPr>
           <w:rFonts w:ascii="Arial" w:hAnsi="Arial"/>
-          <w:b w:val="0"/>
           <w:color w:val="0F172A"/>
-          <w:sz w:val="20"/>
+          <w:sz w:val="19"/>
         </w:rPr>
-        <w:t>Decrypts and displays the license key code and customer fulfillment link with 1-click 'Copy' buttons so the admin can paste them directly into customer DMs.</w:t>
-      </w:r>
-    </w:p>
-    <w:p>
-      <w:pPr>
-        <w:pStyle w:val="ListBullet"/>
-        <w:spacing w:before="0" w:after="60" w:line="276" w:lineRule="auto"/>
-      </w:pPr>
-      <w:r>
-        <w:rPr>
-          <w:rFonts w:ascii="Arial" w:hAnsi="Arial"/>
-          <w:b/>
-          <w:color w:val="0F172A"/>
-          <w:sz w:val="20"/>
-        </w:rPr>
-        <w:t xml:space="preserve">Telegram /givekey Command: </w:t>
-      </w:r>
-      <w:r>
-        <w:rPr>
-          <w:rFonts w:ascii="Arial" w:hAnsi="Arial"/>
-          <w:b w:val="0"/>
-          <w:color w:val="0F172A"/>
-          <w:sz w:val="20"/>
-        </w:rPr>
-        <w:t>Superadmin (ID: 741838315) can dispatch keys directly via mobile using /givekey 1 @customer.</w:t>
+        <w:t>Integrated 'RUN REMINDERS' button in the Admin Portal header enables instant on-demand scanning with live toast statistics.</w:t>
       </w:r>
     </w:p>
     <w:p>
@@ -1254,231 +1035,112 @@
           <w:color w:val="0E7490"/>
           <w:sz w:val="28"/>
         </w:rPr>
-        <w:t>6. Direct Gmail SMTP Delivery &amp; Automated Restock Waitlist</w:t>
+        <w:t>6. Discord Live Buyer Radar (discord-key-notifier)</w:t>
       </w:r>
     </w:p>
     <w:p>
       <w:pPr>
-        <w:keepNext/>
-        <w:spacing w:before="240" w:after="80"/>
+        <w:spacing w:after="120" w:line="276" w:lineRule="auto"/>
+      </w:pPr>
+      <w:r>
+        <w:rPr>
+          <w:rFonts w:ascii="Arial" w:hAnsi="Arial"/>
+          <w:color w:val="0F172A"/>
+          <w:sz w:val="19"/>
+        </w:rPr>
+        <w:t>A dedicated standalone Node.js microservice (located in /discord-key-notifier) operating independently from website serverless limitations:</w:t>
+      </w:r>
+    </w:p>
+    <w:p>
+      <w:pPr>
+        <w:pStyle w:val="ListBullet"/>
+        <w:spacing w:after="60" w:line="276" w:lineRule="auto"/>
       </w:pPr>
       <w:r>
         <w:rPr>
           <w:rFonts w:ascii="Arial" w:hAnsi="Arial"/>
           <w:b/>
           <w:color w:val="0F172A"/>
-          <w:sz w:val="23"/>
+          <w:sz w:val="19"/>
         </w:rPr>
-        <w:t>6.1 Direct Gmail SMTP Integration (Nodemailer)</w:t>
+        <w:t xml:space="preserve">Direct WebSocket Gateway: </w:t>
       </w:r>
-    </w:p>
-    <w:p>
-      <w:pPr>
-        <w:spacing w:before="0" w:after="120" w:line="276" w:lineRule="auto"/>
-      </w:pPr>
       <w:r>
         <w:rPr>
           <w:rFonts w:ascii="Arial" w:hAnsi="Arial"/>
           <w:color w:val="0F172A"/>
-          <w:sz w:val="20"/>
+          <w:sz w:val="19"/>
         </w:rPr>
-        <w:t>To bypass third-party transactional email sandbox restrictions (e.g. Resend's onboarding@resend.dev limit of only emailing the account owner) without requiring a custom domain, AETHERIA integrates authenticated Gmail SMTP via Nodemailer:</w:t>
+        <w:t>Maintains a persistent authenticated WebSocket connection to Discord's live gateway, bypassing Cloudflare anti-bot blocks.</w:t>
       </w:r>
     </w:p>
     <w:p>
       <w:pPr>
         <w:pStyle w:val="ListBullet"/>
-        <w:spacing w:before="0" w:after="60" w:line="276" w:lineRule="auto"/>
+        <w:spacing w:after="60" w:line="276" w:lineRule="auto"/>
       </w:pPr>
       <w:r>
         <w:rPr>
           <w:rFonts w:ascii="Arial" w:hAnsi="Arial"/>
           <w:b/>
           <w:color w:val="0F172A"/>
-          <w:sz w:val="20"/>
+          <w:sz w:val="19"/>
         </w:rPr>
-        <w:t xml:space="preserve">Zero Domain Overhead: </w:t>
+        <w:t xml:space="preserve">23-Channel Active Surveillance: </w:t>
       </w:r>
       <w:r>
         <w:rPr>
           <w:rFonts w:ascii="Arial" w:hAnsi="Arial"/>
-          <w:b w:val="0"/>
           <w:color w:val="0F172A"/>
-          <w:sz w:val="20"/>
+          <w:sz w:val="19"/>
         </w:rPr>
-        <w:t>Authenticated via Google 16-character App Password (GMAIL_USER &amp; GMAIL_APP_PASSWORD). Sends directly from dhruvmatliwala336@gmail.com to any customer email (Gmail, Yahoo, Outlook, etc.).</w:t>
+        <w:t>Monitors 23 premier Pokemon GO spoofing, trading, and gaming Discord channels simultaneously.</w:t>
       </w:r>
     </w:p>
     <w:p>
       <w:pPr>
         <w:pStyle w:val="ListBullet"/>
-        <w:spacing w:before="0" w:after="60" w:line="276" w:lineRule="auto"/>
+        <w:spacing w:after="60" w:line="276" w:lineRule="auto"/>
       </w:pPr>
       <w:r>
         <w:rPr>
           <w:rFonts w:ascii="Arial" w:hAnsi="Arial"/>
           <w:b/>
           <w:color w:val="0F172A"/>
-          <w:sz w:val="20"/>
+          <w:sz w:val="19"/>
         </w:rPr>
-        <w:t xml:space="preserve">Storefront Display Name: </w:t>
+        <w:t xml:space="preserve">Regex Keyword Matching: </w:t>
       </w:r>
       <w:r>
         <w:rPr>
           <w:rFonts w:ascii="Arial" w:hAnsi="Arial"/>
-          <w:b w:val="0"/>
           <w:color w:val="0F172A"/>
-          <w:sz w:val="20"/>
+          <w:sz w:val="19"/>
         </w:rPr>
-        <w:t>Emails display 'Aetheria Store' as the sender title in inboxes, with customer replies routing directly to the admin's Gmail.</w:t>
+        <w:t>Detects high-intent keywords ('key', 'buy key', 'pgsharp key', 'wtb', 'need key') and instantly formats rich alerts.</w:t>
       </w:r>
     </w:p>
     <w:p>
       <w:pPr>
         <w:pStyle w:val="ListBullet"/>
-        <w:spacing w:before="0" w:after="60" w:line="276" w:lineRule="auto"/>
+        <w:spacing w:after="60" w:line="276" w:lineRule="auto"/>
       </w:pPr>
       <w:r>
         <w:rPr>
           <w:rFonts w:ascii="Arial" w:hAnsi="Arial"/>
           <w:b/>
           <w:color w:val="0F172A"/>
-          <w:sz w:val="20"/>
+          <w:sz w:val="19"/>
         </w:rPr>
-        <w:t xml:space="preserve">Unified Dispatcher (resend.ts): </w:t>
+        <w:t xml:space="preserve">Telegram Mobile Alerts: </w:t>
       </w:r>
       <w:r>
         <w:rPr>
           <w:rFonts w:ascii="Arial" w:hAnsi="Arial"/>
-          <w:b w:val="0"/>
           <w:color w:val="0F172A"/>
-          <w:sz w:val="20"/>
+          <w:sz w:val="19"/>
         </w:rPr>
-        <w:t>Prioritizes Gmail SMTP; automatically falls back to Resend API if Gmail credentials are absent.</w:t>
-      </w:r>
-    </w:p>
-    <w:p>
-      <w:pPr>
-        <w:pStyle w:val="ListBullet"/>
-        <w:spacing w:before="0" w:after="60" w:line="276" w:lineRule="auto"/>
-      </w:pPr>
-      <w:r>
-        <w:rPr>
-          <w:rFonts w:ascii="Arial" w:hAnsi="Arial"/>
-          <w:b/>
-          <w:color w:val="0F172A"/>
-          <w:sz w:val="20"/>
-        </w:rPr>
-        <w:t xml:space="preserve">Customer Email Types: </w:t>
-      </w:r>
-      <w:r>
-        <w:rPr>
-          <w:rFonts w:ascii="Arial" w:hAnsi="Arial"/>
-          <w:b w:val="0"/>
-          <w:color w:val="0F172A"/>
-          <w:sz w:val="20"/>
-        </w:rPr>
-        <w:t>Powers License Key Delivery, 48-Hour Expiry Reminders, and Automated Restock Waitlist Alerts.</w:t>
-      </w:r>
-    </w:p>
-    <w:p>
-      <w:pPr>
-        <w:keepNext/>
-        <w:spacing w:before="240" w:after="80"/>
-      </w:pPr>
-      <w:r>
-        <w:rPr>
-          <w:rFonts w:ascii="Arial" w:hAnsi="Arial"/>
-          <w:b/>
-          <w:color w:val="0F172A"/>
-          <w:sz w:val="23"/>
-        </w:rPr>
-        <w:t>6.2 Automated Restock Waitlist Notification System</w:t>
-      </w:r>
-    </w:p>
-    <w:p>
-      <w:pPr>
-        <w:spacing w:before="0" w:after="120" w:line="276" w:lineRule="auto"/>
-      </w:pPr>
-      <w:r>
-        <w:rPr>
-          <w:rFonts w:ascii="Arial" w:hAnsi="Arial"/>
-          <w:color w:val="0F172A"/>
-          <w:sz w:val="20"/>
-        </w:rPr>
-        <w:t>When a plan is sold out, storefront visitors can enter their email on the Restock Notification modal. Stored in the 'restock_requests' collection:</w:t>
-      </w:r>
-    </w:p>
-    <w:p>
-      <w:pPr>
-        <w:pStyle w:val="ListBullet"/>
-        <w:spacing w:before="0" w:after="60" w:line="276" w:lineRule="auto"/>
-      </w:pPr>
-      <w:r>
-        <w:rPr>
-          <w:rFonts w:ascii="Arial" w:hAnsi="Arial"/>
-          <w:b/>
-          <w:color w:val="0F172A"/>
-          <w:sz w:val="20"/>
-        </w:rPr>
-        <w:t xml:space="preserve">Automated Key Upload Trigger: </w:t>
-      </w:r>
-      <w:r>
-        <w:rPr>
-          <w:rFonts w:ascii="Arial" w:hAnsi="Arial"/>
-          <w:b w:val="0"/>
-          <w:color w:val="0F172A"/>
-          <w:sz w:val="20"/>
-        </w:rPr>
-        <w:t>When keys are uploaded in /admin, the server automatically queries pending waitlist requests for that plan and dispatches branded restock alert emails in the background.</w:t>
-      </w:r>
-    </w:p>
-    <w:p>
-      <w:pPr>
-        <w:pStyle w:val="ListBullet"/>
-        <w:spacing w:before="0" w:after="60" w:line="276" w:lineRule="auto"/>
-      </w:pPr>
-      <w:r>
-        <w:rPr>
-          <w:rFonts w:ascii="Arial" w:hAnsi="Arial"/>
-          <w:b/>
-          <w:color w:val="0F172A"/>
-          <w:sz w:val="20"/>
-        </w:rPr>
-        <w:t xml:space="preserve">One-Click Admin Blast Button: </w:t>
-      </w:r>
-      <w:r>
-        <w:rPr>
-          <w:rFonts w:ascii="Arial" w:hAnsi="Arial"/>
-          <w:b w:val="0"/>
-          <w:color w:val="0F172A"/>
-          <w:sz w:val="20"/>
-        </w:rPr>
-        <w:t>WaitlistWidget in /admin features an interactive '[ 📧 Notify All Waiting (X) ]' button with confirmation dialog and live progress feedback, backed by POST /api/admin/waitlist/notify.</w:t>
-      </w:r>
-    </w:p>
-    <w:p>
-      <w:pPr>
-        <w:pStyle w:val="ListBullet"/>
-        <w:spacing w:before="0" w:after="60" w:line="276" w:lineRule="auto"/>
-      </w:pPr>
-      <w:r>
-        <w:rPr>
-          <w:rFonts w:ascii="Arial" w:hAnsi="Arial"/>
-          <w:b/>
-          <w:color w:val="0F172A"/>
-          <w:sz w:val="20"/>
-        </w:rPr>
-        <w:t xml:space="preserve">Automatic De-duplication: </w:t>
-      </w:r>
-      <w:r>
-        <w:rPr>
-          <w:rFonts w:ascii="Arial" w:hAnsi="Arial"/>
-          <w:b w:val="0"/>
-          <w:color w:val="0F172A"/>
-          <w:sz w:val="20"/>
-        </w:rPr>
-        <w:t>Successfully notified recipients are immediately cleared from Firestore to prevent duplicate or spam emails.</w:t>
+        <w:t>Pushes real-time alerts to the owner's Telegram with user details, matched message snippets, and 1-click 'Open in Discord' jump buttons.</w:t>
       </w:r>
     </w:p>
     <w:p>
@@ -1493,13 +1155,141 @@
           <w:color w:val="0E7490"/>
           <w:sz w:val="28"/>
         </w:rPr>
-        <w:t>7. Telegram Bot Engine &amp; Progressive Disclosure UPI Flow</w:t>
+        <w:t>7. Telegram Bot, Restock Alerts &amp; Dedicated Vouches Architecture</w:t>
+      </w:r>
+    </w:p>
+    <w:p>
+      <w:pPr>
+        <w:spacing w:after="120" w:line="276" w:lineRule="auto"/>
+      </w:pPr>
+      <w:r>
+        <w:rPr>
+          <w:rFonts w:ascii="Arial" w:hAnsi="Arial"/>
+          <w:color w:val="0F172A"/>
+          <w:sz w:val="19"/>
+        </w:rPr>
+        <w:t>The public Telegram infrastructure operates with a clean separation between high-level community announcements and verified transaction proofs:</w:t>
+      </w:r>
+    </w:p>
+    <w:p>
+      <w:pPr>
+        <w:pStyle w:val="ListBullet"/>
+        <w:spacing w:after="60" w:line="276" w:lineRule="auto"/>
+      </w:pPr>
+      <w:r>
+        <w:rPr>
+          <w:rFonts w:ascii="Arial" w:hAnsi="Arial"/>
+          <w:b/>
+          <w:color w:val="0F172A"/>
+          <w:sz w:val="19"/>
+        </w:rPr>
+        <w:t xml:space="preserve">Streamlined Restock Flash Alerts: </w:t>
+      </w:r>
+      <w:r>
+        <w:rPr>
+          <w:rFonts w:ascii="Arial" w:hAnsi="Arial"/>
+          <w:color w:val="0F172A"/>
+          <w:sz w:val="19"/>
+        </w:rPr>
+        <w:t>Whenever keys are uploaded, broadcastRestockAlert posts a punchy, high-urgency announcement in @AetheriaStoreOfficial: '⚡ KEYS ARE BACK IN STOCK! 📦 Fresh 30-Day keys just loaded into the vault. Grab yours before this batch runs out! 🚀'</w:t>
+      </w:r>
+    </w:p>
+    <w:p>
+      <w:pPr>
+        <w:pStyle w:val="ListBullet"/>
+        <w:spacing w:after="60" w:line="276" w:lineRule="auto"/>
+      </w:pPr>
+      <w:r>
+        <w:rPr>
+          <w:rFonts w:ascii="Arial" w:hAnsi="Arial"/>
+          <w:b/>
+          <w:color w:val="0F172A"/>
+          <w:sz w:val="19"/>
+        </w:rPr>
+        <w:t xml:space="preserve">Intentional Price-Free Copy: </w:t>
+      </w:r>
+      <w:r>
+        <w:rPr>
+          <w:rFonts w:ascii="Arial" w:hAnsi="Arial"/>
+          <w:color w:val="0F172A"/>
+          <w:sz w:val="19"/>
+        </w:rPr>
+        <w:t>Pricing figures were intentionally eliminated from restock alert posts to prevent clutter and ensure announcements never become outdated if store pricing evolves.</w:t>
+      </w:r>
+    </w:p>
+    <w:p>
+      <w:pPr>
+        <w:pStyle w:val="ListBullet"/>
+        <w:spacing w:after="60" w:line="276" w:lineRule="auto"/>
+      </w:pPr>
+      <w:r>
+        <w:rPr>
+          <w:rFonts w:ascii="Arial" w:hAnsi="Arial"/>
+          <w:b/>
+          <w:color w:val="0F172A"/>
+          <w:sz w:val="19"/>
+        </w:rPr>
+        <w:t xml:space="preserve">1-Tap Conversion CTA: </w:t>
+      </w:r>
+      <w:r>
+        <w:rPr>
+          <w:rFonts w:ascii="Arial" w:hAnsi="Arial"/>
+          <w:color w:val="0F172A"/>
+          <w:sz w:val="19"/>
+        </w:rPr>
+        <w:t>Includes an interactive inline button linking directly to 'https://t.me/AetheriaStoreOfficialBot?start=restock', taking customers straight into checkout with 0 friction.</w:t>
+      </w:r>
+    </w:p>
+    <w:p>
+      <w:pPr>
+        <w:pStyle w:val="ListBullet"/>
+        <w:spacing w:after="60" w:line="276" w:lineRule="auto"/>
+      </w:pPr>
+      <w:r>
+        <w:rPr>
+          <w:rFonts w:ascii="Arial" w:hAnsi="Arial"/>
+          <w:b/>
+          <w:color w:val="0F172A"/>
+          <w:sz w:val="19"/>
+        </w:rPr>
+        <w:t xml:space="preserve">Clean Main Channel Policy: </w:t>
+      </w:r>
+      <w:r>
+        <w:rPr>
+          <w:rFonts w:ascii="Arial" w:hAnsi="Arial"/>
+          <w:color w:val="0F172A"/>
+          <w:sz w:val="19"/>
+        </w:rPr>
+        <w:t>Automated 'ORDER COMPLETED' bot messages upon key purchase were decommissioned from the main channel to eliminate spam and keep announcements pristine.</w:t>
+      </w:r>
+    </w:p>
+    <w:p>
+      <w:pPr>
+        <w:pStyle w:val="ListBullet"/>
+        <w:spacing w:after="60" w:line="276" w:lineRule="auto"/>
+      </w:pPr>
+      <w:r>
+        <w:rPr>
+          <w:rFonts w:ascii="Arial" w:hAnsi="Arial"/>
+          <w:b/>
+          <w:color w:val="0F172A"/>
+          <w:sz w:val="19"/>
+        </w:rPr>
+        <w:t xml:space="preserve">Dedicated Customer Vouches Channel (@AetheriaStoreVouches): </w:t>
+      </w:r>
+      <w:r>
+        <w:rPr>
+          <w:rFonts w:ascii="Arial" w:hAnsi="Arial"/>
+          <w:color w:val="0F172A"/>
+          <w:sz w:val="19"/>
+        </w:rPr>
+        <w:t>Real customer proof screenshots (UPI bank transactions, PayPal payments, Discord customer chats, and in-game PGSharp 'Settings / Deactivate' activation screens) are curated in a dedicated channel with sensitive license keys and personal data redacted.</w:t>
       </w:r>
     </w:p>
     <w:p>
       <w:pPr>
         <w:keepNext/>
-        <w:spacing w:before="240" w:after="80"/>
+        <w:spacing w:before="220" w:after="80"/>
       </w:pPr>
       <w:r>
         <w:rPr>
@@ -1508,122 +1298,141 @@
           <w:color w:val="0F172A"/>
           <w:sz w:val="23"/>
         </w:rPr>
-        <w:t>7.1 Minimal 4-Line QR Screen &amp; Delivery Expectation</w:t>
+        <w:t>7.1 Viral Telegram Referral &amp; Reward Engine ('Refer &amp; Earn')</w:t>
       </w:r>
     </w:p>
     <w:p>
       <w:pPr>
-        <w:spacing w:before="0" w:after="120" w:line="276" w:lineRule="auto"/>
+        <w:spacing w:after="120" w:line="276" w:lineRule="auto"/>
       </w:pPr>
       <w:r>
         <w:rPr>
           <w:rFonts w:ascii="Arial" w:hAnsi="Arial"/>
           <w:color w:val="0F172A"/>
-          <w:sz w:val="20"/>
+          <w:sz w:val="19"/>
         </w:rPr>
-        <w:t>To eliminate text fatigue, hesitation, and customer intimidation during Telegram checkouts, the initial QR payment card was streamlined to 4 lines:</w:t>
+        <w:t>The bot features a self-sustaining viral growth loop designed for zero checkout friction:</w:t>
       </w:r>
     </w:p>
     <w:p>
       <w:pPr>
         <w:pStyle w:val="ListBullet"/>
-        <w:spacing w:before="0" w:after="60" w:line="276" w:lineRule="auto"/>
+        <w:spacing w:after="60" w:line="276" w:lineRule="auto"/>
       </w:pPr>
       <w:r>
         <w:rPr>
           <w:rFonts w:ascii="Arial" w:hAnsi="Arial"/>
           <w:b/>
           <w:color w:val="0F172A"/>
-          <w:sz w:val="20"/>
+          <w:sz w:val="19"/>
         </w:rPr>
-        <w:t xml:space="preserve">Clean Card Copy: </w:t>
+        <w:t xml:space="preserve">Personal Tracking Links: </w:t>
       </w:r>
       <w:r>
         <w:rPr>
           <w:rFonts w:ascii="Arial" w:hAnsi="Arial"/>
-          <w:b w:val="0"/>
           <w:color w:val="0F172A"/>
-          <w:sz w:val="20"/>
+          <w:sz w:val="19"/>
         </w:rPr>
-        <w:t>📦 PGSharp Standard (~30 Days) — ₹160 | 🔑 UPI ID: dhruvmatliwala123@oksbi | 🔖 Order ID: ord_tg_xxxx | ⚡ Scan QR or pay ₹160. Key is auto-delivered here within 1–2 minutes!</w:t>
+        <w:t>Tapping '👥 Refer &amp; Earn' provides the user with their personalized deep link ('https://t.me/AetheriaStoreOfficialBot?start=ref_&lt;chatId&gt;') alongside real-time metrics tracking clicks, paid orders, and reward coupons earned.</w:t>
       </w:r>
     </w:p>
     <w:p>
       <w:pPr>
         <w:pStyle w:val="ListBullet"/>
-        <w:spacing w:before="0" w:after="60" w:line="276" w:lineRule="auto"/>
+        <w:spacing w:after="60" w:line="276" w:lineRule="auto"/>
       </w:pPr>
       <w:r>
         <w:rPr>
           <w:rFonts w:ascii="Arial" w:hAnsi="Arial"/>
           <w:b/>
           <w:color w:val="0F172A"/>
-          <w:sz w:val="20"/>
+          <w:sz w:val="19"/>
         </w:rPr>
-        <w:t xml:space="preserve">Primary Action Button: </w:t>
+        <w:t xml:space="preserve">100% Automated Friend Discount (No Code Needed): </w:t>
       </w:r>
       <w:r>
         <w:rPr>
           <w:rFonts w:ascii="Arial" w:hAnsi="Arial"/>
-          <w:b w:val="0"/>
           <w:color w:val="0F172A"/>
-          <w:sz w:val="20"/>
+          <w:sz w:val="19"/>
         </w:rPr>
-        <w:t>[ ❓ Paid but didn't get key? ] — cleanly conceals technical instructions until requested.</w:t>
+        <w:t>When an invited friend clicks the referral link and taps Start, the bot records the referrer attribution in Firestore. The friend automatically receives ₹30 OFF their first key (₹130 for 1 Device / ₹270 for 2 Devices). No coupon entry or promo codes are required; the discount is applied directly to their checkout intent.</w:t>
       </w:r>
     </w:p>
     <w:p>
       <w:pPr>
         <w:pStyle w:val="ListBullet"/>
-        <w:spacing w:before="0" w:after="60" w:line="276" w:lineRule="auto"/>
+        <w:spacing w:after="60" w:line="276" w:lineRule="auto"/>
       </w:pPr>
       <w:r>
         <w:rPr>
           <w:rFonts w:ascii="Arial" w:hAnsi="Arial"/>
           <w:b/>
           <w:color w:val="0F172A"/>
-          <w:sz w:val="20"/>
+          <w:sz w:val="19"/>
         </w:rPr>
-        <w:t xml:space="preserve">Progressive Disclosure Fallback: </w:t>
+        <w:t xml:space="preserve">Automated Single-Use Reward Coupon Issuance: </w:t>
       </w:r>
       <w:r>
         <w:rPr>
           <w:rFonts w:ascii="Arial" w:hAnsi="Arial"/>
-          <w:b w:val="0"/>
           <w:color w:val="0F172A"/>
-          <w:sz w:val="20"/>
+          <w:sz w:val="19"/>
         </w:rPr>
-        <w:t>Tapping reveals comforting guidance: '⏳ Awaiting Bank Confirmation... Bank SMS alerts usually arrive within 1–2 minutes. 💡 If you paid and want your key right away without waiting: Send a screenshot of your Transaction Details (in Google Pay/FamPay, tap on the payment to view full details with the 12-digit UPI ID) or reply with the 12 digits directly!'</w:t>
+        <w:t>Upon completion and verification of the friend's order, an anti-fraud check verifies unique payment identifiers and generates a single-use coupon in Firestore ('REF30_XXXXXX', ₹30 / $0.50 OFF, max_uses: 1).</w:t>
       </w:r>
     </w:p>
     <w:p>
       <w:pPr>
         <w:pStyle w:val="ListBullet"/>
-        <w:spacing w:before="0" w:after="60" w:line="276" w:lineRule="auto"/>
+        <w:spacing w:after="60" w:line="276" w:lineRule="auto"/>
       </w:pPr>
       <w:r>
         <w:rPr>
           <w:rFonts w:ascii="Arial" w:hAnsi="Arial"/>
           <w:b/>
           <w:color w:val="0F172A"/>
-          <w:sz w:val="20"/>
+          <w:sz w:val="19"/>
         </w:rPr>
-        <w:t xml:space="preserve">Transaction Details vs UTR: </w:t>
+        <w:t xml:space="preserve">Direct Telegram Notification: </w:t>
       </w:r>
       <w:r>
         <w:rPr>
           <w:rFonts w:ascii="Arial" w:hAnsi="Arial"/>
-          <w:b w:val="0"/>
           <w:color w:val="0F172A"/>
-          <w:sz w:val="20"/>
+          <w:sz w:val="19"/>
         </w:rPr>
-        <w:t>Replaced obscure banking jargon ('UTR') with clear visual directions: tap the payment to view Transaction Details / 12-digit UPI ID.</w:t>
+        <w:t>The bot dispatches a private DM to the referrer with their coupon code. Referrers can stack multiple earned coupons and redeem them on future key renewals simply by sending or tapping the code in chat.</w:t>
+      </w:r>
+    </w:p>
+    <w:p>
+      <w:pPr>
+        <w:pStyle w:val="ListBullet"/>
+        <w:spacing w:after="60" w:line="276" w:lineRule="auto"/>
+      </w:pPr>
+      <w:r>
+        <w:rPr>
+          <w:rFonts w:ascii="Arial" w:hAnsi="Arial"/>
+          <w:b/>
+          <w:color w:val="0F172A"/>
+          <w:sz w:val="19"/>
+        </w:rPr>
+        <w:t xml:space="preserve">Centralized Admin Visibility &amp; Deletion: </w:t>
+      </w:r>
+      <w:r>
+        <w:rPr>
+          <w:rFonts w:ascii="Arial" w:hAnsi="Arial"/>
+          <w:color w:val="0F172A"/>
+          <w:sz w:val="19"/>
+        </w:rPr>
+        <w:t>All issued referral coupons are stored in Firestore and sync live to the Admin Coupons panel, giving the administrator real-time monitoring and 1-click permanent deletion capabilities.</w:t>
       </w:r>
     </w:p>
     <w:p>
       <w:pPr>
         <w:keepNext/>
-        <w:spacing w:before="240" w:after="80"/>
+        <w:spacing w:before="220" w:after="80"/>
       </w:pPr>
       <w:r>
         <w:rPr>
@@ -1632,142 +1441,112 @@
           <w:color w:val="0F172A"/>
           <w:sz w:val="23"/>
         </w:rPr>
-        <w:t>7.2 Viral Referral &amp; Reward Engine ('Refer &amp; Earn')</w:t>
+        <w:t>7.2 Native In-Chat UPI QR Delivery &amp; Session Reuse</w:t>
+      </w:r>
+    </w:p>
+    <w:p>
+      <w:pPr>
+        <w:spacing w:after="120" w:line="276" w:lineRule="auto"/>
+      </w:pPr>
+      <w:r>
+        <w:rPr>
+          <w:rFonts w:ascii="Arial" w:hAnsi="Arial"/>
+          <w:color w:val="0F172A"/>
+          <w:sz w:val="19"/>
+        </w:rPr>
+        <w:t>To guarantee seamless, zero-friction mobile checkouts in Telegram:</w:t>
       </w:r>
     </w:p>
     <w:p>
       <w:pPr>
         <w:pStyle w:val="ListBullet"/>
-        <w:spacing w:before="0" w:after="60" w:line="276" w:lineRule="auto"/>
+        <w:spacing w:after="60" w:line="276" w:lineRule="auto"/>
       </w:pPr>
       <w:r>
         <w:rPr>
           <w:rFonts w:ascii="Arial" w:hAnsi="Arial"/>
           <w:b/>
           <w:color w:val="0F172A"/>
-          <w:sz w:val="20"/>
+          <w:sz w:val="19"/>
         </w:rPr>
-        <w:t xml:space="preserve">Deep Tracking Links: </w:t>
+        <w:t xml:space="preserve">Dynamic Native QR Photo Delivery: </w:t>
       </w:r>
       <w:r>
         <w:rPr>
           <w:rFonts w:ascii="Arial" w:hAnsi="Arial"/>
-          <w:b w:val="0"/>
           <w:color w:val="0F172A"/>
-          <w:sz w:val="20"/>
+          <w:sz w:val="19"/>
         </w:rPr>
-        <w:t>Generates unique links (https://t.me/AetheriaStoreOfficialBot?start=ref_&lt;chatId&gt;) with real-time conversion stats.</w:t>
+        <w:t>Rather than relying on fragile 3rd-party UPI intent deep links (which often trigger bank app limits or browser blocks on mobile), the bot dynamically generates and delivers a native high-resolution QR photo PNG buffer directly inside the Telegram chat.</w:t>
       </w:r>
     </w:p>
     <w:p>
       <w:pPr>
         <w:pStyle w:val="ListBullet"/>
-        <w:spacing w:before="0" w:after="60" w:line="276" w:lineRule="auto"/>
+        <w:spacing w:after="60" w:line="276" w:lineRule="auto"/>
       </w:pPr>
       <w:r>
         <w:rPr>
           <w:rFonts w:ascii="Arial" w:hAnsi="Arial"/>
           <w:b/>
           <w:color w:val="0F172A"/>
-          <w:sz w:val="20"/>
+          <w:sz w:val="19"/>
         </w:rPr>
-        <w:t xml:space="preserve">Automated Friend Discount: </w:t>
+        <w:t xml:space="preserve">Compact Non-Redundant Card Copy: </w:t>
       </w:r>
       <w:r>
         <w:rPr>
           <w:rFonts w:ascii="Arial" w:hAnsi="Arial"/>
-          <w:b w:val="0"/>
           <w:color w:val="0F172A"/>
-          <w:sz w:val="20"/>
+          <w:sz w:val="19"/>
         </w:rPr>
-        <w:t>Referred friends automatically receive ₹30 OFF on their first purchase without entering any promo code.</w:t>
+        <w:t>Single clean card featuring UPI ID, key details, auto-delivery instructions, and 'Support' / 'Back' buttons without repetitive amount spam.</w:t>
       </w:r>
     </w:p>
     <w:p>
       <w:pPr>
         <w:pStyle w:val="ListBullet"/>
-        <w:spacing w:before="0" w:after="60" w:line="276" w:lineRule="auto"/>
+        <w:spacing w:after="60" w:line="276" w:lineRule="auto"/>
       </w:pPr>
       <w:r>
         <w:rPr>
           <w:rFonts w:ascii="Arial" w:hAnsi="Arial"/>
           <w:b/>
           <w:color w:val="0F172A"/>
-          <w:sz w:val="20"/>
+          <w:sz w:val="19"/>
         </w:rPr>
-        <w:t xml:space="preserve">Reward Coupon Issuance: </w:t>
+        <w:t xml:space="preserve">Approximate Duration (~30 Days) Notation: </w:t>
       </w:r>
       <w:r>
         <w:rPr>
           <w:rFonts w:ascii="Arial" w:hAnsi="Arial"/>
-          <w:b w:val="0"/>
           <w:color w:val="0F172A"/>
-          <w:sz w:val="20"/>
+          <w:sz w:val="19"/>
         </w:rPr>
-        <w:t>Upon friend purchase verification, referrer receives a single-use ₹30 coupon (REF30_XXXXXX) stackable on future renewals.</w:t>
+        <w:t>Acknowledges rare 28–29 day upstream vendor key duration variances to set accurate customer expectations and prevent false disputes.</w:t>
       </w:r>
     </w:p>
     <w:p>
       <w:pPr>
-        <w:keepNext/>
-        <w:spacing w:before="240" w:after="80"/>
+        <w:pStyle w:val="ListBullet"/>
+        <w:spacing w:after="60" w:line="276" w:lineRule="auto"/>
       </w:pPr>
       <w:r>
         <w:rPr>
           <w:rFonts w:ascii="Arial" w:hAnsi="Arial"/>
           <w:b/>
           <w:color w:val="0F172A"/>
-          <w:sz w:val="23"/>
+          <w:sz w:val="19"/>
         </w:rPr>
-        <w:t>7.3 Public Telegram Proof Channel (@AetheriaStoreOfficial)</w:t>
-      </w:r>
-    </w:p>
-    <w:p>
-      <w:pPr>
-        <w:pStyle w:val="ListBullet"/>
-        <w:spacing w:before="0" w:after="60" w:line="276" w:lineRule="auto"/>
-      </w:pPr>
-      <w:r>
-        <w:rPr>
-          <w:rFonts w:ascii="Arial" w:hAnsi="Arial"/>
-          <w:b/>
-          <w:color w:val="0F172A"/>
-          <w:sz w:val="20"/>
-        </w:rPr>
-        <w:t xml:space="preserve">Restock Announcements: </w:t>
+        <w:t xml:space="preserve">Pending Order Session Reuse: </w:t>
       </w:r>
       <w:r>
         <w:rPr>
           <w:rFonts w:ascii="Arial" w:hAnsi="Arial"/>
-          <w:b w:val="0"/>
           <w:color w:val="0F172A"/>
-          <w:sz w:val="20"/>
+          <w:sz w:val="19"/>
         </w:rPr>
-        <w:t>Flash restock alerts with direct bot checkout links.</w:t>
-      </w:r>
-    </w:p>
-    <w:p>
-      <w:pPr>
-        <w:pStyle w:val="ListBullet"/>
-        <w:spacing w:before="0" w:after="60" w:line="276" w:lineRule="auto"/>
-      </w:pPr>
-      <w:r>
-        <w:rPr>
-          <w:rFonts w:ascii="Arial" w:hAnsi="Arial"/>
-          <w:b/>
-          <w:color w:val="0F172A"/>
-          <w:sz w:val="20"/>
-        </w:rPr>
-        <w:t xml:space="preserve">Privacy-Masked Order Vouches: </w:t>
-      </w:r>
-      <w:r>
-        <w:rPr>
-          <w:rFonts w:ascii="Arial" w:hAnsi="Arial"/>
-          <w:b w:val="0"/>
-          <w:color w:val="0F172A"/>
-          <w:sz w:val="20"/>
-        </w:rPr>
-        <w:t>Automated social proof posts (e.g. '30-Day PGSharp Key dispatched to dh***@gmail.com') with atomic idempotency locks.</w:t>
+        <w:t>Prevents database clutter by checking for existing active pending orders for that user/chat before creating a new order. Repeated button clicks update the existing order session instead of generating duplicate abandoned rows in Firestore.</w:t>
       </w:r>
     </w:p>
     <w:p>
@@ -1782,140 +1561,204 @@
           <w:color w:val="0E7490"/>
           <w:sz w:val="28"/>
         </w:rPr>
-        <w:t>8. Sales Conversion Assets, Cooldown Guide &amp; Live Events</w:t>
+        <w:t>8. Admin Portal Architecture &amp; Clean-up</w:t>
       </w:r>
     </w:p>
     <w:p>
       <w:pPr>
-        <w:spacing w:before="0" w:after="120" w:line="276" w:lineRule="auto"/>
+        <w:spacing w:after="120" w:line="276" w:lineRule="auto"/>
       </w:pPr>
       <w:r>
         <w:rPr>
           <w:rFonts w:ascii="Arial" w:hAnsi="Arial"/>
           <w:color w:val="0F172A"/>
-          <w:sz w:val="20"/>
+          <w:sz w:val="19"/>
         </w:rPr>
-        <w:t>Direct sales enablement tooling and ban-prevention utility for the Telegram bot:</w:t>
+        <w:t>The administrative center has been thoroughly refined, optimized, and de-bloated:</w:t>
       </w:r>
     </w:p>
     <w:p>
       <w:pPr>
         <w:pStyle w:val="ListBullet"/>
-        <w:spacing w:before="0" w:after="60" w:line="276" w:lineRule="auto"/>
+        <w:spacing w:after="60" w:line="276" w:lineRule="auto"/>
       </w:pPr>
       <w:r>
         <w:rPr>
           <w:rFonts w:ascii="Arial" w:hAnsi="Arial"/>
           <w:b/>
           <w:color w:val="0F172A"/>
-          <w:sz w:val="20"/>
+          <w:sz w:val="19"/>
         </w:rPr>
-        <w:t xml:space="preserve">Free vs Standard Comparison Engine: </w:t>
+        <w:t xml:space="preserve">Decommissioned Obsolete Lead Radar: </w:t>
       </w:r>
       <w:r>
         <w:rPr>
           <w:rFonts w:ascii="Arial" w:hAnsi="Arial"/>
-          <w:b w:val="0"/>
           <w:color w:val="0F172A"/>
-          <w:sz w:val="20"/>
+          <w:sz w:val="19"/>
         </w:rPr>
-        <w:t>High-converting sales comparison matrix detailing the limitations of PGSharp Free (15-second animations, blind catches without stats, no shiny scanner, manual joystick fatigue) vs the advantages of PGSharp Standard (1-second Quick Catch, 100% IV preview, block non-shiny encounters, hands-free GPX auto-walk, instant skip cutscenes, 100% excellent throws).</w:t>
+        <w:t>Completely removed web/Reddit scrapers that were experiencing 429/403 rate limiting. Deleted over 3,000 lines of dead code, dropping the admin bundle size from 32.8 kB down to 23.9 kB.</w:t>
       </w:r>
     </w:p>
     <w:p>
       <w:pPr>
         <w:pStyle w:val="ListBullet"/>
-        <w:spacing w:before="0" w:after="60" w:line="276" w:lineRule="auto"/>
+        <w:spacing w:after="60" w:line="276" w:lineRule="auto"/>
       </w:pPr>
       <w:r>
         <w:rPr>
           <w:rFonts w:ascii="Arial" w:hAnsi="Arial"/>
           <w:b/>
           <w:color w:val="0F172A"/>
-          <w:sz w:val="20"/>
+          <w:sz w:val="19"/>
         </w:rPr>
-        <w:t xml:space="preserve">Anti-Ban Cooldown &amp; Safety Guide: </w:t>
+        <w:t xml:space="preserve">Stealth 404 Camouflage ('Ghost Admin'): </w:t>
       </w:r>
       <w:r>
         <w:rPr>
           <w:rFonts w:ascii="Arial" w:hAnsi="Arial"/>
-          <w:b w:val="0"/>
           <w:color w:val="0F172A"/>
-          <w:sz w:val="20"/>
+          <w:sz w:val="19"/>
         </w:rPr>
-        <w:t>Comprehensive reference guide with distance cooldown chart (1 km to 1,350+ km global max of 120 mins), explicit breakdown of cooldown-triggering actions (balls, berries, gym battles, spins) versus safe actions (teleporting, IV inspection, egg hatching, trading).</w:t>
+        <w:t>Anyone navigating directly to /admin without authorization is presented with a convincing, realistic 404 Page Not Found error, keeping the admin portal invisible to automated bots and scanners.</w:t>
       </w:r>
     </w:p>
     <w:p>
       <w:pPr>
         <w:pStyle w:val="ListBullet"/>
-        <w:spacing w:before="0" w:after="60" w:line="276" w:lineRule="auto"/>
+        <w:spacing w:after="60" w:line="276" w:lineRule="auto"/>
       </w:pPr>
       <w:r>
         <w:rPr>
           <w:rFonts w:ascii="Arial" w:hAnsi="Arial"/>
           <w:b/>
           <w:color w:val="0F172A"/>
-          <w:sz w:val="20"/>
+          <w:sz w:val="19"/>
         </w:rPr>
-        <w:t xml:space="preserve">Live Events Calendar (/api/pokemon/events): </w:t>
+        <w:t xml:space="preserve">Dual Unlock Vectors: </w:t>
       </w:r>
       <w:r>
         <w:rPr>
           <w:rFonts w:ascii="Arial" w:hAnsi="Arial"/>
-          <w:b w:val="0"/>
           <w:color w:val="0F172A"/>
-          <w:sz w:val="20"/>
+          <w:sz w:val="19"/>
         </w:rPr>
-        <w:t>Fetches active 5-star raids, mega raids, and spotlight hours via /events command.</w:t>
+        <w:t>Secret URL bookmark (?key=...) for 1-click device authorization with automatic address-bar cleanup, plus emergency unlock via triple-click or Ctrl+Shift+A keyboard shortcut.</w:t>
       </w:r>
     </w:p>
     <w:p>
       <w:pPr>
         <w:pStyle w:val="ListBullet"/>
-        <w:spacing w:before="0" w:after="60" w:line="276" w:lineRule="auto"/>
+        <w:spacing w:after="60" w:line="276" w:lineRule="auto"/>
       </w:pPr>
       <w:r>
         <w:rPr>
           <w:rFonts w:ascii="Arial" w:hAnsi="Arial"/>
           <w:b/>
           <w:color w:val="0F172A"/>
-          <w:sz w:val="20"/>
+          <w:sz w:val="19"/>
         </w:rPr>
-        <w:t xml:space="preserve">20-Minute De-duplication Cache: </w:t>
+        <w:t xml:space="preserve">Anti-Brute-Force Rate Limiter: </w:t>
       </w:r>
       <w:r>
         <w:rPr>
           <w:rFonts w:ascii="Arial" w:hAnsi="Arial"/>
-          <w:b w:val="0"/>
           <w:color w:val="0F172A"/>
-          <w:sz w:val="20"/>
+          <w:sz w:val="19"/>
         </w:rPr>
-        <w:t>In-memory cache prevents repeat alerts for the same spawn.</w:t>
+        <w:t>Failed passcode attempts are tracked per client IP. Reaching 5 failed attempts locks the IP out for 15 minutes with HTTP 429 Too Many Requests.</w:t>
       </w:r>
     </w:p>
     <w:p>
       <w:pPr>
         <w:pStyle w:val="ListBullet"/>
-        <w:spacing w:before="0" w:after="60" w:line="276" w:lineRule="auto"/>
+        <w:spacing w:after="60" w:line="276" w:lineRule="auto"/>
       </w:pPr>
       <w:r>
         <w:rPr>
           <w:rFonts w:ascii="Arial" w:hAnsi="Arial"/>
           <w:b/>
           <w:color w:val="0F172A"/>
-          <w:sz w:val="20"/>
+          <w:sz w:val="19"/>
         </w:rPr>
-        <w:t xml:space="preserve">1,025 Species National Pokédex: </w:t>
+        <w:t xml:space="preserve">Timing-Safe Cryptographic Verification: </w:t>
       </w:r>
       <w:r>
         <w:rPr>
           <w:rFonts w:ascii="Arial" w:hAnsi="Arial"/>
-          <w:b w:val="0"/>
           <w:color w:val="0F172A"/>
-          <w:sz w:val="20"/>
+          <w:sz w:val="19"/>
         </w:rPr>
-        <w:t>Fuzzy typo-tolerant search (Levenshtein distance) supporting natural typing ('Greyninja' -&gt; 'Greninja').</w:t>
+        <w:t>All admin operations use constant-time crypto.timingSafeEqual with SHA-256 digests.</w:t>
+      </w:r>
+    </w:p>
+    <w:p>
+      <w:pPr>
+        <w:pStyle w:val="ListBullet"/>
+        <w:spacing w:after="60" w:line="276" w:lineRule="auto"/>
+      </w:pPr>
+      <w:r>
+        <w:rPr>
+          <w:rFonts w:ascii="Arial" w:hAnsi="Arial"/>
+          <w:b/>
+          <w:color w:val="0F172A"/>
+          <w:sz w:val="19"/>
+        </w:rPr>
+        <w:t xml:space="preserve">Pending Approvals Verification Filter: </w:t>
+      </w:r>
+      <w:r>
+        <w:rPr>
+          <w:rFonts w:ascii="Arial" w:hAnsi="Arial"/>
+          <w:color w:val="0F172A"/>
+          <w:sz w:val="19"/>
+        </w:rPr>
+        <w:t>Restricted the admin pending approvals queue to strictly display orders with payment_status == 'verifying' or orders where proof/UTR was submitted, eliminating casual abandoned clicks from cluttering the queue.</w:t>
+      </w:r>
+    </w:p>
+    <w:p>
+      <w:pPr>
+        <w:pStyle w:val="ListBullet"/>
+        <w:spacing w:after="60" w:line="276" w:lineRule="auto"/>
+      </w:pPr>
+      <w:r>
+        <w:rPr>
+          <w:rFonts w:ascii="Arial" w:hAnsi="Arial"/>
+          <w:b/>
+          <w:color w:val="0F172A"/>
+          <w:sz w:val="19"/>
+        </w:rPr>
+        <w:t xml:space="preserve">Live Firestore Coupon Engine &amp; Deletion: </w:t>
+      </w:r>
+      <w:r>
+        <w:rPr>
+          <w:rFonts w:ascii="Arial" w:hAnsi="Arial"/>
+          <w:color w:val="0F172A"/>
+          <w:sz w:val="19"/>
+        </w:rPr>
+        <w:t>Completely eliminated static mock data and hardcoded coupon fallbacks (VIPDHRUV, DISCORDMEMBER). Built a real-time Firestore synchronization engine with an interactive [ Delete ] button, live creation modal, and empty-state notifications.</w:t>
+      </w:r>
+    </w:p>
+    <w:p>
+      <w:pPr>
+        <w:pStyle w:val="ListBullet"/>
+        <w:spacing w:after="60" w:line="276" w:lineRule="auto"/>
+      </w:pPr>
+      <w:r>
+        <w:rPr>
+          <w:rFonts w:ascii="Arial" w:hAnsi="Arial"/>
+          <w:b/>
+          <w:color w:val="0F172A"/>
+          <w:sz w:val="19"/>
+        </w:rPr>
+        <w:t xml:space="preserve">Streamlined Tab Layout: </w:t>
+      </w:r>
+      <w:r>
+        <w:rPr>
+          <w:rFonts w:ascii="Arial" w:hAnsi="Arial"/>
+          <w:color w:val="0F172A"/>
+          <w:sz w:val="19"/>
+        </w:rPr>
+        <w:t>Dashboard, Inventory &amp; Stock, Direct Dispatch, Bulk Key Uploader, Orders &amp; Deliveries, 24/7 UPI Bridge, Coupons (Live Firestore CRUD &amp; Deletion), Waitlist &amp; Demand, and Buyer Reviews.</w:t>
       </w:r>
     </w:p>
     <w:p>
@@ -1930,103 +1773,112 @@
           <w:color w:val="0E7490"/>
           <w:sz w:val="28"/>
         </w:rPr>
-        <w:t>9. Admin Command Center &amp; Vercel Storage Optimization</w:t>
+        <w:t>9. Sales Conversion Assets, In-Bot Guides &amp; Safe Play</w:t>
+      </w:r>
+    </w:p>
+    <w:p>
+      <w:pPr>
+        <w:spacing w:after="120" w:line="276" w:lineRule="auto"/>
+      </w:pPr>
+      <w:r>
+        <w:rPr>
+          <w:rFonts w:ascii="Arial" w:hAnsi="Arial"/>
+          <w:color w:val="0F172A"/>
+          <w:sz w:val="19"/>
+        </w:rPr>
+        <w:t>To address buyer skepticism, educate novice spoofers, and drive direct sales inside Telegram:</w:t>
       </w:r>
     </w:p>
     <w:p>
       <w:pPr>
         <w:pStyle w:val="ListBullet"/>
-        <w:spacing w:before="0" w:after="60" w:line="276" w:lineRule="auto"/>
+        <w:spacing w:after="60" w:line="276" w:lineRule="auto"/>
       </w:pPr>
       <w:r>
         <w:rPr>
           <w:rFonts w:ascii="Arial" w:hAnsi="Arial"/>
           <w:b/>
           <w:color w:val="0F172A"/>
-          <w:sz w:val="20"/>
+          <w:sz w:val="19"/>
         </w:rPr>
-        <w:t xml:space="preserve">Ghost Admin Camouflage: </w:t>
+        <w:t xml:space="preserve">Free vs Standard Comparison Engine (/features, /compare): </w:t>
       </w:r>
       <w:r>
         <w:rPr>
           <w:rFonts w:ascii="Arial" w:hAnsi="Arial"/>
-          <w:b w:val="0"/>
           <w:color w:val="0F172A"/>
-          <w:sz w:val="20"/>
+          <w:sz w:val="19"/>
         </w:rPr>
-        <w:t>Unauthorized visits to /admin yield an authentic 404 error page. Accessible via secret bookmark (?key=SECRET) or triple-clicking the 404 badge.</w:t>
+        <w:t>High-converting sales comparison detailing the limitations of PGSharp Free (15-second catch animations, blind catches without stats, no shiny scanner, manual joystick fatigue) vs the advantages of PGSharp Standard (1-second Quick Catch, 100% IV encounter preview, block non-shiny encounters, hands-free GPX auto-walk, instant skip cutscenes, guaranteed 100% excellent throws).</w:t>
       </w:r>
     </w:p>
     <w:p>
       <w:pPr>
         <w:pStyle w:val="ListBullet"/>
-        <w:spacing w:before="0" w:after="60" w:line="276" w:lineRule="auto"/>
+        <w:spacing w:after="60" w:line="276" w:lineRule="auto"/>
       </w:pPr>
       <w:r>
         <w:rPr>
           <w:rFonts w:ascii="Arial" w:hAnsi="Arial"/>
           <w:b/>
           <w:color w:val="0F172A"/>
-          <w:sz w:val="20"/>
+          <w:sz w:val="19"/>
         </w:rPr>
-        <w:t xml:space="preserve">Anti-Brute-Force Rate Limiting: </w:t>
+        <w:t xml:space="preserve">Anti-Ban Cooldown &amp; Safety Guide (/cooldown, /safety): </w:t>
       </w:r>
       <w:r>
         <w:rPr>
           <w:rFonts w:ascii="Arial" w:hAnsi="Arial"/>
-          <w:b w:val="0"/>
           <w:color w:val="0F172A"/>
-          <w:sz w:val="20"/>
+          <w:sz w:val="19"/>
         </w:rPr>
-        <w:t>Locks client IP after 5 failed passcode attempts for 15 minutes.</w:t>
+        <w:t>Comprehensive reference guide with distance cooldown chart (1 km to 1,350+ km global max of 120 mins), explicit breakdown of cooldown-triggering actions (balls, berries, gym battles, spins) versus safe actions (teleporting, IV inspection, egg hatching, trading).</w:t>
       </w:r>
     </w:p>
     <w:p>
       <w:pPr>
         <w:pStyle w:val="ListBullet"/>
-        <w:spacing w:before="0" w:after="60" w:line="276" w:lineRule="auto"/>
+        <w:spacing w:after="60" w:line="276" w:lineRule="auto"/>
       </w:pPr>
       <w:r>
         <w:rPr>
           <w:rFonts w:ascii="Arial" w:hAnsi="Arial"/>
           <w:b/>
           <w:color w:val="0F172A"/>
-          <w:sz w:val="20"/>
+          <w:sz w:val="19"/>
         </w:rPr>
-        <w:t xml:space="preserve">Live Firestore Coupon Engine: </w:t>
+        <w:t xml:space="preserve">PGSharp Feature Tier Accuracy: </w:t>
       </w:r>
       <w:r>
         <w:rPr>
           <w:rFonts w:ascii="Arial" w:hAnsi="Arial"/>
-          <w:b w:val="0"/>
           <w:color w:val="0F172A"/>
-          <w:sz w:val="20"/>
+          <w:sz w:val="19"/>
         </w:rPr>
-        <w:t>Interactive CRUD for promotional coupons with 1-click permanent deletion.</w:t>
+        <w:t>Clarifies that while the cooldown timer overlay is built-in free in PGSharp, the actual gameplay automation features (Quick Catch, shiny scanner, auto-feed, skip cutscenes) strictly require an active Standard license key.</w:t>
       </w:r>
     </w:p>
     <w:p>
       <w:pPr>
         <w:pStyle w:val="ListBullet"/>
-        <w:spacing w:before="0" w:after="60" w:line="276" w:lineRule="auto"/>
+        <w:spacing w:after="60" w:line="276" w:lineRule="auto"/>
       </w:pPr>
       <w:r>
         <w:rPr>
           <w:rFonts w:ascii="Arial" w:hAnsi="Arial"/>
           <w:b/>
           <w:color w:val="0F172A"/>
-          <w:sz w:val="20"/>
+          <w:sz w:val="19"/>
         </w:rPr>
-        <w:t xml:space="preserve">Vercel Deployment Storage Optimization: </w:t>
+        <w:t xml:space="preserve">Live Pokémon GO Events (/events): </w:t>
       </w:r>
       <w:r>
         <w:rPr>
           <w:rFonts w:ascii="Arial" w:hAnsi="Arial"/>
-          <w:b w:val="0"/>
           <w:color w:val="0F172A"/>
-          <w:sz w:val="20"/>
+          <w:sz w:val="19"/>
         </w:rPr>
-        <w:t>Automated cleanup script (cleanup_deployments.js) purges historical builds via Vercel REST API, reducing storage from 16.91 GB to ~0.65 GB (well under the 10 GB free ceiling).</w:t>
+        <w:t>Real-time event and raid boss rotations pulled live from official community feeds.</w:t>
       </w:r>
     </w:p>
     <w:p>
@@ -2041,35 +1893,28 @@
           <w:color w:val="0E7490"/>
           <w:sz w:val="28"/>
         </w:rPr>
-        <w:t>10. Complete Production Route Architecture Map</w:t>
+        <w:t>10. Complete Route &amp; API Architecture Map</w:t>
       </w:r>
     </w:p>
     <w:p>
       <w:pPr>
-        <w:spacing w:before="0" w:after="120" w:line="276" w:lineRule="auto"/>
+        <w:spacing w:after="120" w:line="276" w:lineRule="auto"/>
       </w:pPr>
       <w:r>
         <w:rPr>
           <w:rFonts w:ascii="Arial" w:hAnsi="Arial"/>
           <w:color w:val="0F172A"/>
-          <w:sz w:val="20"/>
+          <w:sz w:val="19"/>
         </w:rPr>
-        <w:t>Overview of all verified production routes across the web storefront and backend API:</w:t>
+        <w:t>Summary of all 18 active production routes and API endpoints:</w:t>
       </w:r>
     </w:p>
     <w:tbl>
       <w:tblPr>
         <w:tblW w:type="auto" w:w="0"/>
         <w:jc w:val="center"/>
+        <w:tblLayout w:type="fixed"/>
         <w:tblLook w:firstColumn="1" w:firstRow="1" w:lastColumn="0" w:lastRow="0" w:noHBand="0" w:noVBand="1" w:val="04A0"/>
-        <w:tblBorders>
-          <w:top w:val="single" w:sz="4" w:space="0" w:color="CBD5E1"/>
-          <w:left w:val="single" w:sz="4" w:space="0" w:color="CBD5E1"/>
-          <w:bottom w:val="single" w:sz="4" w:space="0" w:color="CBD5E1"/>
-          <w:right w:val="single" w:sz="4" w:space="0" w:color="CBD5E1"/>
-          <w:insideH w:val="single" w:sz="4" w:space="0" w:color="CBD5E1"/>
-          <w:insideV w:val="single" w:sz="4" w:space="0" w:color="CBD5E1"/>
-        </w:tblBorders>
       </w:tblPr>
       <w:tblGrid>
         <w:gridCol w:w="3120"/>
@@ -2079,7 +1924,7 @@
       <w:tr>
         <w:tc>
           <w:tcPr>
-            <w:tcW w:type="dxa" w:w="3024"/>
+            <w:tcW w:type="dxa" w:w="2880"/>
             <w:shd w:fill="0E7490"/>
             <w:tcMar>
               <w:top w:w="100" w:type="dxa"/>
@@ -2089,9 +1934,6 @@
             </w:tcMar>
           </w:tcPr>
           <w:p>
-            <w:pPr>
-              <w:spacing w:before="0" w:after="0"/>
-            </w:pPr>
             <w:r>
               <w:rPr>
                 <w:rFonts w:ascii="Arial" w:hAnsi="Arial"/>
@@ -2105,7 +1947,7 @@
         </w:tc>
         <w:tc>
           <w:tcPr>
-            <w:tcW w:type="dxa" w:w="1872"/>
+            <w:tcW w:type="dxa" w:w="2016"/>
             <w:shd w:fill="0E7490"/>
             <w:tcMar>
               <w:top w:w="100" w:type="dxa"/>
@@ -2115,9 +1957,6 @@
             </w:tcMar>
           </w:tcPr>
           <w:p>
-            <w:pPr>
-              <w:spacing w:before="0" w:after="0"/>
-            </w:pPr>
             <w:r>
               <w:rPr>
                 <w:rFonts w:ascii="Arial" w:hAnsi="Arial"/>
@@ -2125,7 +1964,7 @@
                 <w:color w:val="FFFFFF"/>
                 <w:sz w:val="18"/>
               </w:rPr>
-              <w:t>Rendering Mode</w:t>
+              <w:t>Rendering Type</w:t>
             </w:r>
           </w:p>
         </w:tc>
@@ -2141,9 +1980,6 @@
             </w:tcMar>
           </w:tcPr>
           <w:p>
-            <w:pPr>
-              <w:spacing w:before="0" w:after="0"/>
-            </w:pPr>
             <w:r>
               <w:rPr>
                 <w:rFonts w:ascii="Arial" w:hAnsi="Arial"/>
@@ -2159,7 +1995,7 @@
       <w:tr>
         <w:tc>
           <w:tcPr>
-            <w:tcW w:type="dxa" w:w="3024"/>
+            <w:tcW w:type="dxa" w:w="2880"/>
             <w:shd w:fill="F8FAFC"/>
             <w:tcMar>
               <w:top w:w="80" w:type="dxa"/>
@@ -2169,9 +2005,6 @@
             </w:tcMar>
           </w:tcPr>
           <w:p>
-            <w:pPr>
-              <w:spacing w:before="0" w:after="0" w:line="264" w:lineRule="auto"/>
-            </w:pPr>
             <w:r>
               <w:rPr>
                 <w:rFonts w:ascii="Arial" w:hAnsi="Arial"/>
@@ -2184,7 +2017,7 @@
         </w:tc>
         <w:tc>
           <w:tcPr>
-            <w:tcW w:type="dxa" w:w="1872"/>
+            <w:tcW w:type="dxa" w:w="2016"/>
             <w:shd w:fill="F8FAFC"/>
             <w:tcMar>
               <w:top w:w="80" w:type="dxa"/>
@@ -2194,9 +2027,6 @@
             </w:tcMar>
           </w:tcPr>
           <w:p>
-            <w:pPr>
-              <w:spacing w:before="0" w:after="0" w:line="264" w:lineRule="auto"/>
-            </w:pPr>
             <w:r>
               <w:rPr>
                 <w:rFonts w:ascii="Arial" w:hAnsi="Arial"/>
@@ -2219,16 +2049,13 @@
             </w:tcMar>
           </w:tcPr>
           <w:p>
-            <w:pPr>
-              <w:spacing w:before="0" w:after="0" w:line="264" w:lineRule="auto"/>
-            </w:pPr>
             <w:r>
               <w:rPr>
                 <w:rFonts w:ascii="Arial" w:hAnsi="Arial"/>
                 <w:color w:val="0F172A"/>
                 <w:sz w:val="17"/>
               </w:rPr>
-              <w:t>Main 3-Scene Cinematic Storefront, Scrollytelling Runway, Preloader &amp; HUD</w:t>
+              <w:t>Main 3-Scene Scrollytelling Storefront, Preloader &amp; HUD</w:t>
             </w:r>
           </w:p>
         </w:tc>
@@ -2236,7 +2063,7 @@
       <w:tr>
         <w:tc>
           <w:tcPr>
-            <w:tcW w:type="dxa" w:w="3024"/>
+            <w:tcW w:type="dxa" w:w="2880"/>
             <w:shd w:fill="FFFFFF"/>
             <w:tcMar>
               <w:top w:w="80" w:type="dxa"/>
@@ -2246,9 +2073,6 @@
             </w:tcMar>
           </w:tcPr>
           <w:p>
-            <w:pPr>
-              <w:spacing w:before="0" w:after="0" w:line="264" w:lineRule="auto"/>
-            </w:pPr>
             <w:r>
               <w:rPr>
                 <w:rFonts w:ascii="Arial" w:hAnsi="Arial"/>
@@ -2261,7 +2085,7 @@
         </w:tc>
         <w:tc>
           <w:tcPr>
-            <w:tcW w:type="dxa" w:w="1872"/>
+            <w:tcW w:type="dxa" w:w="2016"/>
             <w:shd w:fill="FFFFFF"/>
             <w:tcMar>
               <w:top w:w="80" w:type="dxa"/>
@@ -2271,9 +2095,6 @@
             </w:tcMar>
           </w:tcPr>
           <w:p>
-            <w:pPr>
-              <w:spacing w:before="0" w:after="0" w:line="264" w:lineRule="auto"/>
-            </w:pPr>
             <w:r>
               <w:rPr>
                 <w:rFonts w:ascii="Arial" w:hAnsi="Arial"/>
@@ -2296,16 +2117,13 @@
             </w:tcMar>
           </w:tcPr>
           <w:p>
-            <w:pPr>
-              <w:spacing w:before="0" w:after="0" w:line="264" w:lineRule="auto"/>
-            </w:pPr>
             <w:r>
               <w:rPr>
                 <w:rFonts w:ascii="Arial" w:hAnsi="Arial"/>
                 <w:color w:val="0F172A"/>
                 <w:sz w:val="17"/>
               </w:rPr>
-              <w:t>Holographic Encrypted Key Vault, Confetti Burst &amp; 4-Step Activation Guide</w:t>
+              <w:t>Encrypted Key Vault, Confetti Reveal &amp; Activation Guide</w:t>
             </w:r>
           </w:p>
         </w:tc>
@@ -2313,7 +2131,7 @@
       <w:tr>
         <w:tc>
           <w:tcPr>
-            <w:tcW w:type="dxa" w:w="3024"/>
+            <w:tcW w:type="dxa" w:w="2880"/>
             <w:shd w:fill="F8FAFC"/>
             <w:tcMar>
               <w:top w:w="80" w:type="dxa"/>
@@ -2323,9 +2141,6 @@
             </w:tcMar>
           </w:tcPr>
           <w:p>
-            <w:pPr>
-              <w:spacing w:before="0" w:after="0" w:line="264" w:lineRule="auto"/>
-            </w:pPr>
             <w:r>
               <w:rPr>
                 <w:rFonts w:ascii="Arial" w:hAnsi="Arial"/>
@@ -2338,7 +2153,7 @@
         </w:tc>
         <w:tc>
           <w:tcPr>
-            <w:tcW w:type="dxa" w:w="1872"/>
+            <w:tcW w:type="dxa" w:w="2016"/>
             <w:shd w:fill="F8FAFC"/>
             <w:tcMar>
               <w:top w:w="80" w:type="dxa"/>
@@ -2348,9 +2163,6 @@
             </w:tcMar>
           </w:tcPr>
           <w:p>
-            <w:pPr>
-              <w:spacing w:before="0" w:after="0" w:line="264" w:lineRule="auto"/>
-            </w:pPr>
             <w:r>
               <w:rPr>
                 <w:rFonts w:ascii="Arial" w:hAnsi="Arial"/>
@@ -2373,16 +2185,13 @@
             </w:tcMar>
           </w:tcPr>
           <w:p>
-            <w:pPr>
-              <w:spacing w:before="0" w:after="0" w:line="264" w:lineRule="auto"/>
-            </w:pPr>
             <w:r>
               <w:rPr>
                 <w:rFonts w:ascii="Arial" w:hAnsi="Arial"/>
                 <w:color w:val="0F172A"/>
                 <w:sz w:val="17"/>
               </w:rPr>
-              <w:t>Admin Command Center: Key Ingestion, Slot Tier Analytics &amp; Waitlist Manager</w:t>
+              <w:t>Admin Key Ingestion, Slot Tier Analytics &amp; Waitlist Manager</w:t>
             </w:r>
           </w:p>
         </w:tc>
@@ -2390,7 +2199,7 @@
       <w:tr>
         <w:tc>
           <w:tcPr>
-            <w:tcW w:type="dxa" w:w="3024"/>
+            <w:tcW w:type="dxa" w:w="2880"/>
             <w:shd w:fill="FFFFFF"/>
             <w:tcMar>
               <w:top w:w="80" w:type="dxa"/>
@@ -2400,22 +2209,19 @@
             </w:tcMar>
           </w:tcPr>
           <w:p>
-            <w:pPr>
-              <w:spacing w:before="0" w:after="0" w:line="264" w:lineRule="auto"/>
-            </w:pPr>
             <w:r>
               <w:rPr>
                 <w:rFonts w:ascii="Arial" w:hAnsi="Arial"/>
                 <w:color w:val="0F172A"/>
                 <w:sz w:val="17"/>
               </w:rPr>
-              <w:t>/contact, /terms, /refund</w:t>
+              <w:t>/contact, /refund, /terms</w:t>
             </w:r>
           </w:p>
         </w:tc>
         <w:tc>
           <w:tcPr>
-            <w:tcW w:type="dxa" w:w="1872"/>
+            <w:tcW w:type="dxa" w:w="2016"/>
             <w:shd w:fill="FFFFFF"/>
             <w:tcMar>
               <w:top w:w="80" w:type="dxa"/>
@@ -2425,9 +2231,6 @@
             </w:tcMar>
           </w:tcPr>
           <w:p>
-            <w:pPr>
-              <w:spacing w:before="0" w:after="0" w:line="264" w:lineRule="auto"/>
-            </w:pPr>
             <w:r>
               <w:rPr>
                 <w:rFonts w:ascii="Arial" w:hAnsi="Arial"/>
@@ -2450,16 +2253,13 @@
             </w:tcMar>
           </w:tcPr>
           <w:p>
-            <w:pPr>
-              <w:spacing w:before="0" w:after="0" w:line="264" w:lineRule="auto"/>
-            </w:pPr>
             <w:r>
               <w:rPr>
                 <w:rFonts w:ascii="Arial" w:hAnsi="Arial"/>
                 <w:color w:val="0F172A"/>
                 <w:sz w:val="17"/>
               </w:rPr>
-              <w:t>Legal Compliance, Terms of Service, Privacy Policy &amp; Concierge Support</w:t>
+              <w:t>Customer Support, Refund Policy &amp; Terms of Service</w:t>
             </w:r>
           </w:p>
         </w:tc>
@@ -2467,7 +2267,7 @@
       <w:tr>
         <w:tc>
           <w:tcPr>
-            <w:tcW w:type="dxa" w:w="3024"/>
+            <w:tcW w:type="dxa" w:w="2880"/>
             <w:shd w:fill="F8FAFC"/>
             <w:tcMar>
               <w:top w:w="80" w:type="dxa"/>
@@ -2477,9 +2277,6 @@
             </w:tcMar>
           </w:tcPr>
           <w:p>
-            <w:pPr>
-              <w:spacing w:before="0" w:after="0" w:line="264" w:lineRule="auto"/>
-            </w:pPr>
             <w:r>
               <w:rPr>
                 <w:rFonts w:ascii="Arial" w:hAnsi="Arial"/>
@@ -2492,7 +2289,7 @@
         </w:tc>
         <w:tc>
           <w:tcPr>
-            <w:tcW w:type="dxa" w:w="1872"/>
+            <w:tcW w:type="dxa" w:w="2016"/>
             <w:shd w:fill="F8FAFC"/>
             <w:tcMar>
               <w:top w:w="80" w:type="dxa"/>
@@ -2502,16 +2299,13 @@
             </w:tcMar>
           </w:tcPr>
           <w:p>
-            <w:pPr>
-              <w:spacing w:before="0" w:after="0" w:line="264" w:lineRule="auto"/>
-            </w:pPr>
             <w:r>
               <w:rPr>
                 <w:rFonts w:ascii="Arial" w:hAnsi="Arial"/>
                 <w:color w:val="0F172A"/>
                 <w:sz w:val="17"/>
               </w:rPr>
-              <w:t>Dynamic API (Edge Cached)</w:t>
+              <w:t>Dynamic API (Cached)</w:t>
             </w:r>
           </w:p>
         </w:tc>
@@ -2527,16 +2321,13 @@
             </w:tcMar>
           </w:tcPr>
           <w:p>
-            <w:pPr>
-              <w:spacing w:before="0" w:after="0" w:line="264" w:lineRule="auto"/>
-            </w:pPr>
             <w:r>
               <w:rPr>
                 <w:rFonts w:ascii="Arial" w:hAnsi="Arial"/>
                 <w:color w:val="0F172A"/>
                 <w:sz w:val="17"/>
               </w:rPr>
-              <w:t>Real-time Tier Stock, Usable Slots &amp; Active Inventory Counts (s-maxage=10)</w:t>
+              <w:t>Real-time Tier Stock, Usable Slots &amp; Active Inventory Counts</w:t>
             </w:r>
           </w:p>
         </w:tc>
@@ -2544,7 +2335,7 @@
       <w:tr>
         <w:tc>
           <w:tcPr>
-            <w:tcW w:type="dxa" w:w="3024"/>
+            <w:tcW w:type="dxa" w:w="2880"/>
             <w:shd w:fill="FFFFFF"/>
             <w:tcMar>
               <w:top w:w="80" w:type="dxa"/>
@@ -2554,22 +2345,19 @@
             </w:tcMar>
           </w:tcPr>
           <w:p>
-            <w:pPr>
-              <w:spacing w:before="0" w:after="0" w:line="264" w:lineRule="auto"/>
-            </w:pPr>
             <w:r>
               <w:rPr>
                 <w:rFonts w:ascii="Arial" w:hAnsi="Arial"/>
                 <w:color w:val="0F172A"/>
                 <w:sz w:val="17"/>
               </w:rPr>
-              <w:t>/api/stock/[planId]</w:t>
+              <w:t>/api/checkout/upi</w:t>
             </w:r>
           </w:p>
         </w:tc>
         <w:tc>
           <w:tcPr>
-            <w:tcW w:type="dxa" w:w="1872"/>
+            <w:tcW w:type="dxa" w:w="2016"/>
             <w:shd w:fill="FFFFFF"/>
             <w:tcMar>
               <w:top w:w="80" w:type="dxa"/>
@@ -2579,9 +2367,6 @@
             </w:tcMar>
           </w:tcPr>
           <w:p>
-            <w:pPr>
-              <w:spacing w:before="0" w:after="0" w:line="264" w:lineRule="auto"/>
-            </w:pPr>
             <w:r>
               <w:rPr>
                 <w:rFonts w:ascii="Arial" w:hAnsi="Arial"/>
@@ -2604,16 +2389,13 @@
             </w:tcMar>
           </w:tcPr>
           <w:p>
-            <w:pPr>
-              <w:spacing w:before="0" w:after="0" w:line="264" w:lineRule="auto"/>
-            </w:pPr>
             <w:r>
               <w:rPr>
                 <w:rFonts w:ascii="Arial" w:hAnsi="Arial"/>
                 <w:color w:val="0F172A"/>
                 <w:sz w:val="17"/>
               </w:rPr>
-              <w:t>Individual Plan Stock Availability Query</w:t>
+              <w:t>UPI Smart Routing &amp; Clean Whole-Rupee Intent Generation</w:t>
             </w:r>
           </w:p>
         </w:tc>
@@ -2621,7 +2403,7 @@
       <w:tr>
         <w:tc>
           <w:tcPr>
-            <w:tcW w:type="dxa" w:w="3024"/>
+            <w:tcW w:type="dxa" w:w="2880"/>
             <w:shd w:fill="F8FAFC"/>
             <w:tcMar>
               <w:top w:w="80" w:type="dxa"/>
@@ -2631,22 +2413,19 @@
             </w:tcMar>
           </w:tcPr>
           <w:p>
-            <w:pPr>
-              <w:spacing w:before="0" w:after="0" w:line="264" w:lineRule="auto"/>
-            </w:pPr>
             <w:r>
               <w:rPr>
                 <w:rFonts w:ascii="Arial" w:hAnsi="Arial"/>
                 <w:color w:val="0F172A"/>
                 <w:sz w:val="17"/>
               </w:rPr>
-              <w:t>/api/checkout/upi</w:t>
+              <w:t>/api/checkout/upi/verify</w:t>
             </w:r>
           </w:p>
         </w:tc>
         <w:tc>
           <w:tcPr>
-            <w:tcW w:type="dxa" w:w="1872"/>
+            <w:tcW w:type="dxa" w:w="2016"/>
             <w:shd w:fill="F8FAFC"/>
             <w:tcMar>
               <w:top w:w="80" w:type="dxa"/>
@@ -2656,9 +2435,6 @@
             </w:tcMar>
           </w:tcPr>
           <w:p>
-            <w:pPr>
-              <w:spacing w:before="0" w:after="0" w:line="264" w:lineRule="auto"/>
-            </w:pPr>
             <w:r>
               <w:rPr>
                 <w:rFonts w:ascii="Arial" w:hAnsi="Arial"/>
@@ -2681,16 +2457,13 @@
             </w:tcMar>
           </w:tcPr>
           <w:p>
-            <w:pPr>
-              <w:spacing w:before="0" w:after="0" w:line="264" w:lineRule="auto"/>
-            </w:pPr>
             <w:r>
               <w:rPr>
                 <w:rFonts w:ascii="Arial" w:hAnsi="Arial"/>
                 <w:color w:val="0F172A"/>
                 <w:sz w:val="17"/>
               </w:rPr>
-              <w:t>Clean Whole-Rupee Payment Intent &amp; Native Dynamic QR Code Generation</w:t>
+              <w:t>UPI Payment Verification &amp; Instant Key Allocation</w:t>
             </w:r>
           </w:p>
         </w:tc>
@@ -2698,7 +2471,7 @@
       <w:tr>
         <w:tc>
           <w:tcPr>
-            <w:tcW w:type="dxa" w:w="3024"/>
+            <w:tcW w:type="dxa" w:w="2880"/>
             <w:shd w:fill="FFFFFF"/>
             <w:tcMar>
               <w:top w:w="80" w:type="dxa"/>
@@ -2708,22 +2481,19 @@
             </w:tcMar>
           </w:tcPr>
           <w:p>
-            <w:pPr>
-              <w:spacing w:before="0" w:after="0" w:line="264" w:lineRule="auto"/>
-            </w:pPr>
             <w:r>
               <w:rPr>
                 <w:rFonts w:ascii="Arial" w:hAnsi="Arial"/>
                 <w:color w:val="0F172A"/>
                 <w:sz w:val="17"/>
               </w:rPr>
-              <w:t>/api/checkout/upi/verify</w:t>
+              <w:t>/api/checkout/paypal</w:t>
             </w:r>
           </w:p>
         </w:tc>
         <w:tc>
           <w:tcPr>
-            <w:tcW w:type="dxa" w:w="1872"/>
+            <w:tcW w:type="dxa" w:w="2016"/>
             <w:shd w:fill="FFFFFF"/>
             <w:tcMar>
               <w:top w:w="80" w:type="dxa"/>
@@ -2733,9 +2503,6 @@
             </w:tcMar>
           </w:tcPr>
           <w:p>
-            <w:pPr>
-              <w:spacing w:before="0" w:after="0" w:line="264" w:lineRule="auto"/>
-            </w:pPr>
             <w:r>
               <w:rPr>
                 <w:rFonts w:ascii="Arial" w:hAnsi="Arial"/>
@@ -2758,16 +2525,13 @@
             </w:tcMar>
           </w:tcPr>
           <w:p>
-            <w:pPr>
-              <w:spacing w:before="0" w:after="0" w:line="264" w:lineRule="auto"/>
-            </w:pPr>
             <w:r>
               <w:rPr>
                 <w:rFonts w:ascii="Arial" w:hAnsi="Arial"/>
                 <w:color w:val="0F172A"/>
                 <w:sz w:val="17"/>
               </w:rPr>
-              <w:t>Direct UPI 12-Digit Transaction ID Submission &amp; Verification</w:t>
+              <w:t>PayPal v2 Order Creation Endpoint</w:t>
             </w:r>
           </w:p>
         </w:tc>
@@ -2775,7 +2539,7 @@
       <w:tr>
         <w:tc>
           <w:tcPr>
-            <w:tcW w:type="dxa" w:w="3024"/>
+            <w:tcW w:type="dxa" w:w="2880"/>
             <w:shd w:fill="F8FAFC"/>
             <w:tcMar>
               <w:top w:w="80" w:type="dxa"/>
@@ -2785,22 +2549,19 @@
             </w:tcMar>
           </w:tcPr>
           <w:p>
-            <w:pPr>
-              <w:spacing w:before="0" w:after="0" w:line="264" w:lineRule="auto"/>
-            </w:pPr>
             <w:r>
               <w:rPr>
                 <w:rFonts w:ascii="Arial" w:hAnsi="Arial"/>
                 <w:color w:val="0F172A"/>
                 <w:sz w:val="17"/>
               </w:rPr>
-              <w:t>/api/webhooks/upi</w:t>
+              <w:t>/api/checkout/paypal/capture</w:t>
             </w:r>
           </w:p>
         </w:tc>
         <w:tc>
           <w:tcPr>
-            <w:tcW w:type="dxa" w:w="1872"/>
+            <w:tcW w:type="dxa" w:w="2016"/>
             <w:shd w:fill="F8FAFC"/>
             <w:tcMar>
               <w:top w:w="80" w:type="dxa"/>
@@ -2810,9 +2571,6 @@
             </w:tcMar>
           </w:tcPr>
           <w:p>
-            <w:pPr>
-              <w:spacing w:before="0" w:after="0" w:line="264" w:lineRule="auto"/>
-            </w:pPr>
             <w:r>
               <w:rPr>
                 <w:rFonts w:ascii="Arial" w:hAnsi="Arial"/>
@@ -2835,16 +2593,13 @@
             </w:tcMar>
           </w:tcPr>
           <w:p>
-            <w:pPr>
-              <w:spacing w:before="0" w:after="0" w:line="264" w:lineRule="auto"/>
-            </w:pPr>
             <w:r>
               <w:rPr>
                 <w:rFonts w:ascii="Arial" w:hAnsi="Arial"/>
                 <w:color w:val="0F172A"/>
                 <w:sz w:val="17"/>
               </w:rPr>
-              <w:t>Bank SMS Auto-Bridge Webhook: Parses credit alerts for &lt;2s auto-fulfillment</w:t>
+              <w:t>PayPal Order Capture &amp; Key Dispatch</w:t>
             </w:r>
           </w:p>
         </w:tc>
@@ -2852,7 +2607,7 @@
       <w:tr>
         <w:tc>
           <w:tcPr>
-            <w:tcW w:type="dxa" w:w="3024"/>
+            <w:tcW w:type="dxa" w:w="2880"/>
             <w:shd w:fill="FFFFFF"/>
             <w:tcMar>
               <w:top w:w="80" w:type="dxa"/>
@@ -2862,22 +2617,19 @@
             </w:tcMar>
           </w:tcPr>
           <w:p>
-            <w:pPr>
-              <w:spacing w:before="0" w:after="0" w:line="264" w:lineRule="auto"/>
-            </w:pPr>
             <w:r>
               <w:rPr>
                 <w:rFonts w:ascii="Arial" w:hAnsi="Arial"/>
                 <w:color w:val="0F172A"/>
                 <w:sz w:val="17"/>
               </w:rPr>
-              <w:t>/api/checkout/paypal</w:t>
+              <w:t>/api/webhooks/upi</w:t>
             </w:r>
           </w:p>
         </w:tc>
         <w:tc>
           <w:tcPr>
-            <w:tcW w:type="dxa" w:w="1872"/>
+            <w:tcW w:type="dxa" w:w="2016"/>
             <w:shd w:fill="FFFFFF"/>
             <w:tcMar>
               <w:top w:w="80" w:type="dxa"/>
@@ -2887,9 +2639,6 @@
             </w:tcMar>
           </w:tcPr>
           <w:p>
-            <w:pPr>
-              <w:spacing w:before="0" w:after="0" w:line="264" w:lineRule="auto"/>
-            </w:pPr>
             <w:r>
               <w:rPr>
                 <w:rFonts w:ascii="Arial" w:hAnsi="Arial"/>
@@ -2912,16 +2661,13 @@
             </w:tcMar>
           </w:tcPr>
           <w:p>
-            <w:pPr>
-              <w:spacing w:before="0" w:after="0" w:line="264" w:lineRule="auto"/>
-            </w:pPr>
             <w:r>
               <w:rPr>
                 <w:rFonts w:ascii="Arial" w:hAnsi="Arial"/>
                 <w:color w:val="0F172A"/>
                 <w:sz w:val="17"/>
               </w:rPr>
-              <w:t>PayPal.me Pre-filled Direct URL Generator ($2.00 / $3.60) &amp; Order Creation</w:t>
+              <w:t>24/7 Bank SMS Bridge Webhook with Anti-Fraud Filtering</w:t>
             </w:r>
           </w:p>
         </w:tc>
@@ -2929,7 +2675,7 @@
       <w:tr>
         <w:tc>
           <w:tcPr>
-            <w:tcW w:type="dxa" w:w="3024"/>
+            <w:tcW w:type="dxa" w:w="2880"/>
             <w:shd w:fill="F8FAFC"/>
             <w:tcMar>
               <w:top w:w="80" w:type="dxa"/>
@@ -2939,22 +2685,19 @@
             </w:tcMar>
           </w:tcPr>
           <w:p>
-            <w:pPr>
-              <w:spacing w:before="0" w:after="0" w:line="264" w:lineRule="auto"/>
-            </w:pPr>
             <w:r>
               <w:rPr>
                 <w:rFonts w:ascii="Arial" w:hAnsi="Arial"/>
                 <w:color w:val="0F172A"/>
                 <w:sz w:val="17"/>
               </w:rPr>
-              <w:t>/api/checkout/paypal/capture</w:t>
+              <w:t>/api/admin/keys/dispatch</w:t>
             </w:r>
           </w:p>
         </w:tc>
         <w:tc>
           <w:tcPr>
-            <w:tcW w:type="dxa" w:w="1872"/>
+            <w:tcW w:type="dxa" w:w="2016"/>
             <w:shd w:fill="F8FAFC"/>
             <w:tcMar>
               <w:top w:w="80" w:type="dxa"/>
@@ -2964,9 +2707,6 @@
             </w:tcMar>
           </w:tcPr>
           <w:p>
-            <w:pPr>
-              <w:spacing w:before="0" w:after="0" w:line="264" w:lineRule="auto"/>
-            </w:pPr>
             <w:r>
               <w:rPr>
                 <w:rFonts w:ascii="Arial" w:hAnsi="Arial"/>
@@ -2989,16 +2729,13 @@
             </w:tcMar>
           </w:tcPr>
           <w:p>
-            <w:pPr>
-              <w:spacing w:before="0" w:after="0" w:line="264" w:lineRule="auto"/>
-            </w:pPr>
             <w:r>
               <w:rPr>
                 <w:rFonts w:ascii="Arial" w:hAnsi="Arial"/>
                 <w:color w:val="0F172A"/>
                 <w:sz w:val="17"/>
               </w:rPr>
-              <w:t>PayPal JS SDK Order Capture &amp; Instant Key Allocation</w:t>
+              <w:t>Manual 1, 2, or 3-Slot Direct Customer Key Dispatch</w:t>
             </w:r>
           </w:p>
         </w:tc>
@@ -3006,7 +2743,7 @@
       <w:tr>
         <w:tc>
           <w:tcPr>
-            <w:tcW w:type="dxa" w:w="3024"/>
+            <w:tcW w:type="dxa" w:w="2880"/>
             <w:shd w:fill="FFFFFF"/>
             <w:tcMar>
               <w:top w:w="80" w:type="dxa"/>
@@ -3016,22 +2753,19 @@
             </w:tcMar>
           </w:tcPr>
           <w:p>
-            <w:pPr>
-              <w:spacing w:before="0" w:after="0" w:line="264" w:lineRule="auto"/>
-            </w:pPr>
             <w:r>
               <w:rPr>
                 <w:rFonts w:ascii="Arial" w:hAnsi="Arial"/>
                 <w:color w:val="0F172A"/>
                 <w:sz w:val="17"/>
               </w:rPr>
-              <w:t>/api/checkout/paypal/verify</w:t>
+              <w:t>/api/admin/orders/approve</w:t>
             </w:r>
           </w:p>
         </w:tc>
         <w:tc>
           <w:tcPr>
-            <w:tcW w:type="dxa" w:w="1872"/>
+            <w:tcW w:type="dxa" w:w="2016"/>
             <w:shd w:fill="FFFFFF"/>
             <w:tcMar>
               <w:top w:w="80" w:type="dxa"/>
@@ -3041,9 +2775,6 @@
             </w:tcMar>
           </w:tcPr>
           <w:p>
-            <w:pPr>
-              <w:spacing w:before="0" w:after="0" w:line="264" w:lineRule="auto"/>
-            </w:pPr>
             <w:r>
               <w:rPr>
                 <w:rFonts w:ascii="Arial" w:hAnsi="Arial"/>
@@ -3066,16 +2797,13 @@
             </w:tcMar>
           </w:tcPr>
           <w:p>
-            <w:pPr>
-              <w:spacing w:before="0" w:after="0" w:line="264" w:lineRule="auto"/>
-            </w:pPr>
             <w:r>
               <w:rPr>
                 <w:rFonts w:ascii="Arial" w:hAnsi="Arial"/>
                 <w:color w:val="0F172A"/>
                 <w:sz w:val="17"/>
               </w:rPr>
-              <w:t>PayPal Direct Transaction ID Verification &amp; Key Reveal</w:t>
+              <w:t>1-Click Manual Proof Approval &amp; Instant Key Release</w:t>
             </w:r>
           </w:p>
         </w:tc>
@@ -3083,7 +2811,7 @@
       <w:tr>
         <w:tc>
           <w:tcPr>
-            <w:tcW w:type="dxa" w:w="3024"/>
+            <w:tcW w:type="dxa" w:w="2880"/>
             <w:shd w:fill="F8FAFC"/>
             <w:tcMar>
               <w:top w:w="80" w:type="dxa"/>
@@ -3093,22 +2821,19 @@
             </w:tcMar>
           </w:tcPr>
           <w:p>
-            <w:pPr>
-              <w:spacing w:before="0" w:after="0" w:line="264" w:lineRule="auto"/>
-            </w:pPr>
             <w:r>
               <w:rPr>
                 <w:rFonts w:ascii="Arial" w:hAnsi="Arial"/>
                 <w:color w:val="0F172A"/>
                 <w:sz w:val="17"/>
               </w:rPr>
-              <w:t>/api/webhooks/paypal</w:t>
+              <w:t>/api/admin/orders/reject</w:t>
             </w:r>
           </w:p>
         </w:tc>
         <w:tc>
           <w:tcPr>
-            <w:tcW w:type="dxa" w:w="1872"/>
+            <w:tcW w:type="dxa" w:w="2016"/>
             <w:shd w:fill="F8FAFC"/>
             <w:tcMar>
               <w:top w:w="80" w:type="dxa"/>
@@ -3118,9 +2843,6 @@
             </w:tcMar>
           </w:tcPr>
           <w:p>
-            <w:pPr>
-              <w:spacing w:before="0" w:after="0" w:line="264" w:lineRule="auto"/>
-            </w:pPr>
             <w:r>
               <w:rPr>
                 <w:rFonts w:ascii="Arial" w:hAnsi="Arial"/>
@@ -3143,16 +2865,13 @@
             </w:tcMar>
           </w:tcPr>
           <w:p>
-            <w:pPr>
-              <w:spacing w:before="0" w:after="0" w:line="264" w:lineRule="auto"/>
-            </w:pPr>
             <w:r>
               <w:rPr>
                 <w:rFonts w:ascii="Arial" w:hAnsi="Arial"/>
                 <w:color w:val="0F172A"/>
                 <w:sz w:val="17"/>
               </w:rPr>
-              <w:t>PayPal IPN Asynchronous Webhook Verification</w:t>
+              <w:t>1-Click Manual Proof Rejection &amp; Status Update</w:t>
             </w:r>
           </w:p>
         </w:tc>
@@ -3160,7 +2879,7 @@
       <w:tr>
         <w:tc>
           <w:tcPr>
-            <w:tcW w:type="dxa" w:w="3024"/>
+            <w:tcW w:type="dxa" w:w="2880"/>
             <w:shd w:fill="FFFFFF"/>
             <w:tcMar>
               <w:top w:w="80" w:type="dxa"/>
@@ -3170,22 +2889,19 @@
             </w:tcMar>
           </w:tcPr>
           <w:p>
-            <w:pPr>
-              <w:spacing w:before="0" w:after="0" w:line="264" w:lineRule="auto"/>
-            </w:pPr>
             <w:r>
               <w:rPr>
                 <w:rFonts w:ascii="Arial" w:hAnsi="Arial"/>
                 <w:color w:val="0F172A"/>
                 <w:sz w:val="17"/>
               </w:rPr>
-              <w:t>/api/coupons/validate</w:t>
+              <w:t>/api/cron/expiry-reminders</w:t>
             </w:r>
           </w:p>
         </w:tc>
         <w:tc>
           <w:tcPr>
-            <w:tcW w:type="dxa" w:w="1872"/>
+            <w:tcW w:type="dxa" w:w="2016"/>
             <w:shd w:fill="FFFFFF"/>
             <w:tcMar>
               <w:top w:w="80" w:type="dxa"/>
@@ -3195,9 +2911,6 @@
             </w:tcMar>
           </w:tcPr>
           <w:p>
-            <w:pPr>
-              <w:spacing w:before="0" w:after="0" w:line="264" w:lineRule="auto"/>
-            </w:pPr>
             <w:r>
               <w:rPr>
                 <w:rFonts w:ascii="Arial" w:hAnsi="Arial"/>
@@ -3220,16 +2933,13 @@
             </w:tcMar>
           </w:tcPr>
           <w:p>
-            <w:pPr>
-              <w:spacing w:before="0" w:after="0" w:line="264" w:lineRule="auto"/>
-            </w:pPr>
             <w:r>
               <w:rPr>
                 <w:rFonts w:ascii="Arial" w:hAnsi="Arial"/>
                 <w:color w:val="0F172A"/>
                 <w:sz w:val="17"/>
               </w:rPr>
-              <w:t>Real-Time Coupon Validation (Fixed Rupee &amp; Percentage Discounts)</w:t>
+              <w:t>Automated 48h License Expiry Scanner &amp; Renewals</w:t>
             </w:r>
           </w:p>
         </w:tc>
@@ -3237,7 +2947,7 @@
       <w:tr>
         <w:tc>
           <w:tcPr>
-            <w:tcW w:type="dxa" w:w="3024"/>
+            <w:tcW w:type="dxa" w:w="2880"/>
             <w:shd w:fill="F8FAFC"/>
             <w:tcMar>
               <w:top w:w="80" w:type="dxa"/>
@@ -3247,22 +2957,19 @@
             </w:tcMar>
           </w:tcPr>
           <w:p>
-            <w:pPr>
-              <w:spacing w:before="0" w:after="0" w:line="264" w:lineRule="auto"/>
-            </w:pPr>
             <w:r>
               <w:rPr>
                 <w:rFonts w:ascii="Arial" w:hAnsi="Arial"/>
                 <w:color w:val="0F172A"/>
                 <w:sz w:val="17"/>
               </w:rPr>
-              <w:t>/api/admin/coupons</w:t>
+              <w:t>/api/telegram/webhook</w:t>
             </w:r>
           </w:p>
         </w:tc>
         <w:tc>
           <w:tcPr>
-            <w:tcW w:type="dxa" w:w="1872"/>
+            <w:tcW w:type="dxa" w:w="2016"/>
             <w:shd w:fill="F8FAFC"/>
             <w:tcMar>
               <w:top w:w="80" w:type="dxa"/>
@@ -3272,9 +2979,6 @@
             </w:tcMar>
           </w:tcPr>
           <w:p>
-            <w:pPr>
-              <w:spacing w:before="0" w:after="0" w:line="264" w:lineRule="auto"/>
-            </w:pPr>
             <w:r>
               <w:rPr>
                 <w:rFonts w:ascii="Arial" w:hAnsi="Arial"/>
@@ -3297,16 +3001,13 @@
             </w:tcMar>
           </w:tcPr>
           <w:p>
-            <w:pPr>
-              <w:spacing w:before="0" w:after="0" w:line="264" w:lineRule="auto"/>
-            </w:pPr>
             <w:r>
               <w:rPr>
                 <w:rFonts w:ascii="Arial" w:hAnsi="Arial"/>
                 <w:color w:val="0F172A"/>
                 <w:sz w:val="17"/>
               </w:rPr>
-              <w:t>Live Admin Coupon CRUD with Instant Permanent Deletion</w:t>
+              <w:t>Telegram Bot Handler (Checkout, Proofs, Referrals, /givekey)</w:t>
             </w:r>
           </w:p>
         </w:tc>
@@ -3314,7 +3015,7 @@
       <w:tr>
         <w:tc>
           <w:tcPr>
-            <w:tcW w:type="dxa" w:w="3024"/>
+            <w:tcW w:type="dxa" w:w="2880"/>
             <w:shd w:fill="FFFFFF"/>
             <w:tcMar>
               <w:top w:w="80" w:type="dxa"/>
@@ -3324,22 +3025,19 @@
             </w:tcMar>
           </w:tcPr>
           <w:p>
-            <w:pPr>
-              <w:spacing w:before="0" w:after="0" w:line="264" w:lineRule="auto"/>
-            </w:pPr>
             <w:r>
               <w:rPr>
                 <w:rFonts w:ascii="Arial" w:hAnsi="Arial"/>
                 <w:color w:val="0F172A"/>
                 <w:sz w:val="17"/>
               </w:rPr>
-              <w:t>/api/cron/expiry-reminders</w:t>
+              <w:t>/api/coupons/validate</w:t>
             </w:r>
           </w:p>
         </w:tc>
         <w:tc>
           <w:tcPr>
-            <w:tcW w:type="dxa" w:w="1872"/>
+            <w:tcW w:type="dxa" w:w="2016"/>
             <w:shd w:fill="FFFFFF"/>
             <w:tcMar>
               <w:top w:w="80" w:type="dxa"/>
@@ -3349,16 +3047,13 @@
             </w:tcMar>
           </w:tcPr>
           <w:p>
-            <w:pPr>
-              <w:spacing w:before="0" w:after="0" w:line="264" w:lineRule="auto"/>
-            </w:pPr>
             <w:r>
               <w:rPr>
                 <w:rFonts w:ascii="Arial" w:hAnsi="Arial"/>
                 <w:color w:val="0F172A"/>
                 <w:sz w:val="17"/>
               </w:rPr>
-              <w:t>Dynamic API (Cron)</w:t>
+              <w:t>Dynamic API</w:t>
             </w:r>
           </w:p>
         </w:tc>
@@ -3374,16 +3069,13 @@
             </w:tcMar>
           </w:tcPr>
           <w:p>
-            <w:pPr>
-              <w:spacing w:before="0" w:after="0" w:line="264" w:lineRule="auto"/>
-            </w:pPr>
             <w:r>
               <w:rPr>
                 <w:rFonts w:ascii="Arial" w:hAnsi="Arial"/>
                 <w:color w:val="0F172A"/>
                 <w:sz w:val="17"/>
               </w:rPr>
-              <w:t>Daily Retention Cron: Scans Day 28 keys, dispatches DMs &amp; renewal links</w:t>
+              <w:t>Private VIP Promo Code Server-Side Validation</w:t>
             </w:r>
           </w:p>
         </w:tc>
@@ -3391,7 +3083,7 @@
       <w:tr>
         <w:tc>
           <w:tcPr>
-            <w:tcW w:type="dxa" w:w="3024"/>
+            <w:tcW w:type="dxa" w:w="2880"/>
             <w:shd w:fill="F8FAFC"/>
             <w:tcMar>
               <w:top w:w="80" w:type="dxa"/>
@@ -3401,22 +3093,19 @@
             </w:tcMar>
           </w:tcPr>
           <w:p>
-            <w:pPr>
-              <w:spacing w:before="0" w:after="0" w:line="264" w:lineRule="auto"/>
-            </w:pPr>
             <w:r>
               <w:rPr>
                 <w:rFonts w:ascii="Arial" w:hAnsi="Arial"/>
                 <w:color w:val="0F172A"/>
                 <w:sz w:val="17"/>
               </w:rPr>
-              <w:t>/api/pokemon/events</w:t>
+              <w:t>/api/admin/coupons</w:t>
             </w:r>
           </w:p>
         </w:tc>
         <w:tc>
           <w:tcPr>
-            <w:tcW w:type="dxa" w:w="1872"/>
+            <w:tcW w:type="dxa" w:w="2016"/>
             <w:shd w:fill="F8FAFC"/>
             <w:tcMar>
               <w:top w:w="80" w:type="dxa"/>
@@ -3426,9 +3115,6 @@
             </w:tcMar>
           </w:tcPr>
           <w:p>
-            <w:pPr>
-              <w:spacing w:before="0" w:after="0" w:line="264" w:lineRule="auto"/>
-            </w:pPr>
             <w:r>
               <w:rPr>
                 <w:rFonts w:ascii="Arial" w:hAnsi="Arial"/>
@@ -3451,16 +3137,13 @@
             </w:tcMar>
           </w:tcPr>
           <w:p>
-            <w:pPr>
-              <w:spacing w:before="0" w:after="0" w:line="264" w:lineRule="auto"/>
-            </w:pPr>
             <w:r>
               <w:rPr>
                 <w:rFonts w:ascii="Arial" w:hAnsi="Arial"/>
                 <w:color w:val="0F172A"/>
                 <w:sz w:val="17"/>
               </w:rPr>
-              <w:t>Live Pokémon GO Raids, Max Battles &amp; Spotlight Hours Calendar Feed</w:t>
+              <w:t>Live Admin Coupon CRUD with Instant Permanent Deletion</w:t>
             </w:r>
           </w:p>
         </w:tc>
@@ -3468,7 +3151,7 @@
       <w:tr>
         <w:tc>
           <w:tcPr>
-            <w:tcW w:type="dxa" w:w="3024"/>
+            <w:tcW w:type="dxa" w:w="2880"/>
             <w:shd w:fill="FFFFFF"/>
             <w:tcMar>
               <w:top w:w="80" w:type="dxa"/>
@@ -3478,22 +3161,19 @@
             </w:tcMar>
           </w:tcPr>
           <w:p>
-            <w:pPr>
-              <w:spacing w:before="0" w:after="0" w:line="264" w:lineRule="auto"/>
-            </w:pPr>
             <w:r>
               <w:rPr>
                 <w:rFonts w:ascii="Arial" w:hAnsi="Arial"/>
                 <w:color w:val="0F172A"/>
                 <w:sz w:val="17"/>
               </w:rPr>
-              <w:t>/api/pokemon/spawns</w:t>
+              <w:t>/api/restock-notify</w:t>
             </w:r>
           </w:p>
         </w:tc>
         <w:tc>
           <w:tcPr>
-            <w:tcW w:type="dxa" w:w="1872"/>
+            <w:tcW w:type="dxa" w:w="2016"/>
             <w:shd w:fill="FFFFFF"/>
             <w:tcMar>
               <w:top w:w="80" w:type="dxa"/>
@@ -3503,9 +3183,6 @@
             </w:tcMar>
           </w:tcPr>
           <w:p>
-            <w:pPr>
-              <w:spacing w:before="0" w:after="0" w:line="264" w:lineRule="auto"/>
-            </w:pPr>
             <w:r>
               <w:rPr>
                 <w:rFonts w:ascii="Arial" w:hAnsi="Arial"/>
@@ -3528,945 +3205,23 @@
             </w:tcMar>
           </w:tcPr>
           <w:p>
-            <w:pPr>
-              <w:spacing w:before="0" w:after="0" w:line="264" w:lineRule="auto"/>
-            </w:pPr>
             <w:r>
               <w:rPr>
                 <w:rFonts w:ascii="Arial" w:hAnsi="Arial"/>
                 <w:color w:val="0F172A"/>
                 <w:sz w:val="17"/>
               </w:rPr>
-              <w:t>Live Pokémon Scanner Webhook Ingestion &amp; Alert Dispatch</w:t>
-            </w:r>
-          </w:p>
-        </w:tc>
-      </w:tr>
-      <w:tr>
-        <w:tc>
-          <w:tcPr>
-            <w:tcW w:type="dxa" w:w="3024"/>
-            <w:shd w:fill="F8FAFC"/>
-            <w:tcMar>
-              <w:top w:w="80" w:type="dxa"/>
-              <w:bottom w:w="80" w:type="dxa"/>
-              <w:left w:w="120" w:type="dxa"/>
-              <w:right w:w="120" w:type="dxa"/>
-            </w:tcMar>
-          </w:tcPr>
-          <w:p>
-            <w:pPr>
-              <w:spacing w:before="0" w:after="0" w:line="264" w:lineRule="auto"/>
-            </w:pPr>
-            <w:r>
-              <w:rPr>
-                <w:rFonts w:ascii="Arial" w:hAnsi="Arial"/>
-                <w:color w:val="0F172A"/>
-                <w:sz w:val="17"/>
-              </w:rPr>
-              <w:t>/api/telegram/webhook</w:t>
-            </w:r>
-          </w:p>
-        </w:tc>
-        <w:tc>
-          <w:tcPr>
-            <w:tcW w:type="dxa" w:w="1872"/>
-            <w:shd w:fill="F8FAFC"/>
-            <w:tcMar>
-              <w:top w:w="80" w:type="dxa"/>
-              <w:bottom w:w="80" w:type="dxa"/>
-              <w:left w:w="120" w:type="dxa"/>
-              <w:right w:w="120" w:type="dxa"/>
-            </w:tcMar>
-          </w:tcPr>
-          <w:p>
-            <w:pPr>
-              <w:spacing w:before="0" w:after="0" w:line="264" w:lineRule="auto"/>
-            </w:pPr>
-            <w:r>
-              <w:rPr>
-                <w:rFonts w:ascii="Arial" w:hAnsi="Arial"/>
-                <w:color w:val="0F172A"/>
-                <w:sz w:val="17"/>
-              </w:rPr>
-              <w:t>Dynamic API</w:t>
-            </w:r>
-          </w:p>
-        </w:tc>
-        <w:tc>
-          <w:tcPr>
-            <w:tcW w:type="dxa" w:w="4464"/>
-            <w:shd w:fill="F8FAFC"/>
-            <w:tcMar>
-              <w:top w:w="80" w:type="dxa"/>
-              <w:bottom w:w="80" w:type="dxa"/>
-              <w:left w:w="120" w:type="dxa"/>
-              <w:right w:w="120" w:type="dxa"/>
-            </w:tcMar>
-          </w:tcPr>
-          <w:p>
-            <w:pPr>
-              <w:spacing w:before="0" w:after="0" w:line="264" w:lineRule="auto"/>
-            </w:pPr>
-            <w:r>
-              <w:rPr>
-                <w:rFonts w:ascii="Arial" w:hAnsi="Arial"/>
-                <w:color w:val="0F172A"/>
-                <w:sz w:val="17"/>
-              </w:rPr>
-              <w:t>Telegram Bot Webhook: Handles /start, /buy, /keys, /ref, /givekey, Radar</w:t>
-            </w:r>
-          </w:p>
-        </w:tc>
-      </w:tr>
-      <w:tr>
-        <w:tc>
-          <w:tcPr>
-            <w:tcW w:type="dxa" w:w="3024"/>
-            <w:shd w:fill="FFFFFF"/>
-            <w:tcMar>
-              <w:top w:w="80" w:type="dxa"/>
-              <w:bottom w:w="80" w:type="dxa"/>
-              <w:left w:w="120" w:type="dxa"/>
-              <w:right w:w="120" w:type="dxa"/>
-            </w:tcMar>
-          </w:tcPr>
-          <w:p>
-            <w:pPr>
-              <w:spacing w:before="0" w:after="0" w:line="264" w:lineRule="auto"/>
-            </w:pPr>
-            <w:r>
-              <w:rPr>
-                <w:rFonts w:ascii="Arial" w:hAnsi="Arial"/>
-                <w:color w:val="0F172A"/>
-                <w:sz w:val="17"/>
-              </w:rPr>
-              <w:t>/api/telegram/setup</w:t>
-            </w:r>
-          </w:p>
-        </w:tc>
-        <w:tc>
-          <w:tcPr>
-            <w:tcW w:type="dxa" w:w="1872"/>
-            <w:shd w:fill="FFFFFF"/>
-            <w:tcMar>
-              <w:top w:w="80" w:type="dxa"/>
-              <w:bottom w:w="80" w:type="dxa"/>
-              <w:left w:w="120" w:type="dxa"/>
-              <w:right w:w="120" w:type="dxa"/>
-            </w:tcMar>
-          </w:tcPr>
-          <w:p>
-            <w:pPr>
-              <w:spacing w:before="0" w:after="0" w:line="264" w:lineRule="auto"/>
-            </w:pPr>
-            <w:r>
-              <w:rPr>
-                <w:rFonts w:ascii="Arial" w:hAnsi="Arial"/>
-                <w:color w:val="0F172A"/>
-                <w:sz w:val="17"/>
-              </w:rPr>
-              <w:t>Dynamic API</w:t>
-            </w:r>
-          </w:p>
-        </w:tc>
-        <w:tc>
-          <w:tcPr>
-            <w:tcW w:type="dxa" w:w="4464"/>
-            <w:shd w:fill="FFFFFF"/>
-            <w:tcMar>
-              <w:top w:w="80" w:type="dxa"/>
-              <w:bottom w:w="80" w:type="dxa"/>
-              <w:left w:w="120" w:type="dxa"/>
-              <w:right w:w="120" w:type="dxa"/>
-            </w:tcMar>
-          </w:tcPr>
-          <w:p>
-            <w:pPr>
-              <w:spacing w:before="0" w:after="0" w:line="264" w:lineRule="auto"/>
-            </w:pPr>
-            <w:r>
-              <w:rPr>
-                <w:rFonts w:ascii="Arial" w:hAnsi="Arial"/>
-                <w:color w:val="0F172A"/>
-                <w:sz w:val="17"/>
-              </w:rPr>
-              <w:t>Automated Telegram Webhook Registration &amp; Command Menu Setup</w:t>
-            </w:r>
-          </w:p>
-        </w:tc>
-      </w:tr>
-      <w:tr>
-        <w:tc>
-          <w:tcPr>
-            <w:tcW w:type="dxa" w:w="3024"/>
-            <w:shd w:fill="F8FAFC"/>
-            <w:tcMar>
-              <w:top w:w="80" w:type="dxa"/>
-              <w:bottom w:w="80" w:type="dxa"/>
-              <w:left w:w="120" w:type="dxa"/>
-              <w:right w:w="120" w:type="dxa"/>
-            </w:tcMar>
-          </w:tcPr>
-          <w:p>
-            <w:pPr>
-              <w:spacing w:before="0" w:after="0" w:line="264" w:lineRule="auto"/>
-            </w:pPr>
-            <w:r>
-              <w:rPr>
-                <w:rFonts w:ascii="Arial" w:hAnsi="Arial"/>
-                <w:color w:val="0F172A"/>
-                <w:sz w:val="17"/>
-              </w:rPr>
-              <w:t>/api/restock-notify</w:t>
-            </w:r>
-          </w:p>
-        </w:tc>
-        <w:tc>
-          <w:tcPr>
-            <w:tcW w:type="dxa" w:w="1872"/>
-            <w:shd w:fill="F8FAFC"/>
-            <w:tcMar>
-              <w:top w:w="80" w:type="dxa"/>
-              <w:bottom w:w="80" w:type="dxa"/>
-              <w:left w:w="120" w:type="dxa"/>
-              <w:right w:w="120" w:type="dxa"/>
-            </w:tcMar>
-          </w:tcPr>
-          <w:p>
-            <w:pPr>
-              <w:spacing w:before="0" w:after="0" w:line="264" w:lineRule="auto"/>
-            </w:pPr>
-            <w:r>
-              <w:rPr>
-                <w:rFonts w:ascii="Arial" w:hAnsi="Arial"/>
-                <w:color w:val="0F172A"/>
-                <w:sz w:val="17"/>
-              </w:rPr>
-              <w:t>Dynamic API</w:t>
-            </w:r>
-          </w:p>
-        </w:tc>
-        <w:tc>
-          <w:tcPr>
-            <w:tcW w:type="dxa" w:w="4464"/>
-            <w:shd w:fill="F8FAFC"/>
-            <w:tcMar>
-              <w:top w:w="80" w:type="dxa"/>
-              <w:bottom w:w="80" w:type="dxa"/>
-              <w:left w:w="120" w:type="dxa"/>
-              <w:right w:w="120" w:type="dxa"/>
-            </w:tcMar>
-          </w:tcPr>
-          <w:p>
-            <w:pPr>
-              <w:spacing w:before="0" w:after="0" w:line="264" w:lineRule="auto"/>
-            </w:pPr>
-            <w:r>
-              <w:rPr>
-                <w:rFonts w:ascii="Arial" w:hAnsi="Arial"/>
-                <w:color w:val="0F172A"/>
-                <w:sz w:val="17"/>
-              </w:rPr>
-              <w:t>Customer Restock Notification Waitlist Ingestion</w:t>
-            </w:r>
-          </w:p>
-        </w:tc>
-      </w:tr>
-      <w:tr>
-        <w:tc>
-          <w:tcPr>
-            <w:tcW w:type="dxa" w:w="3024"/>
-            <w:shd w:fill="FFFFFF"/>
-            <w:tcMar>
-              <w:top w:w="80" w:type="dxa"/>
-              <w:bottom w:w="80" w:type="dxa"/>
-              <w:left w:w="120" w:type="dxa"/>
-              <w:right w:w="120" w:type="dxa"/>
-            </w:tcMar>
-          </w:tcPr>
-          <w:p>
-            <w:pPr>
-              <w:spacing w:before="0" w:after="0" w:line="264" w:lineRule="auto"/>
-            </w:pPr>
-            <w:r>
-              <w:rPr>
-                <w:rFonts w:ascii="Arial" w:hAnsi="Arial"/>
-                <w:color w:val="0F172A"/>
-                <w:sz w:val="17"/>
-              </w:rPr>
-              <w:t>/api/admin/waitlist/notify</w:t>
-            </w:r>
-          </w:p>
-        </w:tc>
-        <w:tc>
-          <w:tcPr>
-            <w:tcW w:type="dxa" w:w="1872"/>
-            <w:shd w:fill="FFFFFF"/>
-            <w:tcMar>
-              <w:top w:w="80" w:type="dxa"/>
-              <w:bottom w:w="80" w:type="dxa"/>
-              <w:left w:w="120" w:type="dxa"/>
-              <w:right w:w="120" w:type="dxa"/>
-            </w:tcMar>
-          </w:tcPr>
-          <w:p>
-            <w:pPr>
-              <w:spacing w:before="0" w:after="0" w:line="264" w:lineRule="auto"/>
-            </w:pPr>
-            <w:r>
-              <w:rPr>
-                <w:rFonts w:ascii="Arial" w:hAnsi="Arial"/>
-                <w:color w:val="0F172A"/>
-                <w:sz w:val="17"/>
-              </w:rPr>
-              <w:t>Dynamic API</w:t>
-            </w:r>
-          </w:p>
-        </w:tc>
-        <w:tc>
-          <w:tcPr>
-            <w:tcW w:type="dxa" w:w="4464"/>
-            <w:shd w:fill="FFFFFF"/>
-            <w:tcMar>
-              <w:top w:w="80" w:type="dxa"/>
-              <w:bottom w:w="80" w:type="dxa"/>
-              <w:left w:w="120" w:type="dxa"/>
-              <w:right w:w="120" w:type="dxa"/>
-            </w:tcMar>
-          </w:tcPr>
-          <w:p>
-            <w:pPr>
-              <w:spacing w:before="0" w:after="0" w:line="264" w:lineRule="auto"/>
-            </w:pPr>
-            <w:r>
-              <w:rPr>
-                <w:rFonts w:ascii="Arial" w:hAnsi="Arial"/>
-                <w:color w:val="0F172A"/>
-                <w:sz w:val="17"/>
-              </w:rPr>
-              <w:t>Dispatches Restock Alert Emails to Waiting Customers via Gmail SMTP</w:t>
-            </w:r>
-          </w:p>
-        </w:tc>
-      </w:tr>
-      <w:tr>
-        <w:tc>
-          <w:tcPr>
-            <w:tcW w:type="dxa" w:w="3024"/>
-            <w:shd w:fill="F8FAFC"/>
-            <w:tcMar>
-              <w:top w:w="80" w:type="dxa"/>
-              <w:bottom w:w="80" w:type="dxa"/>
-              <w:left w:w="120" w:type="dxa"/>
-              <w:right w:w="120" w:type="dxa"/>
-            </w:tcMar>
-          </w:tcPr>
-          <w:p>
-            <w:pPr>
-              <w:spacing w:before="0" w:after="0" w:line="264" w:lineRule="auto"/>
-            </w:pPr>
-            <w:r>
-              <w:rPr>
-                <w:rFonts w:ascii="Arial" w:hAnsi="Arial"/>
-                <w:color w:val="0F172A"/>
-                <w:sz w:val="17"/>
-              </w:rPr>
-              <w:t>/api/admin/keys</w:t>
-            </w:r>
-          </w:p>
-        </w:tc>
-        <w:tc>
-          <w:tcPr>
-            <w:tcW w:type="dxa" w:w="1872"/>
-            <w:shd w:fill="F8FAFC"/>
-            <w:tcMar>
-              <w:top w:w="80" w:type="dxa"/>
-              <w:bottom w:w="80" w:type="dxa"/>
-              <w:left w:w="120" w:type="dxa"/>
-              <w:right w:w="120" w:type="dxa"/>
-            </w:tcMar>
-          </w:tcPr>
-          <w:p>
-            <w:pPr>
-              <w:spacing w:before="0" w:after="0" w:line="264" w:lineRule="auto"/>
-            </w:pPr>
-            <w:r>
-              <w:rPr>
-                <w:rFonts w:ascii="Arial" w:hAnsi="Arial"/>
-                <w:color w:val="0F172A"/>
-                <w:sz w:val="17"/>
-              </w:rPr>
-              <w:t>Dynamic API</w:t>
-            </w:r>
-          </w:p>
-        </w:tc>
-        <w:tc>
-          <w:tcPr>
-            <w:tcW w:type="dxa" w:w="4464"/>
-            <w:shd w:fill="F8FAFC"/>
-            <w:tcMar>
-              <w:top w:w="80" w:type="dxa"/>
-              <w:bottom w:w="80" w:type="dxa"/>
-              <w:left w:w="120" w:type="dxa"/>
-              <w:right w:w="120" w:type="dxa"/>
-            </w:tcMar>
-          </w:tcPr>
-          <w:p>
-            <w:pPr>
-              <w:spacing w:before="0" w:after="0" w:line="264" w:lineRule="auto"/>
-            </w:pPr>
-            <w:r>
-              <w:rPr>
-                <w:rFonts w:ascii="Arial" w:hAnsi="Arial"/>
-                <w:color w:val="0F172A"/>
-                <w:sz w:val="17"/>
-              </w:rPr>
-              <w:t>Batch Key Ingestion with 3-Slot Tagging, Channel Broadcast &amp; Waitlist Alert</w:t>
-            </w:r>
-          </w:p>
-        </w:tc>
-      </w:tr>
-      <w:tr>
-        <w:tc>
-          <w:tcPr>
-            <w:tcW w:type="dxa" w:w="3024"/>
-            <w:shd w:fill="FFFFFF"/>
-            <w:tcMar>
-              <w:top w:w="80" w:type="dxa"/>
-              <w:bottom w:w="80" w:type="dxa"/>
-              <w:left w:w="120" w:type="dxa"/>
-              <w:right w:w="120" w:type="dxa"/>
-            </w:tcMar>
-          </w:tcPr>
-          <w:p>
-            <w:pPr>
-              <w:spacing w:before="0" w:after="0" w:line="264" w:lineRule="auto"/>
-            </w:pPr>
-            <w:r>
-              <w:rPr>
-                <w:rFonts w:ascii="Arial" w:hAnsi="Arial"/>
-                <w:color w:val="0F172A"/>
-                <w:sz w:val="17"/>
-              </w:rPr>
-              <w:t>/api/admin/keys/dispatch</w:t>
-            </w:r>
-          </w:p>
-        </w:tc>
-        <w:tc>
-          <w:tcPr>
-            <w:tcW w:type="dxa" w:w="1872"/>
-            <w:shd w:fill="FFFFFF"/>
-            <w:tcMar>
-              <w:top w:w="80" w:type="dxa"/>
-              <w:bottom w:w="80" w:type="dxa"/>
-              <w:left w:w="120" w:type="dxa"/>
-              <w:right w:w="120" w:type="dxa"/>
-            </w:tcMar>
-          </w:tcPr>
-          <w:p>
-            <w:pPr>
-              <w:spacing w:before="0" w:after="0" w:line="264" w:lineRule="auto"/>
-            </w:pPr>
-            <w:r>
-              <w:rPr>
-                <w:rFonts w:ascii="Arial" w:hAnsi="Arial"/>
-                <w:color w:val="0F172A"/>
-                <w:sz w:val="17"/>
-              </w:rPr>
-              <w:t>Dynamic API</w:t>
-            </w:r>
-          </w:p>
-        </w:tc>
-        <w:tc>
-          <w:tcPr>
-            <w:tcW w:type="dxa" w:w="4464"/>
-            <w:shd w:fill="FFFFFF"/>
-            <w:tcMar>
-              <w:top w:w="80" w:type="dxa"/>
-              <w:bottom w:w="80" w:type="dxa"/>
-              <w:left w:w="120" w:type="dxa"/>
-              <w:right w:w="120" w:type="dxa"/>
-            </w:tcMar>
-          </w:tcPr>
-          <w:p>
-            <w:pPr>
-              <w:spacing w:before="0" w:after="0" w:line="264" w:lineRule="auto"/>
-            </w:pPr>
-            <w:r>
-              <w:rPr>
-                <w:rFonts w:ascii="Arial" w:hAnsi="Arial"/>
-                <w:color w:val="0F172A"/>
-                <w:sz w:val="17"/>
-              </w:rPr>
-              <w:t>Manual 1, 2, or 3-Slot Direct Customer Key Dispatch</w:t>
-            </w:r>
-          </w:p>
-        </w:tc>
-      </w:tr>
-      <w:tr>
-        <w:tc>
-          <w:tcPr>
-            <w:tcW w:type="dxa" w:w="3024"/>
-            <w:shd w:fill="F8FAFC"/>
-            <w:tcMar>
-              <w:top w:w="80" w:type="dxa"/>
-              <w:bottom w:w="80" w:type="dxa"/>
-              <w:left w:w="120" w:type="dxa"/>
-              <w:right w:w="120" w:type="dxa"/>
-            </w:tcMar>
-          </w:tcPr>
-          <w:p>
-            <w:pPr>
-              <w:spacing w:before="0" w:after="0" w:line="264" w:lineRule="auto"/>
-            </w:pPr>
-            <w:r>
-              <w:rPr>
-                <w:rFonts w:ascii="Arial" w:hAnsi="Arial"/>
-                <w:color w:val="0F172A"/>
-                <w:sz w:val="17"/>
-              </w:rPr>
-              <w:t>/api/admin/stats</w:t>
-            </w:r>
-          </w:p>
-        </w:tc>
-        <w:tc>
-          <w:tcPr>
-            <w:tcW w:type="dxa" w:w="1872"/>
-            <w:shd w:fill="F8FAFC"/>
-            <w:tcMar>
-              <w:top w:w="80" w:type="dxa"/>
-              <w:bottom w:w="80" w:type="dxa"/>
-              <w:left w:w="120" w:type="dxa"/>
-              <w:right w:w="120" w:type="dxa"/>
-            </w:tcMar>
-          </w:tcPr>
-          <w:p>
-            <w:pPr>
-              <w:spacing w:before="0" w:after="0" w:line="264" w:lineRule="auto"/>
-            </w:pPr>
-            <w:r>
-              <w:rPr>
-                <w:rFonts w:ascii="Arial" w:hAnsi="Arial"/>
-                <w:color w:val="0F172A"/>
-                <w:sz w:val="17"/>
-              </w:rPr>
-              <w:t>Dynamic API</w:t>
-            </w:r>
-          </w:p>
-        </w:tc>
-        <w:tc>
-          <w:tcPr>
-            <w:tcW w:type="dxa" w:w="4464"/>
-            <w:shd w:fill="F8FAFC"/>
-            <w:tcMar>
-              <w:top w:w="80" w:type="dxa"/>
-              <w:bottom w:w="80" w:type="dxa"/>
-              <w:left w:w="120" w:type="dxa"/>
-              <w:right w:w="120" w:type="dxa"/>
-            </w:tcMar>
-          </w:tcPr>
-          <w:p>
-            <w:pPr>
-              <w:spacing w:before="0" w:after="0" w:line="264" w:lineRule="auto"/>
-            </w:pPr>
-            <w:r>
-              <w:rPr>
-                <w:rFonts w:ascii="Arial" w:hAnsi="Arial"/>
-                <w:color w:val="0F172A"/>
-                <w:sz w:val="17"/>
-              </w:rPr>
-              <w:t>Administrative Inventory Metrics, Revenue Totals &amp; Slot Analytics</w:t>
-            </w:r>
-          </w:p>
-        </w:tc>
-      </w:tr>
-      <w:tr>
-        <w:tc>
-          <w:tcPr>
-            <w:tcW w:type="dxa" w:w="3024"/>
-            <w:shd w:fill="FFFFFF"/>
-            <w:tcMar>
-              <w:top w:w="80" w:type="dxa"/>
-              <w:bottom w:w="80" w:type="dxa"/>
-              <w:left w:w="120" w:type="dxa"/>
-              <w:right w:w="120" w:type="dxa"/>
-            </w:tcMar>
-          </w:tcPr>
-          <w:p>
-            <w:pPr>
-              <w:spacing w:before="0" w:after="0" w:line="264" w:lineRule="auto"/>
-            </w:pPr>
-            <w:r>
-              <w:rPr>
-                <w:rFonts w:ascii="Arial" w:hAnsi="Arial"/>
-                <w:color w:val="0F172A"/>
-                <w:sz w:val="17"/>
-              </w:rPr>
-              <w:t>/api/admin/orders/approve</w:t>
-            </w:r>
-          </w:p>
-        </w:tc>
-        <w:tc>
-          <w:tcPr>
-            <w:tcW w:type="dxa" w:w="1872"/>
-            <w:shd w:fill="FFFFFF"/>
-            <w:tcMar>
-              <w:top w:w="80" w:type="dxa"/>
-              <w:bottom w:w="80" w:type="dxa"/>
-              <w:left w:w="120" w:type="dxa"/>
-              <w:right w:w="120" w:type="dxa"/>
-            </w:tcMar>
-          </w:tcPr>
-          <w:p>
-            <w:pPr>
-              <w:spacing w:before="0" w:after="0" w:line="264" w:lineRule="auto"/>
-            </w:pPr>
-            <w:r>
-              <w:rPr>
-                <w:rFonts w:ascii="Arial" w:hAnsi="Arial"/>
-                <w:color w:val="0F172A"/>
-                <w:sz w:val="17"/>
-              </w:rPr>
-              <w:t>Dynamic API</w:t>
-            </w:r>
-          </w:p>
-        </w:tc>
-        <w:tc>
-          <w:tcPr>
-            <w:tcW w:type="dxa" w:w="4464"/>
-            <w:shd w:fill="FFFFFF"/>
-            <w:tcMar>
-              <w:top w:w="80" w:type="dxa"/>
-              <w:bottom w:w="80" w:type="dxa"/>
-              <w:left w:w="120" w:type="dxa"/>
-              <w:right w:w="120" w:type="dxa"/>
-            </w:tcMar>
-          </w:tcPr>
-          <w:p>
-            <w:pPr>
-              <w:spacing w:before="0" w:after="0" w:line="264" w:lineRule="auto"/>
-            </w:pPr>
-            <w:r>
-              <w:rPr>
-                <w:rFonts w:ascii="Arial" w:hAnsi="Arial"/>
-                <w:color w:val="0F172A"/>
-                <w:sz w:val="17"/>
-              </w:rPr>
-              <w:t>Manual Order Approval with Atomic Slot Allocation &amp; Email Dispatch</w:t>
-            </w:r>
-          </w:p>
-        </w:tc>
-      </w:tr>
-      <w:tr>
-        <w:tc>
-          <w:tcPr>
-            <w:tcW w:type="dxa" w:w="3024"/>
-            <w:shd w:fill="F8FAFC"/>
-            <w:tcMar>
-              <w:top w:w="80" w:type="dxa"/>
-              <w:bottom w:w="80" w:type="dxa"/>
-              <w:left w:w="120" w:type="dxa"/>
-              <w:right w:w="120" w:type="dxa"/>
-            </w:tcMar>
-          </w:tcPr>
-          <w:p>
-            <w:pPr>
-              <w:spacing w:before="0" w:after="0" w:line="264" w:lineRule="auto"/>
-            </w:pPr>
-            <w:r>
-              <w:rPr>
-                <w:rFonts w:ascii="Arial" w:hAnsi="Arial"/>
-                <w:color w:val="0F172A"/>
-                <w:sz w:val="17"/>
-              </w:rPr>
-              <w:t>/api/admin/orders/reject</w:t>
-            </w:r>
-          </w:p>
-        </w:tc>
-        <w:tc>
-          <w:tcPr>
-            <w:tcW w:type="dxa" w:w="1872"/>
-            <w:shd w:fill="F8FAFC"/>
-            <w:tcMar>
-              <w:top w:w="80" w:type="dxa"/>
-              <w:bottom w:w="80" w:type="dxa"/>
-              <w:left w:w="120" w:type="dxa"/>
-              <w:right w:w="120" w:type="dxa"/>
-            </w:tcMar>
-          </w:tcPr>
-          <w:p>
-            <w:pPr>
-              <w:spacing w:before="0" w:after="0" w:line="264" w:lineRule="auto"/>
-            </w:pPr>
-            <w:r>
-              <w:rPr>
-                <w:rFonts w:ascii="Arial" w:hAnsi="Arial"/>
-                <w:color w:val="0F172A"/>
-                <w:sz w:val="17"/>
-              </w:rPr>
-              <w:t>Dynamic API</w:t>
-            </w:r>
-          </w:p>
-        </w:tc>
-        <w:tc>
-          <w:tcPr>
-            <w:tcW w:type="dxa" w:w="4464"/>
-            <w:shd w:fill="F8FAFC"/>
-            <w:tcMar>
-              <w:top w:w="80" w:type="dxa"/>
-              <w:bottom w:w="80" w:type="dxa"/>
-              <w:left w:w="120" w:type="dxa"/>
-              <w:right w:w="120" w:type="dxa"/>
-            </w:tcMar>
-          </w:tcPr>
-          <w:p>
-            <w:pPr>
-              <w:spacing w:before="0" w:after="0" w:line="264" w:lineRule="auto"/>
-            </w:pPr>
-            <w:r>
-              <w:rPr>
-                <w:rFonts w:ascii="Arial" w:hAnsi="Arial"/>
-                <w:color w:val="0F172A"/>
-                <w:sz w:val="17"/>
-              </w:rPr>
-              <w:t>Manual Order Rejection &amp; Reason Logging</w:t>
-            </w:r>
-          </w:p>
-        </w:tc>
-      </w:tr>
-      <w:tr>
-        <w:tc>
-          <w:tcPr>
-            <w:tcW w:type="dxa" w:w="3024"/>
-            <w:shd w:fill="FFFFFF"/>
-            <w:tcMar>
-              <w:top w:w="80" w:type="dxa"/>
-              <w:bottom w:w="80" w:type="dxa"/>
-              <w:left w:w="120" w:type="dxa"/>
-              <w:right w:w="120" w:type="dxa"/>
-            </w:tcMar>
-          </w:tcPr>
-          <w:p>
-            <w:pPr>
-              <w:spacing w:before="0" w:after="0" w:line="264" w:lineRule="auto"/>
-            </w:pPr>
-            <w:r>
-              <w:rPr>
-                <w:rFonts w:ascii="Arial" w:hAnsi="Arial"/>
-                <w:color w:val="0F172A"/>
-                <w:sz w:val="17"/>
-              </w:rPr>
-              <w:t>/api/admin/orders/quick-approve</w:t>
-            </w:r>
-          </w:p>
-        </w:tc>
-        <w:tc>
-          <w:tcPr>
-            <w:tcW w:type="dxa" w:w="1872"/>
-            <w:shd w:fill="FFFFFF"/>
-            <w:tcMar>
-              <w:top w:w="80" w:type="dxa"/>
-              <w:bottom w:w="80" w:type="dxa"/>
-              <w:left w:w="120" w:type="dxa"/>
-              <w:right w:w="120" w:type="dxa"/>
-            </w:tcMar>
-          </w:tcPr>
-          <w:p>
-            <w:pPr>
-              <w:spacing w:before="0" w:after="0" w:line="264" w:lineRule="auto"/>
-            </w:pPr>
-            <w:r>
-              <w:rPr>
-                <w:rFonts w:ascii="Arial" w:hAnsi="Arial"/>
-                <w:color w:val="0F172A"/>
-                <w:sz w:val="17"/>
-              </w:rPr>
-              <w:t>Dynamic API</w:t>
-            </w:r>
-          </w:p>
-        </w:tc>
-        <w:tc>
-          <w:tcPr>
-            <w:tcW w:type="dxa" w:w="4464"/>
-            <w:shd w:fill="FFFFFF"/>
-            <w:tcMar>
-              <w:top w:w="80" w:type="dxa"/>
-              <w:bottom w:w="80" w:type="dxa"/>
-              <w:left w:w="120" w:type="dxa"/>
-              <w:right w:w="120" w:type="dxa"/>
-            </w:tcMar>
-          </w:tcPr>
-          <w:p>
-            <w:pPr>
-              <w:spacing w:before="0" w:after="0" w:line="264" w:lineRule="auto"/>
-            </w:pPr>
-            <w:r>
-              <w:rPr>
-                <w:rFonts w:ascii="Arial" w:hAnsi="Arial"/>
-                <w:color w:val="0F172A"/>
-                <w:sz w:val="17"/>
-              </w:rPr>
-              <w:t>Discord 1-Click Quick Approval Action Endpoint</w:t>
-            </w:r>
-          </w:p>
-        </w:tc>
-      </w:tr>
-      <w:tr>
-        <w:tc>
-          <w:tcPr>
-            <w:tcW w:type="dxa" w:w="3024"/>
-            <w:shd w:fill="F8FAFC"/>
-            <w:tcMar>
-              <w:top w:w="80" w:type="dxa"/>
-              <w:bottom w:w="80" w:type="dxa"/>
-              <w:left w:w="120" w:type="dxa"/>
-              <w:right w:w="120" w:type="dxa"/>
-            </w:tcMar>
-          </w:tcPr>
-          <w:p>
-            <w:pPr>
-              <w:spacing w:before="0" w:after="0" w:line="264" w:lineRule="auto"/>
-            </w:pPr>
-            <w:r>
-              <w:rPr>
-                <w:rFonts w:ascii="Arial" w:hAnsi="Arial"/>
-                <w:color w:val="0F172A"/>
-                <w:sz w:val="17"/>
-              </w:rPr>
-              <w:t>/api/admin/orders/quick-reject</w:t>
-            </w:r>
-          </w:p>
-        </w:tc>
-        <w:tc>
-          <w:tcPr>
-            <w:tcW w:type="dxa" w:w="1872"/>
-            <w:shd w:fill="F8FAFC"/>
-            <w:tcMar>
-              <w:top w:w="80" w:type="dxa"/>
-              <w:bottom w:w="80" w:type="dxa"/>
-              <w:left w:w="120" w:type="dxa"/>
-              <w:right w:w="120" w:type="dxa"/>
-            </w:tcMar>
-          </w:tcPr>
-          <w:p>
-            <w:pPr>
-              <w:spacing w:before="0" w:after="0" w:line="264" w:lineRule="auto"/>
-            </w:pPr>
-            <w:r>
-              <w:rPr>
-                <w:rFonts w:ascii="Arial" w:hAnsi="Arial"/>
-                <w:color w:val="0F172A"/>
-                <w:sz w:val="17"/>
-              </w:rPr>
-              <w:t>Dynamic API</w:t>
-            </w:r>
-          </w:p>
-        </w:tc>
-        <w:tc>
-          <w:tcPr>
-            <w:tcW w:type="dxa" w:w="4464"/>
-            <w:shd w:fill="F8FAFC"/>
-            <w:tcMar>
-              <w:top w:w="80" w:type="dxa"/>
-              <w:bottom w:w="80" w:type="dxa"/>
-              <w:left w:w="120" w:type="dxa"/>
-              <w:right w:w="120" w:type="dxa"/>
-            </w:tcMar>
-          </w:tcPr>
-          <w:p>
-            <w:pPr>
-              <w:spacing w:before="0" w:after="0" w:line="264" w:lineRule="auto"/>
-            </w:pPr>
-            <w:r>
-              <w:rPr>
-                <w:rFonts w:ascii="Arial" w:hAnsi="Arial"/>
-                <w:color w:val="0F172A"/>
-                <w:sz w:val="17"/>
-              </w:rPr>
-              <w:t>Discord 1-Click Quick Rejection Action Endpoint</w:t>
-            </w:r>
-          </w:p>
-        </w:tc>
-      </w:tr>
-      <w:tr>
-        <w:tc>
-          <w:tcPr>
-            <w:tcW w:type="dxa" w:w="3024"/>
-            <w:shd w:fill="FFFFFF"/>
-            <w:tcMar>
-              <w:top w:w="80" w:type="dxa"/>
-              <w:bottom w:w="80" w:type="dxa"/>
-              <w:left w:w="120" w:type="dxa"/>
-              <w:right w:w="120" w:type="dxa"/>
-            </w:tcMar>
-          </w:tcPr>
-          <w:p>
-            <w:pPr>
-              <w:spacing w:before="0" w:after="0" w:line="264" w:lineRule="auto"/>
-            </w:pPr>
-            <w:r>
-              <w:rPr>
-                <w:rFonts w:ascii="Arial" w:hAnsi="Arial"/>
-                <w:color w:val="0F172A"/>
-                <w:sz w:val="17"/>
-              </w:rPr>
-              <w:t>/api/reviews</w:t>
-            </w:r>
-          </w:p>
-        </w:tc>
-        <w:tc>
-          <w:tcPr>
-            <w:tcW w:type="dxa" w:w="1872"/>
-            <w:shd w:fill="FFFFFF"/>
-            <w:tcMar>
-              <w:top w:w="80" w:type="dxa"/>
-              <w:bottom w:w="80" w:type="dxa"/>
-              <w:left w:w="120" w:type="dxa"/>
-              <w:right w:w="120" w:type="dxa"/>
-            </w:tcMar>
-          </w:tcPr>
-          <w:p>
-            <w:pPr>
-              <w:spacing w:before="0" w:after="0" w:line="264" w:lineRule="auto"/>
-            </w:pPr>
-            <w:r>
-              <w:rPr>
-                <w:rFonts w:ascii="Arial" w:hAnsi="Arial"/>
-                <w:color w:val="0F172A"/>
-                <w:sz w:val="17"/>
-              </w:rPr>
-              <w:t>Dynamic API</w:t>
-            </w:r>
-          </w:p>
-        </w:tc>
-        <w:tc>
-          <w:tcPr>
-            <w:tcW w:type="dxa" w:w="4464"/>
-            <w:shd w:fill="FFFFFF"/>
-            <w:tcMar>
-              <w:top w:w="80" w:type="dxa"/>
-              <w:bottom w:w="80" w:type="dxa"/>
-              <w:left w:w="120" w:type="dxa"/>
-              <w:right w:w="120" w:type="dxa"/>
-            </w:tcMar>
-          </w:tcPr>
-          <w:p>
-            <w:pPr>
-              <w:spacing w:before="0" w:after="0" w:line="264" w:lineRule="auto"/>
-            </w:pPr>
-            <w:r>
-              <w:rPr>
-                <w:rFonts w:ascii="Arial" w:hAnsi="Arial"/>
-                <w:color w:val="0F172A"/>
-                <w:sz w:val="17"/>
-              </w:rPr>
-              <w:t>Verified Customer Reviews Ingestion &amp; Aggregate Rating Feed</w:t>
+              <w:t>Customer Out-of-Stock Email Waitlist Registration</w:t>
             </w:r>
           </w:p>
         </w:tc>
       </w:tr>
     </w:tbl>
+    <w:p>
+      <w:pPr>
+        <w:spacing w:after="240"/>
+      </w:pPr>
+    </w:p>
     <w:p>
       <w:pPr>
         <w:keepNext/>
@@ -4479,116 +3234,89 @@
           <w:color w:val="0E7490"/>
           <w:sz w:val="28"/>
         </w:rPr>
-        <w:t>11. Operational Runbook &amp; CI/CD Deployment Guide</w:t>
+        <w:t>11. Security &amp; Cryptographic Specifications</w:t>
       </w:r>
     </w:p>
     <w:p>
       <w:pPr>
-        <w:spacing w:before="0" w:after="120" w:line="276" w:lineRule="auto"/>
+        <w:spacing w:after="120" w:line="276" w:lineRule="auto"/>
       </w:pPr>
       <w:r>
         <w:rPr>
           <w:rFonts w:ascii="Arial" w:hAnsi="Arial"/>
           <w:color w:val="0F172A"/>
-          <w:sz w:val="20"/>
+          <w:sz w:val="19"/>
         </w:rPr>
-        <w:t>Instructions for running, maintaining, and deploying AETHERIA in production:</w:t>
+        <w:t>Institutional-grade data protection standards enforced across all transactions:</w:t>
       </w:r>
     </w:p>
     <w:p>
       <w:pPr>
         <w:pStyle w:val="ListBullet"/>
-        <w:spacing w:before="0" w:after="60" w:line="276" w:lineRule="auto"/>
+        <w:spacing w:after="60" w:line="276" w:lineRule="auto"/>
       </w:pPr>
       <w:r>
         <w:rPr>
           <w:rFonts w:ascii="Arial" w:hAnsi="Arial"/>
           <w:b/>
           <w:color w:val="0F172A"/>
-          <w:sz w:val="20"/>
+          <w:sz w:val="19"/>
         </w:rPr>
-        <w:t xml:space="preserve">Environment Configuration (.env.local): </w:t>
+        <w:t xml:space="preserve">AES-256-GCM Encryption: </w:t>
       </w:r>
       <w:r>
         <w:rPr>
           <w:rFonts w:ascii="Arial" w:hAnsi="Arial"/>
-          <w:b w:val="0"/>
           <w:color w:val="0F172A"/>
-          <w:sz w:val="20"/>
+          <w:sz w:val="19"/>
         </w:rPr>
-        <w:t>Configure all required keys: FIREBASE_PROJECT_ID, FIREBASE_CLIENT_EMAIL, FIREBASE_PRIVATE_KEY, KEY_ENCRYPTION_SECRET, GMAIL_USER, GMAIL_APP_PASSWORD, RESEND_API_KEY, TELEGRAM_BOT_TOKEN, TELEGRAM_PROOF_CHANNEL, and ADMIN_API_SECRET.</w:t>
+        <w:t>All raw license keys stored in Firestore collection 'keys' are encrypted at rest using unique 12-byte IVs and 16-byte authentication tags.</w:t>
       </w:r>
     </w:p>
     <w:p>
       <w:pPr>
         <w:pStyle w:val="ListBullet"/>
-        <w:spacing w:before="0" w:after="60" w:line="276" w:lineRule="auto"/>
+        <w:spacing w:after="60" w:line="276" w:lineRule="auto"/>
       </w:pPr>
       <w:r>
         <w:rPr>
           <w:rFonts w:ascii="Arial" w:hAnsi="Arial"/>
           <w:b/>
           <w:color w:val="0F172A"/>
-          <w:sz w:val="20"/>
+          <w:sz w:val="19"/>
         </w:rPr>
-        <w:t xml:space="preserve">Local Development Server: </w:t>
+        <w:t xml:space="preserve">Zero Sensitive Data Retention: </w:t>
       </w:r>
       <w:r>
         <w:rPr>
           <w:rFonts w:ascii="Arial" w:hAnsi="Arial"/>
-          <w:b w:val="0"/>
           <w:color w:val="0F172A"/>
-          <w:sz w:val="20"/>
+          <w:sz w:val="19"/>
         </w:rPr>
-        <w:t>Execute 'npm run dev' to launch on http://localhost:3000.</w:t>
+        <w:t>The SMS Bridge explicitly drops all incoming OTPs and login codes, storing only validated bank credit references.</w:t>
       </w:r>
     </w:p>
     <w:p>
       <w:pPr>
         <w:pStyle w:val="ListBullet"/>
-        <w:spacing w:before="0" w:after="60" w:line="276" w:lineRule="auto"/>
+        <w:spacing w:after="60" w:line="276" w:lineRule="auto"/>
       </w:pPr>
       <w:r>
         <w:rPr>
           <w:rFonts w:ascii="Arial" w:hAnsi="Arial"/>
           <w:b/>
           <w:color w:val="0F172A"/>
-          <w:sz w:val="20"/>
+          <w:sz w:val="19"/>
         </w:rPr>
-        <w:t xml:space="preserve">Production Verification Build: </w:t>
+        <w:t xml:space="preserve">Admin Secret Authentication: </w:t>
       </w:r>
       <w:r>
         <w:rPr>
           <w:rFonts w:ascii="Arial" w:hAnsi="Arial"/>
-          <w:b w:val="0"/>
           <w:color w:val="0F172A"/>
-          <w:sz w:val="20"/>
+          <w:sz w:val="19"/>
         </w:rPr>
-        <w:t>Execute 'npm run build' — verifies compilation and TypeScript validity across all routes.</w:t>
-      </w:r>
-    </w:p>
-    <w:p>
-      <w:pPr>
-        <w:pStyle w:val="ListBullet"/>
-        <w:spacing w:before="0" w:after="60" w:line="276" w:lineRule="auto"/>
-      </w:pPr>
-      <w:r>
-        <w:rPr>
-          <w:rFonts w:ascii="Arial" w:hAnsi="Arial"/>
-          <w:b/>
-          <w:color w:val="0F172A"/>
-          <w:sz w:val="20"/>
-        </w:rPr>
-        <w:t xml:space="preserve">Automated Vercel Deployment: </w:t>
-      </w:r>
-      <w:r>
-        <w:rPr>
-          <w:rFonts w:ascii="Arial" w:hAnsi="Arial"/>
-          <w:b w:val="0"/>
-          <w:color w:val="0F172A"/>
-          <w:sz w:val="20"/>
-        </w:rPr>
-        <w:t>Pushing commits to branch 'main' automatically triggers Vercel CI/CD pipeline, deploying to https://aetheria-store.vercel.app with zero downtime.</w:t>
+        <w:t>Admin API endpoints require authenticated 'x-admin-secret' headers matching ADMIN_API_SECRET in environment variables.</w:t>
       </w:r>
     </w:p>
     <w:sectPr>

</xml_diff>

<commit_message>
docs: add section 8 telegram live group radar to system architecture
</commit_message>
<xml_diff>
--- a/docs/Documentation.docx
+++ b/docs/Documentation.docx
@@ -2,7 +2,7 @@
 <file path=word/document.xml><?xml version="1.0" encoding="utf-8"?>
 <w:document xmlns:w="http://schemas.openxmlformats.org/wordprocessingml/2006/main" xmlns:m="http://schemas.openxmlformats.org/officeDocument/2006/math" xmlns:r="http://schemas.openxmlformats.org/officeDocument/2006/relationships" xmlns:o="urn:schemas-microsoft-com:office:office" xmlns:v="urn:schemas-microsoft-com:vml" xmlns:w10="urn:schemas-microsoft-com:office:word" xmlns:a="http://schemas.openxmlformats.org/drawingml/2006/main" xmlns:pic="http://schemas.openxmlformats.org/drawingml/2006/picture" xmlns:wp="http://schemas.openxmlformats.org/drawingml/2006/wordprocessingDrawing">
   <w:body>
-    <w:bookmarkStart w:id="43" w:name="X4aa5aed52caef848dbb7ae26c2f43e284eb533b"/>
+    <w:bookmarkStart w:id="44" w:name="X4aa5aed52caef848dbb7ae26c2f43e284eb533b"/>
     <w:p>
       <w:pPr>
         <w:pStyle w:val="Heading1"/>
@@ -546,6 +546,40 @@
       </w:r>
       <w:r>
         <w:t xml:space="preserve">: Standalone comment crawler microservice monitoring target creator channels and viral Shorts in real time, routing high-intent buyer leads directly to the owner’s Telegram.</w:t>
+      </w:r>
+      <w:r>
+        <w:t xml:space="preserve"> </w:t>
+      </w:r>
+      <w:r>
+        <w:t xml:space="preserve">8.</w:t>
+      </w:r>
+      <w:r>
+        <w:t xml:space="preserve"> </w:t>
+      </w:r>
+      <w:r>
+        <w:rPr>
+          <w:b/>
+          <w:bCs/>
+        </w:rPr>
+        <w:t xml:space="preserve">Telegram Live Group Radar (</w:t>
+      </w:r>
+      <w:r>
+        <w:rPr>
+          <w:rStyle w:val="VerbatimChar"/>
+          <w:b/>
+          <w:bCs/>
+        </w:rPr>
+        <w:t xml:space="preserve">telegram-key-notifier</w:t>
+      </w:r>
+      <w:r>
+        <w:rPr>
+          <w:b/>
+          <w:bCs/>
+        </w:rPr>
+        <w:t xml:space="preserve">)</w:t>
+      </w:r>
+      <w:r>
+        <w:t xml:space="preserve">: Standalone MTProto listener microservice monitoring 9 high-traffic Indian Pokemon GO and PGSharp trading groups in real time, routing high-intent buyer leads directly to the owner’s Telegram.</w:t>
       </w:r>
     </w:p>
     <w:p>
@@ -2485,22 +2519,354 @@
       </w:r>
     </w:p>
     <w:bookmarkEnd w:id="35"/>
-    <w:bookmarkStart w:id="39" w:name="X6db8a6fe6a898cc68ce14e0d5c4b5d0c9d92a97"/>
+    <w:bookmarkStart w:id="36" w:name="Xda63d3ee28e4b32e5d18fa0dc2fa89c26024374"/>
     <w:p>
       <w:pPr>
         <w:pStyle w:val="Heading2"/>
       </w:pPr>
       <w:r>
-        <w:t xml:space="preserve">8. Telegram Bot &amp; Channel Announcement Architecture</w:t>
-      </w:r>
-    </w:p>
-    <w:bookmarkStart w:id="36" w:name="X02ae9847bd9588ccf72013de6dc22b2efcf9bdb"/>
+        <w:t xml:space="preserve">8. Telegram Live Group Radar (</w:t>
+      </w:r>
+      <w:r>
+        <w:rPr>
+          <w:rStyle w:val="VerbatimChar"/>
+        </w:rPr>
+        <w:t xml:space="preserve">telegram-key-notifier</w:t>
+      </w:r>
+      <w:r>
+        <w:t xml:space="preserve">)</w:t>
+      </w:r>
+    </w:p>
+    <w:p>
+      <w:pPr>
+        <w:pStyle w:val="FirstParagraph"/>
+      </w:pPr>
+      <w:r>
+        <w:t xml:space="preserve">A dedicated standalone Node.js microservice located in</w:t>
+      </w:r>
+      <w:r>
+        <w:t xml:space="preserve"> </w:t>
+      </w:r>
+      <w:r>
+        <w:rPr>
+          <w:rStyle w:val="VerbatimChar"/>
+        </w:rPr>
+        <w:t xml:space="preserve">/telegram-key-notifier</w:t>
+      </w:r>
+      <w:r>
+        <w:t xml:space="preserve">:</w:t>
+      </w:r>
+      <w:r>
+        <w:t xml:space="preserve"> </w:t>
+      </w:r>
+      <w:r>
+        <w:t xml:space="preserve">-</w:t>
+      </w:r>
+      <w:r>
+        <w:t xml:space="preserve"> </w:t>
+      </w:r>
+      <w:r>
+        <w:rPr>
+          <w:b/>
+          <w:bCs/>
+        </w:rPr>
+        <w:t xml:space="preserve">Direct MTProto Client Connection</w:t>
+      </w:r>
+      <w:r>
+        <w:t xml:space="preserve">: Utilizes GramJS MTProto client to passively listen across 9 joined Indian Pokemon GO and PGSharp trading groups and channels (</w:t>
+      </w:r>
+      <w:r>
+        <w:rPr>
+          <w:rStyle w:val="VerbatimChar"/>
+        </w:rPr>
+        <w:t xml:space="preserve">targets.json</w:t>
+      </w:r>
+      <w:r>
+        <w:t xml:space="preserve">).</w:t>
+      </w:r>
+      <w:r>
+        <w:t xml:space="preserve"> </w:t>
+      </w:r>
+      <w:r>
+        <w:t xml:space="preserve">-</w:t>
+      </w:r>
+      <w:r>
+        <w:t xml:space="preserve"> </w:t>
+      </w:r>
+      <w:r>
+        <w:rPr>
+          <w:b/>
+          <w:bCs/>
+        </w:rPr>
+        <w:t xml:space="preserve">Strict Timestamp Cut-Off</w:t>
+      </w:r>
+      <w:r>
+        <w:t xml:space="preserve">: Only messages posted after</w:t>
+      </w:r>
+      <w:r>
+        <w:t xml:space="preserve"> </w:t>
+      </w:r>
+      <w:r>
+        <w:rPr>
+          <w:b/>
+          <w:bCs/>
+        </w:rPr>
+        <w:t xml:space="preserve">17-Sep-2026 10:53:00 PM IST</w:t>
+      </w:r>
+      <w:r>
+        <w:t xml:space="preserve"> </w:t>
+      </w:r>
+      <w:r>
+        <w:t xml:space="preserve">(</w:t>
+      </w:r>
+      <w:r>
+        <w:rPr>
+          <w:rStyle w:val="VerbatimChar"/>
+        </w:rPr>
+        <w:t xml:space="preserve">2026-09-17T17:23:00Z</w:t>
+      </w:r>
+      <w:r>
+        <w:t xml:space="preserve">) are evaluated. All historical messages are ignored.</w:t>
+      </w:r>
+      <w:r>
+        <w:t xml:space="preserve"> </w:t>
+      </w:r>
+      <w:r>
+        <w:t xml:space="preserve">-</w:t>
+      </w:r>
+      <w:r>
+        <w:t xml:space="preserve"> </w:t>
+      </w:r>
+      <w:r>
+        <w:rPr>
+          <w:b/>
+          <w:bCs/>
+        </w:rPr>
+        <w:t xml:space="preserve">English &amp; Hinglish Intent Matching</w:t>
+      </w:r>
+      <w:r>
+        <w:t xml:space="preserve">: Monitors for 33 high-intent buyer phrases (</w:t>
+      </w:r>
+      <w:r>
+        <w:rPr>
+          <w:rStyle w:val="VerbatimChar"/>
+        </w:rPr>
+        <w:t xml:space="preserve">key</w:t>
+      </w:r>
+      <w:r>
+        <w:t xml:space="preserve">,</w:t>
+      </w:r>
+      <w:r>
+        <w:t xml:space="preserve"> </w:t>
+      </w:r>
+      <w:r>
+        <w:rPr>
+          <w:rStyle w:val="VerbatimChar"/>
+        </w:rPr>
+        <w:t xml:space="preserve">pgsharp key</w:t>
+      </w:r>
+      <w:r>
+        <w:t xml:space="preserve">,</w:t>
+      </w:r>
+      <w:r>
+        <w:t xml:space="preserve"> </w:t>
+      </w:r>
+      <w:r>
+        <w:rPr>
+          <w:rStyle w:val="VerbatimChar"/>
+        </w:rPr>
+        <w:t xml:space="preserve">standard key</w:t>
+      </w:r>
+      <w:r>
+        <w:t xml:space="preserve">,</w:t>
+      </w:r>
+      <w:r>
+        <w:t xml:space="preserve"> </w:t>
+      </w:r>
+      <w:r>
+        <w:rPr>
+          <w:rStyle w:val="VerbatimChar"/>
+        </w:rPr>
+        <w:t xml:space="preserve">buy key</w:t>
+      </w:r>
+      <w:r>
+        <w:t xml:space="preserve">,</w:t>
+      </w:r>
+      <w:r>
+        <w:t xml:space="preserve"> </w:t>
+      </w:r>
+      <w:r>
+        <w:rPr>
+          <w:rStyle w:val="VerbatimChar"/>
+        </w:rPr>
+        <w:t xml:space="preserve">kitne ka</w:t>
+      </w:r>
+      <w:r>
+        <w:t xml:space="preserve">,</w:t>
+      </w:r>
+      <w:r>
+        <w:t xml:space="preserve"> </w:t>
+      </w:r>
+      <w:r>
+        <w:rPr>
+          <w:rStyle w:val="VerbatimChar"/>
+        </w:rPr>
+        <w:t xml:space="preserve">kaise milegi</w:t>
+      </w:r>
+      <w:r>
+        <w:t xml:space="preserve">,</w:t>
+      </w:r>
+      <w:r>
+        <w:t xml:space="preserve"> </w:t>
+      </w:r>
+      <w:r>
+        <w:rPr>
+          <w:rStyle w:val="VerbatimChar"/>
+        </w:rPr>
+        <w:t xml:space="preserve">kahan se lu</w:t>
+      </w:r>
+      <w:r>
+        <w:t xml:space="preserve">,</w:t>
+      </w:r>
+      <w:r>
+        <w:t xml:space="preserve"> </w:t>
+      </w:r>
+      <w:r>
+        <w:rPr>
+          <w:rStyle w:val="VerbatimChar"/>
+        </w:rPr>
+        <w:t xml:space="preserve">kaise buy kare</w:t>
+      </w:r>
+      <w:r>
+        <w:t xml:space="preserve">,</w:t>
+      </w:r>
+      <w:r>
+        <w:t xml:space="preserve"> </w:t>
+      </w:r>
+      <w:r>
+        <w:rPr>
+          <w:rStyle w:val="VerbatimChar"/>
+        </w:rPr>
+        <w:t xml:space="preserve">key chahiye</w:t>
+      </w:r>
+      <w:r>
+        <w:t xml:space="preserve">) with word-boundary regex.</w:t>
+      </w:r>
+      <w:r>
+        <w:t xml:space="preserve"> </w:t>
+      </w:r>
+      <w:r>
+        <w:t xml:space="preserve">-</w:t>
+      </w:r>
+      <w:r>
+        <w:t xml:space="preserve"> </w:t>
+      </w:r>
+      <w:r>
+        <w:rPr>
+          <w:b/>
+          <w:bCs/>
+        </w:rPr>
+        <w:t xml:space="preserve">Self-Sender Exclusion</w:t>
+      </w:r>
+      <w:r>
+        <w:t xml:space="preserve">: Automatically detects and ignores messages sent by the owner (</w:t>
+      </w:r>
+      <w:r>
+        <w:rPr>
+          <w:rStyle w:val="VerbatimChar"/>
+        </w:rPr>
+        <w:t xml:space="preserve">@sleekfx3</w:t>
+      </w:r>
+      <w:r>
+        <w:t xml:space="preserve">) to avoid false-positive self-notifications.</w:t>
+      </w:r>
+      <w:r>
+        <w:t xml:space="preserve"> </w:t>
+      </w:r>
+      <w:r>
+        <w:t xml:space="preserve">-</w:t>
+      </w:r>
+      <w:r>
+        <w:t xml:space="preserve"> </w:t>
+      </w:r>
+      <w:r>
+        <w:rPr>
+          <w:b/>
+          <w:bCs/>
+        </w:rPr>
+        <w:t xml:space="preserve">Zero-Emoji Mobile Alerts</w:t>
+      </w:r>
+      <w:r>
+        <w:t xml:space="preserve">: Immediately pushes formatted alert cards to the owner’s Telegram with group title, commenter name/username, exact message snippet, and a 1-tap direct jump link (</w:t>
+      </w:r>
+      <w:r>
+        <w:rPr>
+          <w:rStyle w:val="VerbatimChar"/>
+        </w:rPr>
+        <w:t xml:space="preserve">https://t.me/{chat}/{messageId}</w:t>
+      </w:r>
+      <w:r>
+        <w:t xml:space="preserve">).</w:t>
+      </w:r>
+      <w:r>
+        <w:t xml:space="preserve"> </w:t>
+      </w:r>
+      <w:r>
+        <w:t xml:space="preserve">-</w:t>
+      </w:r>
+      <w:r>
+        <w:t xml:space="preserve"> </w:t>
+      </w:r>
+      <w:r>
+        <w:rPr>
+          <w:b/>
+          <w:bCs/>
+        </w:rPr>
+        <w:t xml:space="preserve">Local Health Dashboard</w:t>
+      </w:r>
+      <w:r>
+        <w:t xml:space="preserve">: Built-in HTTP dashboard at</w:t>
+      </w:r>
+      <w:r>
+        <w:t xml:space="preserve"> </w:t>
+      </w:r>
+      <w:r>
+        <w:rPr>
+          <w:rStyle w:val="VerbatimChar"/>
+        </w:rPr>
+        <w:t xml:space="preserve">http://localhost:3002</w:t>
+      </w:r>
+      <w:r>
+        <w:t xml:space="preserve"> </w:t>
+      </w:r>
+      <w:r>
+        <w:t xml:space="preserve">reporting MTProto connection status, monitored targets count, keywords count, and total leads detected.</w:t>
+      </w:r>
+    </w:p>
+    <w:p>
+      <w:r>
+        <w:pict>
+          <v:rect style="width:0;height:1.5pt" o:hralign="center" o:hrstd="t" o:hr="t"/>
+        </w:pict>
+      </w:r>
+    </w:p>
+    <w:bookmarkEnd w:id="36"/>
+    <w:bookmarkStart w:id="40" w:name="X6db8a6fe6a898cc68ce14e0d5c4b5d0c9d92a97"/>
+    <w:p>
+      <w:pPr>
+        <w:pStyle w:val="Heading2"/>
+      </w:pPr>
+      <w:r>
+        <w:t xml:space="preserve">9. Telegram Bot &amp; Channel Announcement Architecture</w:t>
+      </w:r>
+    </w:p>
+    <w:bookmarkStart w:id="37" w:name="X02ae9847bd9588ccf72013de6dc22b2efcf9bdb"/>
     <w:p>
       <w:pPr>
         <w:pStyle w:val="Heading3"/>
       </w:pPr>
       <w:r>
-        <w:t xml:space="preserve">8.1 Minimal 4-Line QR Screen &amp; Progressive Disclosure</w:t>
+        <w:t xml:space="preserve">9.1 Minimal 4-Line QR Screen &amp; Progressive Disclosure</w:t>
       </w:r>
     </w:p>
     <w:p>
@@ -2650,14 +3016,14 @@
         <w:t xml:space="preserve">.</w:t>
       </w:r>
     </w:p>
-    <w:bookmarkEnd w:id="36"/>
-    <w:bookmarkStart w:id="37" w:name="X47c82301dd07ef9336c1959c2655ff3cb0eb7c9"/>
+    <w:bookmarkEnd w:id="37"/>
+    <w:bookmarkStart w:id="38" w:name="X47c82301dd07ef9336c1959c2655ff3cb0eb7c9"/>
     <w:p>
       <w:pPr>
         <w:pStyle w:val="Heading3"/>
       </w:pPr>
       <w:r>
-        <w:t xml:space="preserve">8.2 Viral Telegram Referral &amp; Reward Engine (</w:t>
+        <w:t xml:space="preserve">9.2 Viral Telegram Referral &amp; Reward Engine (</w:t>
       </w:r>
       <w:r>
         <w:t xml:space="preserve">“Refer &amp; Earn”</w:t>
@@ -2783,14 +3149,52 @@
         <w:t xml:space="preserve">) redeemable on future renewals.</w:t>
       </w:r>
     </w:p>
-    <w:bookmarkEnd w:id="37"/>
-    <w:bookmarkStart w:id="38" w:name="X13842493e6922ba38d3777ad41b96aa6b5a6e6c"/>
+    <w:p>
+      <w:pPr>
+        <w:pStyle w:val="Compact"/>
+        <w:numPr>
+          <w:ilvl w:val="0"/>
+          <w:numId w:val="1010"/>
+        </w:numPr>
+      </w:pPr>
+      <w:r>
+        <w:rPr>
+          <w:b/>
+          <w:bCs/>
+        </w:rPr>
+        <w:t xml:space="preserve">Milestone Rewards</w:t>
+      </w:r>
+      <w:r>
+        <w:t xml:space="preserve">: Scaled milestone rewards (3 invites = 50% Off, 5 invites = 1 Free Standard Key for 30 Days).</w:t>
+      </w:r>
+    </w:p>
+    <w:p>
+      <w:pPr>
+        <w:pStyle w:val="Compact"/>
+        <w:numPr>
+          <w:ilvl w:val="0"/>
+          <w:numId w:val="1010"/>
+        </w:numPr>
+      </w:pPr>
+      <w:r>
+        <w:rPr>
+          <w:b/>
+          <w:bCs/>
+        </w:rPr>
+        <w:t xml:space="preserve">Anti-Fraud Protections</w:t>
+      </w:r>
+      <w:r>
+        <w:t xml:space="preserve">: Device and IP fingerprinting, strict chat ID deduplication, and self-referral blocks.</w:t>
+      </w:r>
+    </w:p>
+    <w:bookmarkEnd w:id="38"/>
+    <w:bookmarkStart w:id="39" w:name="X13842493e6922ba38d3777ad41b96aa6b5a6e6c"/>
     <w:p>
       <w:pPr>
         <w:pStyle w:val="Heading3"/>
       </w:pPr>
       <w:r>
-        <w:t xml:space="preserve">8.3 Community Announcements &amp; Dedicated Vouches Architecture</w:t>
+        <w:t xml:space="preserve">9.3 Community Announcements &amp; Dedicated Vouches Architecture</w:t>
       </w:r>
     </w:p>
     <w:p>
@@ -2932,15 +3336,15 @@
         </w:pict>
       </w:r>
     </w:p>
-    <w:bookmarkEnd w:id="38"/>
     <w:bookmarkEnd w:id="39"/>
-    <w:bookmarkStart w:id="40" w:name="Xc4edd6052f2f0c16617110e07b8df38bba5d2da"/>
+    <w:bookmarkEnd w:id="40"/>
+    <w:bookmarkStart w:id="41" w:name="Xc4edd6052f2f0c16617110e07b8df38bba5d2da"/>
     <w:p>
       <w:pPr>
         <w:pStyle w:val="Heading2"/>
       </w:pPr>
       <w:r>
-        <w:t xml:space="preserve">8. Admin Command Center &amp; Vercel Storage Optimization</w:t>
+        <w:t xml:space="preserve">10. Admin Command Center &amp; Vercel Storage Optimization</w:t>
       </w:r>
     </w:p>
     <w:p>
@@ -2956,46 +3360,25 @@
           <w:b/>
           <w:bCs/>
         </w:rPr>
-        <w:t xml:space="preserve">Ghost Admin Camouflage</w:t>
-      </w:r>
-      <w:r>
-        <w:t xml:space="preserve">: Direct visits to</w:t>
-      </w:r>
-      <w:r>
-        <w:t xml:space="preserve"> </w:t>
-      </w:r>
-      <w:r>
-        <w:rPr>
-          <w:rStyle w:val="VerbatimChar"/>
+        <w:t xml:space="preserve">Unified Inventory Dashboard (</w:t>
+      </w:r>
+      <w:r>
+        <w:rPr>
+          <w:rStyle w:val="VerbatimChar"/>
+          <w:b/>
+          <w:bCs/>
         </w:rPr>
         <w:t xml:space="preserve">/admin</w:t>
       </w:r>
       <w:r>
-        <w:t xml:space="preserve"> </w:t>
-      </w:r>
-      <w:r>
-        <w:t xml:space="preserve">without authorization display an authentic</w:t>
-      </w:r>
-      <w:r>
-        <w:t xml:space="preserve"> </w:t>
-      </w:r>
-      <w:r>
-        <w:rPr>
-          <w:rStyle w:val="VerbatimChar"/>
-        </w:rPr>
-        <w:t xml:space="preserve">404 - Page Not Found</w:t>
-      </w:r>
-      <w:r>
-        <w:t xml:space="preserve">. Accessible only via secret bookmark (</w:t>
-      </w:r>
-      <w:r>
-        <w:rPr>
-          <w:rStyle w:val="VerbatimChar"/>
-        </w:rPr>
-        <w:t xml:space="preserve">/admin?key=YOUR_SECRET_KEY</w:t>
-      </w:r>
-      <w:r>
-        <w:t xml:space="preserve">) or triple-clicking the 404 badge.</w:t>
+        <w:rPr>
+          <w:b/>
+          <w:bCs/>
+        </w:rPr>
+        <w:t xml:space="preserve">)</w:t>
+      </w:r>
+      <w:r>
+        <w:t xml:space="preserve">: Real-time stats on available keys, low-stock threshold alerts, pending orders, and restock waitlist count.</w:t>
       </w:r>
     </w:p>
     <w:p>
@@ -3011,10 +3394,10 @@
           <w:b/>
           <w:bCs/>
         </w:rPr>
-        <w:t xml:space="preserve">Anti-Brute-Force Rate Limiting</w:t>
-      </w:r>
-      <w:r>
-        <w:t xml:space="preserve">: Client IP locked after 5 failed passcode attempts for 15 minutes.</w:t>
+        <w:t xml:space="preserve">Manual Key Allocation System</w:t>
+      </w:r>
+      <w:r>
+        <w:t xml:space="preserve">: Dedicated UI tab to directly allocate standard or duo keys to custom customer identifiers (Discord, Telegram, Reddit, Email) without website payment friction.</w:t>
       </w:r>
     </w:p>
     <w:p>
@@ -3030,10 +3413,10 @@
           <w:b/>
           <w:bCs/>
         </w:rPr>
-        <w:t xml:space="preserve">Live Firestore Coupon Engine</w:t>
-      </w:r>
-      <w:r>
-        <w:t xml:space="preserve">: Interactive CRUD for promotional coupons with 1-click permanent deletion.</w:t>
+        <w:t xml:space="preserve">Automated Waitlist Blast</w:t>
+      </w:r>
+      <w:r>
+        <w:t xml:space="preserve">: One-click and auto-on-upload restock alerts emailed to all waiting customers via direct Gmail SMTP.</w:t>
       </w:r>
     </w:p>
     <w:p>
@@ -3049,6 +3432,118 @@
           <w:b/>
           <w:bCs/>
         </w:rPr>
+        <w:t xml:space="preserve">Storage Optimization</w:t>
+      </w:r>
+      <w:r>
+        <w:t xml:space="preserve">: Firestore indexing and bounded document queries to minimize database read/write costs.</w:t>
+      </w:r>
+    </w:p>
+    <w:p>
+      <w:pPr>
+        <w:pStyle w:val="Compact"/>
+        <w:numPr>
+          <w:ilvl w:val="0"/>
+          <w:numId w:val="1012"/>
+        </w:numPr>
+      </w:pPr>
+      <w:r>
+        <w:rPr>
+          <w:b/>
+          <w:bCs/>
+        </w:rPr>
+        <w:t xml:space="preserve">Ghost Admin Camouflage</w:t>
+      </w:r>
+      <w:r>
+        <w:t xml:space="preserve">: Direct visits to</w:t>
+      </w:r>
+      <w:r>
+        <w:t xml:space="preserve"> </w:t>
+      </w:r>
+      <w:r>
+        <w:rPr>
+          <w:rStyle w:val="VerbatimChar"/>
+        </w:rPr>
+        <w:t xml:space="preserve">/admin</w:t>
+      </w:r>
+      <w:r>
+        <w:t xml:space="preserve"> </w:t>
+      </w:r>
+      <w:r>
+        <w:t xml:space="preserve">without authorization display an authentic</w:t>
+      </w:r>
+      <w:r>
+        <w:t xml:space="preserve"> </w:t>
+      </w:r>
+      <w:r>
+        <w:rPr>
+          <w:rStyle w:val="VerbatimChar"/>
+        </w:rPr>
+        <w:t xml:space="preserve">404 - Page Not Found</w:t>
+      </w:r>
+      <w:r>
+        <w:t xml:space="preserve">. Accessible only via secret bookmark (</w:t>
+      </w:r>
+      <w:r>
+        <w:rPr>
+          <w:rStyle w:val="VerbatimChar"/>
+        </w:rPr>
+        <w:t xml:space="preserve">/admin?key=YOUR_SECRET_KEY</w:t>
+      </w:r>
+      <w:r>
+        <w:t xml:space="preserve">) or triple-clicking the 404 badge.</w:t>
+      </w:r>
+    </w:p>
+    <w:p>
+      <w:pPr>
+        <w:pStyle w:val="Compact"/>
+        <w:numPr>
+          <w:ilvl w:val="0"/>
+          <w:numId w:val="1012"/>
+        </w:numPr>
+      </w:pPr>
+      <w:r>
+        <w:rPr>
+          <w:b/>
+          <w:bCs/>
+        </w:rPr>
+        <w:t xml:space="preserve">Anti-Brute-Force Rate Limiting</w:t>
+      </w:r>
+      <w:r>
+        <w:t xml:space="preserve">: Client IP locked after 5 failed passcode attempts for 15 minutes.</w:t>
+      </w:r>
+    </w:p>
+    <w:p>
+      <w:pPr>
+        <w:pStyle w:val="Compact"/>
+        <w:numPr>
+          <w:ilvl w:val="0"/>
+          <w:numId w:val="1012"/>
+        </w:numPr>
+      </w:pPr>
+      <w:r>
+        <w:rPr>
+          <w:b/>
+          <w:bCs/>
+        </w:rPr>
+        <w:t xml:space="preserve">Live Firestore Coupon Engine</w:t>
+      </w:r>
+      <w:r>
+        <w:t xml:space="preserve">: Interactive CRUD for promotional coupons with 1-click permanent deletion.</w:t>
+      </w:r>
+    </w:p>
+    <w:p>
+      <w:pPr>
+        <w:pStyle w:val="Compact"/>
+        <w:numPr>
+          <w:ilvl w:val="0"/>
+          <w:numId w:val="1012"/>
+        </w:numPr>
+      </w:pPr>
+      <w:r>
+        <w:rPr>
+          <w:b/>
+          <w:bCs/>
+        </w:rPr>
         <w:t xml:space="preserve">Vercel Deployment Storage Optimization</w:t>
       </w:r>
       <w:r>
@@ -3071,8 +3566,8 @@
         </w:pict>
       </w:r>
     </w:p>
-    <w:bookmarkEnd w:id="40"/>
-    <w:bookmarkStart w:id="41" w:name="X986e1743c333d831d4e1e700952f4427f78772c"/>
+    <w:bookmarkEnd w:id="41"/>
+    <w:bookmarkStart w:id="42" w:name="X986e1743c333d831d4e1e700952f4427f78772c"/>
     <w:p>
       <w:pPr>
         <w:pStyle w:val="Heading2"/>
@@ -3335,8 +3830,8 @@
         </w:pict>
       </w:r>
     </w:p>
-    <w:bookmarkEnd w:id="41"/>
-    <w:bookmarkStart w:id="42" w:name="production-route-summary"/>
+    <w:bookmarkEnd w:id="42"/>
+    <w:bookmarkStart w:id="43" w:name="production-route-summary"/>
     <w:p>
       <w:pPr>
         <w:pStyle w:val="Heading2"/>
@@ -4897,8 +5392,8 @@
         <w:t xml:space="preserve">AETHERIA Systems • Complete Technical Manual • Updated September 2026</w:t>
       </w:r>
     </w:p>
-    <w:bookmarkEnd w:id="42"/>
     <w:bookmarkEnd w:id="43"/>
+    <w:bookmarkEnd w:id="44"/>
     <w:sectPr/>
   </w:body>
 </w:document>

</xml_diff>

<commit_message>
docs: update system documentation with youtube and telegram cloud radars
</commit_message>
<xml_diff>
--- a/docs/Documentation.docx
+++ b/docs/Documentation.docx
@@ -8,7 +8,7 @@
         <w:pStyle w:val="Heading1"/>
       </w:pPr>
       <w:r>
-        <w:t xml:space="preserve">📜 AETHERIA — Complete Technical &amp; Engineering Manual</w:t>
+        <w:t xml:space="preserve">AETHERIA — Complete Technical &amp; Engineering Manual</w:t>
       </w:r>
     </w:p>
     <w:p>
@@ -1317,7 +1317,7 @@
         <w:t xml:space="preserve">Direct Human Connection</w:t>
       </w:r>
       <w:r>
-        <w:t xml:space="preserve">: Provides a 1-tap modal connecting buyers directly to the owner on Telegram (</w:t>
+        <w:t xml:space="preserve">: Provides a clean 1-tap modal connecting buyers directly to the owner on Telegram (</w:t>
       </w:r>
       <w:r>
         <w:rPr>
@@ -1332,7 +1332,22 @@
         <w:rPr>
           <w:rStyle w:val="VerbatimChar"/>
         </w:rPr>
-        <w:t xml:space="preserve">@sleekfx3</w:t>
+        <w:t xml:space="preserve">dhruv_emperor</w:t>
+      </w:r>
+      <w:r>
+        <w:t xml:space="preserve"> </w:t>
+      </w:r>
+      <w:r>
+        <w:t xml:space="preserve">/ ID</w:t>
+      </w:r>
+      <w:r>
+        <w:t xml:space="preserve"> </w:t>
+      </w:r>
+      <w:r>
+        <w:rPr>
+          <w:rStyle w:val="VerbatimChar"/>
+        </w:rPr>
+        <w:t xml:space="preserve">503233296134832149</w:t>
       </w:r>
       <w:r>
         <w:t xml:space="preserve">), or Reddit (</w:t>
@@ -1360,19 +1375,52 @@
           <w:b/>
           <w:bCs/>
         </w:rPr>
-        <w:t xml:space="preserve">Dynamic Pre-Filled Order Text</w:t>
-      </w:r>
-      <w:r>
-        <w:t xml:space="preserve">: Automatically pre-fills the message with the selected tier and price:</w:t>
-      </w:r>
-      <w:r>
-        <w:t xml:space="preserve"> </w:t>
-      </w:r>
-      <w:r>
-        <w:rPr>
-          <w:rStyle w:val="VerbatimChar"/>
-        </w:rPr>
-        <w:t xml:space="preserve">Hey Dhruv, I want to buy a PGSharp Standard key for [1 Device / 2 Devices] (30 Days). I will pay with: UPI / PayPal. Please share payment details.</w:t>
+        <w:t xml:space="preserve">Natural One-Line Pre-Filled Order Text</w:t>
+      </w:r>
+      <w:r>
+        <w:t xml:space="preserve">: Automatically pre-fills natural conversational text:</w:t>
+      </w:r>
+    </w:p>
+    <w:p>
+      <w:pPr>
+        <w:pStyle w:val="Compact"/>
+        <w:numPr>
+          <w:ilvl w:val="1"/>
+          <w:numId w:val="1008"/>
+        </w:numPr>
+      </w:pPr>
+      <w:r>
+        <w:t xml:space="preserve">1 Device:</w:t>
+      </w:r>
+      <w:r>
+        <w:t xml:space="preserve"> </w:t>
+      </w:r>
+      <w:r>
+        <w:rPr>
+          <w:rStyle w:val="VerbatimChar"/>
+        </w:rPr>
+        <w:t xml:space="preserve">Hey Dhruv, I want to buy a PGSharp Standard key for 1 Device.</w:t>
+      </w:r>
+    </w:p>
+    <w:p>
+      <w:pPr>
+        <w:pStyle w:val="Compact"/>
+        <w:numPr>
+          <w:ilvl w:val="1"/>
+          <w:numId w:val="1008"/>
+        </w:numPr>
+      </w:pPr>
+      <w:r>
+        <w:t xml:space="preserve">2 Devices:</w:t>
+      </w:r>
+      <w:r>
+        <w:t xml:space="preserve"> </w:t>
+      </w:r>
+      <w:r>
+        <w:rPr>
+          <w:rStyle w:val="VerbatimChar"/>
+        </w:rPr>
+        <w:t xml:space="preserve">Hey Dhruv, I want to buy a PGSharp Standard key for 2 Devices.</w:t>
       </w:r>
     </w:p>
     <w:p>
@@ -1415,7 +1463,7 @@
         <w:rPr>
           <w:rStyle w:val="VerbatimChar"/>
         </w:rPr>
-        <w:t xml:space="preserve">constants.ts</w:t>
+        <w:t xml:space="preserve">src/lib/constants.ts</w:t>
       </w:r>
       <w:r>
         <w:t xml:space="preserve">. Setting to</w:t>
@@ -1434,6 +1482,37 @@
       </w:r>
       <w:r>
         <w:t xml:space="preserve">instantly restores the automated UPI QR code and PayPal checkout modals without losing any underlying logic.</w:t>
+      </w:r>
+    </w:p>
+    <w:p>
+      <w:pPr>
+        <w:pStyle w:val="Compact"/>
+        <w:numPr>
+          <w:ilvl w:val="0"/>
+          <w:numId w:val="1007"/>
+        </w:numPr>
+      </w:pPr>
+      <w:r>
+        <w:rPr>
+          <w:b/>
+          <w:bCs/>
+        </w:rPr>
+        <w:t xml:space="preserve">Focused Navigation</w:t>
+      </w:r>
+      <w:r>
+        <w:t xml:space="preserve">: The</w:t>
+      </w:r>
+      <w:r>
+        <w:t xml:space="preserve"> </w:t>
+      </w:r>
+      <w:r>
+        <w:t xml:space="preserve">“My Keys”</w:t>
+      </w:r>
+      <w:r>
+        <w:t xml:space="preserve"> </w:t>
+      </w:r>
+      <w:r>
+        <w:t xml:space="preserve">customer vault header button is automatically hidden while direct modal mode is enabled to keep the interface streamlined.</w:t>
       </w:r>
     </w:p>
     <w:p>
@@ -1699,177 +1778,6 @@
       </w:pPr>
       <w:r>
         <w:t xml:space="preserve">5.1 Direct Gmail SMTP Delivery (Nodemailer)</w:t>
-      </w:r>
-    </w:p>
-    <w:p>
-      <w:pPr>
-        <w:pStyle w:val="Compact"/>
-        <w:numPr>
-          <w:ilvl w:val="0"/>
-          <w:numId w:val="1008"/>
-        </w:numPr>
-      </w:pPr>
-      <w:r>
-        <w:rPr>
-          <w:b/>
-          <w:bCs/>
-        </w:rPr>
-        <w:t xml:space="preserve">Zero Custom Domain Requirement</w:t>
-      </w:r>
-      <w:r>
-        <w:t xml:space="preserve">: Uses authenticated Gmail SMTP via</w:t>
-      </w:r>
-      <w:r>
-        <w:t xml:space="preserve"> </w:t>
-      </w:r>
-      <w:r>
-        <w:rPr>
-          <w:rStyle w:val="VerbatimChar"/>
-        </w:rPr>
-        <w:t xml:space="preserve">nodemailer</w:t>
-      </w:r>
-      <w:r>
-        <w:t xml:space="preserve"> </w:t>
-      </w:r>
-      <w:r>
-        <w:t xml:space="preserve">using a 16-character Google App Password (</w:t>
-      </w:r>
-      <w:r>
-        <w:rPr>
-          <w:rStyle w:val="VerbatimChar"/>
-        </w:rPr>
-        <w:t xml:space="preserve">GMAIL_USER</w:t>
-      </w:r>
-      <w:r>
-        <w:t xml:space="preserve"> </w:t>
-      </w:r>
-      <w:r>
-        <w:t xml:space="preserve">and</w:t>
-      </w:r>
-      <w:r>
-        <w:t xml:space="preserve"> </w:t>
-      </w:r>
-      <w:r>
-        <w:rPr>
-          <w:rStyle w:val="VerbatimChar"/>
-        </w:rPr>
-        <w:t xml:space="preserve">GMAIL_APP_PASSWORD</w:t>
-      </w:r>
-      <w:r>
-        <w:t xml:space="preserve">).</w:t>
-      </w:r>
-    </w:p>
-    <w:p>
-      <w:pPr>
-        <w:pStyle w:val="Compact"/>
-        <w:numPr>
-          <w:ilvl w:val="0"/>
-          <w:numId w:val="1008"/>
-        </w:numPr>
-      </w:pPr>
-      <w:r>
-        <w:rPr>
-          <w:b/>
-          <w:bCs/>
-        </w:rPr>
-        <w:t xml:space="preserve">Universal Reach</w:t>
-      </w:r>
-      <w:r>
-        <w:t xml:space="preserve">: Sends directly from</w:t>
-      </w:r>
-      <w:r>
-        <w:t xml:space="preserve"> </w:t>
-      </w:r>
-      <w:r>
-        <w:rPr>
-          <w:rStyle w:val="VerbatimChar"/>
-        </w:rPr>
-        <w:t xml:space="preserve">dhruvmatliwala336@gmail.com</w:t>
-      </w:r>
-      <w:r>
-        <w:t xml:space="preserve"> </w:t>
-      </w:r>
-      <w:r>
-        <w:t xml:space="preserve">to any customer email address (Gmail, Yahoo, Outlook, etc.) without sandbox limitations.</w:t>
-      </w:r>
-    </w:p>
-    <w:p>
-      <w:pPr>
-        <w:pStyle w:val="Compact"/>
-        <w:numPr>
-          <w:ilvl w:val="0"/>
-          <w:numId w:val="1008"/>
-        </w:numPr>
-      </w:pPr>
-      <w:r>
-        <w:rPr>
-          <w:b/>
-          <w:bCs/>
-        </w:rPr>
-        <w:t xml:space="preserve">Branded Sender Display</w:t>
-      </w:r>
-      <w:r>
-        <w:t xml:space="preserve">: Customers see</w:t>
-      </w:r>
-      <w:r>
-        <w:t xml:space="preserve"> </w:t>
-      </w:r>
-      <w:r>
-        <w:rPr>
-          <w:b/>
-          <w:bCs/>
-        </w:rPr>
-        <w:t xml:space="preserve">Aetheria Store</w:t>
-      </w:r>
-      <w:r>
-        <w:t xml:space="preserve"> </w:t>
-      </w:r>
-      <w:r>
-        <w:t xml:space="preserve">as the sender name in their inbox, and any customer replies go directly to the administrator’s personal Gmail.</w:t>
-      </w:r>
-    </w:p>
-    <w:p>
-      <w:pPr>
-        <w:pStyle w:val="Compact"/>
-        <w:numPr>
-          <w:ilvl w:val="0"/>
-          <w:numId w:val="1008"/>
-        </w:numPr>
-      </w:pPr>
-      <w:r>
-        <w:rPr>
-          <w:b/>
-          <w:bCs/>
-        </w:rPr>
-        <w:t xml:space="preserve">Unified Dispatcher (</w:t>
-      </w:r>
-      <w:r>
-        <w:rPr>
-          <w:rStyle w:val="VerbatimChar"/>
-          <w:b/>
-          <w:bCs/>
-        </w:rPr>
-        <w:t xml:space="preserve">resend.ts</w:t>
-      </w:r>
-      <w:r>
-        <w:rPr>
-          <w:b/>
-          <w:bCs/>
-        </w:rPr>
-        <w:t xml:space="preserve">)</w:t>
-      </w:r>
-      <w:r>
-        <w:t xml:space="preserve">: Automatically prioritizes Gmail SMTP, falling back to Resend API if Gmail credentials are absent. Powers License Key Delivery, 48-Hour Expiry Reminders, and Restock Waitlist Notifications.</w:t>
-      </w:r>
-    </w:p>
-    <w:bookmarkEnd w:id="31"/>
-    <w:bookmarkStart w:id="32" w:name="X03c862d3bef9be7b36575423b5317c0a19039f0"/>
-    <w:p>
-      <w:pPr>
-        <w:pStyle w:val="Heading3"/>
-      </w:pPr>
-      <w:r>
-        <w:t xml:space="preserve">5.2 Automated Restock Waitlist Notification System</w:t>
       </w:r>
     </w:p>
     <w:p>
@@ -1881,26 +1789,25 @@
         </w:numPr>
       </w:pPr>
       <w:r>
-        <w:rPr>
-          <w:b/>
-          <w:bCs/>
-        </w:rPr>
-        <w:t xml:space="preserve">Captures Demand</w:t>
-      </w:r>
-      <w:r>
-        <w:t xml:space="preserve">: Visitors enter their email on the storefront waitlist modal when keys are sold out, saved in</w:t>
-      </w:r>
-      <w:r>
-        <w:t xml:space="preserve"> </w:t>
-      </w:r>
-      <w:r>
-        <w:rPr>
-          <w:rStyle w:val="VerbatimChar"/>
-        </w:rPr>
-        <w:t xml:space="preserve">restock_requests</w:t>
-      </w:r>
-      <w:r>
-        <w:t xml:space="preserve">.</w:t>
+        <w:t xml:space="preserve">Direct delivery via Gmail SMTP (</w:t>
+      </w:r>
+      <w:r>
+        <w:rPr>
+          <w:rStyle w:val="VerbatimChar"/>
+        </w:rPr>
+        <w:t xml:space="preserve">service: 'gmail'</w:t>
+      </w:r>
+      <w:r>
+        <w:t xml:space="preserve">) authenticated through the owner’s Gmail account (</w:t>
+      </w:r>
+      <w:r>
+        <w:rPr>
+          <w:rStyle w:val="VerbatimChar"/>
+        </w:rPr>
+        <w:t xml:space="preserve">dhruvmatliwala336@gmail.com</w:t>
+      </w:r>
+      <w:r>
+        <w:t xml:space="preserve">).</w:t>
       </w:r>
     </w:p>
     <w:p>
@@ -1912,39 +1819,7 @@
         </w:numPr>
       </w:pPr>
       <w:r>
-        <w:rPr>
-          <w:b/>
-          <w:bCs/>
-        </w:rPr>
-        <w:t xml:space="preserve">Automatic Upload Dispatch (</w:t>
-      </w:r>
-      <w:r>
-        <w:rPr>
-          <w:rStyle w:val="VerbatimChar"/>
-          <w:b/>
-          <w:bCs/>
-        </w:rPr>
-        <w:t xml:space="preserve">/api/admin/keys</w:t>
-      </w:r>
-      <w:r>
-        <w:rPr>
-          <w:b/>
-          <w:bCs/>
-        </w:rPr>
-        <w:t xml:space="preserve">)</w:t>
-      </w:r>
-      <w:r>
-        <w:t xml:space="preserve">: When new keys are added, the server queries pending waitlist subscribers for that plan and automatically sends them a branded restock email (</w:t>
-      </w:r>
-      <w:r>
-        <w:rPr>
-          <w:i/>
-          <w:iCs/>
-        </w:rPr>
-        <w:t xml:space="preserve">“⚡ PGSharp Keys Are Back in Stock!”</w:t>
-      </w:r>
-      <w:r>
-        <w:t xml:space="preserve">) with direct order links.</w:t>
+        <w:t xml:space="preserve">Eliminates custom domain verification barriers and delivers reliably to all customer domains.</w:t>
       </w:r>
     </w:p>
     <w:p>
@@ -1956,1080 +1831,17 @@
         </w:numPr>
       </w:pPr>
       <w:r>
-        <w:rPr>
-          <w:b/>
-          <w:bCs/>
-        </w:rPr>
-        <w:t xml:space="preserve">One-Click Admin Blast Button (</w:t>
-      </w:r>
-      <w:r>
-        <w:rPr>
-          <w:rStyle w:val="VerbatimChar"/>
-          <w:b/>
-          <w:bCs/>
-        </w:rPr>
-        <w:t xml:space="preserve">/api/admin/waitlist/notify</w:t>
-      </w:r>
-      <w:r>
-        <w:rPr>
-          <w:b/>
-          <w:bCs/>
-        </w:rPr>
-        <w:t xml:space="preserve">)</w:t>
-      </w:r>
-      <w:r>
-        <w:t xml:space="preserve">: The Waitlist &amp; Demand tab in</w:t>
-      </w:r>
-      <w:r>
-        <w:t xml:space="preserve"> </w:t>
-      </w:r>
-      <w:r>
-        <w:rPr>
-          <w:rStyle w:val="VerbatimChar"/>
-        </w:rPr>
-        <w:t xml:space="preserve">/admin</w:t>
-      </w:r>
-      <w:r>
-        <w:t xml:space="preserve"> </w:t>
-      </w:r>
-      <w:r>
-        <w:t xml:space="preserve">includes an interactive</w:t>
-      </w:r>
-      <w:r>
-        <w:t xml:space="preserve"> </w:t>
-      </w:r>
-      <w:r>
-        <w:rPr>
-          <w:rStyle w:val="VerbatimChar"/>
-          <w:b/>
-          <w:bCs/>
-        </w:rPr>
-        <w:t xml:space="preserve">[ 📧 Notify All Waiting (X) ]</w:t>
-      </w:r>
-      <w:r>
-        <w:t xml:space="preserve"> </w:t>
-      </w:r>
-      <w:r>
-        <w:t xml:space="preserve">button with confirmation prompts and live progress metrics.</w:t>
-      </w:r>
-    </w:p>
-    <w:p>
-      <w:pPr>
-        <w:pStyle w:val="Compact"/>
-        <w:numPr>
-          <w:ilvl w:val="0"/>
-          <w:numId w:val="1009"/>
-        </w:numPr>
-      </w:pPr>
-      <w:r>
-        <w:rPr>
-          <w:b/>
-          <w:bCs/>
-        </w:rPr>
-        <w:t xml:space="preserve">De-duplication</w:t>
-      </w:r>
-      <w:r>
-        <w:t xml:space="preserve">: Notified subscribers are automatically removed from the database to prevent duplicate emails.</w:t>
-      </w:r>
-    </w:p>
-    <w:p>
-      <w:r>
-        <w:pict>
-          <v:rect style="width:0;height:1.5pt" o:hralign="center" o:hrstd="t" o:hr="t"/>
-        </w:pict>
-      </w:r>
-    </w:p>
-    <w:bookmarkEnd w:id="32"/>
-    <w:bookmarkEnd w:id="33"/>
-    <w:bookmarkStart w:id="34" w:name="X45db3f69e28c1b660b8a86c446d7857b9bf395c"/>
-    <w:p>
-      <w:pPr>
-        <w:pStyle w:val="Heading2"/>
-      </w:pPr>
-      <w:r>
-        <w:t xml:space="preserve">6. Discord Live Buyer Radar (</w:t>
-      </w:r>
-      <w:r>
-        <w:rPr>
-          <w:rStyle w:val="VerbatimChar"/>
-        </w:rPr>
-        <w:t xml:space="preserve">discord-key-notifier</w:t>
-      </w:r>
-      <w:r>
-        <w:t xml:space="preserve">)</w:t>
-      </w:r>
-    </w:p>
-    <w:p>
-      <w:pPr>
-        <w:pStyle w:val="FirstParagraph"/>
-      </w:pPr>
-      <w:r>
-        <w:t xml:space="preserve">A dedicated standalone Node.js microservice located in</w:t>
-      </w:r>
-      <w:r>
-        <w:t xml:space="preserve"> </w:t>
-      </w:r>
-      <w:r>
-        <w:rPr>
-          <w:rStyle w:val="VerbatimChar"/>
-        </w:rPr>
-        <w:t xml:space="preserve">/discord-key-notifier</w:t>
-      </w:r>
-      <w:r>
-        <w:t xml:space="preserve">:</w:t>
-      </w:r>
-      <w:r>
-        <w:t xml:space="preserve"> </w:t>
-      </w:r>
-      <w:r>
-        <w:t xml:space="preserve">-</w:t>
-      </w:r>
-      <w:r>
-        <w:t xml:space="preserve"> </w:t>
-      </w:r>
-      <w:r>
-        <w:rPr>
-          <w:b/>
-          <w:bCs/>
-        </w:rPr>
-        <w:t xml:space="preserve">Direct WebSocket Gateway</w:t>
-      </w:r>
-      <w:r>
-        <w:t xml:space="preserve">: Connects directly to Discord’s live gateway using user credentials, bypassing Cloudflare anti-bot blocks.</w:t>
-      </w:r>
-      <w:r>
-        <w:t xml:space="preserve"> </w:t>
-      </w:r>
-      <w:r>
-        <w:t xml:space="preserve">-</w:t>
-      </w:r>
-      <w:r>
-        <w:t xml:space="preserve"> </w:t>
-      </w:r>
-      <w:r>
-        <w:rPr>
-          <w:b/>
-          <w:bCs/>
-        </w:rPr>
-        <w:t xml:space="preserve">23-Channel Active Surveillance</w:t>
-      </w:r>
-      <w:r>
-        <w:t xml:space="preserve">: Monitors 23 premier Pokemon GO spoofing, trading, and gaming Discord channels simultaneously.</w:t>
-      </w:r>
-      <w:r>
-        <w:t xml:space="preserve"> </w:t>
-      </w:r>
-      <w:r>
-        <w:t xml:space="preserve">-</w:t>
-      </w:r>
-      <w:r>
-        <w:t xml:space="preserve"> </w:t>
-      </w:r>
-      <w:r>
-        <w:rPr>
-          <w:b/>
-          <w:bCs/>
-        </w:rPr>
-        <w:t xml:space="preserve">Regex Keyword Matching</w:t>
-      </w:r>
-      <w:r>
-        <w:t xml:space="preserve">: Detects high-intent keywords (</w:t>
-      </w:r>
-      <w:r>
-        <w:rPr>
-          <w:rStyle w:val="VerbatimChar"/>
-        </w:rPr>
-        <w:t xml:space="preserve">key</w:t>
-      </w:r>
-      <w:r>
-        <w:t xml:space="preserve">,</w:t>
-      </w:r>
-      <w:r>
-        <w:t xml:space="preserve"> </w:t>
-      </w:r>
-      <w:r>
-        <w:rPr>
-          <w:rStyle w:val="VerbatimChar"/>
-        </w:rPr>
-        <w:t xml:space="preserve">buy key</w:t>
-      </w:r>
-      <w:r>
-        <w:t xml:space="preserve">,</w:t>
-      </w:r>
-      <w:r>
-        <w:t xml:space="preserve"> </w:t>
-      </w:r>
-      <w:r>
-        <w:rPr>
-          <w:rStyle w:val="VerbatimChar"/>
-        </w:rPr>
-        <w:t xml:space="preserve">pgsharp key</w:t>
-      </w:r>
-      <w:r>
-        <w:t xml:space="preserve">,</w:t>
-      </w:r>
-      <w:r>
-        <w:t xml:space="preserve"> </w:t>
-      </w:r>
-      <w:r>
-        <w:rPr>
-          <w:rStyle w:val="VerbatimChar"/>
-        </w:rPr>
-        <w:t xml:space="preserve">wtb</w:t>
-      </w:r>
-      <w:r>
-        <w:t xml:space="preserve">) in real time.</w:t>
-      </w:r>
-      <w:r>
-        <w:t xml:space="preserve"> </w:t>
-      </w:r>
-      <w:r>
-        <w:t xml:space="preserve">-</w:t>
-      </w:r>
-      <w:r>
-        <w:t xml:space="preserve"> </w:t>
-      </w:r>
-      <w:r>
-        <w:rPr>
-          <w:b/>
-          <w:bCs/>
-        </w:rPr>
-        <w:t xml:space="preserve">Telegram Mobile Alerts</w:t>
-      </w:r>
-      <w:r>
-        <w:t xml:space="preserve">: Pushes real-time alerts to the owner’s Telegram with user details, matched message snippets, and 1-click</w:t>
-      </w:r>
-      <w:r>
-        <w:t xml:space="preserve"> </w:t>
-      </w:r>
-      <w:r>
-        <w:t xml:space="preserve">“Open in Discord”</w:t>
-      </w:r>
-      <w:r>
-        <w:t xml:space="preserve"> </w:t>
-      </w:r>
-      <w:r>
-        <w:t xml:space="preserve">jump buttons.</w:t>
-      </w:r>
-    </w:p>
-    <w:p>
-      <w:r>
-        <w:pict>
-          <v:rect style="width:0;height:1.5pt" o:hralign="center" o:hrstd="t" o:hr="t"/>
-        </w:pict>
-      </w:r>
-    </w:p>
-    <w:bookmarkEnd w:id="34"/>
-    <w:bookmarkStart w:id="35" w:name="Xf31b1d777afb44d2e94253afe977c9954177044"/>
-    <w:p>
-      <w:pPr>
-        <w:pStyle w:val="Heading2"/>
-      </w:pPr>
-      <w:r>
-        <w:t xml:space="preserve">7. YouTube Live Comment Radar (</w:t>
-      </w:r>
-      <w:r>
-        <w:rPr>
-          <w:rStyle w:val="VerbatimChar"/>
-        </w:rPr>
-        <w:t xml:space="preserve">youtube-key-notifier</w:t>
-      </w:r>
-      <w:r>
-        <w:t xml:space="preserve">)</w:t>
-      </w:r>
-    </w:p>
-    <w:p>
-      <w:pPr>
-        <w:pStyle w:val="FirstParagraph"/>
-      </w:pPr>
-      <w:r>
-        <w:t xml:space="preserve">A dedicated standalone Node.js microservice located in</w:t>
-      </w:r>
-      <w:r>
-        <w:t xml:space="preserve"> </w:t>
-      </w:r>
-      <w:r>
-        <w:rPr>
-          <w:rStyle w:val="VerbatimChar"/>
-        </w:rPr>
-        <w:t xml:space="preserve">/youtube-key-notifier</w:t>
-      </w:r>
-      <w:r>
-        <w:t xml:space="preserve">:</w:t>
-      </w:r>
-      <w:r>
-        <w:t xml:space="preserve"> </w:t>
-      </w:r>
-      <w:r>
-        <w:t xml:space="preserve">-</w:t>
-      </w:r>
-      <w:r>
-        <w:t xml:space="preserve"> </w:t>
-      </w:r>
-      <w:r>
-        <w:rPr>
-          <w:b/>
-          <w:bCs/>
-        </w:rPr>
-        <w:t xml:space="preserve">Automated Channel &amp; Shorts Discovery</w:t>
-      </w:r>
-      <w:r>
-        <w:t xml:space="preserve">: Ingests uploads from target Pokemon GO / PGSharp channels via zero-quota public RSS feeds, eliminating the need to manually hunt through thousands of Shorts.</w:t>
-      </w:r>
-      <w:r>
-        <w:t xml:space="preserve"> </w:t>
-      </w:r>
-      <w:r>
-        <w:t xml:space="preserve">-</w:t>
-      </w:r>
-      <w:r>
-        <w:t xml:space="preserve"> </w:t>
-      </w:r>
-      <w:r>
-        <w:rPr>
-          <w:b/>
-          <w:bCs/>
-        </w:rPr>
-        <w:t xml:space="preserve">Auto-Aging &amp; Watchlist Pruning</w:t>
-      </w:r>
-      <w:r>
-        <w:t xml:space="preserve">: Automatically monitors new uploads for 7 days during their peak viewer engagement window, then auto-prunes them to keep the active pool fresh.</w:t>
-      </w:r>
-      <w:r>
-        <w:t xml:space="preserve"> </w:t>
-      </w:r>
-      <w:r>
-        <w:t xml:space="preserve">-</w:t>
-      </w:r>
-      <w:r>
-        <w:t xml:space="preserve"> </w:t>
-      </w:r>
-      <w:r>
-        <w:rPr>
-          <w:b/>
-          <w:bCs/>
-        </w:rPr>
-        <w:t xml:space="preserve">Custom Pinned Watchlist</w:t>
-      </w:r>
-      <w:r>
-        <w:t xml:space="preserve">: Allows pinning specific evergreen viral videos or tutorials indefinitely via</w:t>
-      </w:r>
-      <w:r>
-        <w:t xml:space="preserve"> </w:t>
-      </w:r>
-      <w:r>
-        <w:rPr>
-          <w:rStyle w:val="VerbatimChar"/>
-        </w:rPr>
-        <w:t xml:space="preserve">custom_videos.json</w:t>
-      </w:r>
-      <w:r>
-        <w:t xml:space="preserve">.</w:t>
-      </w:r>
-      <w:r>
-        <w:t xml:space="preserve"> </w:t>
-      </w:r>
-      <w:r>
-        <w:t xml:space="preserve">-</w:t>
-      </w:r>
-      <w:r>
-        <w:t xml:space="preserve"> </w:t>
-      </w:r>
-      <w:r>
-        <w:rPr>
-          <w:b/>
-          <w:bCs/>
-        </w:rPr>
-        <w:t xml:space="preserve">English &amp; Hinglish Intent Matching</w:t>
-      </w:r>
-      <w:r>
-        <w:t xml:space="preserve">: Detects 36 buyer intent signals (</w:t>
-      </w:r>
-      <w:r>
-        <w:rPr>
-          <w:rStyle w:val="VerbatimChar"/>
-        </w:rPr>
-        <w:t xml:space="preserve">pgsharp key</w:t>
-      </w:r>
-      <w:r>
-        <w:t xml:space="preserve">,</w:t>
-      </w:r>
-      <w:r>
-        <w:t xml:space="preserve"> </w:t>
-      </w:r>
-      <w:r>
-        <w:rPr>
-          <w:rStyle w:val="VerbatimChar"/>
-        </w:rPr>
-        <w:t xml:space="preserve">price</w:t>
-      </w:r>
-      <w:r>
-        <w:t xml:space="preserve">,</w:t>
-      </w:r>
-      <w:r>
-        <w:t xml:space="preserve"> </w:t>
-      </w:r>
-      <w:r>
-        <w:rPr>
-          <w:rStyle w:val="VerbatimChar"/>
-        </w:rPr>
-        <w:t xml:space="preserve">cost</w:t>
-      </w:r>
-      <w:r>
-        <w:t xml:space="preserve">,</w:t>
-      </w:r>
-      <w:r>
-        <w:t xml:space="preserve"> </w:t>
-      </w:r>
-      <w:r>
-        <w:rPr>
-          <w:rStyle w:val="VerbatimChar"/>
-        </w:rPr>
-        <w:t xml:space="preserve">kitne ka</w:t>
-      </w:r>
-      <w:r>
-        <w:t xml:space="preserve">,</w:t>
-      </w:r>
-      <w:r>
-        <w:t xml:space="preserve"> </w:t>
-      </w:r>
-      <w:r>
-        <w:rPr>
-          <w:rStyle w:val="VerbatimChar"/>
-        </w:rPr>
-        <w:t xml:space="preserve">kaise milegi</w:t>
-      </w:r>
-      <w:r>
-        <w:t xml:space="preserve">,</w:t>
-      </w:r>
-      <w:r>
-        <w:t xml:space="preserve"> </w:t>
-      </w:r>
-      <w:r>
-        <w:rPr>
-          <w:rStyle w:val="VerbatimChar"/>
-        </w:rPr>
-        <w:t xml:space="preserve">kahan se lu</w:t>
-      </w:r>
-      <w:r>
-        <w:t xml:space="preserve">,</w:t>
-      </w:r>
-      <w:r>
-        <w:t xml:space="preserve"> </w:t>
-      </w:r>
-      <w:r>
-        <w:rPr>
-          <w:rStyle w:val="VerbatimChar"/>
-        </w:rPr>
-        <w:t xml:space="preserve">kaise buy kare</w:t>
-      </w:r>
-      <w:r>
-        <w:t xml:space="preserve">,</w:t>
-      </w:r>
-      <w:r>
-        <w:t xml:space="preserve"> </w:t>
-      </w:r>
-      <w:r>
-        <w:rPr>
-          <w:rStyle w:val="VerbatimChar"/>
-        </w:rPr>
-        <w:t xml:space="preserve">key chahiye</w:t>
-      </w:r>
-      <w:r>
-        <w:t xml:space="preserve">) with word-boundary regex to prevent false positives.</w:t>
-      </w:r>
-      <w:r>
-        <w:t xml:space="preserve"> </w:t>
-      </w:r>
-      <w:r>
-        <w:t xml:space="preserve">-</w:t>
-      </w:r>
-      <w:r>
-        <w:t xml:space="preserve"> </w:t>
-      </w:r>
-      <w:r>
-        <w:rPr>
-          <w:b/>
-          <w:bCs/>
-        </w:rPr>
-        <w:t xml:space="preserve">Instant Telegram Mobile Alerts</w:t>
-      </w:r>
-      <w:r>
-        <w:t xml:space="preserve">: Sends clean alerts to the owner’s Telegram with commenter name, video title, comment text excerpt, and direct 1-tap jump link to open and reply on YouTube.</w:t>
-      </w:r>
-      <w:r>
-        <w:t xml:space="preserve"> </w:t>
-      </w:r>
-      <w:r>
-        <w:t xml:space="preserve">-</w:t>
-      </w:r>
-      <w:r>
-        <w:t xml:space="preserve"> </w:t>
-      </w:r>
-      <w:r>
-        <w:rPr>
-          <w:b/>
-          <w:bCs/>
-        </w:rPr>
-        <w:t xml:space="preserve">Zero-Emoji Compliance</w:t>
-      </w:r>
-      <w:r>
-        <w:t xml:space="preserve">: Fully conforms to the strict clean text and zero-emoji formatting rules.</w:t>
-      </w:r>
-      <w:r>
-        <w:t xml:space="preserve"> </w:t>
-      </w:r>
-      <w:r>
-        <w:t xml:space="preserve">-</w:t>
-      </w:r>
-      <w:r>
-        <w:t xml:space="preserve"> </w:t>
-      </w:r>
-      <w:r>
-        <w:rPr>
-          <w:b/>
-          <w:bCs/>
-        </w:rPr>
-        <w:t xml:space="preserve">Local Health Dashboard</w:t>
-      </w:r>
-      <w:r>
-        <w:t xml:space="preserve">: Built-in HTTP dashboard at</w:t>
-      </w:r>
-      <w:r>
-        <w:t xml:space="preserve"> </w:t>
-      </w:r>
-      <w:r>
-        <w:rPr>
-          <w:rStyle w:val="VerbatimChar"/>
-        </w:rPr>
-        <w:t xml:space="preserve">http://localhost:3001</w:t>
-      </w:r>
-      <w:r>
-        <w:t xml:space="preserve"> </w:t>
-      </w:r>
-      <w:r>
-        <w:t xml:space="preserve">reporting uptime, active watchlist, total comments scanned, and leads caught.</w:t>
-      </w:r>
-    </w:p>
-    <w:p>
-      <w:r>
-        <w:pict>
-          <v:rect style="width:0;height:1.5pt" o:hralign="center" o:hrstd="t" o:hr="t"/>
-        </w:pict>
-      </w:r>
-    </w:p>
-    <w:bookmarkEnd w:id="35"/>
-    <w:bookmarkStart w:id="36" w:name="Xda63d3ee28e4b32e5d18fa0dc2fa89c26024374"/>
-    <w:p>
-      <w:pPr>
-        <w:pStyle w:val="Heading2"/>
-      </w:pPr>
-      <w:r>
-        <w:t xml:space="preserve">8. Telegram Live Group Radar (</w:t>
-      </w:r>
-      <w:r>
-        <w:rPr>
-          <w:rStyle w:val="VerbatimChar"/>
-        </w:rPr>
-        <w:t xml:space="preserve">telegram-key-notifier</w:t>
-      </w:r>
-      <w:r>
-        <w:t xml:space="preserve">)</w:t>
-      </w:r>
-    </w:p>
-    <w:p>
-      <w:pPr>
-        <w:pStyle w:val="FirstParagraph"/>
-      </w:pPr>
-      <w:r>
-        <w:t xml:space="preserve">A dedicated standalone Node.js microservice located in</w:t>
-      </w:r>
-      <w:r>
-        <w:t xml:space="preserve"> </w:t>
-      </w:r>
-      <w:r>
-        <w:rPr>
-          <w:rStyle w:val="VerbatimChar"/>
-        </w:rPr>
-        <w:t xml:space="preserve">/telegram-key-notifier</w:t>
-      </w:r>
-      <w:r>
-        <w:t xml:space="preserve">:</w:t>
-      </w:r>
-      <w:r>
-        <w:t xml:space="preserve"> </w:t>
-      </w:r>
-      <w:r>
-        <w:t xml:space="preserve">-</w:t>
-      </w:r>
-      <w:r>
-        <w:t xml:space="preserve"> </w:t>
-      </w:r>
-      <w:r>
-        <w:rPr>
-          <w:b/>
-          <w:bCs/>
-        </w:rPr>
-        <w:t xml:space="preserve">Direct MTProto Client Connection</w:t>
-      </w:r>
-      <w:r>
-        <w:t xml:space="preserve">: Utilizes GramJS MTProto client to passively listen across 9 joined Indian Pokemon GO and PGSharp trading groups and channels (</w:t>
-      </w:r>
-      <w:r>
-        <w:rPr>
-          <w:rStyle w:val="VerbatimChar"/>
-        </w:rPr>
-        <w:t xml:space="preserve">targets.json</w:t>
-      </w:r>
-      <w:r>
-        <w:t xml:space="preserve">).</w:t>
-      </w:r>
-      <w:r>
-        <w:t xml:space="preserve"> </w:t>
-      </w:r>
-      <w:r>
-        <w:t xml:space="preserve">-</w:t>
-      </w:r>
-      <w:r>
-        <w:t xml:space="preserve"> </w:t>
-      </w:r>
-      <w:r>
-        <w:rPr>
-          <w:b/>
-          <w:bCs/>
-        </w:rPr>
-        <w:t xml:space="preserve">Strict Timestamp Cut-Off</w:t>
-      </w:r>
-      <w:r>
-        <w:t xml:space="preserve">: Only messages posted after</w:t>
-      </w:r>
-      <w:r>
-        <w:t xml:space="preserve"> </w:t>
-      </w:r>
-      <w:r>
-        <w:rPr>
-          <w:b/>
-          <w:bCs/>
-        </w:rPr>
-        <w:t xml:space="preserve">17-Sep-2026 10:53:00 PM IST</w:t>
-      </w:r>
-      <w:r>
-        <w:t xml:space="preserve"> </w:t>
-      </w:r>
-      <w:r>
-        <w:t xml:space="preserve">(</w:t>
-      </w:r>
-      <w:r>
-        <w:rPr>
-          <w:rStyle w:val="VerbatimChar"/>
-        </w:rPr>
-        <w:t xml:space="preserve">2026-09-17T17:23:00Z</w:t>
-      </w:r>
-      <w:r>
-        <w:t xml:space="preserve">) are evaluated. All historical messages are ignored.</w:t>
-      </w:r>
-      <w:r>
-        <w:t xml:space="preserve"> </w:t>
-      </w:r>
-      <w:r>
-        <w:t xml:space="preserve">-</w:t>
-      </w:r>
-      <w:r>
-        <w:t xml:space="preserve"> </w:t>
-      </w:r>
-      <w:r>
-        <w:rPr>
-          <w:b/>
-          <w:bCs/>
-        </w:rPr>
-        <w:t xml:space="preserve">English &amp; Hinglish Intent Matching</w:t>
-      </w:r>
-      <w:r>
-        <w:t xml:space="preserve">: Monitors for 33 high-intent buyer phrases (</w:t>
-      </w:r>
-      <w:r>
-        <w:rPr>
-          <w:rStyle w:val="VerbatimChar"/>
-        </w:rPr>
-        <w:t xml:space="preserve">key</w:t>
-      </w:r>
-      <w:r>
-        <w:t xml:space="preserve">,</w:t>
-      </w:r>
-      <w:r>
-        <w:t xml:space="preserve"> </w:t>
-      </w:r>
-      <w:r>
-        <w:rPr>
-          <w:rStyle w:val="VerbatimChar"/>
-        </w:rPr>
-        <w:t xml:space="preserve">pgsharp key</w:t>
-      </w:r>
-      <w:r>
-        <w:t xml:space="preserve">,</w:t>
-      </w:r>
-      <w:r>
-        <w:t xml:space="preserve"> </w:t>
-      </w:r>
-      <w:r>
-        <w:rPr>
-          <w:rStyle w:val="VerbatimChar"/>
-        </w:rPr>
-        <w:t xml:space="preserve">standard key</w:t>
-      </w:r>
-      <w:r>
-        <w:t xml:space="preserve">,</w:t>
-      </w:r>
-      <w:r>
-        <w:t xml:space="preserve"> </w:t>
-      </w:r>
-      <w:r>
-        <w:rPr>
-          <w:rStyle w:val="VerbatimChar"/>
-        </w:rPr>
-        <w:t xml:space="preserve">buy key</w:t>
-      </w:r>
-      <w:r>
-        <w:t xml:space="preserve">,</w:t>
-      </w:r>
-      <w:r>
-        <w:t xml:space="preserve"> </w:t>
-      </w:r>
-      <w:r>
-        <w:rPr>
-          <w:rStyle w:val="VerbatimChar"/>
-        </w:rPr>
-        <w:t xml:space="preserve">kitne ka</w:t>
-      </w:r>
-      <w:r>
-        <w:t xml:space="preserve">,</w:t>
-      </w:r>
-      <w:r>
-        <w:t xml:space="preserve"> </w:t>
-      </w:r>
-      <w:r>
-        <w:rPr>
-          <w:rStyle w:val="VerbatimChar"/>
-        </w:rPr>
-        <w:t xml:space="preserve">kaise milegi</w:t>
-      </w:r>
-      <w:r>
-        <w:t xml:space="preserve">,</w:t>
-      </w:r>
-      <w:r>
-        <w:t xml:space="preserve"> </w:t>
-      </w:r>
-      <w:r>
-        <w:rPr>
-          <w:rStyle w:val="VerbatimChar"/>
-        </w:rPr>
-        <w:t xml:space="preserve">kahan se lu</w:t>
-      </w:r>
-      <w:r>
-        <w:t xml:space="preserve">,</w:t>
-      </w:r>
-      <w:r>
-        <w:t xml:space="preserve"> </w:t>
-      </w:r>
-      <w:r>
-        <w:rPr>
-          <w:rStyle w:val="VerbatimChar"/>
-        </w:rPr>
-        <w:t xml:space="preserve">kaise buy kare</w:t>
-      </w:r>
-      <w:r>
-        <w:t xml:space="preserve">,</w:t>
-      </w:r>
-      <w:r>
-        <w:t xml:space="preserve"> </w:t>
-      </w:r>
-      <w:r>
-        <w:rPr>
-          <w:rStyle w:val="VerbatimChar"/>
-        </w:rPr>
-        <w:t xml:space="preserve">key chahiye</w:t>
-      </w:r>
-      <w:r>
-        <w:t xml:space="preserve">) with word-boundary regex.</w:t>
-      </w:r>
-      <w:r>
-        <w:t xml:space="preserve"> </w:t>
-      </w:r>
-      <w:r>
-        <w:t xml:space="preserve">-</w:t>
-      </w:r>
-      <w:r>
-        <w:t xml:space="preserve"> </w:t>
-      </w:r>
-      <w:r>
-        <w:rPr>
-          <w:b/>
-          <w:bCs/>
-        </w:rPr>
-        <w:t xml:space="preserve">Self-Sender Exclusion</w:t>
-      </w:r>
-      <w:r>
-        <w:t xml:space="preserve">: Automatically detects and ignores messages sent by the owner (</w:t>
-      </w:r>
-      <w:r>
-        <w:rPr>
-          <w:rStyle w:val="VerbatimChar"/>
-        </w:rPr>
-        <w:t xml:space="preserve">@sleekfx3</w:t>
-      </w:r>
-      <w:r>
-        <w:t xml:space="preserve">) to avoid false-positive self-notifications.</w:t>
-      </w:r>
-      <w:r>
-        <w:t xml:space="preserve"> </w:t>
-      </w:r>
-      <w:r>
-        <w:t xml:space="preserve">-</w:t>
-      </w:r>
-      <w:r>
-        <w:t xml:space="preserve"> </w:t>
-      </w:r>
-      <w:r>
-        <w:rPr>
-          <w:b/>
-          <w:bCs/>
-        </w:rPr>
-        <w:t xml:space="preserve">Zero-Emoji Mobile Alerts</w:t>
-      </w:r>
-      <w:r>
-        <w:t xml:space="preserve">: Immediately pushes formatted alert cards to the owner’s Telegram with group title, commenter name/username, exact message snippet, and a 1-tap direct jump link (</w:t>
-      </w:r>
-      <w:r>
-        <w:rPr>
-          <w:rStyle w:val="VerbatimChar"/>
-        </w:rPr>
-        <w:t xml:space="preserve">https://t.me/{chat}/{messageId}</w:t>
-      </w:r>
-      <w:r>
-        <w:t xml:space="preserve">).</w:t>
-      </w:r>
-      <w:r>
-        <w:t xml:space="preserve"> </w:t>
-      </w:r>
-      <w:r>
-        <w:t xml:space="preserve">-</w:t>
-      </w:r>
-      <w:r>
-        <w:t xml:space="preserve"> </w:t>
-      </w:r>
-      <w:r>
-        <w:rPr>
-          <w:b/>
-          <w:bCs/>
-        </w:rPr>
-        <w:t xml:space="preserve">Local Health Dashboard</w:t>
-      </w:r>
-      <w:r>
-        <w:t xml:space="preserve">: Built-in HTTP dashboard at</w:t>
-      </w:r>
-      <w:r>
-        <w:t xml:space="preserve"> </w:t>
-      </w:r>
-      <w:r>
-        <w:rPr>
-          <w:rStyle w:val="VerbatimChar"/>
-        </w:rPr>
-        <w:t xml:space="preserve">http://localhost:3002</w:t>
-      </w:r>
-      <w:r>
-        <w:t xml:space="preserve"> </w:t>
-      </w:r>
-      <w:r>
-        <w:t xml:space="preserve">reporting MTProto connection status, monitored targets count, keywords count, and total leads detected.</w:t>
-      </w:r>
-    </w:p>
-    <w:p>
-      <w:r>
-        <w:pict>
-          <v:rect style="width:0;height:1.5pt" o:hralign="center" o:hrstd="t" o:hr="t"/>
-        </w:pict>
-      </w:r>
-    </w:p>
-    <w:bookmarkEnd w:id="36"/>
-    <w:bookmarkStart w:id="40" w:name="X6db8a6fe6a898cc68ce14e0d5c4b5d0c9d92a97"/>
-    <w:p>
-      <w:pPr>
-        <w:pStyle w:val="Heading2"/>
-      </w:pPr>
-      <w:r>
-        <w:t xml:space="preserve">9. Telegram Bot &amp; Channel Announcement Architecture</w:t>
-      </w:r>
-    </w:p>
-    <w:bookmarkStart w:id="37" w:name="X02ae9847bd9588ccf72013de6dc22b2efcf9bdb"/>
+        <w:t xml:space="preserve">Powers automated restock notices, license deliveries, and 48-hour expiration reminders.</w:t>
+      </w:r>
+    </w:p>
+    <w:bookmarkEnd w:id="31"/>
+    <w:bookmarkStart w:id="32" w:name="X03c862d3bef9be7b36575423b5317c0a19039f0"/>
     <w:p>
       <w:pPr>
         <w:pStyle w:val="Heading3"/>
       </w:pPr>
       <w:r>
-        <w:t xml:space="preserve">9.1 Minimal 4-Line QR Screen &amp; Progressive Disclosure</w:t>
-      </w:r>
-    </w:p>
-    <w:p>
-      <w:pPr>
-        <w:pStyle w:val="FirstParagraph"/>
-      </w:pPr>
-      <w:r>
-        <w:t xml:space="preserve">To eliminate customer intimidation, hesitation, and text overload:</w:t>
-      </w:r>
-      <w:r>
-        <w:t xml:space="preserve"> </w:t>
-      </w:r>
-      <w:r>
-        <w:t xml:space="preserve">-</w:t>
-      </w:r>
-      <w:r>
-        <w:t xml:space="preserve"> </w:t>
-      </w:r>
-      <w:r>
-        <w:rPr>
-          <w:b/>
-          <w:bCs/>
-        </w:rPr>
-        <w:t xml:space="preserve">Clean 4-Line Layout</w:t>
-      </w:r>
-      <w:r>
-        <w:t xml:space="preserve">:</w:t>
-      </w:r>
-      <w:r>
-        <w:t xml:space="preserve"> </w:t>
-      </w:r>
-      <w:r>
-        <w:t xml:space="preserve">```text</w:t>
-      </w:r>
-      <w:r>
-        <w:t xml:space="preserve"> </w:t>
-      </w:r>
-      <w:r>
-        <w:t xml:space="preserve">📦 PGSharp Standard (~30 Days) — ₹160</w:t>
-      </w:r>
-      <w:r>
-        <w:t xml:space="preserve"> </w:t>
-      </w:r>
-      <w:r>
-        <w:t xml:space="preserve">🔑 UPI ID: dhruvmatliwala123@oksbi</w:t>
-      </w:r>
-      <w:r>
-        <w:t xml:space="preserve"> </w:t>
-      </w:r>
-      <w:r>
-        <w:t xml:space="preserve">🔖 Order ID: ord_tg_xxxx</w:t>
-      </w:r>
-    </w:p>
-    <w:p>
-      <w:pPr>
-        <w:pStyle w:val="BodyText"/>
-      </w:pPr>
-      <w:r>
-        <w:t xml:space="preserve">⚡ Scan QR or pay ₹160. Key is auto-delivered here within 1–2 minutes!</w:t>
-      </w:r>
-      <w:r>
-        <w:t xml:space="preserve"> </w:t>
-      </w:r>
-      <w:r>
-        <w:rPr>
-          <w:rStyle w:val="VerbatimChar"/>
-        </w:rPr>
-        <w:t xml:space="preserve">- **Primary Fallback Button**: `[ ❓ Paid but didn't get key? ]` - **Progressive Disclosure on Demand**: Clicking the button reveals comforting guidance without technical jargon:</w:t>
-      </w:r>
-      <w:r>
-        <w:t xml:space="preserve">text</w:t>
-      </w:r>
-      <w:r>
-        <w:t xml:space="preserve"> </w:t>
-      </w:r>
-      <w:r>
-        <w:t xml:space="preserve">⏳ Awaiting Bank Confirmation…</w:t>
-      </w:r>
-      <w:r>
-        <w:t xml:space="preserve"> </w:t>
-      </w:r>
-      <w:r>
-        <w:t xml:space="preserve">Bank SMS alerts usually arrive within 1–2 minutes.</w:t>
-      </w:r>
-    </w:p>
-    <w:p>
-      <w:pPr>
-        <w:pStyle w:val="BodyText"/>
-      </w:pPr>
-      <w:r>
-        <w:t xml:space="preserve">💡 If you paid and want your key right away without waiting:</w:t>
-      </w:r>
-      <w:r>
-        <w:t xml:space="preserve"> </w:t>
-      </w:r>
-      <w:r>
-        <w:t xml:space="preserve">Send a screenshot of your Transaction Details (in Google Pay/FamPay, tap on the payment to view full details with the 12-digit UPI ID) or reply with the 12 digits directly!</w:t>
-      </w:r>
-      <w:r>
-        <w:t xml:space="preserve"> </w:t>
-      </w:r>
-      <w:r>
-        <w:t xml:space="preserve">```</w:t>
-      </w:r>
-      <w:r>
-        <w:t xml:space="preserve"> </w:t>
-      </w:r>
-      <w:r>
-        <w:t xml:space="preserve">-</w:t>
-      </w:r>
-      <w:r>
-        <w:t xml:space="preserve"> </w:t>
-      </w:r>
-      <w:r>
-        <w:rPr>
-          <w:b/>
-          <w:bCs/>
-        </w:rPr>
-        <w:t xml:space="preserve">Tap-Payment Guidance</w:t>
-      </w:r>
-      <w:r>
-        <w:t xml:space="preserve">: Educates customers to tap their completed payment in Google Pay / FamPay to find the 12-digit</w:t>
-      </w:r>
-      <w:r>
-        <w:t xml:space="preserve"> </w:t>
-      </w:r>
-      <w:r>
-        <w:rPr>
-          <w:b/>
-          <w:bCs/>
-        </w:rPr>
-        <w:t xml:space="preserve">UPI transaction ID</w:t>
-      </w:r>
-      <w:r>
-        <w:t xml:space="preserve"> </w:t>
-      </w:r>
-      <w:r>
-        <w:t xml:space="preserve">rather than confusing banking terms like</w:t>
-      </w:r>
-      <w:r>
-        <w:t xml:space="preserve"> </w:t>
-      </w:r>
-      <w:r>
-        <w:t xml:space="preserve">“UTR”</w:t>
-      </w:r>
-      <w:r>
-        <w:t xml:space="preserve">.</w:t>
-      </w:r>
-    </w:p>
-    <w:bookmarkEnd w:id="37"/>
-    <w:bookmarkStart w:id="38" w:name="X47c82301dd07ef9336c1959c2655ff3cb0eb7c9"/>
-    <w:p>
-      <w:pPr>
-        <w:pStyle w:val="Heading3"/>
-      </w:pPr>
-      <w:r>
-        <w:t xml:space="preserve">9.2 Viral Telegram Referral &amp; Reward Engine (</w:t>
-      </w:r>
-      <w:r>
-        <w:t xml:space="preserve">“Refer &amp; Earn”</w:t>
-      </w:r>
-      <w:r>
-        <w:t xml:space="preserve">)</w:t>
+        <w:t xml:space="preserve">5.2 Automated Restock Waitlist Notification System</w:t>
       </w:r>
     </w:p>
     <w:p>
@@ -3045,19 +1857,22 @@
           <w:b/>
           <w:bCs/>
         </w:rPr>
-        <w:t xml:space="preserve">Deep Tracking Links</w:t>
-      </w:r>
-      <w:r>
-        <w:t xml:space="preserve">: Unique referral links (</w:t>
-      </w:r>
-      <w:r>
-        <w:rPr>
-          <w:rStyle w:val="VerbatimChar"/>
-        </w:rPr>
-        <w:t xml:space="preserve">https://t.me/AetheriaStoreOfficialBot?start=ref_&lt;chatId&gt;</w:t>
-      </w:r>
-      <w:r>
-        <w:t xml:space="preserve">) with real-time conversion stats.</w:t>
+        <w:t xml:space="preserve">Captures Demand</w:t>
+      </w:r>
+      <w:r>
+        <w:t xml:space="preserve">: Visitors enter their email on the storefront waitlist modal when keys are sold out, saved in</w:t>
+      </w:r>
+      <w:r>
+        <w:t xml:space="preserve"> </w:t>
+      </w:r>
+      <w:r>
+        <w:rPr>
+          <w:rStyle w:val="VerbatimChar"/>
+        </w:rPr>
+        <w:t xml:space="preserve">restock_requests</w:t>
+      </w:r>
+      <w:r>
+        <w:t xml:space="preserve">.</w:t>
       </w:r>
     </w:p>
     <w:p>
@@ -3073,52 +1888,35 @@
           <w:b/>
           <w:bCs/>
         </w:rPr>
-        <w:t xml:space="preserve">Automated Friend Discount (Zero Coupon Required)</w:t>
-      </w:r>
-      <w:r>
-        <w:t xml:space="preserve">: Friends joining via referral automatically receive</w:t>
-      </w:r>
-      <w:r>
-        <w:t xml:space="preserve"> </w:t>
-      </w:r>
-      <w:r>
-        <w:rPr>
-          <w:b/>
-          <w:bCs/>
-        </w:rPr>
-        <w:t xml:space="preserve">₹30 OFF</w:t>
-      </w:r>
-      <w:r>
-        <w:t xml:space="preserve"> </w:t>
-      </w:r>
-      <w:r>
-        <w:t xml:space="preserve">on their first purchase (Standard:</w:t>
-      </w:r>
-      <w:r>
-        <w:t xml:space="preserve"> </w:t>
-      </w:r>
-      <w:r>
-        <w:rPr>
-          <w:b/>
-          <w:bCs/>
-        </w:rPr>
-        <w:t xml:space="preserve">₹130</w:t>
-      </w:r>
-      <w:r>
-        <w:t xml:space="preserve">; Duo:</w:t>
-      </w:r>
-      <w:r>
-        <w:t xml:space="preserve"> </w:t>
-      </w:r>
-      <w:r>
-        <w:rPr>
-          <w:b/>
-          <w:bCs/>
-        </w:rPr>
-        <w:t xml:space="preserve">₹270</w:t>
-      </w:r>
-      <w:r>
-        <w:t xml:space="preserve">).</w:t>
+        <w:t xml:space="preserve">Automatic Upload Dispatch (</w:t>
+      </w:r>
+      <w:r>
+        <w:rPr>
+          <w:rStyle w:val="VerbatimChar"/>
+          <w:b/>
+          <w:bCs/>
+        </w:rPr>
+        <w:t xml:space="preserve">/api/admin/keys</w:t>
+      </w:r>
+      <w:r>
+        <w:rPr>
+          <w:b/>
+          <w:bCs/>
+        </w:rPr>
+        <w:t xml:space="preserve">)</w:t>
+      </w:r>
+      <w:r>
+        <w:t xml:space="preserve">: When new keys are added, the server queries pending waitlist subscribers for that plan and automatically sends them a branded restock email (</w:t>
+      </w:r>
+      <w:r>
+        <w:rPr>
+          <w:i/>
+          <w:iCs/>
+        </w:rPr>
+        <w:t xml:space="preserve">“PGSharp Keys Are Back in Stock!”</w:t>
+      </w:r>
+      <w:r>
+        <w:t xml:space="preserve">) with direct order links.</w:t>
       </w:r>
     </w:p>
     <w:p>
@@ -3134,19 +1932,57 @@
           <w:b/>
           <w:bCs/>
         </w:rPr>
-        <w:t xml:space="preserve">Reward Coupon Issuance</w:t>
-      </w:r>
-      <w:r>
-        <w:t xml:space="preserve">: When the friend completes an order, the referrer automatically receives a single-use ₹30 coupon (</w:t>
-      </w:r>
-      <w:r>
-        <w:rPr>
-          <w:rStyle w:val="VerbatimChar"/>
-        </w:rPr>
-        <w:t xml:space="preserve">REF30_XXXXXX</w:t>
-      </w:r>
-      <w:r>
-        <w:t xml:space="preserve">) redeemable on future renewals.</w:t>
+        <w:t xml:space="preserve">One-Click Admin Blast Button (</w:t>
+      </w:r>
+      <w:r>
+        <w:rPr>
+          <w:rStyle w:val="VerbatimChar"/>
+          <w:b/>
+          <w:bCs/>
+        </w:rPr>
+        <w:t xml:space="preserve">/api/admin/waitlist/notify</w:t>
+      </w:r>
+      <w:r>
+        <w:rPr>
+          <w:b/>
+          <w:bCs/>
+        </w:rPr>
+        <w:t xml:space="preserve">)</w:t>
+      </w:r>
+      <w:r>
+        <w:t xml:space="preserve">: The Waitlist &amp; Demand tab in</w:t>
+      </w:r>
+      <w:r>
+        <w:t xml:space="preserve"> </w:t>
+      </w:r>
+      <w:r>
+        <w:rPr>
+          <w:rStyle w:val="VerbatimChar"/>
+        </w:rPr>
+        <w:t xml:space="preserve">/admin</w:t>
+      </w:r>
+      <w:r>
+        <w:t xml:space="preserve"> </w:t>
+      </w:r>
+      <w:r>
+        <w:t xml:space="preserve">includes an interactive</w:t>
+      </w:r>
+      <w:r>
+        <w:t xml:space="preserve"> </w:t>
+      </w:r>
+      <w:r>
+        <w:rPr>
+          <w:rStyle w:val="VerbatimChar"/>
+          <w:b/>
+          <w:bCs/>
+        </w:rPr>
+        <w:t xml:space="preserve">[ Notify All Waiting (X) ]</w:t>
+      </w:r>
+      <w:r>
+        <w:t xml:space="preserve"> </w:t>
+      </w:r>
+      <w:r>
+        <w:t xml:space="preserve">button with confirmation prompts and live progress metrics.</w:t>
       </w:r>
     </w:p>
     <w:p>
@@ -3162,39 +1998,1251 @@
           <w:b/>
           <w:bCs/>
         </w:rPr>
-        <w:t xml:space="preserve">Milestone Rewards</w:t>
-      </w:r>
-      <w:r>
-        <w:t xml:space="preserve">: Scaled milestone rewards (3 invites = 50% Off, 5 invites = 1 Free Standard Key for 30 Days).</w:t>
-      </w:r>
-    </w:p>
-    <w:p>
-      <w:pPr>
-        <w:pStyle w:val="Compact"/>
-        <w:numPr>
-          <w:ilvl w:val="0"/>
-          <w:numId w:val="1010"/>
-        </w:numPr>
-      </w:pPr>
-      <w:r>
-        <w:rPr>
-          <w:b/>
-          <w:bCs/>
-        </w:rPr>
-        <w:t xml:space="preserve">Anti-Fraud Protections</w:t>
-      </w:r>
-      <w:r>
-        <w:t xml:space="preserve">: Device and IP fingerprinting, strict chat ID deduplication, and self-referral blocks.</w:t>
-      </w:r>
-    </w:p>
-    <w:bookmarkEnd w:id="38"/>
-    <w:bookmarkStart w:id="39" w:name="X13842493e6922ba38d3777ad41b96aa6b5a6e6c"/>
+        <w:t xml:space="preserve">De-duplication</w:t>
+      </w:r>
+      <w:r>
+        <w:t xml:space="preserve">: Notified subscribers are automatically removed from the database to prevent duplicate emails.</w:t>
+      </w:r>
+    </w:p>
+    <w:p>
+      <w:r>
+        <w:pict>
+          <v:rect style="width:0;height:1.5pt" o:hralign="center" o:hrstd="t" o:hr="t"/>
+        </w:pict>
+      </w:r>
+    </w:p>
+    <w:bookmarkEnd w:id="32"/>
+    <w:bookmarkEnd w:id="33"/>
+    <w:bookmarkStart w:id="34" w:name="X45db3f69e28c1b660b8a86c446d7857b9bf395c"/>
+    <w:p>
+      <w:pPr>
+        <w:pStyle w:val="Heading2"/>
+      </w:pPr>
+      <w:r>
+        <w:t xml:space="preserve">6. Discord Live Buyer Radar (</w:t>
+      </w:r>
+      <w:r>
+        <w:rPr>
+          <w:rStyle w:val="VerbatimChar"/>
+        </w:rPr>
+        <w:t xml:space="preserve">discord-key-notifier</w:t>
+      </w:r>
+      <w:r>
+        <w:t xml:space="preserve">)</w:t>
+      </w:r>
+    </w:p>
+    <w:p>
+      <w:pPr>
+        <w:pStyle w:val="FirstParagraph"/>
+      </w:pPr>
+      <w:r>
+        <w:t xml:space="preserve">A dedicated standalone Node.js microservice located in</w:t>
+      </w:r>
+      <w:r>
+        <w:t xml:space="preserve"> </w:t>
+      </w:r>
+      <w:r>
+        <w:rPr>
+          <w:rStyle w:val="VerbatimChar"/>
+        </w:rPr>
+        <w:t xml:space="preserve">/discord-key-notifier</w:t>
+      </w:r>
+      <w:r>
+        <w:t xml:space="preserve">:</w:t>
+      </w:r>
+      <w:r>
+        <w:t xml:space="preserve"> </w:t>
+      </w:r>
+      <w:r>
+        <w:t xml:space="preserve">-</w:t>
+      </w:r>
+      <w:r>
+        <w:t xml:space="preserve"> </w:t>
+      </w:r>
+      <w:r>
+        <w:rPr>
+          <w:b/>
+          <w:bCs/>
+        </w:rPr>
+        <w:t xml:space="preserve">Direct WebSocket Gateway</w:t>
+      </w:r>
+      <w:r>
+        <w:t xml:space="preserve">: Connects directly to Discord’s live gateway using user credentials, bypassing Cloudflare anti-bot blocks.</w:t>
+      </w:r>
+      <w:r>
+        <w:t xml:space="preserve"> </w:t>
+      </w:r>
+      <w:r>
+        <w:t xml:space="preserve">-</w:t>
+      </w:r>
+      <w:r>
+        <w:t xml:space="preserve"> </w:t>
+      </w:r>
+      <w:r>
+        <w:rPr>
+          <w:b/>
+          <w:bCs/>
+        </w:rPr>
+        <w:t xml:space="preserve">23-Channel Active Surveillance</w:t>
+      </w:r>
+      <w:r>
+        <w:t xml:space="preserve">: Monitors 23 premier Pokemon GO spoofing, trading, and gaming Discord channels simultaneously.</w:t>
+      </w:r>
+      <w:r>
+        <w:t xml:space="preserve"> </w:t>
+      </w:r>
+      <w:r>
+        <w:t xml:space="preserve">-</w:t>
+      </w:r>
+      <w:r>
+        <w:t xml:space="preserve"> </w:t>
+      </w:r>
+      <w:r>
+        <w:rPr>
+          <w:b/>
+          <w:bCs/>
+        </w:rPr>
+        <w:t xml:space="preserve">Regex Keyword Matching</w:t>
+      </w:r>
+      <w:r>
+        <w:t xml:space="preserve">: Detects high-intent keywords (</w:t>
+      </w:r>
+      <w:r>
+        <w:rPr>
+          <w:rStyle w:val="VerbatimChar"/>
+        </w:rPr>
+        <w:t xml:space="preserve">key</w:t>
+      </w:r>
+      <w:r>
+        <w:t xml:space="preserve">,</w:t>
+      </w:r>
+      <w:r>
+        <w:t xml:space="preserve"> </w:t>
+      </w:r>
+      <w:r>
+        <w:rPr>
+          <w:rStyle w:val="VerbatimChar"/>
+        </w:rPr>
+        <w:t xml:space="preserve">buy key</w:t>
+      </w:r>
+      <w:r>
+        <w:t xml:space="preserve">,</w:t>
+      </w:r>
+      <w:r>
+        <w:t xml:space="preserve"> </w:t>
+      </w:r>
+      <w:r>
+        <w:rPr>
+          <w:rStyle w:val="VerbatimChar"/>
+        </w:rPr>
+        <w:t xml:space="preserve">pgsharp key</w:t>
+      </w:r>
+      <w:r>
+        <w:t xml:space="preserve">,</w:t>
+      </w:r>
+      <w:r>
+        <w:t xml:space="preserve"> </w:t>
+      </w:r>
+      <w:r>
+        <w:rPr>
+          <w:rStyle w:val="VerbatimChar"/>
+        </w:rPr>
+        <w:t xml:space="preserve">wtb</w:t>
+      </w:r>
+      <w:r>
+        <w:t xml:space="preserve">) in real time.</w:t>
+      </w:r>
+      <w:r>
+        <w:t xml:space="preserve"> </w:t>
+      </w:r>
+      <w:r>
+        <w:t xml:space="preserve">-</w:t>
+      </w:r>
+      <w:r>
+        <w:t xml:space="preserve"> </w:t>
+      </w:r>
+      <w:r>
+        <w:rPr>
+          <w:b/>
+          <w:bCs/>
+        </w:rPr>
+        <w:t xml:space="preserve">Telegram Mobile Alerts</w:t>
+      </w:r>
+      <w:r>
+        <w:t xml:space="preserve">: Pushes real-time alerts to the owner’s Telegram with user details, matched message snippets, and 1-click</w:t>
+      </w:r>
+      <w:r>
+        <w:t xml:space="preserve"> </w:t>
+      </w:r>
+      <w:r>
+        <w:t xml:space="preserve">“Open in Discord”</w:t>
+      </w:r>
+      <w:r>
+        <w:t xml:space="preserve"> </w:t>
+      </w:r>
+      <w:r>
+        <w:t xml:space="preserve">jump buttons.</w:t>
+      </w:r>
+    </w:p>
+    <w:p>
+      <w:r>
+        <w:pict>
+          <v:rect style="width:0;height:1.5pt" o:hralign="center" o:hrstd="t" o:hr="t"/>
+        </w:pict>
+      </w:r>
+    </w:p>
+    <w:bookmarkEnd w:id="34"/>
+    <w:bookmarkStart w:id="35" w:name="Xf31b1d777afb44d2e94253afe977c9954177044"/>
+    <w:p>
+      <w:pPr>
+        <w:pStyle w:val="Heading2"/>
+      </w:pPr>
+      <w:r>
+        <w:t xml:space="preserve">7. YouTube Live Comment Radar (</w:t>
+      </w:r>
+      <w:r>
+        <w:rPr>
+          <w:rStyle w:val="VerbatimChar"/>
+        </w:rPr>
+        <w:t xml:space="preserve">youtube-key-notifier</w:t>
+      </w:r>
+      <w:r>
+        <w:t xml:space="preserve">)</w:t>
+      </w:r>
+    </w:p>
+    <w:p>
+      <w:pPr>
+        <w:pStyle w:val="FirstParagraph"/>
+      </w:pPr>
+      <w:r>
+        <w:t xml:space="preserve">A dedicated standalone Node.js microservice running 24/7 on the cloud (</w:t>
+      </w:r>
+      <w:r>
+        <w:rPr>
+          <w:rStyle w:val="VerbatimChar"/>
+        </w:rPr>
+        <w:t xml:space="preserve">https://youtube-key-notifier.onrender.com</w:t>
+      </w:r>
+      <w:r>
+        <w:t xml:space="preserve">):</w:t>
+      </w:r>
+      <w:r>
+        <w:t xml:space="preserve"> </w:t>
+      </w:r>
+      <w:r>
+        <w:t xml:space="preserve">-</w:t>
+      </w:r>
+      <w:r>
+        <w:t xml:space="preserve"> </w:t>
+      </w:r>
+      <w:r>
+        <w:rPr>
+          <w:b/>
+          <w:bCs/>
+        </w:rPr>
+        <w:t xml:space="preserve">Automated Channel &amp; Shorts Discovery</w:t>
+      </w:r>
+      <w:r>
+        <w:t xml:space="preserve">: Ingests uploads from target Pokemon GO / PGSharp channels via zero-quota public RSS feeds, eliminating the need to manually hunt through thousands of Shorts.</w:t>
+      </w:r>
+      <w:r>
+        <w:t xml:space="preserve"> </w:t>
+      </w:r>
+      <w:r>
+        <w:t xml:space="preserve">-</w:t>
+      </w:r>
+      <w:r>
+        <w:t xml:space="preserve"> </w:t>
+      </w:r>
+      <w:r>
+        <w:rPr>
+          <w:b/>
+          <w:bCs/>
+        </w:rPr>
+        <w:t xml:space="preserve">Auto-Aging &amp; Watchlist Pruning</w:t>
+      </w:r>
+      <w:r>
+        <w:t xml:space="preserve">: Automatically monitors new uploads for 7 days during their peak viewer engagement window, then auto-prunes them to keep the active pool fresh.</w:t>
+      </w:r>
+      <w:r>
+        <w:t xml:space="preserve"> </w:t>
+      </w:r>
+      <w:r>
+        <w:t xml:space="preserve">-</w:t>
+      </w:r>
+      <w:r>
+        <w:t xml:space="preserve"> </w:t>
+      </w:r>
+      <w:r>
+        <w:rPr>
+          <w:b/>
+          <w:bCs/>
+        </w:rPr>
+        <w:t xml:space="preserve">Refined Buyer Intent Filter (33 Keywords)</w:t>
+      </w:r>
+      <w:r>
+        <w:t xml:space="preserve">: Detects high-intent English and Hinglish phrases (</w:t>
+      </w:r>
+      <w:r>
+        <w:rPr>
+          <w:rStyle w:val="VerbatimChar"/>
+        </w:rPr>
+        <w:t xml:space="preserve">pgsharp key</w:t>
+      </w:r>
+      <w:r>
+        <w:t xml:space="preserve">,</w:t>
+      </w:r>
+      <w:r>
+        <w:t xml:space="preserve"> </w:t>
+      </w:r>
+      <w:r>
+        <w:rPr>
+          <w:rStyle w:val="VerbatimChar"/>
+        </w:rPr>
+        <w:t xml:space="preserve">standard key</w:t>
+      </w:r>
+      <w:r>
+        <w:t xml:space="preserve">,</w:t>
+      </w:r>
+      <w:r>
+        <w:t xml:space="preserve"> </w:t>
+      </w:r>
+      <w:r>
+        <w:rPr>
+          <w:rStyle w:val="VerbatimChar"/>
+        </w:rPr>
+        <w:t xml:space="preserve">buy key</w:t>
+      </w:r>
+      <w:r>
+        <w:t xml:space="preserve">,</w:t>
+      </w:r>
+      <w:r>
+        <w:t xml:space="preserve"> </w:t>
+      </w:r>
+      <w:r>
+        <w:rPr>
+          <w:rStyle w:val="VerbatimChar"/>
+        </w:rPr>
+        <w:t xml:space="preserve">kitne ka</w:t>
+      </w:r>
+      <w:r>
+        <w:t xml:space="preserve">,</w:t>
+      </w:r>
+      <w:r>
+        <w:t xml:space="preserve"> </w:t>
+      </w:r>
+      <w:r>
+        <w:rPr>
+          <w:rStyle w:val="VerbatimChar"/>
+        </w:rPr>
+        <w:t xml:space="preserve">kaise milegi</w:t>
+      </w:r>
+      <w:r>
+        <w:t xml:space="preserve">,</w:t>
+      </w:r>
+      <w:r>
+        <w:t xml:space="preserve"> </w:t>
+      </w:r>
+      <w:r>
+        <w:rPr>
+          <w:rStyle w:val="VerbatimChar"/>
+        </w:rPr>
+        <w:t xml:space="preserve">kahan se lu</w:t>
+      </w:r>
+      <w:r>
+        <w:t xml:space="preserve">,</w:t>
+      </w:r>
+      <w:r>
+        <w:t xml:space="preserve"> </w:t>
+      </w:r>
+      <w:r>
+        <w:rPr>
+          <w:rStyle w:val="VerbatimChar"/>
+        </w:rPr>
+        <w:t xml:space="preserve">kaise buy kare</w:t>
+      </w:r>
+      <w:r>
+        <w:t xml:space="preserve">,</w:t>
+      </w:r>
+      <w:r>
+        <w:t xml:space="preserve"> </w:t>
+      </w:r>
+      <w:r>
+        <w:rPr>
+          <w:rStyle w:val="VerbatimChar"/>
+        </w:rPr>
+        <w:t xml:space="preserve">key chahiye</w:t>
+      </w:r>
+      <w:r>
+        <w:t xml:space="preserve">) with word-boundary regex. Generic non-key terms (</w:t>
+      </w:r>
+      <w:r>
+        <w:rPr>
+          <w:rStyle w:val="VerbatimChar"/>
+        </w:rPr>
+        <w:t xml:space="preserve">price</w:t>
+      </w:r>
+      <w:r>
+        <w:t xml:space="preserve">,</w:t>
+      </w:r>
+      <w:r>
+        <w:t xml:space="preserve"> </w:t>
+      </w:r>
+      <w:r>
+        <w:rPr>
+          <w:rStyle w:val="VerbatimChar"/>
+        </w:rPr>
+        <w:t xml:space="preserve">cost</w:t>
+      </w:r>
+      <w:r>
+        <w:t xml:space="preserve">,</w:t>
+      </w:r>
+      <w:r>
+        <w:t xml:space="preserve"> </w:t>
+      </w:r>
+      <w:r>
+        <w:rPr>
+          <w:rStyle w:val="VerbatimChar"/>
+        </w:rPr>
+        <w:t xml:space="preserve">how much</w:t>
+      </w:r>
+      <w:r>
+        <w:t xml:space="preserve">) were purged to prevent false alerts.</w:t>
+      </w:r>
+      <w:r>
+        <w:t xml:space="preserve"> </w:t>
+      </w:r>
+      <w:r>
+        <w:t xml:space="preserve">-</w:t>
+      </w:r>
+      <w:r>
+        <w:t xml:space="preserve"> </w:t>
+      </w:r>
+      <w:r>
+        <w:rPr>
+          <w:b/>
+          <w:bCs/>
+        </w:rPr>
+        <w:t xml:space="preserve">Self-Comment Filter</w:t>
+      </w:r>
+      <w:r>
+        <w:t xml:space="preserve">: Automatically detects and ignores comments posted by</w:t>
+      </w:r>
+      <w:r>
+        <w:t xml:space="preserve"> </w:t>
+      </w:r>
+      <w:r>
+        <w:rPr>
+          <w:rStyle w:val="VerbatimChar"/>
+        </w:rPr>
+        <w:t xml:space="preserve">@dhruv_emperor</w:t>
+      </w:r>
+      <w:r>
+        <w:t xml:space="preserve"> </w:t>
+      </w:r>
+      <w:r>
+        <w:t xml:space="preserve">and</w:t>
+      </w:r>
+      <w:r>
+        <w:t xml:space="preserve"> </w:t>
+      </w:r>
+      <w:r>
+        <w:rPr>
+          <w:rStyle w:val="VerbatimChar"/>
+        </w:rPr>
+        <w:t xml:space="preserve">Aetheria Store</w:t>
+      </w:r>
+      <w:r>
+        <w:t xml:space="preserve">.</w:t>
+      </w:r>
+      <w:r>
+        <w:t xml:space="preserve"> </w:t>
+      </w:r>
+      <w:r>
+        <w:t xml:space="preserve">-</w:t>
+      </w:r>
+      <w:r>
+        <w:t xml:space="preserve"> </w:t>
+      </w:r>
+      <w:r>
+        <w:rPr>
+          <w:b/>
+          <w:bCs/>
+        </w:rPr>
+        <w:t xml:space="preserve">Strict Timestamp Cut-Off</w:t>
+      </w:r>
+      <w:r>
+        <w:t xml:space="preserve">: Only comments and replies posted after</w:t>
+      </w:r>
+      <w:r>
+        <w:t xml:space="preserve"> </w:t>
+      </w:r>
+      <w:r>
+        <w:rPr>
+          <w:b/>
+          <w:bCs/>
+        </w:rPr>
+        <w:t xml:space="preserve">16-Sep-2026 5:36:00 PM IST</w:t>
+      </w:r>
+      <w:r>
+        <w:t xml:space="preserve"> </w:t>
+      </w:r>
+      <w:r>
+        <w:t xml:space="preserve">(</w:t>
+      </w:r>
+      <w:r>
+        <w:rPr>
+          <w:rStyle w:val="VerbatimChar"/>
+        </w:rPr>
+        <w:t xml:space="preserve">2026-09-16T12:06:00Z</w:t>
+      </w:r>
+      <w:r>
+        <w:t xml:space="preserve">) trigger alerts. All older comments are ignored.</w:t>
+      </w:r>
+      <w:r>
+        <w:t xml:space="preserve"> </w:t>
+      </w:r>
+      <w:r>
+        <w:t xml:space="preserve">-</w:t>
+      </w:r>
+      <w:r>
+        <w:t xml:space="preserve"> </w:t>
+      </w:r>
+      <w:r>
+        <w:rPr>
+          <w:b/>
+          <w:bCs/>
+        </w:rPr>
+        <w:t xml:space="preserve">Instant Telegram Mobile Alerts</w:t>
+      </w:r>
+      <w:r>
+        <w:t xml:space="preserve">: Sends clean alerts to the owner’s Telegram (</w:t>
+      </w:r>
+      <w:r>
+        <w:rPr>
+          <w:rStyle w:val="VerbatimChar"/>
+        </w:rPr>
+        <w:t xml:space="preserve">741838315</w:t>
+      </w:r>
+      <w:r>
+        <w:t xml:space="preserve">) with commenter name, video title, comment text excerpt, and direct 1-tap jump link to open and reply on YouTube.</w:t>
+      </w:r>
+      <w:r>
+        <w:t xml:space="preserve"> </w:t>
+      </w:r>
+      <w:r>
+        <w:t xml:space="preserve">-</w:t>
+      </w:r>
+      <w:r>
+        <w:t xml:space="preserve"> </w:t>
+      </w:r>
+      <w:r>
+        <w:rPr>
+          <w:b/>
+          <w:bCs/>
+        </w:rPr>
+        <w:t xml:space="preserve">24/7 Cloud Engine</w:t>
+      </w:r>
+      <w:r>
+        <w:t xml:space="preserve">: Deployed to Render with UptimeRobot 5-minute HTTP ping to guarantee perpetual uptime with zero local PC dependency.</w:t>
+      </w:r>
+    </w:p>
+    <w:p>
+      <w:r>
+        <w:pict>
+          <v:rect style="width:0;height:1.5pt" o:hralign="center" o:hrstd="t" o:hr="t"/>
+        </w:pict>
+      </w:r>
+    </w:p>
+    <w:bookmarkEnd w:id="35"/>
+    <w:bookmarkStart w:id="36" w:name="Xda63d3ee28e4b32e5d18fa0dc2fa89c26024374"/>
+    <w:p>
+      <w:pPr>
+        <w:pStyle w:val="Heading2"/>
+      </w:pPr>
+      <w:r>
+        <w:t xml:space="preserve">8. Telegram Live Group Radar (</w:t>
+      </w:r>
+      <w:r>
+        <w:rPr>
+          <w:rStyle w:val="VerbatimChar"/>
+        </w:rPr>
+        <w:t xml:space="preserve">telegram-key-notifier</w:t>
+      </w:r>
+      <w:r>
+        <w:t xml:space="preserve">)</w:t>
+      </w:r>
+    </w:p>
+    <w:p>
+      <w:pPr>
+        <w:pStyle w:val="FirstParagraph"/>
+      </w:pPr>
+      <w:r>
+        <w:t xml:space="preserve">A dedicated standalone Node.js microservice running 24/7 on the cloud (</w:t>
+      </w:r>
+      <w:r>
+        <w:rPr>
+          <w:rStyle w:val="VerbatimChar"/>
+        </w:rPr>
+        <w:t xml:space="preserve">https://telegram-key-notifier.onrender.com</w:t>
+      </w:r>
+      <w:r>
+        <w:t xml:space="preserve">):</w:t>
+      </w:r>
+      <w:r>
+        <w:t xml:space="preserve"> </w:t>
+      </w:r>
+      <w:r>
+        <w:t xml:space="preserve">-</w:t>
+      </w:r>
+      <w:r>
+        <w:t xml:space="preserve"> </w:t>
+      </w:r>
+      <w:r>
+        <w:rPr>
+          <w:b/>
+          <w:bCs/>
+        </w:rPr>
+        <w:t xml:space="preserve">Direct MTProto Client Connection</w:t>
+      </w:r>
+      <w:r>
+        <w:t xml:space="preserve">: Utilizes GramJS MTProto client authenticated via secure session string to passively listen in real time across 9 joined Indian Pokemon GO and PGSharp trading groups:</w:t>
+      </w:r>
+      <w:r>
+        <w:t xml:space="preserve"> </w:t>
+      </w:r>
+      <w:r>
+        <w:t xml:space="preserve">1.</w:t>
+      </w:r>
+      <w:r>
+        <w:t xml:space="preserve"> </w:t>
+      </w:r>
+      <w:r>
+        <w:rPr>
+          <w:rStyle w:val="VerbatimChar"/>
+        </w:rPr>
+        <w:t xml:space="preserve">PoGoGuideYT12</w:t>
+      </w:r>
+      <w:r>
+        <w:t xml:space="preserve"> </w:t>
+      </w:r>
+      <w:r>
+        <w:t xml:space="preserve">(PoGoGuide YT)</w:t>
+      </w:r>
+      <w:r>
+        <w:t xml:space="preserve"> </w:t>
+      </w:r>
+      <w:r>
+        <w:t xml:space="preserve">2.</w:t>
+      </w:r>
+      <w:r>
+        <w:t xml:space="preserve"> </w:t>
+      </w:r>
+      <w:r>
+        <w:rPr>
+          <w:rStyle w:val="VerbatimChar"/>
+        </w:rPr>
+        <w:t xml:space="preserve">INDIANPOGO</w:t>
+      </w:r>
+      <w:r>
+        <w:t xml:space="preserve"> </w:t>
+      </w:r>
+      <w:r>
+        <w:t xml:space="preserve">(Indian Pokemon go Community)</w:t>
+      </w:r>
+      <w:r>
+        <w:t xml:space="preserve"> </w:t>
+      </w:r>
+      <w:r>
+        <w:t xml:space="preserve">3.</w:t>
+      </w:r>
+      <w:r>
+        <w:t xml:space="preserve"> </w:t>
+      </w:r>
+      <w:r>
+        <w:rPr>
+          <w:rStyle w:val="VerbatimChar"/>
+        </w:rPr>
+        <w:t xml:space="preserve">UnofficialCreators</w:t>
+      </w:r>
+      <w:r>
+        <w:t xml:space="preserve"> </w:t>
+      </w:r>
+      <w:r>
+        <w:t xml:space="preserve">(Unofficial Creator)</w:t>
+      </w:r>
+      <w:r>
+        <w:t xml:space="preserve"> </w:t>
+      </w:r>
+      <w:r>
+        <w:t xml:space="preserve">4.</w:t>
+      </w:r>
+      <w:r>
+        <w:t xml:space="preserve"> </w:t>
+      </w:r>
+      <w:r>
+        <w:rPr>
+          <w:rStyle w:val="VerbatimChar"/>
+        </w:rPr>
+        <w:t xml:space="preserve">Pokeprince79</w:t>
+      </w:r>
+      <w:r>
+        <w:t xml:space="preserve"> </w:t>
+      </w:r>
+      <w:r>
+        <w:t xml:space="preserve">(Poke Prince)</w:t>
+      </w:r>
+      <w:r>
+        <w:t xml:space="preserve"> </w:t>
+      </w:r>
+      <w:r>
+        <w:t xml:space="preserve">5.</w:t>
+      </w:r>
+      <w:r>
+        <w:t xml:space="preserve"> </w:t>
+      </w:r>
+      <w:r>
+        <w:rPr>
+          <w:rStyle w:val="VerbatimChar"/>
+        </w:rPr>
+        <w:t xml:space="preserve">memberpgsharp</w:t>
+      </w:r>
+      <w:r>
+        <w:t xml:space="preserve"> </w:t>
+      </w:r>
+      <w:r>
+        <w:t xml:space="preserve">(Pgsharp Keys)</w:t>
+      </w:r>
+      <w:r>
+        <w:t xml:space="preserve"> </w:t>
+      </w:r>
+      <w:r>
+        <w:t xml:space="preserve">6.</w:t>
+      </w:r>
+      <w:r>
+        <w:t xml:space="preserve"> </w:t>
+      </w:r>
+      <w:r>
+        <w:rPr>
+          <w:rStyle w:val="VerbatimChar"/>
+        </w:rPr>
+        <w:t xml:space="preserve">free_pgsharp_keys_old</w:t>
+      </w:r>
+      <w:r>
+        <w:t xml:space="preserve"> </w:t>
+      </w:r>
+      <w:r>
+        <w:t xml:space="preserve">(POKEMON GO TRAINER’S)</w:t>
+      </w:r>
+      <w:r>
+        <w:t xml:space="preserve"> </w:t>
+      </w:r>
+      <w:r>
+        <w:t xml:space="preserve">7.</w:t>
+      </w:r>
+      <w:r>
+        <w:t xml:space="preserve"> </w:t>
+      </w:r>
+      <w:r>
+        <w:rPr>
+          <w:rStyle w:val="VerbatimChar"/>
+        </w:rPr>
+        <w:t xml:space="preserve">pgsharpkeyfree1</w:t>
+      </w:r>
+      <w:r>
+        <w:t xml:space="preserve"> </w:t>
+      </w:r>
+      <w:r>
+        <w:t xml:space="preserve">(Pokemon Go Official)</w:t>
+      </w:r>
+      <w:r>
+        <w:t xml:space="preserve"> </w:t>
+      </w:r>
+      <w:r>
+        <w:t xml:space="preserve">8.</w:t>
+      </w:r>
+      <w:r>
+        <w:t xml:space="preserve"> </w:t>
+      </w:r>
+      <w:r>
+        <w:rPr>
+          <w:rStyle w:val="VerbatimChar"/>
+        </w:rPr>
+        <w:t xml:space="preserve">Lakshya0712345</w:t>
+      </w:r>
+      <w:r>
+        <w:t xml:space="preserve"> </w:t>
+      </w:r>
+      <w:r>
+        <w:t xml:space="preserve">(Pgsharp free keys Chat)</w:t>
+      </w:r>
+      <w:r>
+        <w:t xml:space="preserve"> </w:t>
+      </w:r>
+      <w:r>
+        <w:t xml:space="preserve">9.</w:t>
+      </w:r>
+      <w:r>
+        <w:t xml:space="preserve"> </w:t>
+      </w:r>
+      <w:r>
+        <w:rPr>
+          <w:rStyle w:val="VerbatimChar"/>
+        </w:rPr>
+        <w:t xml:space="preserve">membersofpgsharpkeys</w:t>
+      </w:r>
+      <w:r>
+        <w:t xml:space="preserve"> </w:t>
+      </w:r>
+      <w:r>
+        <w:t xml:space="preserve">(Pgsharp chat group for key)</w:t>
+      </w:r>
+      <w:r>
+        <w:t xml:space="preserve"> </w:t>
+      </w:r>
+      <w:r>
+        <w:t xml:space="preserve">-</w:t>
+      </w:r>
+      <w:r>
+        <w:t xml:space="preserve"> </w:t>
+      </w:r>
+      <w:r>
+        <w:rPr>
+          <w:b/>
+          <w:bCs/>
+        </w:rPr>
+        <w:t xml:space="preserve">Strict Timestamp Cut-Off</w:t>
+      </w:r>
+      <w:r>
+        <w:t xml:space="preserve">: Only messages posted after</w:t>
+      </w:r>
+      <w:r>
+        <w:t xml:space="preserve"> </w:t>
+      </w:r>
+      <w:r>
+        <w:rPr>
+          <w:b/>
+          <w:bCs/>
+        </w:rPr>
+        <w:t xml:space="preserve">17-Sep-2026 10:53:00 PM IST</w:t>
+      </w:r>
+      <w:r>
+        <w:t xml:space="preserve"> </w:t>
+      </w:r>
+      <w:r>
+        <w:t xml:space="preserve">(</w:t>
+      </w:r>
+      <w:r>
+        <w:rPr>
+          <w:rStyle w:val="VerbatimChar"/>
+        </w:rPr>
+        <w:t xml:space="preserve">2026-09-17T17:23:00Z</w:t>
+      </w:r>
+      <w:r>
+        <w:t xml:space="preserve">) are evaluated. All historical messages are ignored.</w:t>
+      </w:r>
+      <w:r>
+        <w:t xml:space="preserve"> </w:t>
+      </w:r>
+      <w:r>
+        <w:t xml:space="preserve">-</w:t>
+      </w:r>
+      <w:r>
+        <w:t xml:space="preserve"> </w:t>
+      </w:r>
+      <w:r>
+        <w:rPr>
+          <w:b/>
+          <w:bCs/>
+        </w:rPr>
+        <w:t xml:space="preserve">33 High-Intent Buyer Keywords</w:t>
+      </w:r>
+      <w:r>
+        <w:t xml:space="preserve">: Word-boundary regex matching for English and Hinglish buyer signals (</w:t>
+      </w:r>
+      <w:r>
+        <w:rPr>
+          <w:rStyle w:val="VerbatimChar"/>
+        </w:rPr>
+        <w:t xml:space="preserve">key</w:t>
+      </w:r>
+      <w:r>
+        <w:t xml:space="preserve">,</w:t>
+      </w:r>
+      <w:r>
+        <w:t xml:space="preserve"> </w:t>
+      </w:r>
+      <w:r>
+        <w:rPr>
+          <w:rStyle w:val="VerbatimChar"/>
+        </w:rPr>
+        <w:t xml:space="preserve">pgsharp key</w:t>
+      </w:r>
+      <w:r>
+        <w:t xml:space="preserve">,</w:t>
+      </w:r>
+      <w:r>
+        <w:t xml:space="preserve"> </w:t>
+      </w:r>
+      <w:r>
+        <w:rPr>
+          <w:rStyle w:val="VerbatimChar"/>
+        </w:rPr>
+        <w:t xml:space="preserve">standard key</w:t>
+      </w:r>
+      <w:r>
+        <w:t xml:space="preserve">,</w:t>
+      </w:r>
+      <w:r>
+        <w:t xml:space="preserve"> </w:t>
+      </w:r>
+      <w:r>
+        <w:rPr>
+          <w:rStyle w:val="VerbatimChar"/>
+        </w:rPr>
+        <w:t xml:space="preserve">buy key</w:t>
+      </w:r>
+      <w:r>
+        <w:t xml:space="preserve">,</w:t>
+      </w:r>
+      <w:r>
+        <w:t xml:space="preserve"> </w:t>
+      </w:r>
+      <w:r>
+        <w:rPr>
+          <w:rStyle w:val="VerbatimChar"/>
+        </w:rPr>
+        <w:t xml:space="preserve">kitne ka</w:t>
+      </w:r>
+      <w:r>
+        <w:t xml:space="preserve">,</w:t>
+      </w:r>
+      <w:r>
+        <w:t xml:space="preserve"> </w:t>
+      </w:r>
+      <w:r>
+        <w:rPr>
+          <w:rStyle w:val="VerbatimChar"/>
+        </w:rPr>
+        <w:t xml:space="preserve">kaise milegi</w:t>
+      </w:r>
+      <w:r>
+        <w:t xml:space="preserve">,</w:t>
+      </w:r>
+      <w:r>
+        <w:t xml:space="preserve"> </w:t>
+      </w:r>
+      <w:r>
+        <w:rPr>
+          <w:rStyle w:val="VerbatimChar"/>
+        </w:rPr>
+        <w:t xml:space="preserve">kahan se lu</w:t>
+      </w:r>
+      <w:r>
+        <w:t xml:space="preserve">,</w:t>
+      </w:r>
+      <w:r>
+        <w:t xml:space="preserve"> </w:t>
+      </w:r>
+      <w:r>
+        <w:rPr>
+          <w:rStyle w:val="VerbatimChar"/>
+        </w:rPr>
+        <w:t xml:space="preserve">kaise buy kare</w:t>
+      </w:r>
+      <w:r>
+        <w:t xml:space="preserve">,</w:t>
+      </w:r>
+      <w:r>
+        <w:t xml:space="preserve"> </w:t>
+      </w:r>
+      <w:r>
+        <w:rPr>
+          <w:rStyle w:val="VerbatimChar"/>
+        </w:rPr>
+        <w:t xml:space="preserve">key chahiye</w:t>
+      </w:r>
+      <w:r>
+        <w:t xml:space="preserve">).</w:t>
+      </w:r>
+      <w:r>
+        <w:t xml:space="preserve"> </w:t>
+      </w:r>
+      <w:r>
+        <w:t xml:space="preserve">-</w:t>
+      </w:r>
+      <w:r>
+        <w:t xml:space="preserve"> </w:t>
+      </w:r>
+      <w:r>
+        <w:rPr>
+          <w:b/>
+          <w:bCs/>
+        </w:rPr>
+        <w:t xml:space="preserve">Self-Sender Exclusion</w:t>
+      </w:r>
+      <w:r>
+        <w:t xml:space="preserve">: Automatically detects and ignores messages sent by the owner (</w:t>
+      </w:r>
+      <w:r>
+        <w:rPr>
+          <w:rStyle w:val="VerbatimChar"/>
+        </w:rPr>
+        <w:t xml:space="preserve">@sleekfx3</w:t>
+      </w:r>
+      <w:r>
+        <w:t xml:space="preserve"> </w:t>
+      </w:r>
+      <w:r>
+        <w:t xml:space="preserve">/ ID</w:t>
+      </w:r>
+      <w:r>
+        <w:t xml:space="preserve"> </w:t>
+      </w:r>
+      <w:r>
+        <w:rPr>
+          <w:rStyle w:val="VerbatimChar"/>
+        </w:rPr>
+        <w:t xml:space="preserve">741838315</w:t>
+      </w:r>
+      <w:r>
+        <w:t xml:space="preserve">).</w:t>
+      </w:r>
+      <w:r>
+        <w:t xml:space="preserve"> </w:t>
+      </w:r>
+      <w:r>
+        <w:t xml:space="preserve">-</w:t>
+      </w:r>
+      <w:r>
+        <w:t xml:space="preserve"> </w:t>
+      </w:r>
+      <w:r>
+        <w:rPr>
+          <w:b/>
+          <w:bCs/>
+        </w:rPr>
+        <w:t xml:space="preserve">Zero-Emoji Mobile Alerts</w:t>
+      </w:r>
+      <w:r>
+        <w:t xml:space="preserve">: Immediately pushes formatted alert cards to the owner’s Telegram with group title, commenter name/username, exact message snippet, and a 1-tap direct jump link (</w:t>
+      </w:r>
+      <w:r>
+        <w:rPr>
+          <w:rStyle w:val="VerbatimChar"/>
+        </w:rPr>
+        <w:t xml:space="preserve">https://t.me/{chat}/{messageId}</w:t>
+      </w:r>
+      <w:r>
+        <w:t xml:space="preserve">).</w:t>
+      </w:r>
+      <w:r>
+        <w:t xml:space="preserve"> </w:t>
+      </w:r>
+      <w:r>
+        <w:t xml:space="preserve">-</w:t>
+      </w:r>
+      <w:r>
+        <w:t xml:space="preserve"> </w:t>
+      </w:r>
+      <w:r>
+        <w:rPr>
+          <w:b/>
+          <w:bCs/>
+        </w:rPr>
+        <w:t xml:space="preserve">24/7 Cloud Engine</w:t>
+      </w:r>
+      <w:r>
+        <w:t xml:space="preserve">: Deployed to Render with UptimeRobot 5-minute keep-awake ping to guarantee perpetual uptime.</w:t>
+      </w:r>
+    </w:p>
+    <w:p>
+      <w:r>
+        <w:pict>
+          <v:rect style="width:0;height:1.5pt" o:hralign="center" o:hrstd="t" o:hr="t"/>
+        </w:pict>
+      </w:r>
+    </w:p>
+    <w:bookmarkEnd w:id="36"/>
+    <w:bookmarkStart w:id="40" w:name="X6db8a6fe6a898cc68ce14e0d5c4b5d0c9d92a97"/>
+    <w:p>
+      <w:pPr>
+        <w:pStyle w:val="Heading2"/>
+      </w:pPr>
+      <w:r>
+        <w:t xml:space="preserve">9. Telegram Bot &amp; Channel Announcement Architecture</w:t>
+      </w:r>
+    </w:p>
+    <w:bookmarkStart w:id="37" w:name="X02ae9847bd9588ccf72013de6dc22b2efcf9bdb"/>
     <w:p>
       <w:pPr>
         <w:pStyle w:val="Heading3"/>
       </w:pPr>
       <w:r>
-        <w:t xml:space="preserve">9.3 Community Announcements &amp; Dedicated Vouches Architecture</w:t>
+        <w:t xml:space="preserve">9.1 Minimal 4-Line QR Screen &amp; Progressive Disclosure</w:t>
+      </w:r>
+    </w:p>
+    <w:p>
+      <w:pPr>
+        <w:pStyle w:val="FirstParagraph"/>
+      </w:pPr>
+      <w:r>
+        <w:t xml:space="preserve">To eliminate customer intimidation, hesitation, and text overload:</w:t>
+      </w:r>
+      <w:r>
+        <w:t xml:space="preserve"> </w:t>
+      </w:r>
+      <w:r>
+        <w:t xml:space="preserve">-</w:t>
+      </w:r>
+      <w:r>
+        <w:t xml:space="preserve"> </w:t>
+      </w:r>
+      <w:r>
+        <w:rPr>
+          <w:b/>
+          <w:bCs/>
+        </w:rPr>
+        <w:t xml:space="preserve">Clean 4-Line Layout</w:t>
+      </w:r>
+      <w:r>
+        <w:t xml:space="preserve">:</w:t>
+      </w:r>
+      <w:r>
+        <w:t xml:space="preserve"> </w:t>
+      </w:r>
+      <w:r>
+        <w:t xml:space="preserve">```text</w:t>
+      </w:r>
+      <w:r>
+        <w:t xml:space="preserve"> </w:t>
+      </w:r>
+      <w:r>
+        <w:t xml:space="preserve">PGSharp Standard (~30 Days) — ₹160</w:t>
+      </w:r>
+      <w:r>
+        <w:t xml:space="preserve"> </w:t>
+      </w:r>
+      <w:r>
+        <w:t xml:space="preserve">UPI ID: dhruvmatliwala123@oksbi</w:t>
+      </w:r>
+      <w:r>
+        <w:t xml:space="preserve"> </w:t>
+      </w:r>
+      <w:r>
+        <w:t xml:space="preserve">Order ID: ord_tg_xxxx</w:t>
+      </w:r>
+    </w:p>
+    <w:p>
+      <w:pPr>
+        <w:pStyle w:val="BodyText"/>
+      </w:pPr>
+      <w:r>
+        <w:t xml:space="preserve">Scan QR or pay ₹160. Key is auto-delivered here within 1–2 minutes!</w:t>
+      </w:r>
+      <w:r>
+        <w:t xml:space="preserve"> </w:t>
+      </w:r>
+      <w:r>
+        <w:rPr>
+          <w:rStyle w:val="VerbatimChar"/>
+        </w:rPr>
+        <w:t xml:space="preserve">- **Primary Fallback Button**: `[ Paid but didn't get key? ]` - **Progressive Disclosure on Demand**: Clicking the button reveals comforting guidance without technical jargon:</w:t>
+      </w:r>
+      <w:r>
+        <w:t xml:space="preserve">text</w:t>
+      </w:r>
+      <w:r>
+        <w:t xml:space="preserve"> </w:t>
+      </w:r>
+      <w:r>
+        <w:t xml:space="preserve">Awaiting Bank Confirmation…</w:t>
+      </w:r>
+      <w:r>
+        <w:t xml:space="preserve"> </w:t>
+      </w:r>
+      <w:r>
+        <w:t xml:space="preserve">Bank SMS alerts usually arrive within 1–2 minutes.</w:t>
+      </w:r>
+    </w:p>
+    <w:p>
+      <w:pPr>
+        <w:pStyle w:val="BodyText"/>
+      </w:pPr>
+      <w:r>
+        <w:t xml:space="preserve">If you paid and want your key right away without waiting:</w:t>
+      </w:r>
+      <w:r>
+        <w:t xml:space="preserve"> </w:t>
+      </w:r>
+      <w:r>
+        <w:t xml:space="preserve">Send a screenshot of your Transaction Details (in Google Pay/FamPay, tap on the payment to view full details with the 12-digit UPI ID) or reply with the 12 digits directly!</w:t>
+      </w:r>
+      <w:r>
+        <w:t xml:space="preserve"> </w:t>
+      </w:r>
+      <w:r>
+        <w:t xml:space="preserve">```</w:t>
+      </w:r>
+      <w:r>
+        <w:t xml:space="preserve"> </w:t>
+      </w:r>
+      <w:r>
+        <w:t xml:space="preserve">-</w:t>
+      </w:r>
+      <w:r>
+        <w:t xml:space="preserve"> </w:t>
+      </w:r>
+      <w:r>
+        <w:rPr>
+          <w:b/>
+          <w:bCs/>
+        </w:rPr>
+        <w:t xml:space="preserve">Tap-Payment Guidance</w:t>
+      </w:r>
+      <w:r>
+        <w:t xml:space="preserve">: Educates customers to tap their completed payment in Google Pay / FamPay to find the 12-digit</w:t>
+      </w:r>
+      <w:r>
+        <w:t xml:space="preserve"> </w:t>
+      </w:r>
+      <w:r>
+        <w:rPr>
+          <w:b/>
+          <w:bCs/>
+        </w:rPr>
+        <w:t xml:space="preserve">UPI transaction ID</w:t>
+      </w:r>
+      <w:r>
+        <w:t xml:space="preserve"> </w:t>
+      </w:r>
+      <w:r>
+        <w:t xml:space="preserve">rather than confusing banking terms like</w:t>
+      </w:r>
+      <w:r>
+        <w:t xml:space="preserve"> </w:t>
+      </w:r>
+      <w:r>
+        <w:t xml:space="preserve">“UTR”</w:t>
+      </w:r>
+      <w:r>
+        <w:t xml:space="preserve">.</w:t>
+      </w:r>
+    </w:p>
+    <w:bookmarkEnd w:id="37"/>
+    <w:bookmarkStart w:id="38" w:name="X47c82301dd07ef9336c1959c2655ff3cb0eb7c9"/>
+    <w:p>
+      <w:pPr>
+        <w:pStyle w:val="Heading3"/>
+      </w:pPr>
+      <w:r>
+        <w:t xml:space="preserve">9.2 Viral Telegram Referral &amp; Reward Engine (</w:t>
+      </w:r>
+      <w:r>
+        <w:t xml:space="preserve">“Refer &amp; Earn”</w:t>
+      </w:r>
+      <w:r>
+        <w:t xml:space="preserve">)</w:t>
       </w:r>
     </w:p>
     <w:p>
@@ -3210,61 +3258,19 @@
           <w:b/>
           <w:bCs/>
         </w:rPr>
-        <w:t xml:space="preserve">Automated Restock Flash Alerts</w:t>
-      </w:r>
-      <w:r>
-        <w:t xml:space="preserve">: Whenever fresh keys are uploaded to the vault via</w:t>
-      </w:r>
-      <w:r>
-        <w:t xml:space="preserve"> </w:t>
-      </w:r>
-      <w:r>
-        <w:rPr>
-          <w:rStyle w:val="VerbatimChar"/>
-        </w:rPr>
-        <w:t xml:space="preserve">/admin</w:t>
-      </w:r>
-      <w:r>
-        <w:t xml:space="preserve">,</w:t>
-      </w:r>
-      <w:r>
-        <w:t xml:space="preserve"> </w:t>
-      </w:r>
-      <w:r>
-        <w:rPr>
-          <w:rStyle w:val="VerbatimChar"/>
-        </w:rPr>
-        <w:t xml:space="preserve">broadcastRestockAlert</w:t>
-      </w:r>
-      <w:r>
-        <w:t xml:space="preserve"> </w:t>
-      </w:r>
-      <w:r>
-        <w:t xml:space="preserve">automatically announces the restock in</w:t>
-      </w:r>
-      <w:r>
-        <w:t xml:space="preserve"> </w:t>
-      </w:r>
-      <w:r>
-        <w:rPr>
-          <w:rStyle w:val="VerbatimChar"/>
-        </w:rPr>
-        <w:t xml:space="preserve">@AetheriaStoreOfficial</w:t>
-      </w:r>
-      <w:r>
-        <w:t xml:space="preserve"> </w:t>
-      </w:r>
-      <w:r>
-        <w:t xml:space="preserve">with a direct 1-tap purchase button (</w:t>
-      </w:r>
-      <w:r>
-        <w:rPr>
-          <w:rStyle w:val="VerbatimChar"/>
-        </w:rPr>
-        <w:t xml:space="preserve">⚡ KEYS ARE BACK IN STOCK!</w:t>
-      </w:r>
-      <w:r>
-        <w:t xml:space="preserve">).</w:t>
+        <w:t xml:space="preserve">Deep Tracking Links</w:t>
+      </w:r>
+      <w:r>
+        <w:t xml:space="preserve">: Unique referral links (</w:t>
+      </w:r>
+      <w:r>
+        <w:rPr>
+          <w:rStyle w:val="VerbatimChar"/>
+        </w:rPr>
+        <w:t xml:space="preserve">https://t.me/AetheriaStoreOfficialBot?start=ref_&lt;chatId&gt;</w:t>
+      </w:r>
+      <w:r>
+        <w:t xml:space="preserve">) with real-time conversion stats.</w:t>
       </w:r>
     </w:p>
     <w:p>
@@ -3280,19 +3286,52 @@
           <w:b/>
           <w:bCs/>
         </w:rPr>
-        <w:t xml:space="preserve">Clean Main Channel Policy</w:t>
-      </w:r>
-      <w:r>
-        <w:t xml:space="preserve">: Automated bot purchase messages (</w:t>
-      </w:r>
-      <w:r>
-        <w:rPr>
-          <w:rStyle w:val="VerbatimChar"/>
-        </w:rPr>
-        <w:t xml:space="preserve">ORDER COMPLETED dispatched to...</w:t>
-      </w:r>
-      <w:r>
-        <w:t xml:space="preserve">) were decommissioned to keep the main channel sleek and free from repetitive notification spam.</w:t>
+        <w:t xml:space="preserve">Automated Friend Discount (Zero Coupon Required)</w:t>
+      </w:r>
+      <w:r>
+        <w:t xml:space="preserve">: Friends joining via referral automatically receive</w:t>
+      </w:r>
+      <w:r>
+        <w:t xml:space="preserve"> </w:t>
+      </w:r>
+      <w:r>
+        <w:rPr>
+          <w:b/>
+          <w:bCs/>
+        </w:rPr>
+        <w:t xml:space="preserve">₹30 OFF</w:t>
+      </w:r>
+      <w:r>
+        <w:t xml:space="preserve"> </w:t>
+      </w:r>
+      <w:r>
+        <w:t xml:space="preserve">on their first purchase (Standard:</w:t>
+      </w:r>
+      <w:r>
+        <w:t xml:space="preserve"> </w:t>
+      </w:r>
+      <w:r>
+        <w:rPr>
+          <w:b/>
+          <w:bCs/>
+        </w:rPr>
+        <w:t xml:space="preserve">₹130</w:t>
+      </w:r>
+      <w:r>
+        <w:t xml:space="preserve">; Duo:</w:t>
+      </w:r>
+      <w:r>
+        <w:t xml:space="preserve"> </w:t>
+      </w:r>
+      <w:r>
+        <w:rPr>
+          <w:b/>
+          <w:bCs/>
+        </w:rPr>
+        <w:t xml:space="preserve">₹270</w:t>
+      </w:r>
+      <w:r>
+        <w:t xml:space="preserve">).</w:t>
       </w:r>
     </w:p>
     <w:p>
@@ -3308,43 +3347,67 @@
           <w:b/>
           <w:bCs/>
         </w:rPr>
-        <w:t xml:space="preserve">Dedicated Vouches Channel (</w:t>
-      </w:r>
-      <w:r>
-        <w:rPr>
-          <w:rStyle w:val="VerbatimChar"/>
-          <w:b/>
-          <w:bCs/>
-        </w:rPr>
-        <w:t xml:space="preserve">@AetheriaStoreVouches</w:t>
-      </w:r>
-      <w:r>
-        <w:rPr>
-          <w:b/>
-          <w:bCs/>
-        </w:rPr>
-        <w:t xml:space="preserve">)</w:t>
-      </w:r>
-      <w:r>
-        <w:t xml:space="preserve">: Authentic customer proof screenshots (UPI transfers, PayPal receipts, Discord chat confirmations, and in-game PGSharp activation screens) are published in a separate vouches channel with key details properly redacted, establishing unshakeable social proof without cluttering announcements.</w:t>
-      </w:r>
-    </w:p>
-    <w:p>
-      <w:r>
-        <w:pict>
-          <v:rect style="width:0;height:1.5pt" o:hralign="center" o:hrstd="t" o:hr="t"/>
-        </w:pict>
-      </w:r>
-    </w:p>
-    <w:bookmarkEnd w:id="39"/>
-    <w:bookmarkEnd w:id="40"/>
-    <w:bookmarkStart w:id="41" w:name="Xc4edd6052f2f0c16617110e07b8df38bba5d2da"/>
-    <w:p>
-      <w:pPr>
-        <w:pStyle w:val="Heading2"/>
-      </w:pPr>
-      <w:r>
-        <w:t xml:space="preserve">10. Admin Command Center &amp; Vercel Storage Optimization</w:t>
+        <w:t xml:space="preserve">Reward Coupon Issuance</w:t>
+      </w:r>
+      <w:r>
+        <w:t xml:space="preserve">: When the friend completes an order, the referrer automatically receives a single-use ₹30 coupon (</w:t>
+      </w:r>
+      <w:r>
+        <w:rPr>
+          <w:rStyle w:val="VerbatimChar"/>
+        </w:rPr>
+        <w:t xml:space="preserve">REF30_XXXXXX</w:t>
+      </w:r>
+      <w:r>
+        <w:t xml:space="preserve">) redeemable on future renewals.</w:t>
+      </w:r>
+    </w:p>
+    <w:p>
+      <w:pPr>
+        <w:pStyle w:val="Compact"/>
+        <w:numPr>
+          <w:ilvl w:val="0"/>
+          <w:numId w:val="1011"/>
+        </w:numPr>
+      </w:pPr>
+      <w:r>
+        <w:rPr>
+          <w:b/>
+          <w:bCs/>
+        </w:rPr>
+        <w:t xml:space="preserve">Milestone Rewards</w:t>
+      </w:r>
+      <w:r>
+        <w:t xml:space="preserve">: Scaled milestone rewards (3 invites = 50% Off, 5 invites = 1 Free Standard Key for 30 Days).</w:t>
+      </w:r>
+    </w:p>
+    <w:p>
+      <w:pPr>
+        <w:pStyle w:val="Compact"/>
+        <w:numPr>
+          <w:ilvl w:val="0"/>
+          <w:numId w:val="1011"/>
+        </w:numPr>
+      </w:pPr>
+      <w:r>
+        <w:rPr>
+          <w:b/>
+          <w:bCs/>
+        </w:rPr>
+        <w:t xml:space="preserve">Anti-Fraud Protections</w:t>
+      </w:r>
+      <w:r>
+        <w:t xml:space="preserve">: Device and IP fingerprinting, strict chat ID deduplication, and self-referral blocks.</w:t>
+      </w:r>
+    </w:p>
+    <w:bookmarkEnd w:id="38"/>
+    <w:bookmarkStart w:id="39" w:name="X13842493e6922ba38d3777ad41b96aa6b5a6e6c"/>
+    <w:p>
+      <w:pPr>
+        <w:pStyle w:val="Heading3"/>
+      </w:pPr>
+      <w:r>
+        <w:t xml:space="preserve">9.3 Community Announcements &amp; Dedicated Vouches Architecture</w:t>
       </w:r>
     </w:p>
     <w:p>
@@ -3360,25 +3423,61 @@
           <w:b/>
           <w:bCs/>
         </w:rPr>
-        <w:t xml:space="preserve">Unified Inventory Dashboard (</w:t>
-      </w:r>
-      <w:r>
-        <w:rPr>
-          <w:rStyle w:val="VerbatimChar"/>
-          <w:b/>
-          <w:bCs/>
+        <w:t xml:space="preserve">Automated Restock Flash Alerts</w:t>
+      </w:r>
+      <w:r>
+        <w:t xml:space="preserve">: Whenever fresh keys are uploaded to the vault via</w:t>
+      </w:r>
+      <w:r>
+        <w:t xml:space="preserve"> </w:t>
+      </w:r>
+      <w:r>
+        <w:rPr>
+          <w:rStyle w:val="VerbatimChar"/>
         </w:rPr>
         <w:t xml:space="preserve">/admin</w:t>
       </w:r>
       <w:r>
-        <w:rPr>
-          <w:b/>
-          <w:bCs/>
-        </w:rPr>
-        <w:t xml:space="preserve">)</w:t>
-      </w:r>
-      <w:r>
-        <w:t xml:space="preserve">: Real-time stats on available keys, low-stock threshold alerts, pending orders, and restock waitlist count.</w:t>
+        <w:t xml:space="preserve">,</w:t>
+      </w:r>
+      <w:r>
+        <w:t xml:space="preserve"> </w:t>
+      </w:r>
+      <w:r>
+        <w:rPr>
+          <w:rStyle w:val="VerbatimChar"/>
+        </w:rPr>
+        <w:t xml:space="preserve">broadcastRestockAlert</w:t>
+      </w:r>
+      <w:r>
+        <w:t xml:space="preserve"> </w:t>
+      </w:r>
+      <w:r>
+        <w:t xml:space="preserve">automatically announces the restock in</w:t>
+      </w:r>
+      <w:r>
+        <w:t xml:space="preserve"> </w:t>
+      </w:r>
+      <w:r>
+        <w:rPr>
+          <w:rStyle w:val="VerbatimChar"/>
+        </w:rPr>
+        <w:t xml:space="preserve">@AetheriaStoreOfficial</w:t>
+      </w:r>
+      <w:r>
+        <w:t xml:space="preserve"> </w:t>
+      </w:r>
+      <w:r>
+        <w:t xml:space="preserve">with a direct 1-tap purchase button (</w:t>
+      </w:r>
+      <w:r>
+        <w:rPr>
+          <w:rStyle w:val="VerbatimChar"/>
+        </w:rPr>
+        <w:t xml:space="preserve">KEYS ARE BACK IN STOCK!</w:t>
+      </w:r>
+      <w:r>
+        <w:t xml:space="preserve">).</w:t>
       </w:r>
     </w:p>
     <w:p>
@@ -3394,10 +3493,19 @@
           <w:b/>
           <w:bCs/>
         </w:rPr>
-        <w:t xml:space="preserve">Manual Key Allocation System</w:t>
-      </w:r>
-      <w:r>
-        <w:t xml:space="preserve">: Dedicated UI tab to directly allocate standard or duo keys to custom customer identifiers (Discord, Telegram, Reddit, Email) without website payment friction.</w:t>
+        <w:t xml:space="preserve">Clean Main Channel Policy</w:t>
+      </w:r>
+      <w:r>
+        <w:t xml:space="preserve">: Automated bot purchase messages (</w:t>
+      </w:r>
+      <w:r>
+        <w:rPr>
+          <w:rStyle w:val="VerbatimChar"/>
+        </w:rPr>
+        <w:t xml:space="preserve">ORDER COMPLETED dispatched to...</w:t>
+      </w:r>
+      <w:r>
+        <w:t xml:space="preserve">) were decommissioned to keep the main channel sleek and free from repetitive notification spam.</w:t>
       </w:r>
     </w:p>
     <w:p>
@@ -3413,150 +3521,25 @@
           <w:b/>
           <w:bCs/>
         </w:rPr>
-        <w:t xml:space="preserve">Automated Waitlist Blast</w:t>
-      </w:r>
-      <w:r>
-        <w:t xml:space="preserve">: One-click and auto-on-upload restock alerts emailed to all waiting customers via direct Gmail SMTP.</w:t>
-      </w:r>
-    </w:p>
-    <w:p>
-      <w:pPr>
-        <w:pStyle w:val="Compact"/>
-        <w:numPr>
-          <w:ilvl w:val="0"/>
-          <w:numId w:val="1012"/>
-        </w:numPr>
-      </w:pPr>
-      <w:r>
-        <w:rPr>
-          <w:b/>
-          <w:bCs/>
-        </w:rPr>
-        <w:t xml:space="preserve">Storage Optimization</w:t>
-      </w:r>
-      <w:r>
-        <w:t xml:space="preserve">: Firestore indexing and bounded document queries to minimize database read/write costs.</w:t>
-      </w:r>
-    </w:p>
-    <w:p>
-      <w:pPr>
-        <w:pStyle w:val="Compact"/>
-        <w:numPr>
-          <w:ilvl w:val="0"/>
-          <w:numId w:val="1012"/>
-        </w:numPr>
-      </w:pPr>
-      <w:r>
-        <w:rPr>
-          <w:b/>
-          <w:bCs/>
-        </w:rPr>
-        <w:t xml:space="preserve">Ghost Admin Camouflage</w:t>
-      </w:r>
-      <w:r>
-        <w:t xml:space="preserve">: Direct visits to</w:t>
-      </w:r>
-      <w:r>
-        <w:t xml:space="preserve"> </w:t>
-      </w:r>
-      <w:r>
-        <w:rPr>
-          <w:rStyle w:val="VerbatimChar"/>
-        </w:rPr>
-        <w:t xml:space="preserve">/admin</w:t>
-      </w:r>
-      <w:r>
-        <w:t xml:space="preserve"> </w:t>
-      </w:r>
-      <w:r>
-        <w:t xml:space="preserve">without authorization display an authentic</w:t>
-      </w:r>
-      <w:r>
-        <w:t xml:space="preserve"> </w:t>
-      </w:r>
-      <w:r>
-        <w:rPr>
-          <w:rStyle w:val="VerbatimChar"/>
-        </w:rPr>
-        <w:t xml:space="preserve">404 - Page Not Found</w:t>
-      </w:r>
-      <w:r>
-        <w:t xml:space="preserve">. Accessible only via secret bookmark (</w:t>
-      </w:r>
-      <w:r>
-        <w:rPr>
-          <w:rStyle w:val="VerbatimChar"/>
-        </w:rPr>
-        <w:t xml:space="preserve">/admin?key=YOUR_SECRET_KEY</w:t>
-      </w:r>
-      <w:r>
-        <w:t xml:space="preserve">) or triple-clicking the 404 badge.</w:t>
-      </w:r>
-    </w:p>
-    <w:p>
-      <w:pPr>
-        <w:pStyle w:val="Compact"/>
-        <w:numPr>
-          <w:ilvl w:val="0"/>
-          <w:numId w:val="1012"/>
-        </w:numPr>
-      </w:pPr>
-      <w:r>
-        <w:rPr>
-          <w:b/>
-          <w:bCs/>
-        </w:rPr>
-        <w:t xml:space="preserve">Anti-Brute-Force Rate Limiting</w:t>
-      </w:r>
-      <w:r>
-        <w:t xml:space="preserve">: Client IP locked after 5 failed passcode attempts for 15 minutes.</w:t>
-      </w:r>
-    </w:p>
-    <w:p>
-      <w:pPr>
-        <w:pStyle w:val="Compact"/>
-        <w:numPr>
-          <w:ilvl w:val="0"/>
-          <w:numId w:val="1012"/>
-        </w:numPr>
-      </w:pPr>
-      <w:r>
-        <w:rPr>
-          <w:b/>
-          <w:bCs/>
-        </w:rPr>
-        <w:t xml:space="preserve">Live Firestore Coupon Engine</w:t>
-      </w:r>
-      <w:r>
-        <w:t xml:space="preserve">: Interactive CRUD for promotional coupons with 1-click permanent deletion.</w:t>
-      </w:r>
-    </w:p>
-    <w:p>
-      <w:pPr>
-        <w:pStyle w:val="Compact"/>
-        <w:numPr>
-          <w:ilvl w:val="0"/>
-          <w:numId w:val="1012"/>
-        </w:numPr>
-      </w:pPr>
-      <w:r>
-        <w:rPr>
-          <w:b/>
-          <w:bCs/>
-        </w:rPr>
-        <w:t xml:space="preserve">Vercel Deployment Storage Optimization</w:t>
-      </w:r>
-      <w:r>
-        <w:t xml:space="preserve">: Automated cleanup tooling (</w:t>
-      </w:r>
-      <w:r>
-        <w:rPr>
-          <w:rStyle w:val="VerbatimChar"/>
-        </w:rPr>
-        <w:t xml:space="preserve">cleanup_deployments.js</w:t>
-      </w:r>
-      <w:r>
-        <w:t xml:space="preserve">) purges historical preview builds via the Vercel REST API, reducing deployment storage from 16.91 GB to ~0.65 GB (well under the 10 GB free ceiling).</w:t>
+        <w:t xml:space="preserve">Dedicated Vouches Channel (</w:t>
+      </w:r>
+      <w:r>
+        <w:rPr>
+          <w:rStyle w:val="VerbatimChar"/>
+          <w:b/>
+          <w:bCs/>
+        </w:rPr>
+        <w:t xml:space="preserve">@AetheriaStoreVouches</w:t>
+      </w:r>
+      <w:r>
+        <w:rPr>
+          <w:b/>
+          <w:bCs/>
+        </w:rPr>
+        <w:t xml:space="preserve">)</w:t>
+      </w:r>
+      <w:r>
+        <w:t xml:space="preserve">: Authentic customer proof screenshots (UPI transfers, PayPal receipts, Discord chat confirmations, and in-game PGSharp activation screens) are published in a separate vouches channel with key details properly redacted, establishing unshakeable social proof without cluttering announcements.</w:t>
       </w:r>
     </w:p>
     <w:p>
@@ -3566,14 +3549,15 @@
         </w:pict>
       </w:r>
     </w:p>
-    <w:bookmarkEnd w:id="41"/>
-    <w:bookmarkStart w:id="42" w:name="X986e1743c333d831d4e1e700952f4427f78772c"/>
+    <w:bookmarkEnd w:id="39"/>
+    <w:bookmarkEnd w:id="40"/>
+    <w:bookmarkStart w:id="41" w:name="Xc4edd6052f2f0c16617110e07b8df38bba5d2da"/>
     <w:p>
       <w:pPr>
         <w:pStyle w:val="Heading2"/>
       </w:pPr>
       <w:r>
-        <w:t xml:space="preserve">9. Sales Conversion Assets, Cooldown Guide &amp; Live Events</w:t>
+        <w:t xml:space="preserve">10. Admin Command Center &amp; Vercel Storage Optimization</w:t>
       </w:r>
     </w:p>
     <w:p>
@@ -3589,37 +3573,15 @@
           <w:b/>
           <w:bCs/>
         </w:rPr>
-        <w:t xml:space="preserve">Free vs Standard Comparison Engine (</w:t>
-      </w:r>
-      <w:r>
-        <w:rPr>
-          <w:rStyle w:val="VerbatimChar"/>
-          <w:b/>
-          <w:bCs/>
-        </w:rPr>
-        <w:t xml:space="preserve">/features</w:t>
-      </w:r>
-      <w:r>
-        <w:rPr>
-          <w:b/>
-          <w:bCs/>
-        </w:rPr>
-        <w:t xml:space="preserve">,</w:t>
-      </w:r>
-      <w:r>
-        <w:rPr>
-          <w:b/>
-          <w:bCs/>
-        </w:rPr>
-        <w:t xml:space="preserve"> </w:t>
-      </w:r>
-      <w:r>
-        <w:rPr>
-          <w:rStyle w:val="VerbatimChar"/>
-          <w:b/>
-          <w:bCs/>
-        </w:rPr>
-        <w:t xml:space="preserve">/compare</w:t>
+        <w:t xml:space="preserve">Unified Inventory Dashboard (</w:t>
+      </w:r>
+      <w:r>
+        <w:rPr>
+          <w:rStyle w:val="VerbatimChar"/>
+          <w:b/>
+          <w:bCs/>
+        </w:rPr>
+        <w:t xml:space="preserve">/admin</w:t>
       </w:r>
       <w:r>
         <w:rPr>
@@ -3629,7 +3591,7 @@
         <w:t xml:space="preserve">)</w:t>
       </w:r>
       <w:r>
-        <w:t xml:space="preserve">: High-converting sales comparison detailing the limitations of PGSharp Free (15-second catch animations, blind catches without stats, no shiny scanner, manual joystick fatigue) vs the advantages of PGSharp Standard (1-second Quick Catch, 100% IV encounter preview, block non-shiny encounters, hands-free GPX auto-walk, instant skip cutscenes, guaranteed 100% excellent throws).</w:t>
+        <w:t xml:space="preserve">: Real-time stats on available keys, low-stock threshold alerts, pending orders, and restock waitlist count.</w:t>
       </w:r>
     </w:p>
     <w:p>
@@ -3645,47 +3607,10 @@
           <w:b/>
           <w:bCs/>
         </w:rPr>
-        <w:t xml:space="preserve">Anti-Ban Cooldown &amp; Safety Guide (</w:t>
-      </w:r>
-      <w:r>
-        <w:rPr>
-          <w:rStyle w:val="VerbatimChar"/>
-          <w:b/>
-          <w:bCs/>
-        </w:rPr>
-        <w:t xml:space="preserve">/cooldown</w:t>
-      </w:r>
-      <w:r>
-        <w:rPr>
-          <w:b/>
-          <w:bCs/>
-        </w:rPr>
-        <w:t xml:space="preserve">,</w:t>
-      </w:r>
-      <w:r>
-        <w:rPr>
-          <w:b/>
-          <w:bCs/>
-        </w:rPr>
-        <w:t xml:space="preserve"> </w:t>
-      </w:r>
-      <w:r>
-        <w:rPr>
-          <w:rStyle w:val="VerbatimChar"/>
-          <w:b/>
-          <w:bCs/>
-        </w:rPr>
-        <w:t xml:space="preserve">/safety</w:t>
-      </w:r>
-      <w:r>
-        <w:rPr>
-          <w:b/>
-          <w:bCs/>
-        </w:rPr>
-        <w:t xml:space="preserve">)</w:t>
-      </w:r>
-      <w:r>
-        <w:t xml:space="preserve">: Comprehensive reference guide with distance cooldown chart (1 km to 1,350+ km global max of 120 mins), explicit breakdown of cooldown-triggering actions (balls, berries, gym battles, spins) versus safe actions (teleporting, IV inspection, egg hatching, trading).</w:t>
+        <w:t xml:space="preserve">Manual Key Allocation System</w:t>
+      </w:r>
+      <w:r>
+        <w:t xml:space="preserve">: Dedicated UI tab to directly allocate standard or duo keys to custom customer identifiers (Discord, Telegram, Reddit, Email) without website payment friction.</w:t>
       </w:r>
     </w:p>
     <w:p>
@@ -3701,25 +3626,10 @@
           <w:b/>
           <w:bCs/>
         </w:rPr>
-        <w:t xml:space="preserve">Direct Scanner Webhook (</w:t>
-      </w:r>
-      <w:r>
-        <w:rPr>
-          <w:rStyle w:val="VerbatimChar"/>
-          <w:b/>
-          <w:bCs/>
-        </w:rPr>
-        <w:t xml:space="preserve">/api/pokemon/spawns</w:t>
-      </w:r>
-      <w:r>
-        <w:rPr>
-          <w:b/>
-          <w:bCs/>
-        </w:rPr>
-        <w:t xml:space="preserve">)</w:t>
-      </w:r>
-      <w:r>
-        <w:t xml:space="preserve">: High-performance ingestion endpoint for raw scanner telemetry (Golbat, Poracle, MAD, RDM formats) with 20-minute in-memory de-duplication cache.</w:t>
+        <w:t xml:space="preserve">Automated Waitlist Blast</w:t>
+      </w:r>
+      <w:r>
+        <w:t xml:space="preserve">: One-click and auto-on-upload restock alerts emailed to all waiting customers via direct Gmail SMTP.</w:t>
       </w:r>
     </w:p>
     <w:p>
@@ -3735,46 +3645,10 @@
           <w:b/>
           <w:bCs/>
         </w:rPr>
-        <w:t xml:space="preserve">National Pokédex Database (1,025 Species) &amp; Fuzzy Search</w:t>
-      </w:r>
-      <w:r>
-        <w:t xml:space="preserve">: Typo-tolerant Levenshtein search supporting natural queries (</w:t>
-      </w:r>
-      <w:r>
-        <w:rPr>
-          <w:rStyle w:val="VerbatimChar"/>
-        </w:rPr>
-        <w:t xml:space="preserve">Greyninja</w:t>
-      </w:r>
-      <w:r>
-        <w:t xml:space="preserve"> </w:t>
-      </w:r>
-      <w:r>
-        <w:t xml:space="preserve">➔</w:t>
-      </w:r>
-      <w:r>
-        <w:t xml:space="preserve"> </w:t>
-      </w:r>
-      <w:r>
-        <w:rPr>
-          <w:rStyle w:val="VerbatimChar"/>
-        </w:rPr>
-        <w:t xml:space="preserve">Greninja</w:t>
-      </w:r>
-      <w:r>
-        <w:t xml:space="preserve">,</w:t>
-      </w:r>
-      <w:r>
-        <w:t xml:space="preserve"> </w:t>
-      </w:r>
-      <w:r>
-        <w:rPr>
-          <w:rStyle w:val="VerbatimChar"/>
-        </w:rPr>
-        <w:t xml:space="preserve">Swampert 1/14/15</w:t>
-      </w:r>
-      <w:r>
-        <w:t xml:space="preserve">).</w:t>
+        <w:t xml:space="preserve">Storage Optimization</w:t>
+      </w:r>
+      <w:r>
+        <w:t xml:space="preserve">: Firestore indexing and bounded document queries to minimize database read/write costs.</w:t>
       </w:r>
     </w:p>
     <w:p>
@@ -3790,37 +3664,112 @@
           <w:b/>
           <w:bCs/>
         </w:rPr>
-        <w:t xml:space="preserve">Live Events Calendar (</w:t>
-      </w:r>
-      <w:r>
-        <w:rPr>
-          <w:rStyle w:val="VerbatimChar"/>
-          <w:b/>
-          <w:bCs/>
-        </w:rPr>
-        <w:t xml:space="preserve">/api/pokemon/events</w:t>
-      </w:r>
-      <w:r>
-        <w:rPr>
-          <w:b/>
-          <w:bCs/>
-        </w:rPr>
-        <w:t xml:space="preserve">)</w:t>
-      </w:r>
-      <w:r>
-        <w:t xml:space="preserve">: Real-time event and raid boss rotations accessible via</w:t>
-      </w:r>
-      <w:r>
-        <w:t xml:space="preserve"> </w:t>
-      </w:r>
-      <w:r>
-        <w:rPr>
-          <w:rStyle w:val="VerbatimChar"/>
-        </w:rPr>
-        <w:t xml:space="preserve">/events</w:t>
-      </w:r>
-      <w:r>
-        <w:t xml:space="preserve">.</w:t>
+        <w:t xml:space="preserve">Ghost Admin Camouflage</w:t>
+      </w:r>
+      <w:r>
+        <w:t xml:space="preserve">: Direct visits to</w:t>
+      </w:r>
+      <w:r>
+        <w:t xml:space="preserve"> </w:t>
+      </w:r>
+      <w:r>
+        <w:rPr>
+          <w:rStyle w:val="VerbatimChar"/>
+        </w:rPr>
+        <w:t xml:space="preserve">/admin</w:t>
+      </w:r>
+      <w:r>
+        <w:t xml:space="preserve"> </w:t>
+      </w:r>
+      <w:r>
+        <w:t xml:space="preserve">without authorization display an authentic</w:t>
+      </w:r>
+      <w:r>
+        <w:t xml:space="preserve"> </w:t>
+      </w:r>
+      <w:r>
+        <w:rPr>
+          <w:rStyle w:val="VerbatimChar"/>
+        </w:rPr>
+        <w:t xml:space="preserve">404 - Page Not Found</w:t>
+      </w:r>
+      <w:r>
+        <w:t xml:space="preserve">. Accessible only via secret bookmark (</w:t>
+      </w:r>
+      <w:r>
+        <w:rPr>
+          <w:rStyle w:val="VerbatimChar"/>
+        </w:rPr>
+        <w:t xml:space="preserve">/admin?key=YOUR_SECRET_KEY</w:t>
+      </w:r>
+      <w:r>
+        <w:t xml:space="preserve">) or triple-clicking the 404 badge.</w:t>
+      </w:r>
+    </w:p>
+    <w:p>
+      <w:pPr>
+        <w:pStyle w:val="Compact"/>
+        <w:numPr>
+          <w:ilvl w:val="0"/>
+          <w:numId w:val="1013"/>
+        </w:numPr>
+      </w:pPr>
+      <w:r>
+        <w:rPr>
+          <w:b/>
+          <w:bCs/>
+        </w:rPr>
+        <w:t xml:space="preserve">Anti-Brute-Force Rate Limiting</w:t>
+      </w:r>
+      <w:r>
+        <w:t xml:space="preserve">: Client IP locked after 5 failed passcode attempts for 15 minutes.</w:t>
+      </w:r>
+    </w:p>
+    <w:p>
+      <w:pPr>
+        <w:pStyle w:val="Compact"/>
+        <w:numPr>
+          <w:ilvl w:val="0"/>
+          <w:numId w:val="1013"/>
+        </w:numPr>
+      </w:pPr>
+      <w:r>
+        <w:rPr>
+          <w:b/>
+          <w:bCs/>
+        </w:rPr>
+        <w:t xml:space="preserve">Live Firestore Coupon Engine</w:t>
+      </w:r>
+      <w:r>
+        <w:t xml:space="preserve">: Interactive CRUD for promotional coupons with 1-click permanent deletion.</w:t>
+      </w:r>
+    </w:p>
+    <w:p>
+      <w:pPr>
+        <w:pStyle w:val="Compact"/>
+        <w:numPr>
+          <w:ilvl w:val="0"/>
+          <w:numId w:val="1013"/>
+        </w:numPr>
+      </w:pPr>
+      <w:r>
+        <w:rPr>
+          <w:b/>
+          <w:bCs/>
+        </w:rPr>
+        <w:t xml:space="preserve">Vercel Deployment Storage Optimization</w:t>
+      </w:r>
+      <w:r>
+        <w:t xml:space="preserve">: Automated cleanup tooling (</w:t>
+      </w:r>
+      <w:r>
+        <w:rPr>
+          <w:rStyle w:val="VerbatimChar"/>
+        </w:rPr>
+        <w:t xml:space="preserve">cleanup_deployments.js</w:t>
+      </w:r>
+      <w:r>
+        <w:t xml:space="preserve">) purges historical preview builds via the Vercel REST API, reducing deployment storage from 16.91 GB to ~0.65 GB (well under the 10 GB free ceiling).</w:t>
       </w:r>
     </w:p>
     <w:p>
@@ -3830,6 +3779,270 @@
         </w:pict>
       </w:r>
     </w:p>
+    <w:bookmarkEnd w:id="41"/>
+    <w:bookmarkStart w:id="42" w:name="X986e1743c333d831d4e1e700952f4427f78772c"/>
+    <w:p>
+      <w:pPr>
+        <w:pStyle w:val="Heading2"/>
+      </w:pPr>
+      <w:r>
+        <w:t xml:space="preserve">11. Sales Conversion Assets, Cooldown Guide &amp; Live Events</w:t>
+      </w:r>
+    </w:p>
+    <w:p>
+      <w:pPr>
+        <w:pStyle w:val="Compact"/>
+        <w:numPr>
+          <w:ilvl w:val="0"/>
+          <w:numId w:val="1014"/>
+        </w:numPr>
+      </w:pPr>
+      <w:r>
+        <w:rPr>
+          <w:b/>
+          <w:bCs/>
+        </w:rPr>
+        <w:t xml:space="preserve">Free vs Standard Comparison Engine (</w:t>
+      </w:r>
+      <w:r>
+        <w:rPr>
+          <w:rStyle w:val="VerbatimChar"/>
+          <w:b/>
+          <w:bCs/>
+        </w:rPr>
+        <w:t xml:space="preserve">/features</w:t>
+      </w:r>
+      <w:r>
+        <w:rPr>
+          <w:b/>
+          <w:bCs/>
+        </w:rPr>
+        <w:t xml:space="preserve">,</w:t>
+      </w:r>
+      <w:r>
+        <w:rPr>
+          <w:b/>
+          <w:bCs/>
+        </w:rPr>
+        <w:t xml:space="preserve"> </w:t>
+      </w:r>
+      <w:r>
+        <w:rPr>
+          <w:rStyle w:val="VerbatimChar"/>
+          <w:b/>
+          <w:bCs/>
+        </w:rPr>
+        <w:t xml:space="preserve">/compare</w:t>
+      </w:r>
+      <w:r>
+        <w:rPr>
+          <w:b/>
+          <w:bCs/>
+        </w:rPr>
+        <w:t xml:space="preserve">)</w:t>
+      </w:r>
+      <w:r>
+        <w:t xml:space="preserve">: High-converting sales comparison detailing the limitations of PGSharp Free (15-second catch animations, blind catches without stats, no shiny scanner, manual joystick fatigue) vs the advantages of PGSharp Standard (1-second Quick Catch, 100% IV encounter preview, block non-shiny encounters, hands-free GPX auto-walk, instant skip cutscenes, guaranteed 100% excellent throws).</w:t>
+      </w:r>
+    </w:p>
+    <w:p>
+      <w:pPr>
+        <w:pStyle w:val="Compact"/>
+        <w:numPr>
+          <w:ilvl w:val="0"/>
+          <w:numId w:val="1014"/>
+        </w:numPr>
+      </w:pPr>
+      <w:r>
+        <w:rPr>
+          <w:b/>
+          <w:bCs/>
+        </w:rPr>
+        <w:t xml:space="preserve">Anti-Ban Cooldown &amp; Safety Guide (</w:t>
+      </w:r>
+      <w:r>
+        <w:rPr>
+          <w:rStyle w:val="VerbatimChar"/>
+          <w:b/>
+          <w:bCs/>
+        </w:rPr>
+        <w:t xml:space="preserve">/cooldown</w:t>
+      </w:r>
+      <w:r>
+        <w:rPr>
+          <w:b/>
+          <w:bCs/>
+        </w:rPr>
+        <w:t xml:space="preserve">,</w:t>
+      </w:r>
+      <w:r>
+        <w:rPr>
+          <w:b/>
+          <w:bCs/>
+        </w:rPr>
+        <w:t xml:space="preserve"> </w:t>
+      </w:r>
+      <w:r>
+        <w:rPr>
+          <w:rStyle w:val="VerbatimChar"/>
+          <w:b/>
+          <w:bCs/>
+        </w:rPr>
+        <w:t xml:space="preserve">/safety</w:t>
+      </w:r>
+      <w:r>
+        <w:rPr>
+          <w:b/>
+          <w:bCs/>
+        </w:rPr>
+        <w:t xml:space="preserve">)</w:t>
+      </w:r>
+      <w:r>
+        <w:t xml:space="preserve">: Comprehensive reference guide with distance cooldown chart (1 km to 1,350+ km global max of 120 mins), explicit breakdown of cooldown-triggering actions (balls, berries, gym battles, spins) versus safe actions (teleporting, IV inspection, egg hatching, trading).</w:t>
+      </w:r>
+    </w:p>
+    <w:p>
+      <w:pPr>
+        <w:pStyle w:val="Compact"/>
+        <w:numPr>
+          <w:ilvl w:val="0"/>
+          <w:numId w:val="1014"/>
+        </w:numPr>
+      </w:pPr>
+      <w:r>
+        <w:rPr>
+          <w:b/>
+          <w:bCs/>
+        </w:rPr>
+        <w:t xml:space="preserve">Direct Scanner Webhook (</w:t>
+      </w:r>
+      <w:r>
+        <w:rPr>
+          <w:rStyle w:val="VerbatimChar"/>
+          <w:b/>
+          <w:bCs/>
+        </w:rPr>
+        <w:t xml:space="preserve">/api/pokemon/spawns</w:t>
+      </w:r>
+      <w:r>
+        <w:rPr>
+          <w:b/>
+          <w:bCs/>
+        </w:rPr>
+        <w:t xml:space="preserve">)</w:t>
+      </w:r>
+      <w:r>
+        <w:t xml:space="preserve">: High-performance ingestion endpoint for raw scanner telemetry (Golbat, Poracle, MAD, RDM formats) with 20-minute in-memory de-duplication cache.</w:t>
+      </w:r>
+    </w:p>
+    <w:p>
+      <w:pPr>
+        <w:pStyle w:val="Compact"/>
+        <w:numPr>
+          <w:ilvl w:val="0"/>
+          <w:numId w:val="1014"/>
+        </w:numPr>
+      </w:pPr>
+      <w:r>
+        <w:rPr>
+          <w:b/>
+          <w:bCs/>
+        </w:rPr>
+        <w:t xml:space="preserve">National Pokédex Database (1,025 Species) &amp; Fuzzy Search</w:t>
+      </w:r>
+      <w:r>
+        <w:t xml:space="preserve">: Typo-tolerant Levenshtein search supporting natural queries (</w:t>
+      </w:r>
+      <w:r>
+        <w:rPr>
+          <w:rStyle w:val="VerbatimChar"/>
+        </w:rPr>
+        <w:t xml:space="preserve">Greyninja</w:t>
+      </w:r>
+      <w:r>
+        <w:t xml:space="preserve"> </w:t>
+      </w:r>
+      <w:r>
+        <w:t xml:space="preserve">-&gt;</w:t>
+      </w:r>
+      <w:r>
+        <w:t xml:space="preserve"> </w:t>
+      </w:r>
+      <w:r>
+        <w:rPr>
+          <w:rStyle w:val="VerbatimChar"/>
+        </w:rPr>
+        <w:t xml:space="preserve">Greninja</w:t>
+      </w:r>
+      <w:r>
+        <w:t xml:space="preserve">,</w:t>
+      </w:r>
+      <w:r>
+        <w:t xml:space="preserve"> </w:t>
+      </w:r>
+      <w:r>
+        <w:rPr>
+          <w:rStyle w:val="VerbatimChar"/>
+        </w:rPr>
+        <w:t xml:space="preserve">Swampert 1/14/15</w:t>
+      </w:r>
+      <w:r>
+        <w:t xml:space="preserve">).</w:t>
+      </w:r>
+    </w:p>
+    <w:p>
+      <w:pPr>
+        <w:pStyle w:val="Compact"/>
+        <w:numPr>
+          <w:ilvl w:val="0"/>
+          <w:numId w:val="1014"/>
+        </w:numPr>
+      </w:pPr>
+      <w:r>
+        <w:rPr>
+          <w:b/>
+          <w:bCs/>
+        </w:rPr>
+        <w:t xml:space="preserve">Live Events Calendar (</w:t>
+      </w:r>
+      <w:r>
+        <w:rPr>
+          <w:rStyle w:val="VerbatimChar"/>
+          <w:b/>
+          <w:bCs/>
+        </w:rPr>
+        <w:t xml:space="preserve">/api/pokemon/events</w:t>
+      </w:r>
+      <w:r>
+        <w:rPr>
+          <w:b/>
+          <w:bCs/>
+        </w:rPr>
+        <w:t xml:space="preserve">)</w:t>
+      </w:r>
+      <w:r>
+        <w:t xml:space="preserve">: Real-time event and raid boss rotations accessible via</w:t>
+      </w:r>
+      <w:r>
+        <w:t xml:space="preserve"> </w:t>
+      </w:r>
+      <w:r>
+        <w:rPr>
+          <w:rStyle w:val="VerbatimChar"/>
+        </w:rPr>
+        <w:t xml:space="preserve">/events</w:t>
+      </w:r>
+      <w:r>
+        <w:t xml:space="preserve">.</w:t>
+      </w:r>
+    </w:p>
+    <w:p>
+      <w:r>
+        <w:pict>
+          <v:rect style="width:0;height:1.5pt" o:hralign="center" o:hrstd="t" o:hr="t"/>
+        </w:pict>
+      </w:r>
+    </w:p>
     <w:bookmarkEnd w:id="42"/>
     <w:bookmarkStart w:id="43" w:name="production-route-summary"/>
     <w:p>
@@ -3837,7 +4050,7 @@
         <w:pStyle w:val="Heading2"/>
       </w:pPr>
       <w:r>
-        <w:t xml:space="preserve">10. Production Route Summary</w:t>
+        <w:t xml:space="preserve">12. Production Route Summary</w:t>
       </w:r>
     </w:p>
     <w:tbl>
@@ -5643,6 +5856,9 @@
     <w:abstractNumId w:val="991"/>
   </w:num>
   <w:num w:numId="1013">
+    <w:abstractNumId w:val="991"/>
+  </w:num>
+  <w:num w:numId="1014">
     <w:abstractNumId w:val="991"/>
   </w:num>
 </w:numbering>

</xml_diff>

<commit_message>
docs: document reddit real-time lead radar subsystem in section 9
</commit_message>
<xml_diff>
--- a/docs/Documentation.docx
+++ b/docs/Documentation.docx
@@ -2,7 +2,7 @@
 <file path=word/document.xml><?xml version="1.0" encoding="utf-8"?>
 <w:document xmlns:w="http://schemas.openxmlformats.org/wordprocessingml/2006/main" xmlns:m="http://schemas.openxmlformats.org/officeDocument/2006/math" xmlns:r="http://schemas.openxmlformats.org/officeDocument/2006/relationships" xmlns:o="urn:schemas-microsoft-com:office:office" xmlns:v="urn:schemas-microsoft-com:vml" xmlns:w10="urn:schemas-microsoft-com:office:word" xmlns:a="http://schemas.openxmlformats.org/drawingml/2006/main" xmlns:pic="http://schemas.openxmlformats.org/drawingml/2006/picture" xmlns:wp="http://schemas.openxmlformats.org/drawingml/2006/wordprocessingDrawing">
   <w:body>
-    <w:bookmarkStart w:id="44" w:name="X4aa5aed52caef848dbb7ae26c2f43e284eb533b"/>
+    <w:bookmarkStart w:id="45" w:name="X4aa5aed52caef848dbb7ae26c2f43e284eb533b"/>
     <w:p>
       <w:pPr>
         <w:pStyle w:val="Heading1"/>
@@ -3064,22 +3064,313 @@
       </w:r>
     </w:p>
     <w:bookmarkEnd w:id="36"/>
-    <w:bookmarkStart w:id="40" w:name="X6db8a6fe6a898cc68ce14e0d5c4b5d0c9d92a97"/>
+    <w:bookmarkStart w:id="37" w:name="X75c1bd484364c73d45830d3f2d15fe3d0732b0d"/>
     <w:p>
       <w:pPr>
         <w:pStyle w:val="Heading2"/>
       </w:pPr>
       <w:r>
-        <w:t xml:space="preserve">9. Telegram Bot &amp; Channel Announcement Architecture</w:t>
-      </w:r>
-    </w:p>
-    <w:bookmarkStart w:id="37" w:name="X02ae9847bd9588ccf72013de6dc22b2efcf9bdb"/>
+        <w:t xml:space="preserve">9. Reddit Real-Time Lead Radar (F5Bot &amp; Telegram Bridge)</w:t>
+      </w:r>
+    </w:p>
+    <w:p>
+      <w:pPr>
+        <w:pStyle w:val="FirstParagraph"/>
+      </w:pPr>
+      <w:r>
+        <w:t xml:space="preserve">A dedicated continuous surveillance pipeline monitoring Reddit communities (including</w:t>
+      </w:r>
+      <w:r>
+        <w:t xml:space="preserve"> </w:t>
+      </w:r>
+      <w:r>
+        <w:rPr>
+          <w:rStyle w:val="VerbatimChar"/>
+        </w:rPr>
+        <w:t xml:space="preserve">r/PoGoAndroidSpoofing</w:t>
+      </w:r>
+      <w:r>
+        <w:t xml:space="preserve">,</w:t>
+      </w:r>
+      <w:r>
+        <w:t xml:space="preserve"> </w:t>
+      </w:r>
+      <w:r>
+        <w:rPr>
+          <w:rStyle w:val="VerbatimChar"/>
+        </w:rPr>
+        <w:t xml:space="preserve">r/PokemonGoSpoofing</w:t>
+      </w:r>
+      <w:r>
+        <w:t xml:space="preserve">, and related forums):</w:t>
+      </w:r>
+      <w:r>
+        <w:t xml:space="preserve"> </w:t>
+      </w:r>
+      <w:r>
+        <w:t xml:space="preserve">-</w:t>
+      </w:r>
+      <w:r>
+        <w:t xml:space="preserve"> </w:t>
+      </w:r>
+      <w:r>
+        <w:rPr>
+          <w:b/>
+          <w:bCs/>
+        </w:rPr>
+        <w:t xml:space="preserve">Continuous Subreddit &amp; Comment Ingestion</w:t>
+      </w:r>
+      <w:r>
+        <w:t xml:space="preserve">: Powered by F5Bot’s background ingestion pipeline to bypass Reddit’s API restrictions and datacenter rate-limit blocking.</w:t>
+      </w:r>
+      <w:r>
+        <w:t xml:space="preserve"> </w:t>
+      </w:r>
+      <w:r>
+        <w:t xml:space="preserve">-</w:t>
+      </w:r>
+      <w:r>
+        <w:t xml:space="preserve"> </w:t>
+      </w:r>
+      <w:r>
+        <w:rPr>
+          <w:b/>
+          <w:bCs/>
+        </w:rPr>
+        <w:t xml:space="preserve">5 High-Intent Buyer Monitors</w:t>
+      </w:r>
+      <w:r>
+        <w:t xml:space="preserve">:</w:t>
+      </w:r>
+      <w:r>
+        <w:t xml:space="preserve"> </w:t>
+      </w:r>
+      <w:r>
+        <w:t xml:space="preserve">1.</w:t>
+      </w:r>
+      <w:r>
+        <w:t xml:space="preserve"> </w:t>
+      </w:r>
+      <w:r>
+        <w:rPr>
+          <w:rStyle w:val="VerbatimChar"/>
+        </w:rPr>
+        <w:t xml:space="preserve">pgsharp key</w:t>
+      </w:r>
+      <w:r>
+        <w:t xml:space="preserve"> </w:t>
+      </w:r>
+      <w:r>
+        <w:t xml:space="preserve">(Matches all direct key requests, buying threads, and sharing queries)</w:t>
+      </w:r>
+      <w:r>
+        <w:t xml:space="preserve"> </w:t>
+      </w:r>
+      <w:r>
+        <w:t xml:space="preserve">2.</w:t>
+      </w:r>
+      <w:r>
+        <w:t xml:space="preserve"> </w:t>
+      </w:r>
+      <w:r>
+        <w:rPr>
+          <w:rStyle w:val="VerbatimChar"/>
+        </w:rPr>
+        <w:t xml:space="preserve">standard key</w:t>
+      </w:r>
+      <w:r>
+        <w:t xml:space="preserve"> </w:t>
+      </w:r>
+      <w:r>
+        <w:t xml:space="preserve">(Matches users specifically seeking the paid Standard edition)</w:t>
+      </w:r>
+      <w:r>
+        <w:t xml:space="preserve"> </w:t>
+      </w:r>
+      <w:r>
+        <w:t xml:space="preserve">3.</w:t>
+      </w:r>
+      <w:r>
+        <w:t xml:space="preserve"> </w:t>
+      </w:r>
+      <w:r>
+        <w:rPr>
+          <w:rStyle w:val="VerbatimChar"/>
+        </w:rPr>
+        <w:t xml:space="preserve">buy pgsharp</w:t>
+      </w:r>
+      <w:r>
+        <w:t xml:space="preserve"> </w:t>
+      </w:r>
+      <w:r>
+        <w:t xml:space="preserve">(Matches high-intent purchase inquiries and card bypass questions)</w:t>
+      </w:r>
+      <w:r>
+        <w:t xml:space="preserve"> </w:t>
+      </w:r>
+      <w:r>
+        <w:t xml:space="preserve">4.</w:t>
+      </w:r>
+      <w:r>
+        <w:t xml:space="preserve"> </w:t>
+      </w:r>
+      <w:r>
+        <w:rPr>
+          <w:rStyle w:val="VerbatimChar"/>
+        </w:rPr>
+        <w:t xml:space="preserve">pgsharp payment</w:t>
+      </w:r>
+      <w:r>
+        <w:t xml:space="preserve"> </w:t>
+      </w:r>
+      <w:r>
+        <w:t xml:space="preserve">(Detects customers experiencing card declines on the official site)</w:t>
+      </w:r>
+      <w:r>
+        <w:t xml:space="preserve"> </w:t>
+      </w:r>
+      <w:r>
+        <w:t xml:space="preserve">5.</w:t>
+      </w:r>
+      <w:r>
+        <w:t xml:space="preserve"> </w:t>
+      </w:r>
+      <w:r>
+        <w:rPr>
+          <w:rStyle w:val="VerbatimChar"/>
+        </w:rPr>
+        <w:t xml:space="preserve">pgsharp license</w:t>
+      </w:r>
+      <w:r>
+        <w:t xml:space="preserve"> </w:t>
+      </w:r>
+      <w:r>
+        <w:t xml:space="preserve">(Catches license renewals, questions, and expiration help)</w:t>
+      </w:r>
+      <w:r>
+        <w:t xml:space="preserve"> </w:t>
+      </w:r>
+      <w:r>
+        <w:t xml:space="preserve">-</w:t>
+      </w:r>
+      <w:r>
+        <w:t xml:space="preserve"> </w:t>
+      </w:r>
+      <w:r>
+        <w:rPr>
+          <w:b/>
+          <w:bCs/>
+        </w:rPr>
+        <w:t xml:space="preserve">Zero-False-Positive Filtering</w:t>
+      </w:r>
+      <w:r>
+        <w:t xml:space="preserve">: Configured with strict</w:t>
+      </w:r>
+      <w:r>
+        <w:t xml:space="preserve"> </w:t>
+      </w:r>
+      <w:r>
+        <w:t xml:space="preserve">“Whole words only”</w:t>
+      </w:r>
+      <w:r>
+        <w:t xml:space="preserve"> </w:t>
+      </w:r>
+      <w:r>
+        <w:t xml:space="preserve">matching and restricted strictly to Reddit domains to prevent non-gaming or tech news false positives.</w:t>
+      </w:r>
+      <w:r>
+        <w:t xml:space="preserve"> </w:t>
+      </w:r>
+      <w:r>
+        <w:t xml:space="preserve">-</w:t>
+      </w:r>
+      <w:r>
+        <w:t xml:space="preserve"> </w:t>
+      </w:r>
+      <w:r>
+        <w:rPr>
+          <w:b/>
+          <w:bCs/>
+        </w:rPr>
+        <w:t xml:space="preserve">Isolated Secondary Gmail Architecture</w:t>
+      </w:r>
+      <w:r>
+        <w:t xml:space="preserve">: Utilizes an isolated alert email address disconnected from personal inboxes, ensuring complete personal data security and privacy.</w:t>
+      </w:r>
+      <w:r>
+        <w:t xml:space="preserve"> </w:t>
+      </w:r>
+      <w:r>
+        <w:t xml:space="preserve">-</w:t>
+      </w:r>
+      <w:r>
+        <w:t xml:space="preserve"> </w:t>
+      </w:r>
+      <w:r>
+        <w:rPr>
+          <w:b/>
+          <w:bCs/>
+        </w:rPr>
+        <w:t xml:space="preserve">Instant Telegram Push Routing (</w:t>
+      </w:r>
+      <w:r>
+        <w:rPr>
+          <w:rStyle w:val="VerbatimChar"/>
+          <w:b/>
+          <w:bCs/>
+        </w:rPr>
+        <w:t xml:space="preserve">@GmailBot</w:t>
+      </w:r>
+      <w:r>
+        <w:rPr>
+          <w:b/>
+          <w:bCs/>
+        </w:rPr>
+        <w:t xml:space="preserve">)</w:t>
+      </w:r>
+      <w:r>
+        <w:t xml:space="preserve">: Integrated with Telegram’s official</w:t>
+      </w:r>
+      <w:r>
+        <w:t xml:space="preserve"> </w:t>
+      </w:r>
+      <w:r>
+        <w:rPr>
+          <w:rStyle w:val="VerbatimChar"/>
+        </w:rPr>
+        <w:t xml:space="preserve">@GmailBot</w:t>
+      </w:r>
+      <w:r>
+        <w:t xml:space="preserve"> </w:t>
+      </w:r>
+      <w:r>
+        <w:t xml:space="preserve">bridge. Alert emails trigger instantaneous mobile push notifications in Telegram containing the post title, excerpt, and 1-tap direct link to reply or send a private chat.</w:t>
+      </w:r>
+    </w:p>
+    <w:p>
+      <w:r>
+        <w:pict>
+          <v:rect style="width:0;height:1.5pt" o:hralign="center" o:hrstd="t" o:hr="t"/>
+        </w:pict>
+      </w:r>
+    </w:p>
+    <w:bookmarkEnd w:id="37"/>
+    <w:bookmarkStart w:id="41" w:name="X6db8a6fe6a898cc68ce14e0d5c4b5d0c9d92a97"/>
+    <w:p>
+      <w:pPr>
+        <w:pStyle w:val="Heading2"/>
+      </w:pPr>
+      <w:r>
+        <w:t xml:space="preserve">10. Telegram Bot &amp; Channel Announcement Architecture</w:t>
+      </w:r>
+    </w:p>
+    <w:bookmarkStart w:id="38" w:name="X02ae9847bd9588ccf72013de6dc22b2efcf9bdb"/>
     <w:p>
       <w:pPr>
         <w:pStyle w:val="Heading3"/>
       </w:pPr>
       <w:r>
-        <w:t xml:space="preserve">9.1 Minimal 4-Line QR Screen &amp; Progressive Disclosure</w:t>
+        <w:t xml:space="preserve">10.1 Minimal 4-Line QR Screen &amp; Progressive Disclosure</w:t>
       </w:r>
     </w:p>
     <w:p>
@@ -3229,14 +3520,14 @@
         <w:t xml:space="preserve">.</w:t>
       </w:r>
     </w:p>
-    <w:bookmarkEnd w:id="37"/>
-    <w:bookmarkStart w:id="38" w:name="X47c82301dd07ef9336c1959c2655ff3cb0eb7c9"/>
+    <w:bookmarkEnd w:id="38"/>
+    <w:bookmarkStart w:id="39" w:name="X47c82301dd07ef9336c1959c2655ff3cb0eb7c9"/>
     <w:p>
       <w:pPr>
         <w:pStyle w:val="Heading3"/>
       </w:pPr>
       <w:r>
-        <w:t xml:space="preserve">9.2 Viral Telegram Referral &amp; Reward Engine (</w:t>
+        <w:t xml:space="preserve">10.2 Viral Telegram Referral &amp; Reward Engine (</w:t>
       </w:r>
       <w:r>
         <w:t xml:space="preserve">“Refer &amp; Earn”</w:t>
@@ -3400,14 +3691,14 @@
         <w:t xml:space="preserve">: Device and IP fingerprinting, strict chat ID deduplication, and self-referral blocks.</w:t>
       </w:r>
     </w:p>
-    <w:bookmarkEnd w:id="38"/>
-    <w:bookmarkStart w:id="39" w:name="X13842493e6922ba38d3777ad41b96aa6b5a6e6c"/>
+    <w:bookmarkEnd w:id="39"/>
+    <w:bookmarkStart w:id="40" w:name="X13842493e6922ba38d3777ad41b96aa6b5a6e6c"/>
     <w:p>
       <w:pPr>
         <w:pStyle w:val="Heading3"/>
       </w:pPr>
       <w:r>
-        <w:t xml:space="preserve">9.3 Community Announcements &amp; Dedicated Vouches Architecture</w:t>
+        <w:t xml:space="preserve">10.3 Community Announcements &amp; Dedicated Vouches Architecture</w:t>
       </w:r>
     </w:p>
     <w:p>
@@ -3549,15 +3840,15 @@
         </w:pict>
       </w:r>
     </w:p>
-    <w:bookmarkEnd w:id="39"/>
     <w:bookmarkEnd w:id="40"/>
-    <w:bookmarkStart w:id="41" w:name="Xc4edd6052f2f0c16617110e07b8df38bba5d2da"/>
+    <w:bookmarkEnd w:id="41"/>
+    <w:bookmarkStart w:id="42" w:name="Xc4edd6052f2f0c16617110e07b8df38bba5d2da"/>
     <w:p>
       <w:pPr>
         <w:pStyle w:val="Heading2"/>
       </w:pPr>
       <w:r>
-        <w:t xml:space="preserve">10. Admin Command Center &amp; Vercel Storage Optimization</w:t>
+        <w:t xml:space="preserve">11. Admin Command Center &amp; Vercel Storage Optimization</w:t>
       </w:r>
     </w:p>
     <w:p>
@@ -3779,14 +4070,14 @@
         </w:pict>
       </w:r>
     </w:p>
-    <w:bookmarkEnd w:id="41"/>
-    <w:bookmarkStart w:id="42" w:name="X986e1743c333d831d4e1e700952f4427f78772c"/>
+    <w:bookmarkEnd w:id="42"/>
+    <w:bookmarkStart w:id="43" w:name="X986e1743c333d831d4e1e700952f4427f78772c"/>
     <w:p>
       <w:pPr>
         <w:pStyle w:val="Heading2"/>
       </w:pPr>
       <w:r>
-        <w:t xml:space="preserve">11. Sales Conversion Assets, Cooldown Guide &amp; Live Events</w:t>
+        <w:t xml:space="preserve">12. Sales Conversion Assets, Cooldown Guide &amp; Live Events</w:t>
       </w:r>
     </w:p>
     <w:p>
@@ -4043,14 +4334,14 @@
         </w:pict>
       </w:r>
     </w:p>
-    <w:bookmarkEnd w:id="42"/>
-    <w:bookmarkStart w:id="43" w:name="production-route-summary"/>
+    <w:bookmarkEnd w:id="43"/>
+    <w:bookmarkStart w:id="44" w:name="production-route-summary"/>
     <w:p>
       <w:pPr>
         <w:pStyle w:val="Heading2"/>
       </w:pPr>
       <w:r>
-        <w:t xml:space="preserve">12. Production Route Summary</w:t>
+        <w:t xml:space="preserve">13. Production Route Summary</w:t>
       </w:r>
     </w:p>
     <w:tbl>
@@ -5605,8 +5896,8 @@
         <w:t xml:space="preserve">AETHERIA Systems • Complete Technical Manual • Updated September 2026</w:t>
       </w:r>
     </w:p>
-    <w:bookmarkEnd w:id="43"/>
     <w:bookmarkEnd w:id="44"/>
+    <w:bookmarkEnd w:id="45"/>
     <w:sectPr/>
   </w:body>
 </w:document>

</xml_diff>

<commit_message>
feat(crm): add slot-proportional profit and revenue persistence bridge
</commit_message>
<xml_diff>
--- a/docs/Documentation.docx
+++ b/docs/Documentation.docx
@@ -5486,6 +5486,141 @@
     <w:p>
       <w:pPr>
         <w:keepNext/>
+        <w:spacing w:before="240" w:after="80"/>
+      </w:pPr>
+      <w:r>
+        <w:rPr>
+          <w:rFonts w:ascii="Arial" w:hAnsi="Arial"/>
+          <w:b/>
+          <w:color w:val="0F172A"/>
+          <w:sz w:val="23"/>
+        </w:rPr>
+        <w:t>11.5 Slot-Proportional Profit &amp; Revenue Engine</w:t>
+      </w:r>
+    </w:p>
+    <w:p>
+      <w:pPr>
+        <w:pStyle w:val="ListBullet"/>
+        <w:spacing w:before="0" w:after="60" w:line="276" w:lineRule="auto"/>
+      </w:pPr>
+      <w:r>
+        <w:rPr>
+          <w:rFonts w:ascii="Arial" w:hAnsi="Arial"/>
+          <w:b/>
+          <w:color w:val="0F172A"/>
+          <w:sz w:val="20"/>
+        </w:rPr>
+        <w:t xml:space="preserve">Slot-Proportional Cost Architecture: </w:t>
+      </w:r>
+      <w:r>
+        <w:rPr>
+          <w:rFonts w:ascii="Arial" w:hAnsi="Arial"/>
+          <w:b w:val="0"/>
+          <w:color w:val="0F172A"/>
+          <w:sz w:val="20"/>
+        </w:rPr>
+        <w:t>Calculates profit based on Patreon's flat Rs 200 cost for a 3-device key (Rs 67 per slot). 1 Device costs Rs 67 (Profit: +Rs 93 / +Rs 63 ref), 2 Devices costs Rs 133 (Profit: +Rs 167 / +Rs 137 ref), and 3 Devices costs Rs 200 (Profit: +Rs 200 / +Rs 170 ref).</w:t>
+      </w:r>
+    </w:p>
+    <w:p>
+      <w:pPr>
+        <w:pStyle w:val="ListBullet"/>
+        <w:spacing w:before="0" w:after="60" w:line="276" w:lineRule="auto"/>
+      </w:pPr>
+      <w:r>
+        <w:rPr>
+          <w:rFonts w:ascii="Arial" w:hAnsi="Arial"/>
+          <w:b/>
+          <w:color w:val="0F172A"/>
+          <w:sz w:val="20"/>
+        </w:rPr>
+        <w:t xml:space="preserve">3-Device Plan Support (Rs 400): </w:t>
+      </w:r>
+      <w:r>
+        <w:rPr>
+          <w:rFonts w:ascii="Arial" w:hAnsi="Arial"/>
+          <w:b w:val="0"/>
+          <w:color w:val="0F172A"/>
+          <w:sz w:val="20"/>
+        </w:rPr>
+        <w:t>Added full 3-Device key plan to Log Sale, Edit, and Renew modals alongside 1 Device (Standard - Rs 160) and 2 Devices (Duo - Rs 300).</w:t>
+      </w:r>
+    </w:p>
+    <w:p>
+      <w:pPr>
+        <w:pStyle w:val="ListBullet"/>
+        <w:spacing w:before="0" w:after="60" w:line="276" w:lineRule="auto"/>
+      </w:pPr>
+      <w:r>
+        <w:rPr>
+          <w:rFonts w:ascii="Arial" w:hAnsi="Arial"/>
+          <w:b/>
+          <w:color w:val="0F172A"/>
+          <w:sz w:val="20"/>
+        </w:rPr>
+        <w:t xml:space="preserve">1-Click Pricing &amp; Discount Presets: </w:t>
+      </w:r>
+      <w:r>
+        <w:rPr>
+          <w:rFonts w:ascii="Arial" w:hAnsi="Arial"/>
+          <w:b w:val="0"/>
+          <w:color w:val="0F172A"/>
+          <w:sz w:val="20"/>
+        </w:rPr>
+        <w:t>Modal controls include [ Standard Price ], [ -30 Referral ], and custom amount inputs with live real-time net profit and margin calculation banners.</w:t>
+      </w:r>
+    </w:p>
+    <w:p>
+      <w:pPr>
+        <w:pStyle w:val="ListBullet"/>
+        <w:spacing w:before="0" w:after="60" w:line="276" w:lineRule="auto"/>
+      </w:pPr>
+      <w:r>
+        <w:rPr>
+          <w:rFonts w:ascii="Arial" w:hAnsi="Arial"/>
+          <w:b/>
+          <w:color w:val="0F172A"/>
+          <w:sz w:val="20"/>
+        </w:rPr>
+        <w:t xml:space="preserve">Top Financial Analytics Card: </w:t>
+      </w:r>
+      <w:r>
+        <w:rPr>
+          <w:rFonts w:ascii="Arial" w:hAnsi="Arial"/>
+          <w:b w:val="0"/>
+          <w:color w:val="0F172A"/>
+          <w:sz w:val="20"/>
+        </w:rPr>
+        <w:t>Dedicated dashboard banner above the CRM table tracking Total Revenue, Patreon Inventory Costs, Net Profit, and Overall Margin across all tracked sales.</w:t>
+      </w:r>
+    </w:p>
+    <w:p>
+      <w:pPr>
+        <w:pStyle w:val="ListBullet"/>
+        <w:spacing w:before="0" w:after="60" w:line="276" w:lineRule="auto"/>
+      </w:pPr>
+      <w:r>
+        <w:rPr>
+          <w:rFonts w:ascii="Arial" w:hAnsi="Arial"/>
+          <w:b/>
+          <w:color w:val="0F172A"/>
+          <w:sz w:val="20"/>
+        </w:rPr>
+        <w:t xml:space="preserve">Historical Baseline Isolation: </w:t>
+      </w:r>
+      <w:r>
+        <w:rPr>
+          <w:rFonts w:ascii="Arial" w:hAnsi="Arial"/>
+          <w:b w:val="0"/>
+          <w:color w:val="0F172A"/>
+          <w:sz w:val="20"/>
+        </w:rPr>
+        <w:t>All pre-existing 30 records entered prior to launch are flagged as untracked legacy records, preserving their reminder schedules while keeping the new profit ledger 100% accurate.</w:t>
+      </w:r>
+    </w:p>
+    <w:p>
+      <w:pPr>
+        <w:keepNext/>
         <w:spacing w:before="320" w:after="120"/>
       </w:pPr>
       <w:r>

</xml_diff>

<commit_message>
docs: add section 14.6 crm security lock and master passcode gate
</commit_message>
<xml_diff>
--- a/docs/Documentation.docx
+++ b/docs/Documentation.docx
@@ -4436,7 +4436,7 @@
                 <w:color w:val="0F172A"/>
                 <w:sz w:val="17"/>
               </w:rPr>
-              <w:t>Static / Client HTML</w:t>
+              <w:t>Protected HTML</w:t>
             </w:r>
           </w:p>
         </w:tc>
@@ -4461,7 +4461,161 @@
                 <w:color w:val="0F172A"/>
                 <w:sz w:val="17"/>
               </w:rPr>
-              <w:t>Customer Renewal CRM Dashboard: Real-time Multi-Platform License Management</w:t>
+              <w:t>Customer Renewal CRM Dashboard: Gated by Master Passcode Lock Screen</w:t>
+            </w:r>
+          </w:p>
+        </w:tc>
+      </w:tr>
+      <w:tr>
+        <w:tc>
+          <w:tcPr>
+            <w:tcW w:type="dxa" w:w="3024"/>
+            <w:shd w:fill="F8FAFC"/>
+            <w:tcMar>
+              <w:top w:w="80" w:type="dxa"/>
+              <w:bottom w:w="80" w:type="dxa"/>
+              <w:left w:w="120" w:type="dxa"/>
+              <w:right w:w="120" w:type="dxa"/>
+            </w:tcMar>
+          </w:tcPr>
+          <w:p>
+            <w:pPr>
+              <w:spacing w:before="0" w:after="0" w:line="264" w:lineRule="auto"/>
+            </w:pPr>
+            <w:r>
+              <w:rPr>
+                <w:rFonts w:ascii="Arial" w:hAnsi="Arial"/>
+                <w:color w:val="0F172A"/>
+                <w:sz w:val="17"/>
+              </w:rPr>
+              <w:t>/api/crm/login</w:t>
+            </w:r>
+          </w:p>
+        </w:tc>
+        <w:tc>
+          <w:tcPr>
+            <w:tcW w:type="dxa" w:w="1872"/>
+            <w:shd w:fill="F8FAFC"/>
+            <w:tcMar>
+              <w:top w:w="80" w:type="dxa"/>
+              <w:bottom w:w="80" w:type="dxa"/>
+              <w:left w:w="120" w:type="dxa"/>
+              <w:right w:w="120" w:type="dxa"/>
+            </w:tcMar>
+          </w:tcPr>
+          <w:p>
+            <w:pPr>
+              <w:spacing w:before="0" w:after="0" w:line="264" w:lineRule="auto"/>
+            </w:pPr>
+            <w:r>
+              <w:rPr>
+                <w:rFonts w:ascii="Arial" w:hAnsi="Arial"/>
+                <w:color w:val="0F172A"/>
+                <w:sz w:val="17"/>
+              </w:rPr>
+              <w:t>Dynamic API (Node)</w:t>
+            </w:r>
+          </w:p>
+        </w:tc>
+        <w:tc>
+          <w:tcPr>
+            <w:tcW w:type="dxa" w:w="4464"/>
+            <w:shd w:fill="F8FAFC"/>
+            <w:tcMar>
+              <w:top w:w="80" w:type="dxa"/>
+              <w:bottom w:w="80" w:type="dxa"/>
+              <w:left w:w="120" w:type="dxa"/>
+              <w:right w:w="120" w:type="dxa"/>
+            </w:tcMar>
+          </w:tcPr>
+          <w:p>
+            <w:pPr>
+              <w:spacing w:before="0" w:after="0" w:line="264" w:lineRule="auto"/>
+            </w:pPr>
+            <w:r>
+              <w:rPr>
+                <w:rFonts w:ascii="Arial" w:hAnsi="Arial"/>
+                <w:color w:val="0F172A"/>
+                <w:sz w:val="17"/>
+              </w:rPr>
+              <w:t>CRM Master Passcode Authentication &amp; 1-Year Session Cookie Dispenser</w:t>
+            </w:r>
+          </w:p>
+        </w:tc>
+      </w:tr>
+      <w:tr>
+        <w:tc>
+          <w:tcPr>
+            <w:tcW w:type="dxa" w:w="3024"/>
+            <w:shd w:fill="FFFFFF"/>
+            <w:tcMar>
+              <w:top w:w="80" w:type="dxa"/>
+              <w:bottom w:w="80" w:type="dxa"/>
+              <w:left w:w="120" w:type="dxa"/>
+              <w:right w:w="120" w:type="dxa"/>
+            </w:tcMar>
+          </w:tcPr>
+          <w:p>
+            <w:pPr>
+              <w:spacing w:before="0" w:after="0" w:line="264" w:lineRule="auto"/>
+            </w:pPr>
+            <w:r>
+              <w:rPr>
+                <w:rFonts w:ascii="Arial" w:hAnsi="Arial"/>
+                <w:color w:val="0F172A"/>
+                <w:sz w:val="17"/>
+              </w:rPr>
+              <w:t>/api/crm/logout</w:t>
+            </w:r>
+          </w:p>
+        </w:tc>
+        <w:tc>
+          <w:tcPr>
+            <w:tcW w:type="dxa" w:w="1872"/>
+            <w:shd w:fill="FFFFFF"/>
+            <w:tcMar>
+              <w:top w:w="80" w:type="dxa"/>
+              <w:bottom w:w="80" w:type="dxa"/>
+              <w:left w:w="120" w:type="dxa"/>
+              <w:right w:w="120" w:type="dxa"/>
+            </w:tcMar>
+          </w:tcPr>
+          <w:p>
+            <w:pPr>
+              <w:spacing w:before="0" w:after="0" w:line="264" w:lineRule="auto"/>
+            </w:pPr>
+            <w:r>
+              <w:rPr>
+                <w:rFonts w:ascii="Arial" w:hAnsi="Arial"/>
+                <w:color w:val="0F172A"/>
+                <w:sz w:val="17"/>
+              </w:rPr>
+              <w:t>Dynamic API (Node)</w:t>
+            </w:r>
+          </w:p>
+        </w:tc>
+        <w:tc>
+          <w:tcPr>
+            <w:tcW w:type="dxa" w:w="4464"/>
+            <w:shd w:fill="FFFFFF"/>
+            <w:tcMar>
+              <w:top w:w="80" w:type="dxa"/>
+              <w:bottom w:w="80" w:type="dxa"/>
+              <w:left w:w="120" w:type="dxa"/>
+              <w:right w:w="120" w:type="dxa"/>
+            </w:tcMar>
+          </w:tcPr>
+          <w:p>
+            <w:pPr>
+              <w:spacing w:before="0" w:after="0" w:line="264" w:lineRule="auto"/>
+            </w:pPr>
+            <w:r>
+              <w:rPr>
+                <w:rFonts w:ascii="Arial" w:hAnsi="Arial"/>
+                <w:color w:val="0F172A"/>
+                <w:sz w:val="17"/>
+              </w:rPr>
+              <w:t>CRM Session Invalidation &amp; Cookie Revocation Endpoint</w:t>
             </w:r>
           </w:p>
         </w:tc>
@@ -4513,7 +4667,7 @@
                 <w:color w:val="0F172A"/>
                 <w:sz w:val="17"/>
               </w:rPr>
-              <w:t>Dynamic API (Node)</w:t>
+              <w:t>Protected API (Node)</w:t>
             </w:r>
           </w:p>
         </w:tc>
@@ -4538,7 +4692,7 @@
                 <w:color w:val="0F172A"/>
                 <w:sz w:val="17"/>
               </w:rPr>
-              <w:t>CRM Sales Retrieval API with Pending Days Ordering</w:t>
+              <w:t>CRM Sales Retrieval API with Pending Days Ordering (Requires Auth Token)</w:t>
             </w:r>
           </w:p>
         </w:tc>
@@ -4590,7 +4744,7 @@
                 <w:color w:val="0F172A"/>
                 <w:sz w:val="17"/>
               </w:rPr>
-              <w:t>Dynamic API (Node)</w:t>
+              <w:t>Protected API (Node)</w:t>
             </w:r>
           </w:p>
         </w:tc>
@@ -4667,7 +4821,7 @@
                 <w:color w:val="0F172A"/>
                 <w:sz w:val="17"/>
               </w:rPr>
-              <w:t>Dynamic API (Node)</w:t>
+              <w:t>Protected API (Node)</w:t>
             </w:r>
           </w:p>
         </w:tc>
@@ -4744,7 +4898,7 @@
                 <w:color w:val="0F172A"/>
                 <w:sz w:val="17"/>
               </w:rPr>
-              <w:t>Dynamic API (Node)</w:t>
+              <w:t>Protected API (Node)</w:t>
             </w:r>
           </w:p>
         </w:tc>
@@ -5621,6 +5775,141 @@
     <w:p>
       <w:pPr>
         <w:keepNext/>
+        <w:spacing w:before="240" w:after="80"/>
+      </w:pPr>
+      <w:r>
+        <w:rPr>
+          <w:rFonts w:ascii="Arial" w:hAnsi="Arial"/>
+          <w:b/>
+          <w:color w:val="0F172A"/>
+          <w:sz w:val="23"/>
+        </w:rPr>
+        <w:t>11.6 CRM Security Lock &amp; Persistent Master Passcode Gate</w:t>
+      </w:r>
+    </w:p>
+    <w:p>
+      <w:pPr>
+        <w:pStyle w:val="ListBullet"/>
+        <w:spacing w:before="0" w:after="60" w:line="276" w:lineRule="auto"/>
+      </w:pPr>
+      <w:r>
+        <w:rPr>
+          <w:rFonts w:ascii="Arial" w:hAnsi="Arial"/>
+          <w:b/>
+          <w:color w:val="0F172A"/>
+          <w:sz w:val="20"/>
+        </w:rPr>
+        <w:t xml:space="preserve">Restricted Obsidian Lock Screen: </w:t>
+      </w:r>
+      <w:r>
+        <w:rPr>
+          <w:rFonts w:ascii="Arial" w:hAnsi="Arial"/>
+          <w:b w:val="0"/>
+          <w:color w:val="0F172A"/>
+          <w:sz w:val="20"/>
+        </w:rPr>
+        <w:t>Unauthenticated visitors navigating to /crm are blocked by a secure dark-mode login gate that prevents unauthorized viewing or extraction of customer names, emails, contact handles, and profit data.</w:t>
+      </w:r>
+    </w:p>
+    <w:p>
+      <w:pPr>
+        <w:pStyle w:val="ListBullet"/>
+        <w:spacing w:before="0" w:after="60" w:line="276" w:lineRule="auto"/>
+      </w:pPr>
+      <w:r>
+        <w:rPr>
+          <w:rFonts w:ascii="Arial" w:hAnsi="Arial"/>
+          <w:b/>
+          <w:color w:val="0F172A"/>
+          <w:sz w:val="20"/>
+        </w:rPr>
+        <w:t xml:space="preserve">High-Entropy Master Passcode: </w:t>
+      </w:r>
+      <w:r>
+        <w:rPr>
+          <w:rFonts w:ascii="Arial" w:hAnsi="Arial"/>
+          <w:b w:val="0"/>
+          <w:color w:val="0F172A"/>
+          <w:sz w:val="20"/>
+        </w:rPr>
+        <w:t>Protected via high-entropy 28-character security passcode (Aeth$9xK!7mP_2vQ-8zL4.dY~2026), with fallback validation against ADMIN_API_SECRET.</w:t>
+      </w:r>
+    </w:p>
+    <w:p>
+      <w:pPr>
+        <w:pStyle w:val="ListBullet"/>
+        <w:spacing w:before="0" w:after="60" w:line="276" w:lineRule="auto"/>
+      </w:pPr>
+      <w:r>
+        <w:rPr>
+          <w:rFonts w:ascii="Arial" w:hAnsi="Arial"/>
+          <w:b/>
+          <w:color w:val="0F172A"/>
+          <w:sz w:val="20"/>
+        </w:rPr>
+        <w:t xml:space="preserve">1-Year Persistent Browser Session: </w:t>
+      </w:r>
+      <w:r>
+        <w:rPr>
+          <w:rFonts w:ascii="Arial" w:hAnsi="Arial"/>
+          <w:b w:val="0"/>
+          <w:color w:val="0F172A"/>
+          <w:sz w:val="20"/>
+        </w:rPr>
+        <w:t>Authenticating sets a 1-year SameSite cookie and synchronizes with localStorage, allowing seamless access across device restarts without needing to re-type the passcode every time.</w:t>
+      </w:r>
+    </w:p>
+    <w:p>
+      <w:pPr>
+        <w:pStyle w:val="ListBullet"/>
+        <w:spacing w:before="0" w:after="60" w:line="276" w:lineRule="auto"/>
+      </w:pPr>
+      <w:r>
+        <w:rPr>
+          <w:rFonts w:ascii="Arial" w:hAnsi="Arial"/>
+          <w:b/>
+          <w:color w:val="0F172A"/>
+          <w:sz w:val="20"/>
+        </w:rPr>
+        <w:t xml:space="preserve">1-Click Bookmark URL Authentication: </w:t>
+      </w:r>
+      <w:r>
+        <w:rPr>
+          <w:rFonts w:ascii="Arial" w:hAnsi="Arial"/>
+          <w:b w:val="0"/>
+          <w:color w:val="0F172A"/>
+          <w:sz w:val="20"/>
+        </w:rPr>
+        <w:t>Visiting /crm?auth=PASSCODE instantly authenticates the browser, saves credentials, and strips the secret from the address bar for effortless 1-click access.</w:t>
+      </w:r>
+    </w:p>
+    <w:p>
+      <w:pPr>
+        <w:pStyle w:val="ListBullet"/>
+        <w:spacing w:before="0" w:after="60" w:line="276" w:lineRule="auto"/>
+      </w:pPr>
+      <w:r>
+        <w:rPr>
+          <w:rFonts w:ascii="Arial" w:hAnsi="Arial"/>
+          <w:b/>
+          <w:color w:val="0F172A"/>
+          <w:sz w:val="20"/>
+        </w:rPr>
+        <w:t xml:space="preserve">API Endpoint Security Shield: </w:t>
+      </w:r>
+      <w:r>
+        <w:rPr>
+          <w:rFonts w:ascii="Arial" w:hAnsi="Arial"/>
+          <w:b w:val="0"/>
+          <w:color w:val="0F172A"/>
+          <w:sz w:val="20"/>
+        </w:rPr>
+        <w:t>All backend endpoints (/api/sales, /api/sales/update, /api/renew, /api/delete) enforce token validation and reject unauthenticated requests with HTTP 401 Unauthorized.</w:t>
+      </w:r>
+    </w:p>
+    <w:p>
+      <w:pPr>
+        <w:keepNext/>
         <w:spacing w:before="320" w:after="120"/>
       </w:pPr>
       <w:r>

</xml_diff>

<commit_message>
docs: document 3-tab CRM navigation architecture and update docx manual
</commit_message>
<xml_diff>
--- a/docs/Documentation.docx
+++ b/docs/Documentation.docx
@@ -5910,6 +5910,93 @@
     <w:p>
       <w:pPr>
         <w:keepNext/>
+        <w:spacing w:before="240" w:after="80"/>
+      </w:pPr>
+      <w:r>
+        <w:rPr>
+          <w:rFonts w:ascii="Arial" w:hAnsi="Arial"/>
+          <w:b/>
+          <w:color w:val="0F172A"/>
+          <w:sz w:val="23"/>
+        </w:rPr>
+        <w:t>11.7 3-Tab Executive Architecture &amp; Streamlined Table Columns</w:t>
+      </w:r>
+    </w:p>
+    <w:p>
+      <w:pPr>
+        <w:pStyle w:val="ListBullet"/>
+        <w:spacing w:before="0" w:after="60" w:line="276" w:lineRule="auto"/>
+      </w:pPr>
+      <w:r>
+        <w:rPr>
+          <w:rFonts w:ascii="Arial" w:hAnsi="Arial"/>
+          <w:b/>
+          <w:color w:val="0F172A"/>
+          <w:sz w:val="20"/>
+        </w:rPr>
+        <w:t xml:space="preserve">3-Tab Separation Architecture: </w:t>
+      </w:r>
+      <w:r>
+        <w:rPr>
+          <w:rFonts w:ascii="Arial" w:hAnsi="Arial"/>
+          <w:b w:val="0"/>
+          <w:color w:val="0F172A"/>
+          <w:sz w:val="20"/>
+        </w:rPr>
+        <w:t>Replaced the previously stacked, lengthy single-page layout with three dedicated, distraction-free views: Customer Licenses Tab (daily operations, search, filters, renewal table), Profit &amp; Financial Tracker Tab (5 KPI cards, tier margins, platform performance), and Sourced Email Accounts Tab (Patreon account loads, distribution pills, load cards).</w:t>
+      </w:r>
+    </w:p>
+    <w:p>
+      <w:pPr>
+        <w:pStyle w:val="ListBullet"/>
+        <w:spacing w:before="0" w:after="60" w:line="276" w:lineRule="auto"/>
+      </w:pPr>
+      <w:r>
+        <w:rPr>
+          <w:rFonts w:ascii="Arial" w:hAnsi="Arial"/>
+          <w:b/>
+          <w:color w:val="0F172A"/>
+          <w:sz w:val="20"/>
+        </w:rPr>
+        <w:t xml:space="preserve">Streamlined 8-Column Table Design: </w:t>
+      </w:r>
+      <w:r>
+        <w:rPr>
+          <w:rFonts w:ascii="Arial" w:hAnsi="Arial"/>
+          <w:b w:val="0"/>
+          <w:color w:val="0F172A"/>
+          <w:sz w:val="20"/>
+        </w:rPr>
+        <w:t>Consolidated redundant columns into 8 high-density columns: Customer &amp; Contact (combined name + handle), Plan, Amount / Profit (selling price + net profit badge), Platform, Source Account Email, Expiry / Days Left (timeline + pending days), Status, and Actions.</w:t>
+      </w:r>
+    </w:p>
+    <w:p>
+      <w:pPr>
+        <w:pStyle w:val="ListBullet"/>
+        <w:spacing w:before="0" w:after="60" w:line="276" w:lineRule="auto"/>
+      </w:pPr>
+      <w:r>
+        <w:rPr>
+          <w:rFonts w:ascii="Arial" w:hAnsi="Arial"/>
+          <w:b/>
+          <w:color w:val="0F172A"/>
+          <w:sz w:val="20"/>
+        </w:rPr>
+        <w:t xml:space="preserve">Persistent Tab State &amp; Smart Switching: </w:t>
+      </w:r>
+      <w:r>
+        <w:rPr>
+          <w:rFonts w:ascii="Arial" w:hAnsi="Arial"/>
+          <w:b w:val="0"/>
+          <w:color w:val="0F172A"/>
+          <w:sz w:val="20"/>
+        </w:rPr>
+        <w:t>Active tab state is saved to localStorage (crm_active_tab) and restored on page refresh. Contextual actions such as clicking quick-filter cards or account badges automatically switch to the Customer Licenses tab and apply filters synchronously.</w:t>
+      </w:r>
+    </w:p>
+    <w:p>
+      <w:pPr>
+        <w:keepNext/>
         <w:spacing w:before="320" w:after="120"/>
       </w:pPr>
       <w:r>

</xml_diff>

<commit_message>
docs: update documentation for combined licenses and accounts with isolated profit tab
</commit_message>
<xml_diff>
--- a/docs/Documentation.docx
+++ b/docs/Documentation.docx
@@ -5919,7 +5919,7 @@
           <w:color w:val="0F172A"/>
           <w:sz w:val="23"/>
         </w:rPr>
-        <w:t>11.7 3-Tab Executive Architecture &amp; Streamlined Table Columns</w:t>
+        <w:t>11.7 Dual-Tab Architecture: Combined Licenses &amp; Accounts with Dedicated Profit Tracker</w:t>
       </w:r>
     </w:p>
     <w:p>
@@ -5934,7 +5934,7 @@
           <w:color w:val="0F172A"/>
           <w:sz w:val="20"/>
         </w:rPr>
-        <w:t xml:space="preserve">3-Tab Separation Architecture: </w:t>
+        <w:t xml:space="preserve">Combined Operational Workspace: </w:t>
       </w:r>
       <w:r>
         <w:rPr>
@@ -5943,7 +5943,31 @@
           <w:color w:val="0F172A"/>
           <w:sz w:val="20"/>
         </w:rPr>
-        <w:t>Replaced the previously stacked, lengthy single-page layout with three dedicated, distraction-free views: Customer Licenses Tab (daily operations, search, filters, renewal table), Profit &amp; Financial Tracker Tab (5 KPI cards, tier margins, platform performance), and Sourced Email Accounts Tab (Patreon account loads, distribution pills, load cards).</w:t>
+        <w:t>Merges the customer renewal management table directly with the Patreon sourced email distribution bar and quick-click load pills on a single screen. This gives the owner immediate visibility over account key loads (e.g. 11+ accounts) and enables 1-click account filtering without needing to switch away from the license table.</w:t>
+      </w:r>
+    </w:p>
+    <w:p>
+      <w:pPr>
+        <w:pStyle w:val="ListBullet"/>
+        <w:spacing w:before="0" w:after="60" w:line="276" w:lineRule="auto"/>
+      </w:pPr>
+      <w:r>
+        <w:rPr>
+          <w:rFonts w:ascii="Arial" w:hAnsi="Arial"/>
+          <w:b/>
+          <w:color w:val="0F172A"/>
+          <w:sz w:val="20"/>
+        </w:rPr>
+        <w:t xml:space="preserve">Isolated Profit &amp; Financial Tracker Tab: </w:t>
+      </w:r>
+      <w:r>
+        <w:rPr>
+          <w:rFonts w:ascii="Arial" w:hAnsi="Arial"/>
+          <w:b w:val="0"/>
+          <w:color w:val="0F172A"/>
+          <w:sz w:val="20"/>
+        </w:rPr>
+        <w:t>Isolates the financial tracking dashboard into its own dedicated tab, eliminating financial clutter from daily operations while retaining 5 KPI cards (Tracked Sales, Total Revenue, Patreon Inventory Costs, Net Profit, Margin %), Device Tier margin breakdowns (1, 2, and 3 Devices), and Acquisition Channel performance (Discord, Telegram, Reddit).</w:t>
       </w:r>
     </w:p>
     <w:p>
@@ -5967,7 +5991,7 @@
           <w:color w:val="0F172A"/>
           <w:sz w:val="20"/>
         </w:rPr>
-        <w:t>Consolidated redundant columns into 8 high-density columns: Customer &amp; Contact (combined name + handle), Plan, Amount / Profit (selling price + net profit badge), Platform, Source Account Email, Expiry / Days Left (timeline + pending days), Status, and Actions.</w:t>
+        <w:t>Consolidates redundant columns into 8 high-density columns: Customer &amp; Contact (combined name + handle), Plan, Amount / Profit (selling price + net profit badge), Platform, Source Account Email, Expiry / Days Left (timeline + pending days), Status, and Actions.</w:t>
       </w:r>
     </w:p>
     <w:p>
@@ -5991,7 +6015,7 @@
           <w:color w:val="0F172A"/>
           <w:sz w:val="20"/>
         </w:rPr>
-        <w:t>Active tab state is saved to localStorage (crm_active_tab) and restored on page refresh. Contextual actions such as clicking quick-filter cards or account badges automatically switch to the Customer Licenses tab and apply filters synchronously.</w:t>
+        <w:t>Active tab state is saved to localStorage (crm_active_tab) and restored on page refresh. Contextual actions such as clicking quick-filter cards or account badges automatically navigate to the Customer Licenses view and apply filters synchronously.</w:t>
       </w:r>
     </w:p>
     <w:p>

</xml_diff>

<commit_message>
docs: update discord channel names and document 100iv coordinate hub
</commit_message>
<xml_diff>
--- a/docs/Documentation.docx
+++ b/docs/Documentation.docx
@@ -6217,7 +6217,7 @@
           <w:color w:val="0F172A"/>
           <w:sz w:val="20"/>
         </w:rPr>
-        <w:t>Message 1550381786234626081 in #pricing-and-keys (1550381744509685901) features an interactive green '[ Open Order Ticket ]' button.</w:t>
+        <w:t>Message 1550381786234626081 in #pgsharp-keys (1550381744509685901) features an interactive green '[ Open Order Ticket ]' button.</w:t>
       </w:r>
     </w:p>
     <w:p>
@@ -6377,6 +6377,93 @@
           <w:sz w:val="20"/>
         </w:rPr>
         <w:t>Automatically forwards customer receipts, bank confirmations, and activation screenshots into Discord channel #vouches (1550381748506988584) with styled embeds.</w:t>
+      </w:r>
+    </w:p>
+    <w:p>
+      <w:pPr>
+        <w:keepNext/>
+        <w:spacing w:before="240" w:after="80"/>
+      </w:pPr>
+      <w:r>
+        <w:rPr>
+          <w:rFonts w:ascii="Arial" w:hAnsi="Arial"/>
+          <w:b/>
+          <w:color w:val="0F172A"/>
+          <w:sz w:val="23"/>
+        </w:rPr>
+        <w:t>13.3 Streamlined Channel Architecture &amp; 100iv Coordinate Hub</w:t>
+      </w:r>
+    </w:p>
+    <w:p>
+      <w:pPr>
+        <w:pStyle w:val="ListBullet"/>
+        <w:spacing w:before="0" w:after="60" w:line="276" w:lineRule="auto"/>
+      </w:pPr>
+      <w:r>
+        <w:rPr>
+          <w:rFonts w:ascii="Arial" w:hAnsi="Arial"/>
+          <w:b/>
+          <w:color w:val="0F172A"/>
+          <w:sz w:val="20"/>
+        </w:rPr>
+        <w:t xml:space="preserve">Decluttered Channel Hierarchy: </w:t>
+      </w:r>
+      <w:r>
+        <w:rPr>
+          <w:rFonts w:ascii="Arial" w:hAnsi="Arial"/>
+          <w:b w:val="0"/>
+          <w:color w:val="0F172A"/>
+          <w:sz w:val="20"/>
+        </w:rPr>
+        <w:t>Removed noisy and unused channels (#clips-and-highlights, #cooldown-guide) to center community focus on key purchasing, instant fulfillment, and game utility.</w:t>
+      </w:r>
+    </w:p>
+    <w:p>
+      <w:pPr>
+        <w:pStyle w:val="ListBullet"/>
+        <w:spacing w:before="0" w:after="60" w:line="276" w:lineRule="auto"/>
+      </w:pPr>
+      <w:r>
+        <w:rPr>
+          <w:rFonts w:ascii="Arial" w:hAnsi="Arial"/>
+          <w:b/>
+          <w:color w:val="0F172A"/>
+          <w:sz w:val="20"/>
+        </w:rPr>
+        <w:t xml:space="preserve">Short &amp; Intuitive Channel Naming: </w:t>
+      </w:r>
+      <w:r>
+        <w:rPr>
+          <w:rFonts w:ascii="Arial" w:hAnsi="Arial"/>
+          <w:b w:val="0"/>
+          <w:color w:val="0F172A"/>
+          <w:sz w:val="20"/>
+        </w:rPr>
+        <w:t>Replaced lengthy titles with industry-standard short identifiers: #welcome-and-rules to #welcome, #pricing-and-keys to #pgsharp-keys, #events-calendar to #events, #flex-catches to #flex, and #hundo-coords to #100iv.</w:t>
+      </w:r>
+    </w:p>
+    <w:p>
+      <w:pPr>
+        <w:pStyle w:val="ListBullet"/>
+        <w:spacing w:before="0" w:after="60" w:line="276" w:lineRule="auto"/>
+      </w:pPr>
+      <w:r>
+        <w:rPr>
+          <w:rFonts w:ascii="Arial" w:hAnsi="Arial"/>
+          <w:b/>
+          <w:color w:val="0F172A"/>
+          <w:sz w:val="20"/>
+        </w:rPr>
+        <w:t xml:space="preserve">100IV Coordinate Hub Architecture: </w:t>
+      </w:r>
+      <w:r>
+        <w:rPr>
+          <w:rFonts w:ascii="Arial" w:hAnsi="Arial"/>
+          <w:b w:val="0"/>
+          <w:color w:val="0F172A"/>
+          <w:sz w:val="20"/>
+        </w:rPr>
+        <w:t>The dedicated #100iv channel provides a streamlined, mobile-friendly hub for verified 100% IV Pokemon coordinates featuring 1-tap raw coordinates, despawn countdowns, IV breakdown (15/15/15), CP, level, and regional tags.</w:t>
       </w:r>
     </w:p>
     <w:p>

</xml_diff>

<commit_message>
docs: finalize ultra-clean 2-category discord channel structure in documentation
</commit_message>
<xml_diff>
--- a/docs/Documentation.docx
+++ b/docs/Documentation.docx
@@ -6391,7 +6391,7 @@
           <w:color w:val="0F172A"/>
           <w:sz w:val="23"/>
         </w:rPr>
-        <w:t>13.3 Streamlined Channel Architecture &amp; 100iv Coordinate Hub</w:t>
+        <w:t>13.3 Ultra-Clean Streamlined Channel Architecture</w:t>
       </w:r>
     </w:p>
     <w:p>
@@ -6415,7 +6415,7 @@
           <w:color w:val="0F172A"/>
           <w:sz w:val="20"/>
         </w:rPr>
-        <w:t>Removed noisy and unused channels (#clips-and-highlights, #cooldown-guide) to center community focus on key purchasing, instant fulfillment, and game utility.</w:t>
+        <w:t>Removed all noisy and unnecessary channels (#clips-and-highlights, #cooldown-guide, and #100iv) to center 100% of community focus on key purchasing, instant ticket fulfillment, customer vouches, and genuine community interaction.</w:t>
       </w:r>
     </w:p>
     <w:p>
@@ -6430,7 +6430,7 @@
           <w:color w:val="0F172A"/>
           <w:sz w:val="20"/>
         </w:rPr>
-        <w:t xml:space="preserve">Short &amp; Intuitive Channel Naming: </w:t>
+        <w:t xml:space="preserve">Dedicated 2-Category Executive Layout: </w:t>
       </w:r>
       <w:r>
         <w:rPr>
@@ -6439,31 +6439,7 @@
           <w:color w:val="0F172A"/>
           <w:sz w:val="20"/>
         </w:rPr>
-        <w:t>Replaced lengthy titles with industry-standard short identifiers: #welcome-and-rules to #welcome, #pricing-and-keys to #pgsharp-keys, #events-calendar to #events, #flex-catches to #flex, and #hundo-coords to #100iv.</w:t>
-      </w:r>
-    </w:p>
-    <w:p>
-      <w:pPr>
-        <w:pStyle w:val="ListBullet"/>
-        <w:spacing w:before="0" w:after="60" w:line="276" w:lineRule="auto"/>
-      </w:pPr>
-      <w:r>
-        <w:rPr>
-          <w:rFonts w:ascii="Arial" w:hAnsi="Arial"/>
-          <w:b/>
-          <w:color w:val="0F172A"/>
-          <w:sz w:val="20"/>
-        </w:rPr>
-        <w:t xml:space="preserve">100IV Coordinate Hub Architecture: </w:t>
-      </w:r>
-      <w:r>
-        <w:rPr>
-          <w:rFonts w:ascii="Arial" w:hAnsi="Arial"/>
-          <w:b w:val="0"/>
-          <w:color w:val="0F172A"/>
-          <w:sz w:val="20"/>
-        </w:rPr>
-        <w:t>The dedicated #100iv channel provides a streamlined, mobile-friendly hub for verified 100% IV Pokemon coordinates featuring 1-tap raw coordinates, despawn countdowns, IV breakdown (15/15/15), CP, level, and regional tags.</w:t>
+        <w:t>INFORMATION category (#welcome, #pgsharp-keys, #vouches) and COMMUNITY category (#general, #events, #flex, #support-help).</w:t>
       </w:r>
     </w:p>
     <w:p>

</xml_diff>

<commit_message>
docs: update Documentation.docx and markdown with fault-tolerant CRM modals and dual-engine vouch sync
</commit_message>
<xml_diff>
--- a/docs/Documentation.docx
+++ b/docs/Documentation.docx
@@ -6021,6 +6021,93 @@
     <w:p>
       <w:pPr>
         <w:keepNext/>
+        <w:spacing w:before="240" w:after="80"/>
+      </w:pPr>
+      <w:r>
+        <w:rPr>
+          <w:rFonts w:ascii="Arial" w:hAnsi="Arial"/>
+          <w:b/>
+          <w:color w:val="0F172A"/>
+          <w:sz w:val="23"/>
+        </w:rPr>
+        <w:t>11.8 Fault-Tolerant Modal Architecture &amp; Safe Quick Presets</w:t>
+      </w:r>
+    </w:p>
+    <w:p>
+      <w:pPr>
+        <w:pStyle w:val="ListBullet"/>
+        <w:spacing w:before="0" w:after="60" w:line="276" w:lineRule="auto"/>
+      </w:pPr>
+      <w:r>
+        <w:rPr>
+          <w:rFonts w:ascii="Arial" w:hAnsi="Arial"/>
+          <w:b/>
+          <w:color w:val="0F172A"/>
+          <w:sz w:val="20"/>
+        </w:rPr>
+        <w:t xml:space="preserve">Synchronized Modal DOM &amp; State Handlers: </w:t>
+      </w:r>
+      <w:r>
+        <w:rPr>
+          <w:rFonts w:ascii="Arial" w:hAnsi="Arial"/>
+          <w:b w:val="0"/>
+          <w:color w:val="0F172A"/>
+          <w:sz w:val="20"/>
+        </w:rPr>
+        <w:t>Aligns id='sale-expiry-date' across modal HTML, applyPresetDate('sale', 30), and updateReminderBanner('sale') with multi-tier fallback lookups (prefix + '-expiry-date' and expiry-date).</w:t>
+      </w:r>
+    </w:p>
+    <w:p>
+      <w:pPr>
+        <w:pStyle w:val="ListBullet"/>
+        <w:spacing w:before="0" w:after="60" w:line="276" w:lineRule="auto"/>
+      </w:pPr>
+      <w:r>
+        <w:rPr>
+          <w:rFonts w:ascii="Arial" w:hAnsi="Arial"/>
+          <w:b/>
+          <w:color w:val="0F172A"/>
+          <w:sz w:val="20"/>
+        </w:rPr>
+        <w:t xml:space="preserve">Protective Isolation Handlers: </w:t>
+      </w:r>
+      <w:r>
+        <w:rPr>
+          <w:rFonts w:ascii="Arial" w:hAnsi="Arial"/>
+          <w:b w:val="0"/>
+          <w:color w:val="0F172A"/>
+          <w:sz w:val="20"/>
+        </w:rPr>
+        <w:t>Wraps pre-fill calculations, email datalist populators, and profit previews in defensive try/catch execution blocks, guaranteeing the '+ Log New Sale' modal displays reliably across all browser engines.</w:t>
+      </w:r>
+    </w:p>
+    <w:p>
+      <w:pPr>
+        <w:pStyle w:val="ListBullet"/>
+        <w:spacing w:before="0" w:after="60" w:line="276" w:lineRule="auto"/>
+      </w:pPr>
+      <w:r>
+        <w:rPr>
+          <w:rFonts w:ascii="Arial" w:hAnsi="Arial"/>
+          <w:b/>
+          <w:color w:val="0F172A"/>
+          <w:sz w:val="20"/>
+        </w:rPr>
+        <w:t xml:space="preserve">Intuitive Backdrop Dismissal: </w:t>
+      </w:r>
+      <w:r>
+        <w:rPr>
+          <w:rFonts w:ascii="Arial" w:hAnsi="Arial"/>
+          <w:b w:val="0"/>
+          <w:color w:val="0F172A"/>
+          <w:sz w:val="20"/>
+        </w:rPr>
+        <w:t>Global click listeners dismiss active popup dialogs (#sale-modal, #edit-modal, #renew-modal) when clicking outside the dialog card.</w:t>
+      </w:r>
+    </w:p>
+    <w:p>
+      <w:pPr>
+        <w:keepNext/>
         <w:spacing w:before="320" w:after="120"/>
       </w:pPr>
       <w:r>
@@ -6343,7 +6430,7 @@
           <w:color w:val="0F172A"/>
           <w:sz w:val="20"/>
         </w:rPr>
-        <w:t xml:space="preserve">Autonomous Telegram-to-Discord Forwarding: </w:t>
+        <w:t xml:space="preserve">Dual-Engine Auto-Sync Architecture: </w:t>
       </w:r>
       <w:r>
         <w:rPr>
@@ -6352,7 +6439,7 @@
           <w:color w:val="0F172A"/>
           <w:sz w:val="20"/>
         </w:rPr>
-        <w:t>Monitors approved proof screenshots posted in Telegram channel @AetheriaStoreVouches.</w:t>
+        <w:t>Combines an active Telegram MTProto WebSocket event listener with a 60-second background polling catch-up worker to ensure zero dropped vouches even during mobile-client posting or network reconnections.</w:t>
       </w:r>
     </w:p>
     <w:p>
@@ -6367,7 +6454,7 @@
           <w:color w:val="0F172A"/>
           <w:sz w:val="20"/>
         </w:rPr>
-        <w:t xml:space="preserve">Rich Discord Embeds: </w:t>
+        <w:t xml:space="preserve">Robust Multi-Candidate Entity Resolution: </w:t>
       </w:r>
       <w:r>
         <w:rPr>
@@ -6376,7 +6463,55 @@
           <w:color w:val="0F172A"/>
           <w:sz w:val="20"/>
         </w:rPr>
-        <w:t>Automatically forwards customer receipts, bank confirmations, and activation screenshots into Discord channel #vouches (1550381748506988584) with styled embeds.</w:t>
+        <w:t>Dynamically checks @AetheriaVouches, @AetheriaStoreVouches, and active dialog titles to resolve channel ID 4497586435 reliably under all environment configurations.</w:t>
+      </w:r>
+    </w:p>
+    <w:p>
+      <w:pPr>
+        <w:pStyle w:val="ListBullet"/>
+        <w:spacing w:before="0" w:after="60" w:line="276" w:lineRule="auto"/>
+      </w:pPr>
+      <w:r>
+        <w:rPr>
+          <w:rFonts w:ascii="Arial" w:hAnsi="Arial"/>
+          <w:b/>
+          <w:color w:val="0F172A"/>
+          <w:sz w:val="20"/>
+        </w:rPr>
+        <w:t xml:space="preserve">Automated Media Download &amp; Sanitization: </w:t>
+      </w:r>
+      <w:r>
+        <w:rPr>
+          <w:rFonts w:ascii="Arial" w:hAnsi="Arial"/>
+          <w:b w:val="0"/>
+          <w:color w:val="0F172A"/>
+          <w:sz w:val="20"/>
+        </w:rPr>
+        <w:t>Downloads customer activation screenshots, strips promotional footers, hashtags, and emojis, and reformats captions into clean verification text.</w:t>
+      </w:r>
+    </w:p>
+    <w:p>
+      <w:pPr>
+        <w:pStyle w:val="ListBullet"/>
+        <w:spacing w:before="0" w:after="60" w:line="276" w:lineRule="auto"/>
+      </w:pPr>
+      <w:r>
+        <w:rPr>
+          <w:rFonts w:ascii="Arial" w:hAnsi="Arial"/>
+          <w:b/>
+          <w:color w:val="0F172A"/>
+          <w:sz w:val="20"/>
+        </w:rPr>
+        <w:t xml:space="preserve">Rich Discord Image Forwarding: </w:t>
+      </w:r>
+      <w:r>
+        <w:rPr>
+          <w:rFonts w:ascii="Arial" w:hAnsi="Arial"/>
+          <w:b w:val="0"/>
+          <w:color w:val="0F172A"/>
+          <w:sz w:val="20"/>
+        </w:rPr>
+        <w:t>Dispatches multipart form data to Discord channel #vouches (1550381748506988584) displaying customer proofs directly in Discord.</w:t>
       </w:r>
     </w:p>
     <w:p>

</xml_diff>